<commit_message>
Add Week05 material and Team Report v1.3
</commit_message>
<xml_diff>
--- a/Assignments/Assignment1/Team Report.docx
+++ b/Assignments/Assignment1/Team Report.docx
@@ -4,6 +4,7 @@
   <w:body>
     <w:p>
       <w:pPr>
+        <w:spacing w:line="240" w:lineRule="auto"/>
         <w:jc w:val="center"/>
         <w:rPr>
           <w:rFonts w:hint="default" w:ascii="Times New Roman" w:hAnsi="Times New Roman" w:cs="Times New Roman"/>
@@ -21,7 +22,7 @@
         <mc:AlternateContent>
           <mc:Choice Requires="wps">
             <w:drawing>
-              <wp:anchor distT="0" distB="0" distL="114300" distR="114300" simplePos="0" relativeHeight="251660288" behindDoc="0" locked="0" layoutInCell="1" allowOverlap="1">
+              <wp:anchor distT="0" distB="0" distL="114300" distR="114300" simplePos="0" relativeHeight="251661312" behindDoc="0" locked="0" layoutInCell="1" allowOverlap="1">
                 <wp:simplePos x="0" y="0"/>
                 <wp:positionH relativeFrom="column">
                   <wp:posOffset>-5715</wp:posOffset>
@@ -146,7 +147,7 @@
           </mc:Choice>
           <mc:Fallback>
             <w:pict>
-              <v:shape id="_x0000_s1026" o:spid="_x0000_s1026" o:spt="202" type="#_x0000_t202" style="position:absolute;left:0pt;margin-left:-0.45pt;margin-top:33.2pt;height:68.15pt;width:315pt;z-index:251660288;mso-width-relative:page;mso-height-relative:page;" fillcolor="#FFFFFF [3201]" filled="t" stroked="f" coordsize="21600,21600" o:gfxdata="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">
+              <v:shape id="_x0000_s1026" o:spid="_x0000_s1026" o:spt="202" type="#_x0000_t202" style="position:absolute;left:0pt;margin-left:-0.45pt;margin-top:33.2pt;height:68.15pt;width:315pt;z-index:251661312;mso-width-relative:page;mso-height-relative:page;" fillcolor="#FFFFFF [3201]" filled="t" stroked="f" coordsize="21600,21600" o:gfxdata="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">
                 <v:fill on="t" focussize="0,0"/>
                 <v:stroke on="f" weight="0.5pt"/>
                 <v:imagedata o:title=""/>
@@ -232,7 +233,7 @@
           <w:lang w:val="en-US"/>
         </w:rPr>
         <w:drawing>
-          <wp:anchor distT="0" distB="0" distL="114300" distR="114300" simplePos="0" relativeHeight="251659264" behindDoc="0" locked="0" layoutInCell="1" allowOverlap="1">
+          <wp:anchor distT="0" distB="0" distL="114300" distR="114300" simplePos="0" relativeHeight="251660288" behindDoc="0" locked="0" layoutInCell="1" allowOverlap="1">
             <wp:simplePos x="0" y="0"/>
             <wp:positionH relativeFrom="column">
               <wp:posOffset>4098925</wp:posOffset>
@@ -257,10 +258,10 @@
                     </pic:cNvPicPr>
                   </pic:nvPicPr>
                   <pic:blipFill>
-                    <a:blip r:embed="rId4">
+                    <a:blip r:embed="rId6">
                       <a:extLst>
                         <a:ext uri="{96DAC541-7B7A-43D3-8B79-37D633B846F1}">
-                          <asvg:svgBlip xmlns:asvg="http://schemas.microsoft.com/office/drawing/2016/SVG/main" r:embed="rId5"/>
+                          <asvg:svgBlip xmlns:asvg="http://schemas.microsoft.com/office/drawing/2016/SVG/main" r:embed="rId7"/>
                         </a:ext>
                       </a:extLst>
                     </a:blip>
@@ -285,84 +286,84 @@
       </w:r>
       <w:r>
         <w:rPr>
-          <w:rFonts w:hint="default"/>
+          <w:rFonts w:hint="default" w:ascii="Times New Roman" w:hAnsi="Times New Roman" w:cs="Times New Roman"/>
           <w:lang w:val="en-US"/>
         </w:rPr>
         <w:br w:type="textWrapping"/>
       </w:r>
       <w:r>
         <w:rPr>
-          <w:rFonts w:hint="default"/>
+          <w:rFonts w:hint="default" w:ascii="Times New Roman" w:hAnsi="Times New Roman" w:cs="Times New Roman"/>
           <w:lang w:val="en-US"/>
         </w:rPr>
         <w:br w:type="textWrapping"/>
       </w:r>
       <w:r>
         <w:rPr>
-          <w:rFonts w:hint="default"/>
+          <w:rFonts w:hint="default" w:ascii="Times New Roman" w:hAnsi="Times New Roman" w:cs="Times New Roman"/>
           <w:lang w:val="en-US"/>
         </w:rPr>
         <w:br w:type="textWrapping"/>
       </w:r>
       <w:r>
         <w:rPr>
-          <w:rFonts w:hint="default"/>
+          <w:rFonts w:hint="default" w:ascii="Times New Roman" w:hAnsi="Times New Roman" w:cs="Times New Roman"/>
           <w:lang w:val="en-US"/>
         </w:rPr>
         <w:br w:type="textWrapping"/>
       </w:r>
       <w:r>
         <w:rPr>
-          <w:rFonts w:hint="default"/>
+          <w:rFonts w:hint="default" w:ascii="Times New Roman" w:hAnsi="Times New Roman" w:cs="Times New Roman"/>
           <w:lang w:val="en-US"/>
         </w:rPr>
         <w:br w:type="textWrapping"/>
       </w:r>
       <w:r>
         <w:rPr>
-          <w:rFonts w:hint="default"/>
+          <w:rFonts w:hint="default" w:ascii="Times New Roman" w:hAnsi="Times New Roman" w:cs="Times New Roman"/>
           <w:lang w:val="en-US"/>
         </w:rPr>
         <w:br w:type="textWrapping"/>
       </w:r>
       <w:r>
         <w:rPr>
-          <w:rFonts w:hint="default"/>
+          <w:rFonts w:hint="default" w:ascii="Times New Roman" w:hAnsi="Times New Roman" w:cs="Times New Roman"/>
           <w:lang w:val="en-US"/>
         </w:rPr>
         <w:br w:type="textWrapping"/>
       </w:r>
       <w:r>
         <w:rPr>
-          <w:rFonts w:hint="default"/>
+          <w:rFonts w:hint="default" w:ascii="Times New Roman" w:hAnsi="Times New Roman" w:cs="Times New Roman"/>
           <w:lang w:val="en-US"/>
         </w:rPr>
         <w:br w:type="textWrapping"/>
       </w:r>
       <w:r>
         <w:rPr>
-          <w:rFonts w:hint="default"/>
+          <w:rFonts w:hint="default" w:ascii="Times New Roman" w:hAnsi="Times New Roman" w:cs="Times New Roman"/>
           <w:lang w:val="en-US"/>
         </w:rPr>
         <w:br w:type="textWrapping"/>
       </w:r>
       <w:r>
         <w:rPr>
-          <w:rFonts w:hint="default"/>
+          <w:rFonts w:hint="default" w:ascii="Times New Roman" w:hAnsi="Times New Roman" w:cs="Times New Roman"/>
           <w:lang w:val="en-US"/>
         </w:rPr>
         <w:br w:type="textWrapping"/>
       </w:r>
       <w:r>
         <w:rPr>
-          <w:rFonts w:hint="default"/>
+          <w:rFonts w:hint="default" w:ascii="Times New Roman" w:hAnsi="Times New Roman" w:cs="Times New Roman"/>
           <w:lang w:val="en-US"/>
         </w:rPr>
         <w:br w:type="textWrapping"/>
       </w:r>
       <w:r>
         <w:rPr>
-          <w:rFonts w:hint="default"/>
+          <w:rFonts w:hint="default" w:ascii="Times New Roman" w:hAnsi="Times New Roman" w:cs="Times New Roman"/>
           <w:lang w:val="en-US"/>
         </w:rPr>
         <w:br w:type="textWrapping"/>
@@ -379,6 +380,7 @@
     </w:p>
     <w:p>
       <w:pPr>
+        <w:spacing w:line="240" w:lineRule="auto"/>
         <w:ind w:left="480" w:hanging="480" w:hangingChars="100"/>
         <w:jc w:val="center"/>
         <w:rPr>
@@ -395,11 +397,30 @@
           <w:szCs w:val="48"/>
           <w:lang w:val="en-US"/>
         </w:rPr>
-        <w:t>Software Requirement Specifications</w:t>
-      </w:r>
-    </w:p>
-    <w:p>
-      <w:pPr>
+        <w:t>Software Requirement</w:t>
+      </w:r>
+      <w:r>
+        <w:rPr>
+          <w:rFonts w:hint="default" w:ascii="Times New Roman" w:hAnsi="Times New Roman" w:cs="Times New Roman"/>
+          <w:sz w:val="48"/>
+          <w:szCs w:val="48"/>
+          <w:lang w:val="en-US"/>
+        </w:rPr>
+        <w:t>s</w:t>
+      </w:r>
+      <w:r>
+        <w:rPr>
+          <w:rFonts w:hint="default" w:ascii="Times New Roman" w:hAnsi="Times New Roman" w:cs="Times New Roman"/>
+          <w:sz w:val="48"/>
+          <w:szCs w:val="48"/>
+          <w:lang w:val="en-US"/>
+        </w:rPr>
+        <w:t xml:space="preserve"> Specification</w:t>
+      </w:r>
+    </w:p>
+    <w:p>
+      <w:pPr>
+        <w:spacing w:line="240" w:lineRule="auto"/>
         <w:ind w:left="480" w:hanging="480" w:hangingChars="100"/>
         <w:jc w:val="left"/>
         <w:rPr>
@@ -412,6 +433,7 @@
     </w:p>
     <w:p>
       <w:pPr>
+        <w:spacing w:line="240" w:lineRule="auto"/>
         <w:ind w:left="480" w:hanging="480" w:hangingChars="100"/>
         <w:jc w:val="left"/>
         <w:rPr>
@@ -424,6 +446,7 @@
     </w:p>
     <w:p>
       <w:pPr>
+        <w:spacing w:line="240" w:lineRule="auto"/>
         <w:ind w:left="480" w:hanging="480" w:hangingChars="100"/>
         <w:jc w:val="left"/>
         <w:rPr>
@@ -436,6 +459,7 @@
     </w:p>
     <w:p>
       <w:pPr>
+        <w:spacing w:line="240" w:lineRule="auto"/>
         <w:jc w:val="left"/>
         <w:rPr>
           <w:rFonts w:hint="default" w:ascii="Times New Roman" w:hAnsi="Times New Roman" w:cs="Times New Roman"/>
@@ -447,6 +471,7 @@
     </w:p>
     <w:p>
       <w:pPr>
+        <w:spacing w:line="240" w:lineRule="auto"/>
         <w:jc w:val="left"/>
         <w:rPr>
           <w:rFonts w:hint="default" w:ascii="Times New Roman" w:hAnsi="Times New Roman" w:cs="Times New Roman"/>
@@ -460,6 +485,7 @@
     </w:p>
     <w:p>
       <w:pPr>
+        <w:spacing w:line="240" w:lineRule="auto"/>
         <w:jc w:val="left"/>
         <w:rPr>
           <w:rFonts w:hint="default" w:ascii="Times New Roman" w:hAnsi="Times New Roman" w:cs="Times New Roman"/>
@@ -473,6 +499,7 @@
     </w:p>
     <w:p>
       <w:pPr>
+        <w:spacing w:line="240" w:lineRule="auto"/>
         <w:jc w:val="left"/>
         <w:rPr>
           <w:rFonts w:hint="default" w:ascii="Times New Roman" w:hAnsi="Times New Roman" w:cs="Times New Roman"/>
@@ -486,6 +513,7 @@
     </w:p>
     <w:p>
       <w:pPr>
+        <w:spacing w:line="240" w:lineRule="auto"/>
         <w:jc w:val="left"/>
         <w:rPr>
           <w:rFonts w:hint="default" w:ascii="Times New Roman" w:hAnsi="Times New Roman" w:cs="Times New Roman"/>
@@ -499,6 +527,7 @@
     </w:p>
     <w:p>
       <w:pPr>
+        <w:spacing w:line="240" w:lineRule="auto"/>
         <w:jc w:val="left"/>
         <w:rPr>
           <w:rFonts w:hint="default" w:ascii="Times New Roman" w:hAnsi="Times New Roman" w:cs="Times New Roman"/>
@@ -539,6 +568,7 @@
     </w:p>
     <w:p>
       <w:pPr>
+        <w:spacing w:line="240" w:lineRule="auto"/>
         <w:jc w:val="left"/>
         <w:rPr>
           <w:rFonts w:hint="default" w:ascii="Times New Roman" w:hAnsi="Times New Roman" w:cs="Times New Roman"/>
@@ -570,6 +600,7 @@
     </w:p>
     <w:p>
       <w:pPr>
+        <w:spacing w:line="240" w:lineRule="auto"/>
         <w:jc w:val="left"/>
         <w:rPr>
           <w:rFonts w:hint="default" w:ascii="Times New Roman" w:hAnsi="Times New Roman" w:cs="Times New Roman"/>
@@ -601,6 +632,7 @@
     </w:p>
     <w:p>
       <w:pPr>
+        <w:spacing w:line="240" w:lineRule="auto"/>
         <w:ind w:left="480" w:hanging="281" w:hangingChars="100"/>
         <w:jc w:val="left"/>
         <w:rPr>
@@ -633,6 +665,7 @@
     </w:p>
     <w:p>
       <w:pPr>
+        <w:spacing w:line="240" w:lineRule="auto"/>
         <w:ind w:left="480" w:hanging="281" w:hangingChars="100"/>
         <w:jc w:val="left"/>
         <w:rPr>
@@ -665,6 +698,7 @@
     </w:p>
     <w:p>
       <w:pPr>
+        <w:spacing w:line="240" w:lineRule="auto"/>
         <w:ind w:left="480" w:hanging="280" w:hangingChars="100"/>
         <w:jc w:val="left"/>
         <w:rPr>
@@ -686,6 +720,7 @@
     </w:p>
     <w:p>
       <w:pPr>
+        <w:spacing w:line="240" w:lineRule="auto"/>
         <w:ind w:left="480" w:hanging="280" w:hangingChars="100"/>
         <w:jc w:val="left"/>
         <w:rPr>
@@ -707,6 +742,7 @@
     </w:p>
     <w:p>
       <w:pPr>
+        <w:spacing w:line="240" w:lineRule="auto"/>
         <w:ind w:left="480" w:hanging="281" w:hangingChars="100"/>
         <w:jc w:val="left"/>
         <w:rPr>
@@ -758,6 +794,7 @@
     </w:p>
     <w:p>
       <w:pPr>
+        <w:spacing w:line="240" w:lineRule="auto"/>
         <w:ind w:left="480" w:hanging="281" w:hangingChars="100"/>
         <w:jc w:val="left"/>
         <w:rPr>
@@ -809,6 +846,7 @@
     </w:p>
     <w:p>
       <w:pPr>
+        <w:spacing w:line="240" w:lineRule="auto"/>
         <w:ind w:left="480" w:hanging="281" w:hangingChars="100"/>
         <w:jc w:val="left"/>
         <w:rPr>
@@ -860,12 +898,11 @@
     </w:p>
     <w:p>
       <w:pPr>
+        <w:spacing w:line="240" w:lineRule="auto"/>
         <w:ind w:left="480" w:hanging="281" w:hangingChars="100"/>
         <w:jc w:val="left"/>
         <w:rPr>
           <w:rFonts w:hint="default" w:ascii="Times New Roman" w:hAnsi="Times New Roman" w:cs="Times New Roman"/>
-          <w:sz w:val="28"/>
-          <w:szCs w:val="28"/>
           <w:lang w:val="en-US"/>
         </w:rPr>
       </w:pPr>
@@ -887,23 +924,1926 @@
           <w:szCs w:val="28"/>
           <w:lang w:val="en-US"/>
         </w:rPr>
-        <w:t>: words</w:t>
-      </w:r>
-    </w:p>
-    <w:p>
-      <w:pPr>
-        <w:pStyle w:val="7"/>
+        <w:t>: word</w:t>
+      </w:r>
+      <w:r>
+        <w:rPr>
+          <w:rFonts w:hint="default" w:ascii="Times New Roman" w:hAnsi="Times New Roman" w:cs="Times New Roman"/>
+          <w:sz w:val="28"/>
+          <w:szCs w:val="28"/>
+          <w:lang w:val="en-US"/>
+        </w:rPr>
+        <w:t>s</w:t>
+      </w:r>
+    </w:p>
+    <w:p>
+      <w:pPr>
+        <w:bidi w:val="0"/>
+        <w:spacing w:line="240" w:lineRule="auto"/>
+        <w:rPr>
+          <w:rFonts w:hint="default" w:ascii="Times New Roman" w:hAnsi="Times New Roman" w:cs="Times New Roman"/>
+          <w:b/>
+          <w:bCs/>
+          <w:lang w:val="en-US"/>
+        </w:rPr>
+      </w:pPr>
+      <w:r>
+        <w:rPr>
+          <w:rFonts w:hint="default" w:ascii="Times New Roman" w:hAnsi="Times New Roman" w:cs="Times New Roman"/>
+          <w:b/>
+          <w:bCs/>
+          <w:lang w:val="en-US"/>
+        </w:rPr>
+        <w:t>Abstraction</w:t>
+      </w:r>
+    </w:p>
+    <w:p>
+      <w:pPr>
+        <w:bidi w:val="0"/>
+        <w:spacing w:line="240" w:lineRule="auto"/>
+        <w:rPr>
+          <w:rFonts w:hint="default" w:ascii="Times New Roman" w:hAnsi="Times New Roman" w:cs="Times New Roman"/>
+          <w:b/>
+          <w:bCs/>
+          <w:lang w:val="en-US"/>
+        </w:rPr>
+      </w:pPr>
+    </w:p>
+    <w:p>
+      <w:pPr>
+        <w:bidi w:val="0"/>
+        <w:spacing w:line="240" w:lineRule="auto"/>
+        <w:rPr>
+          <w:rFonts w:hint="default" w:ascii="Times New Roman" w:hAnsi="Times New Roman" w:cs="Times New Roman"/>
+          <w:b/>
+          <w:bCs/>
+          <w:lang w:val="en-US"/>
+        </w:rPr>
+      </w:pPr>
+    </w:p>
+    <w:p>
+      <w:pPr>
+        <w:bidi w:val="0"/>
+        <w:spacing w:line="240" w:lineRule="auto"/>
+        <w:rPr>
+          <w:rFonts w:hint="default" w:ascii="Times New Roman" w:hAnsi="Times New Roman" w:cs="Times New Roman"/>
+          <w:b/>
+          <w:bCs/>
+          <w:lang w:val="en-US"/>
+        </w:rPr>
+      </w:pPr>
+    </w:p>
+    <w:p>
+      <w:pPr>
+        <w:bidi w:val="0"/>
+        <w:spacing w:line="240" w:lineRule="auto"/>
+        <w:rPr>
+          <w:rFonts w:hint="default" w:ascii="Times New Roman" w:hAnsi="Times New Roman" w:cs="Times New Roman"/>
+          <w:b/>
+          <w:bCs/>
+          <w:lang w:val="en-US"/>
+        </w:rPr>
+      </w:pPr>
+    </w:p>
+    <w:p>
+      <w:pPr>
+        <w:bidi w:val="0"/>
+        <w:spacing w:line="240" w:lineRule="auto"/>
+        <w:rPr>
+          <w:rFonts w:hint="default" w:ascii="Times New Roman" w:hAnsi="Times New Roman" w:cs="Times New Roman"/>
+          <w:b/>
+          <w:bCs/>
+          <w:lang w:val="en-US"/>
+        </w:rPr>
+      </w:pPr>
+    </w:p>
+    <w:p>
+      <w:pPr>
+        <w:bidi w:val="0"/>
+        <w:spacing w:line="240" w:lineRule="auto"/>
+        <w:rPr>
+          <w:rFonts w:hint="default" w:ascii="Times New Roman" w:hAnsi="Times New Roman" w:cs="Times New Roman"/>
+          <w:b/>
+          <w:bCs/>
+          <w:lang w:val="en-US"/>
+        </w:rPr>
+      </w:pPr>
+    </w:p>
+    <w:p>
+      <w:pPr>
+        <w:bidi w:val="0"/>
+        <w:spacing w:line="240" w:lineRule="auto"/>
+        <w:rPr>
+          <w:rFonts w:hint="default" w:ascii="Times New Roman" w:hAnsi="Times New Roman" w:cs="Times New Roman"/>
+          <w:b/>
+          <w:bCs/>
+          <w:lang w:val="en-US"/>
+        </w:rPr>
+      </w:pPr>
+    </w:p>
+    <w:p>
+      <w:pPr>
+        <w:bidi w:val="0"/>
+        <w:spacing w:line="240" w:lineRule="auto"/>
+        <w:rPr>
+          <w:rFonts w:hint="default" w:ascii="Times New Roman" w:hAnsi="Times New Roman" w:cs="Times New Roman"/>
+          <w:b/>
+          <w:bCs/>
+          <w:lang w:val="en-US"/>
+        </w:rPr>
+      </w:pPr>
+    </w:p>
+    <w:p>
+      <w:pPr>
+        <w:bidi w:val="0"/>
+        <w:spacing w:line="240" w:lineRule="auto"/>
+        <w:rPr>
+          <w:rFonts w:hint="default" w:ascii="Times New Roman" w:hAnsi="Times New Roman" w:cs="Times New Roman"/>
+          <w:b/>
+          <w:bCs/>
+          <w:lang w:val="en-US"/>
+        </w:rPr>
+      </w:pPr>
+    </w:p>
+    <w:p>
+      <w:pPr>
+        <w:bidi w:val="0"/>
+        <w:spacing w:line="240" w:lineRule="auto"/>
+        <w:rPr>
+          <w:rFonts w:hint="default" w:ascii="Times New Roman" w:hAnsi="Times New Roman" w:cs="Times New Roman"/>
+          <w:b/>
+          <w:bCs/>
+          <w:lang w:val="en-US"/>
+        </w:rPr>
+      </w:pPr>
+    </w:p>
+    <w:p>
+      <w:pPr>
+        <w:bidi w:val="0"/>
+        <w:spacing w:line="240" w:lineRule="auto"/>
+        <w:rPr>
+          <w:rFonts w:hint="default" w:ascii="Times New Roman" w:hAnsi="Times New Roman" w:cs="Times New Roman"/>
+          <w:b/>
+          <w:bCs/>
+          <w:lang w:val="en-US"/>
+        </w:rPr>
+      </w:pPr>
+    </w:p>
+    <w:p>
+      <w:pPr>
+        <w:bidi w:val="0"/>
+        <w:spacing w:line="240" w:lineRule="auto"/>
+        <w:rPr>
+          <w:rFonts w:hint="default" w:ascii="Times New Roman" w:hAnsi="Times New Roman" w:cs="Times New Roman"/>
+          <w:b/>
+          <w:bCs/>
+          <w:lang w:val="en-US"/>
+        </w:rPr>
+      </w:pPr>
+    </w:p>
+    <w:p>
+      <w:pPr>
+        <w:bidi w:val="0"/>
+        <w:spacing w:line="240" w:lineRule="auto"/>
+        <w:rPr>
+          <w:rFonts w:hint="default" w:ascii="Times New Roman" w:hAnsi="Times New Roman" w:cs="Times New Roman"/>
+          <w:b/>
+          <w:bCs/>
+          <w:lang w:val="en-US"/>
+        </w:rPr>
+      </w:pPr>
+    </w:p>
+    <w:p>
+      <w:pPr>
+        <w:bidi w:val="0"/>
+        <w:spacing w:line="240" w:lineRule="auto"/>
+        <w:rPr>
+          <w:rFonts w:hint="default" w:ascii="Times New Roman" w:hAnsi="Times New Roman" w:cs="Times New Roman"/>
+          <w:b/>
+          <w:bCs/>
+          <w:lang w:val="en-US"/>
+        </w:rPr>
+      </w:pPr>
+    </w:p>
+    <w:p>
+      <w:pPr>
+        <w:bidi w:val="0"/>
+        <w:spacing w:line="240" w:lineRule="auto"/>
+        <w:rPr>
+          <w:rFonts w:hint="default" w:ascii="Times New Roman" w:hAnsi="Times New Roman" w:cs="Times New Roman"/>
+          <w:b/>
+          <w:bCs/>
+          <w:lang w:val="en-US"/>
+        </w:rPr>
+      </w:pPr>
+    </w:p>
+    <w:p>
+      <w:pPr>
+        <w:bidi w:val="0"/>
+        <w:spacing w:line="240" w:lineRule="auto"/>
+        <w:rPr>
+          <w:rFonts w:hint="default" w:ascii="Times New Roman" w:hAnsi="Times New Roman" w:cs="Times New Roman"/>
+          <w:b/>
+          <w:bCs/>
+          <w:lang w:val="en-US"/>
+        </w:rPr>
+      </w:pPr>
+    </w:p>
+    <w:p>
+      <w:pPr>
+        <w:bidi w:val="0"/>
+        <w:spacing w:line="240" w:lineRule="auto"/>
+        <w:rPr>
+          <w:rFonts w:hint="default" w:ascii="Times New Roman" w:hAnsi="Times New Roman" w:cs="Times New Roman"/>
+          <w:b/>
+          <w:bCs/>
+          <w:lang w:val="en-US"/>
+        </w:rPr>
+      </w:pPr>
+    </w:p>
+    <w:p>
+      <w:pPr>
+        <w:bidi w:val="0"/>
+        <w:spacing w:line="240" w:lineRule="auto"/>
+        <w:rPr>
+          <w:rFonts w:hint="default" w:ascii="Times New Roman" w:hAnsi="Times New Roman" w:cs="Times New Roman"/>
+          <w:b/>
+          <w:bCs/>
+          <w:lang w:val="en-US"/>
+        </w:rPr>
+      </w:pPr>
+    </w:p>
+    <w:p>
+      <w:pPr>
+        <w:bidi w:val="0"/>
+        <w:spacing w:line="240" w:lineRule="auto"/>
+        <w:rPr>
+          <w:rFonts w:hint="default" w:ascii="Times New Roman" w:hAnsi="Times New Roman" w:cs="Times New Roman"/>
+          <w:b/>
+          <w:bCs/>
+          <w:lang w:val="en-US"/>
+        </w:rPr>
+      </w:pPr>
+    </w:p>
+    <w:p>
+      <w:pPr>
+        <w:bidi w:val="0"/>
+        <w:spacing w:line="240" w:lineRule="auto"/>
+        <w:rPr>
+          <w:rFonts w:hint="default" w:ascii="Times New Roman" w:hAnsi="Times New Roman" w:cs="Times New Roman"/>
+          <w:b/>
+          <w:bCs/>
+          <w:lang w:val="en-US"/>
+        </w:rPr>
+      </w:pPr>
+    </w:p>
+    <w:p>
+      <w:pPr>
+        <w:bidi w:val="0"/>
+        <w:spacing w:line="240" w:lineRule="auto"/>
+        <w:rPr>
+          <w:rFonts w:hint="default" w:ascii="Times New Roman" w:hAnsi="Times New Roman" w:cs="Times New Roman"/>
+          <w:b/>
+          <w:bCs/>
+          <w:lang w:val="en-US"/>
+        </w:rPr>
+      </w:pPr>
+    </w:p>
+    <w:p>
+      <w:pPr>
+        <w:bidi w:val="0"/>
+        <w:spacing w:line="240" w:lineRule="auto"/>
+        <w:rPr>
+          <w:rFonts w:hint="default" w:ascii="Times New Roman" w:hAnsi="Times New Roman" w:cs="Times New Roman"/>
+          <w:b/>
+          <w:bCs/>
+          <w:lang w:val="en-US"/>
+        </w:rPr>
+      </w:pPr>
+    </w:p>
+    <w:p>
+      <w:pPr>
+        <w:bidi w:val="0"/>
+        <w:spacing w:line="240" w:lineRule="auto"/>
+        <w:rPr>
+          <w:rFonts w:hint="default" w:ascii="Times New Roman" w:hAnsi="Times New Roman" w:cs="Times New Roman"/>
+          <w:b/>
+          <w:bCs/>
+          <w:lang w:val="en-US"/>
+        </w:rPr>
+      </w:pPr>
+    </w:p>
+    <w:p>
+      <w:pPr>
+        <w:bidi w:val="0"/>
+        <w:spacing w:line="240" w:lineRule="auto"/>
+        <w:rPr>
+          <w:rFonts w:hint="default" w:ascii="Times New Roman" w:hAnsi="Times New Roman" w:cs="Times New Roman"/>
+          <w:b/>
+          <w:bCs/>
+          <w:lang w:val="en-US"/>
+        </w:rPr>
+      </w:pPr>
+    </w:p>
+    <w:p>
+      <w:pPr>
+        <w:bidi w:val="0"/>
+        <w:spacing w:line="240" w:lineRule="auto"/>
+        <w:rPr>
+          <w:rFonts w:hint="default" w:ascii="Times New Roman" w:hAnsi="Times New Roman" w:cs="Times New Roman"/>
+          <w:b/>
+          <w:bCs/>
+          <w:lang w:val="en-US"/>
+        </w:rPr>
+      </w:pPr>
+    </w:p>
+    <w:p>
+      <w:pPr>
+        <w:bidi w:val="0"/>
+        <w:spacing w:line="240" w:lineRule="auto"/>
+        <w:rPr>
+          <w:rFonts w:hint="default" w:ascii="Times New Roman" w:hAnsi="Times New Roman" w:cs="Times New Roman"/>
+          <w:b/>
+          <w:bCs/>
+          <w:lang w:val="en-US"/>
+        </w:rPr>
+      </w:pPr>
+    </w:p>
+    <w:p>
+      <w:pPr>
+        <w:bidi w:val="0"/>
+        <w:spacing w:line="240" w:lineRule="auto"/>
+        <w:rPr>
+          <w:rFonts w:hint="default" w:ascii="Times New Roman" w:hAnsi="Times New Roman" w:cs="Times New Roman"/>
+          <w:b/>
+          <w:bCs/>
+          <w:lang w:val="en-US"/>
+        </w:rPr>
+      </w:pPr>
+    </w:p>
+    <w:p>
+      <w:pPr>
+        <w:bidi w:val="0"/>
+        <w:spacing w:line="240" w:lineRule="auto"/>
+        <w:rPr>
+          <w:rFonts w:hint="default" w:ascii="Times New Roman" w:hAnsi="Times New Roman" w:cs="Times New Roman"/>
+          <w:b/>
+          <w:bCs/>
+          <w:lang w:val="en-US"/>
+        </w:rPr>
+      </w:pPr>
+    </w:p>
+    <w:p>
+      <w:pPr>
+        <w:bidi w:val="0"/>
+        <w:spacing w:line="240" w:lineRule="auto"/>
+        <w:rPr>
+          <w:rFonts w:hint="default" w:ascii="Times New Roman" w:hAnsi="Times New Roman" w:cs="Times New Roman"/>
+          <w:b/>
+          <w:bCs/>
+          <w:lang w:val="en-US"/>
+        </w:rPr>
+      </w:pPr>
+    </w:p>
+    <w:p>
+      <w:pPr>
+        <w:bidi w:val="0"/>
+        <w:spacing w:line="240" w:lineRule="auto"/>
+        <w:rPr>
+          <w:rStyle w:val="13"/>
+          <w:rFonts w:hint="default" w:ascii="Times New Roman" w:hAnsi="Times New Roman" w:cs="Times New Roman"/>
+          <w:lang w:val="en-US"/>
+        </w:rPr>
+      </w:pPr>
+      <w:r>
+        <w:rPr>
+          <w:rStyle w:val="13"/>
+          <w:rFonts w:hint="default" w:ascii="Times New Roman" w:hAnsi="Times New Roman" w:cs="Times New Roman"/>
+          <w:lang w:val="en-US"/>
+        </w:rPr>
+        <w:t>Table of Contents</w:t>
+      </w:r>
+    </w:p>
+    <w:p>
+      <w:pPr>
+        <w:bidi w:val="0"/>
+        <w:spacing w:line="240" w:lineRule="auto"/>
+        <w:rPr>
+          <w:rFonts w:hint="default" w:ascii="Times New Roman" w:hAnsi="Times New Roman" w:cs="Times New Roman"/>
+        </w:rPr>
+      </w:pPr>
+      <w:r>
+        <w:rPr>
+          <w:rFonts w:hint="default" w:ascii="Times New Roman" w:hAnsi="Times New Roman" w:cs="Times New Roman"/>
+        </w:rPr>
+        <w:fldChar w:fldCharType="begin"/>
+      </w:r>
+      <w:r>
+        <w:rPr>
+          <w:rFonts w:hint="default" w:ascii="Times New Roman" w:hAnsi="Times New Roman" w:cs="Times New Roman"/>
+        </w:rPr>
+        <w:instrText xml:space="preserve">TOC \o "1-3" \h \u </w:instrText>
+      </w:r>
+      <w:r>
+        <w:rPr>
+          <w:rFonts w:hint="default" w:ascii="Times New Roman" w:hAnsi="Times New Roman" w:cs="Times New Roman"/>
+        </w:rPr>
+        <w:fldChar w:fldCharType="separate"/>
+      </w:r>
+    </w:p>
+    <w:p>
+      <w:pPr>
+        <w:bidi w:val="0"/>
+        <w:spacing w:line="240" w:lineRule="auto"/>
+        <w:rPr>
+          <w:rFonts w:hint="default" w:ascii="Times New Roman" w:hAnsi="Times New Roman" w:cs="Times New Roman"/>
+          <w:szCs w:val="25"/>
+          <w:lang w:val="en-US"/>
+        </w:rPr>
+      </w:pPr>
+      <w:r>
+        <w:rPr>
+          <w:rFonts w:hint="default" w:ascii="Times New Roman" w:hAnsi="Times New Roman" w:cs="Times New Roman"/>
+          <w:b/>
+          <w:bCs/>
+          <w:sz w:val="32"/>
+          <w:szCs w:val="32"/>
+          <w:lang w:val="en-US"/>
+        </w:rPr>
+        <w:t>Part A: Introduction..................................................................</w:t>
+      </w:r>
+      <w:r>
+        <w:rPr>
+          <w:rFonts w:hint="default" w:ascii="Times New Roman" w:hAnsi="Times New Roman" w:cs="Times New Roman"/>
+          <w:b/>
+          <w:bCs/>
+          <w:sz w:val="25"/>
+          <w:szCs w:val="25"/>
+          <w:lang w:val="en-US"/>
+        </w:rPr>
+        <w:t>4</w:t>
+      </w:r>
+    </w:p>
+    <w:p>
+      <w:pPr>
+        <w:bidi w:val="0"/>
+        <w:spacing w:line="240" w:lineRule="auto"/>
+        <w:rPr>
+          <w:rFonts w:hint="default" w:ascii="Times New Roman" w:hAnsi="Times New Roman" w:cs="Times New Roman"/>
+          <w:b/>
+          <w:bCs/>
+          <w:sz w:val="25"/>
+          <w:szCs w:val="25"/>
+          <w:lang w:val="en-US"/>
+        </w:rPr>
+      </w:pPr>
+      <w:r>
+        <w:rPr>
+          <w:rFonts w:hint="default" w:ascii="Times New Roman" w:hAnsi="Times New Roman" w:cs="Times New Roman"/>
+          <w:b/>
+          <w:bCs/>
+          <w:sz w:val="32"/>
+          <w:szCs w:val="32"/>
+          <w:lang w:val="en-US"/>
+        </w:rPr>
+        <w:t>Part B: Project Overview..........................................................</w:t>
+      </w:r>
+      <w:r>
+        <w:rPr>
+          <w:rFonts w:hint="default" w:ascii="Times New Roman" w:hAnsi="Times New Roman" w:cs="Times New Roman"/>
+          <w:b/>
+          <w:bCs/>
+          <w:sz w:val="25"/>
+          <w:szCs w:val="25"/>
+          <w:lang w:val="en-US"/>
+        </w:rPr>
+        <w:t>4</w:t>
+      </w:r>
+    </w:p>
+    <w:p>
+      <w:pPr>
+        <w:bidi w:val="0"/>
+        <w:spacing w:line="240" w:lineRule="auto"/>
+        <w:ind w:left="400" w:leftChars="100" w:firstLine="0" w:firstLineChars="0"/>
+        <w:rPr>
+          <w:rFonts w:hint="default" w:ascii="Times New Roman" w:hAnsi="Times New Roman" w:cs="Times New Roman"/>
+          <w:lang w:val="en-US"/>
+        </w:rPr>
+      </w:pPr>
+      <w:r>
+        <w:rPr>
+          <w:rFonts w:hint="default" w:ascii="Times New Roman" w:hAnsi="Times New Roman" w:cs="Times New Roman"/>
+          <w:b/>
+          <w:bCs/>
+          <w:sz w:val="28"/>
+          <w:szCs w:val="28"/>
+          <w:lang w:val="en-US"/>
+        </w:rPr>
+        <w:t>2.1 Domain Vocabulary......................................................................</w:t>
+      </w:r>
+      <w:r>
+        <w:rPr>
+          <w:rFonts w:hint="default" w:ascii="Times New Roman" w:hAnsi="Times New Roman" w:cs="Times New Roman"/>
+          <w:b/>
+          <w:bCs/>
+          <w:sz w:val="25"/>
+          <w:szCs w:val="25"/>
+          <w:lang w:val="en-US"/>
+        </w:rPr>
+        <w:t>4</w:t>
+      </w:r>
+    </w:p>
+    <w:p>
+      <w:pPr>
+        <w:bidi w:val="0"/>
+        <w:spacing w:line="240" w:lineRule="auto"/>
+        <w:ind w:left="400" w:leftChars="100" w:firstLine="0" w:firstLineChars="0"/>
+        <w:rPr>
+          <w:rFonts w:hint="default" w:ascii="Times New Roman" w:hAnsi="Times New Roman" w:cs="Times New Roman"/>
+          <w:b/>
+          <w:bCs/>
+          <w:sz w:val="28"/>
+          <w:szCs w:val="28"/>
+          <w:lang w:val="en-US"/>
+        </w:rPr>
+      </w:pPr>
+      <w:r>
+        <w:rPr>
+          <w:rFonts w:hint="default" w:ascii="Times New Roman" w:hAnsi="Times New Roman" w:cs="Times New Roman"/>
+          <w:b/>
+          <w:bCs/>
+          <w:sz w:val="28"/>
+          <w:szCs w:val="28"/>
+          <w:lang w:val="en-US"/>
+        </w:rPr>
+        <w:t>2.</w:t>
+      </w:r>
+      <w:r>
+        <w:rPr>
+          <w:rFonts w:hint="default" w:cs="Times New Roman"/>
+          <w:b/>
+          <w:bCs/>
+          <w:sz w:val="28"/>
+          <w:szCs w:val="28"/>
+          <w:lang w:val="en-US"/>
+        </w:rPr>
+        <w:t>2</w:t>
+      </w:r>
+      <w:r>
+        <w:rPr>
+          <w:rFonts w:hint="default" w:ascii="Times New Roman" w:hAnsi="Times New Roman" w:cs="Times New Roman"/>
+          <w:b/>
+          <w:bCs/>
+          <w:sz w:val="28"/>
+          <w:szCs w:val="28"/>
+          <w:lang w:val="en-US"/>
+        </w:rPr>
+        <w:t xml:space="preserve"> </w:t>
+      </w:r>
+      <w:r>
+        <w:rPr>
+          <w:rFonts w:hint="default" w:cs="Times New Roman"/>
+          <w:b/>
+          <w:bCs/>
+          <w:sz w:val="28"/>
+          <w:szCs w:val="28"/>
+          <w:lang w:val="en-US"/>
+        </w:rPr>
+        <w:t>Goals.........................</w:t>
+      </w:r>
+      <w:r>
+        <w:rPr>
+          <w:rFonts w:hint="default" w:ascii="Times New Roman" w:hAnsi="Times New Roman" w:cs="Times New Roman"/>
+          <w:b/>
+          <w:bCs/>
+          <w:sz w:val="28"/>
+          <w:szCs w:val="28"/>
+          <w:lang w:val="en-US"/>
+        </w:rPr>
+        <w:t>.....................................................................</w:t>
+      </w:r>
+      <w:r>
+        <w:rPr>
+          <w:rFonts w:hint="default" w:cs="Times New Roman"/>
+          <w:b/>
+          <w:bCs/>
+          <w:sz w:val="28"/>
+          <w:szCs w:val="28"/>
+          <w:lang w:val="en-US"/>
+        </w:rPr>
+        <w:t>.</w:t>
+      </w:r>
+      <w:r>
+        <w:rPr>
+          <w:rFonts w:hint="default" w:cs="Times New Roman"/>
+          <w:b/>
+          <w:bCs/>
+          <w:sz w:val="25"/>
+          <w:szCs w:val="25"/>
+          <w:lang w:val="en-US"/>
+        </w:rPr>
+        <w:t>5</w:t>
+      </w:r>
+    </w:p>
+    <w:p>
+      <w:pPr>
+        <w:pStyle w:val="9"/>
         <w:bidi w:val="0"/>
         <w:spacing w:line="240" w:lineRule="auto"/>
         <w:ind w:left="0" w:leftChars="0" w:firstLine="0" w:firstLineChars="0"/>
-      </w:pPr>
-      <w:r>
-        <w:rPr>
-          <w:rFonts w:hint="default"/>
-          <w:lang w:val="en-US"/>
-        </w:rPr>
-        <w:t>Table of Contents</w:t>
-      </w:r>
+        <w:rPr>
+          <w:rFonts w:hint="default" w:ascii="Times New Roman" w:hAnsi="Times New Roman" w:cs="Times New Roman"/>
+          <w:lang w:val="en-US"/>
+        </w:rPr>
+        <w:sectPr>
+          <w:headerReference r:id="rId3" w:type="default"/>
+          <w:footerReference r:id="rId4" w:type="default"/>
+          <w:pgSz w:w="11906" w:h="16838"/>
+          <w:pgMar w:top="1440" w:right="1800" w:bottom="1440" w:left="1800" w:header="720" w:footer="720" w:gutter="0"/>
+          <w:cols w:space="720" w:num="1"/>
+          <w:docGrid w:linePitch="360" w:charSpace="0"/>
+        </w:sectPr>
+      </w:pPr>
+    </w:p>
+    <w:p>
+      <w:pPr>
+        <w:pStyle w:val="2"/>
+        <w:bidi w:val="0"/>
+        <w:spacing w:line="240" w:lineRule="auto"/>
+        <w:rPr>
+          <w:rStyle w:val="12"/>
+          <w:rFonts w:hint="default" w:ascii="Times New Roman" w:hAnsi="Times New Roman" w:cs="Times New Roman"/>
+          <w:b/>
+          <w:bCs/>
+          <w:lang w:val="en-US"/>
+        </w:rPr>
+      </w:pPr>
+      <w:r>
+        <w:rPr>
+          <w:rFonts w:hint="default" w:ascii="Times New Roman" w:hAnsi="Times New Roman" w:cs="Times New Roman"/>
+          <w:lang w:val="en-US"/>
+        </w:rPr>
+        <w:t>Part A: Introduction</w:t>
+      </w:r>
+      <w:r>
+        <w:rPr>
+          <w:rFonts w:hint="default" w:ascii="Times New Roman" w:hAnsi="Times New Roman" w:cs="Times New Roman"/>
+        </w:rPr>
+        <w:fldChar w:fldCharType="begin"/>
+      </w:r>
+      <w:r>
+        <w:rPr>
+          <w:rFonts w:hint="default" w:ascii="Times New Roman" w:hAnsi="Times New Roman" w:cs="Times New Roman"/>
+        </w:rPr>
+        <w:instrText xml:space="preserve">TOC \o "1-3" \h \u </w:instrText>
+      </w:r>
+      <w:r>
+        <w:rPr>
+          <w:rFonts w:hint="default" w:ascii="Times New Roman" w:hAnsi="Times New Roman" w:cs="Times New Roman"/>
+        </w:rPr>
+        <w:fldChar w:fldCharType="separate"/>
+      </w:r>
+    </w:p>
+    <w:p>
+      <w:pPr>
+        <w:pStyle w:val="8"/>
+        <w:keepNext w:val="0"/>
+        <w:keepLines w:val="0"/>
+        <w:widowControl/>
+        <w:suppressLineNumbers w:val="0"/>
+        <w:bidi w:val="0"/>
+        <w:spacing w:before="240" w:beforeAutospacing="0" w:after="240" w:afterAutospacing="0" w:line="240" w:lineRule="auto"/>
+        <w:jc w:val="both"/>
+        <w:rPr>
+          <w:rFonts w:hint="default" w:ascii="Times New Roman" w:hAnsi="Times New Roman" w:cs="Times New Roman"/>
+          <w:b w:val="0"/>
+          <w:bCs w:val="0"/>
+          <w:i w:val="0"/>
+          <w:iCs w:val="0"/>
+          <w:color w:val="000000"/>
+          <w:sz w:val="23"/>
+          <w:szCs w:val="23"/>
+          <w:u w:val="none"/>
+          <w:shd w:val="clear" w:fill="FFFFFF"/>
+          <w:vertAlign w:val="baseline"/>
+          <w:lang w:val="en-US"/>
+        </w:rPr>
+      </w:pPr>
+      <w:r>
+        <w:rPr>
+          <w:rFonts w:hint="default" w:ascii="Times New Roman" w:hAnsi="Times New Roman" w:cs="Times New Roman"/>
+          <w:b w:val="0"/>
+          <w:bCs w:val="0"/>
+          <w:sz w:val="23"/>
+          <w:szCs w:val="23"/>
+          <w:lang w:val="en-US"/>
+        </w:rPr>
+        <w:t xml:space="preserve">The Software Requirements Specification (SRS) emphasizes the </w:t>
+      </w:r>
+      <w:r>
+        <w:rPr>
+          <w:rFonts w:hint="default" w:ascii="Times New Roman" w:hAnsi="Times New Roman" w:eastAsia="SimSun" w:cs="Times New Roman"/>
+          <w:b w:val="0"/>
+          <w:bCs w:val="0"/>
+          <w:i w:val="0"/>
+          <w:iCs w:val="0"/>
+          <w:color w:val="000000"/>
+          <w:sz w:val="23"/>
+          <w:szCs w:val="23"/>
+          <w:u w:val="none"/>
+          <w:shd w:val="clear" w:fill="FFFFFF"/>
+          <w:vertAlign w:val="baseline"/>
+        </w:rPr>
+        <w:t>comprehensive functional and non-functional requirements for the Smart Fleet Management System (SmartFM) designed for ABC-Trans, one of Vietnam's most prominent logistics and transportation enterprises.</w:t>
+      </w:r>
+      <w:r>
+        <w:rPr>
+          <w:rFonts w:hint="default" w:ascii="Times New Roman" w:hAnsi="Times New Roman" w:eastAsia="SimSun" w:cs="Times New Roman"/>
+          <w:b w:val="0"/>
+          <w:bCs w:val="0"/>
+          <w:i w:val="0"/>
+          <w:iCs w:val="0"/>
+          <w:color w:val="000000"/>
+          <w:sz w:val="23"/>
+          <w:szCs w:val="23"/>
+          <w:u w:val="none"/>
+          <w:shd w:val="clear" w:fill="FFFFFF"/>
+          <w:vertAlign w:val="baseline"/>
+          <w:lang w:val="en-US"/>
+        </w:rPr>
+        <w:t xml:space="preserve"> </w:t>
+      </w:r>
+      <w:r>
+        <w:rPr>
+          <w:rFonts w:hint="default" w:ascii="Times New Roman" w:hAnsi="Times New Roman" w:cs="Times New Roman"/>
+          <w:b w:val="0"/>
+          <w:bCs w:val="0"/>
+          <w:i w:val="0"/>
+          <w:iCs w:val="0"/>
+          <w:color w:val="000000"/>
+          <w:sz w:val="23"/>
+          <w:szCs w:val="23"/>
+          <w:u w:val="none"/>
+          <w:shd w:val="clear" w:fill="FFFFFF"/>
+          <w:vertAlign w:val="baseline"/>
+          <w:lang w:val="en-US"/>
+        </w:rPr>
+        <w:t>Notably</w:t>
+      </w:r>
+      <w:r>
+        <w:rPr>
+          <w:rFonts w:hint="default" w:ascii="Times New Roman" w:hAnsi="Times New Roman" w:eastAsia="SimSun" w:cs="Times New Roman"/>
+          <w:b w:val="0"/>
+          <w:bCs w:val="0"/>
+          <w:i w:val="0"/>
+          <w:iCs w:val="0"/>
+          <w:color w:val="000000"/>
+          <w:sz w:val="23"/>
+          <w:szCs w:val="23"/>
+          <w:u w:val="none"/>
+          <w:shd w:val="clear" w:fill="FFFFFF"/>
+          <w:vertAlign w:val="baseline"/>
+          <w:lang w:val="en-US"/>
+        </w:rPr>
+        <w:t xml:space="preserve">, </w:t>
+      </w:r>
+      <w:r>
+        <w:rPr>
+          <w:rFonts w:hint="default" w:ascii="Times New Roman" w:hAnsi="Times New Roman" w:eastAsia="SimSun" w:cs="Times New Roman"/>
+          <w:i w:val="0"/>
+          <w:iCs w:val="0"/>
+          <w:color w:val="000000"/>
+          <w:sz w:val="23"/>
+          <w:szCs w:val="23"/>
+          <w:u w:val="none"/>
+          <w:shd w:val="clear" w:fill="FFFFFF"/>
+          <w:vertAlign w:val="baseline"/>
+        </w:rPr>
+        <w:t>ABC-Trans operates a nationwide network providing vital supply chain services to major department stores and supermarkets.</w:t>
+      </w:r>
+      <w:r>
+        <w:rPr>
+          <w:rFonts w:hint="default" w:ascii="Times New Roman" w:hAnsi="Times New Roman" w:eastAsia="SimSun" w:cs="Times New Roman"/>
+          <w:i w:val="0"/>
+          <w:iCs w:val="0"/>
+          <w:color w:val="000000"/>
+          <w:sz w:val="23"/>
+          <w:szCs w:val="23"/>
+          <w:u w:val="none"/>
+          <w:shd w:val="clear" w:fill="FFFFFF"/>
+          <w:vertAlign w:val="baseline"/>
+          <w:lang w:val="en-US"/>
+        </w:rPr>
+        <w:t xml:space="preserve"> In addition, the centralized </w:t>
+      </w:r>
+      <w:r>
+        <w:rPr>
+          <w:rFonts w:hint="default" w:ascii="Times New Roman" w:hAnsi="Times New Roman" w:cs="Times New Roman"/>
+          <w:i w:val="0"/>
+          <w:iCs w:val="0"/>
+          <w:color w:val="000000"/>
+          <w:sz w:val="23"/>
+          <w:szCs w:val="23"/>
+          <w:u w:val="none"/>
+          <w:shd w:val="clear" w:fill="FFFFFF"/>
+          <w:vertAlign w:val="baseline"/>
+        </w:rPr>
+        <w:t>cosystem unifies enterprise-wide fleet tracking, driver allocations, booking pipelines, and financial transactions</w:t>
+      </w:r>
+      <w:r>
+        <w:rPr>
+          <w:rFonts w:hint="default" w:ascii="Times New Roman" w:hAnsi="Times New Roman" w:cs="Times New Roman"/>
+          <w:i w:val="0"/>
+          <w:iCs w:val="0"/>
+          <w:color w:val="000000"/>
+          <w:sz w:val="23"/>
+          <w:szCs w:val="23"/>
+          <w:u w:val="none"/>
+          <w:shd w:val="clear" w:fill="FFFFFF"/>
+          <w:vertAlign w:val="baseline"/>
+          <w:lang w:val="en-US"/>
+        </w:rPr>
+        <w:t xml:space="preserve"> which overcome</w:t>
+      </w:r>
+      <w:r>
+        <w:rPr>
+          <w:rFonts w:hint="default" w:ascii="Times New Roman" w:hAnsi="Times New Roman" w:eastAsia="SimSun" w:cs="Times New Roman"/>
+          <w:i w:val="0"/>
+          <w:iCs w:val="0"/>
+          <w:color w:val="000000"/>
+          <w:sz w:val="23"/>
+          <w:szCs w:val="23"/>
+          <w:u w:val="none"/>
+          <w:shd w:val="clear" w:fill="FFFFFF"/>
+          <w:vertAlign w:val="baseline"/>
+        </w:rPr>
+        <w:t xml:space="preserve">operational scaling limitations </w:t>
+      </w:r>
+      <w:r>
+        <w:rPr>
+          <w:rFonts w:hint="default" w:ascii="Times New Roman" w:hAnsi="Times New Roman" w:eastAsia="SimSun" w:cs="Times New Roman"/>
+          <w:b w:val="0"/>
+          <w:bCs w:val="0"/>
+          <w:i w:val="0"/>
+          <w:iCs w:val="0"/>
+          <w:color w:val="000000"/>
+          <w:sz w:val="23"/>
+          <w:szCs w:val="23"/>
+          <w:u w:val="none"/>
+          <w:shd w:val="clear" w:fill="FFFFFF"/>
+          <w:vertAlign w:val="baseline"/>
+        </w:rPr>
+        <w:t>caused by legacy, disconnected, branch-specific software and manual record-keeping</w:t>
+      </w:r>
+      <w:r>
+        <w:rPr>
+          <w:rFonts w:hint="default" w:ascii="Times New Roman" w:hAnsi="Times New Roman" w:cs="Times New Roman"/>
+          <w:b w:val="0"/>
+          <w:bCs w:val="0"/>
+          <w:i w:val="0"/>
+          <w:iCs w:val="0"/>
+          <w:color w:val="000000"/>
+          <w:sz w:val="23"/>
+          <w:szCs w:val="23"/>
+          <w:u w:val="none"/>
+          <w:shd w:val="clear" w:fill="FFFFFF"/>
+          <w:vertAlign w:val="baseline"/>
+          <w:lang w:val="en-US"/>
+        </w:rPr>
+        <w:t>.</w:t>
+      </w:r>
+    </w:p>
+    <w:p>
+      <w:pPr>
+        <w:pStyle w:val="8"/>
+        <w:keepNext w:val="0"/>
+        <w:keepLines w:val="0"/>
+        <w:widowControl/>
+        <w:suppressLineNumbers w:val="0"/>
+        <w:bidi w:val="0"/>
+        <w:spacing w:before="240" w:beforeAutospacing="0" w:after="240" w:afterAutospacing="0" w:line="240" w:lineRule="auto"/>
+        <w:jc w:val="both"/>
+        <w:rPr>
+          <w:rFonts w:hint="default" w:ascii="Times New Roman" w:hAnsi="Times New Roman" w:cs="Times New Roman"/>
+          <w:i w:val="0"/>
+          <w:iCs w:val="0"/>
+          <w:color w:val="000000"/>
+          <w:sz w:val="23"/>
+          <w:szCs w:val="23"/>
+          <w:u w:val="none"/>
+          <w:shd w:val="clear" w:fill="FFFFFF"/>
+          <w:vertAlign w:val="baseline"/>
+          <w:lang w:val="en-US"/>
+        </w:rPr>
+      </w:pPr>
+      <w:r>
+        <w:rPr>
+          <w:rFonts w:hint="default" w:ascii="Times New Roman" w:hAnsi="Times New Roman" w:cs="Times New Roman"/>
+          <w:b w:val="0"/>
+          <w:bCs w:val="0"/>
+          <w:i w:val="0"/>
+          <w:iCs w:val="0"/>
+          <w:color w:val="000000"/>
+          <w:sz w:val="23"/>
+          <w:szCs w:val="23"/>
+          <w:u w:val="none"/>
+          <w:shd w:val="clear" w:fill="FFFFFF"/>
+          <w:vertAlign w:val="baseline"/>
+          <w:lang w:val="en-US"/>
+        </w:rPr>
+        <w:t xml:space="preserve">In addition, the main purpose of this report is to </w:t>
+      </w:r>
+      <w:r>
+        <w:rPr>
+          <w:rFonts w:hint="default" w:ascii="Times New Roman" w:hAnsi="Times New Roman" w:eastAsia="SimSun" w:cs="Times New Roman"/>
+          <w:b w:val="0"/>
+          <w:bCs w:val="0"/>
+          <w:i w:val="0"/>
+          <w:iCs w:val="0"/>
+          <w:color w:val="000000"/>
+          <w:sz w:val="23"/>
+          <w:szCs w:val="23"/>
+          <w:u w:val="none"/>
+          <w:shd w:val="clear" w:fill="FFFFFF"/>
+          <w:vertAlign w:val="baseline"/>
+        </w:rPr>
+        <w:t xml:space="preserve">map out the system boundaries and business processes using the Tasks </w:t>
+      </w:r>
+      <w:r>
+        <w:rPr>
+          <w:rFonts w:hint="default" w:ascii="Times New Roman" w:hAnsi="Times New Roman" w:cs="Times New Roman"/>
+          <w:b w:val="0"/>
+          <w:bCs w:val="0"/>
+          <w:i w:val="0"/>
+          <w:iCs w:val="0"/>
+          <w:color w:val="000000"/>
+          <w:sz w:val="23"/>
+          <w:szCs w:val="23"/>
+          <w:u w:val="none"/>
+          <w:shd w:val="clear" w:fill="FFFFFF"/>
+          <w:vertAlign w:val="baseline"/>
+          <w:lang w:val="en-US"/>
+        </w:rPr>
+        <w:t>and</w:t>
+      </w:r>
+      <w:r>
+        <w:rPr>
+          <w:rFonts w:hint="default" w:ascii="Times New Roman" w:hAnsi="Times New Roman" w:eastAsia="SimSun" w:cs="Times New Roman"/>
+          <w:b w:val="0"/>
+          <w:bCs w:val="0"/>
+          <w:i w:val="0"/>
+          <w:iCs w:val="0"/>
+          <w:color w:val="000000"/>
+          <w:sz w:val="23"/>
+          <w:szCs w:val="23"/>
+          <w:u w:val="none"/>
+          <w:shd w:val="clear" w:fill="FFFFFF"/>
+          <w:vertAlign w:val="baseline"/>
+        </w:rPr>
+        <w:t xml:space="preserve"> Support approach</w:t>
+      </w:r>
+      <w:r>
+        <w:rPr>
+          <w:rFonts w:hint="default" w:ascii="Times New Roman" w:hAnsi="Times New Roman" w:cs="Times New Roman"/>
+          <w:b w:val="0"/>
+          <w:bCs w:val="0"/>
+          <w:i w:val="0"/>
+          <w:iCs w:val="0"/>
+          <w:color w:val="000000"/>
+          <w:sz w:val="23"/>
+          <w:szCs w:val="23"/>
+          <w:u w:val="none"/>
+          <w:shd w:val="clear" w:fill="FFFFFF"/>
+          <w:vertAlign w:val="baseline"/>
+          <w:lang w:val="en-US"/>
+        </w:rPr>
+        <w:t>. B</w:t>
+      </w:r>
+      <w:r>
+        <w:rPr>
+          <w:rFonts w:hint="default" w:ascii="Times New Roman" w:hAnsi="Times New Roman" w:eastAsia="SimSun" w:cs="Times New Roman"/>
+          <w:i w:val="0"/>
+          <w:iCs w:val="0"/>
+          <w:color w:val="000000"/>
+          <w:sz w:val="23"/>
+          <w:szCs w:val="23"/>
+          <w:u w:val="none"/>
+          <w:shd w:val="clear" w:fill="FFFFFF"/>
+          <w:vertAlign w:val="baseline"/>
+        </w:rPr>
+        <w:t xml:space="preserve">y focusing heavily on domain-level interactions and user workflows rather than pre-emptive database architecture, this specification ensures that the developed software natively resolves the technical challenges of high-volume, concurrent read operations </w:t>
+      </w:r>
+      <w:r>
+        <w:rPr>
+          <w:rFonts w:hint="default" w:ascii="Times New Roman" w:hAnsi="Times New Roman" w:cs="Times New Roman"/>
+          <w:i w:val="0"/>
+          <w:iCs w:val="0"/>
+          <w:color w:val="000000"/>
+          <w:sz w:val="23"/>
+          <w:szCs w:val="23"/>
+          <w:u w:val="none"/>
+          <w:shd w:val="clear" w:fill="FFFFFF"/>
+          <w:vertAlign w:val="baseline"/>
+          <w:lang w:val="en-US"/>
+        </w:rPr>
+        <w:t>including</w:t>
+      </w:r>
+      <w:r>
+        <w:rPr>
+          <w:rFonts w:hint="default" w:ascii="Times New Roman" w:hAnsi="Times New Roman" w:eastAsia="SimSun" w:cs="Times New Roman"/>
+          <w:i w:val="0"/>
+          <w:iCs w:val="0"/>
+          <w:color w:val="000000"/>
+          <w:sz w:val="23"/>
+          <w:szCs w:val="23"/>
+          <w:u w:val="none"/>
+          <w:shd w:val="clear" w:fill="FFFFFF"/>
+          <w:vertAlign w:val="baseline"/>
+        </w:rPr>
+        <w:t xml:space="preserve"> real-time tracking</w:t>
+      </w:r>
+      <w:r>
+        <w:rPr>
+          <w:rFonts w:hint="default" w:ascii="Times New Roman" w:hAnsi="Times New Roman" w:cs="Times New Roman"/>
+          <w:i w:val="0"/>
+          <w:iCs w:val="0"/>
+          <w:color w:val="000000"/>
+          <w:sz w:val="23"/>
+          <w:szCs w:val="23"/>
+          <w:u w:val="none"/>
+          <w:shd w:val="clear" w:fill="FFFFFF"/>
+          <w:vertAlign w:val="baseline"/>
+          <w:lang w:val="en-US"/>
+        </w:rPr>
+        <w:t xml:space="preserve"> </w:t>
+      </w:r>
+      <w:r>
+        <w:rPr>
+          <w:rFonts w:hint="default" w:ascii="Times New Roman" w:hAnsi="Times New Roman" w:eastAsia="SimSun" w:cs="Times New Roman"/>
+          <w:i w:val="0"/>
+          <w:iCs w:val="0"/>
+          <w:color w:val="000000"/>
+          <w:sz w:val="23"/>
+          <w:szCs w:val="23"/>
+          <w:u w:val="none"/>
+          <w:shd w:val="clear" w:fill="FFFFFF"/>
+          <w:vertAlign w:val="baseline"/>
+        </w:rPr>
+        <w:t>and high-integrity write transactions across all regional branches</w:t>
+      </w:r>
+      <w:r>
+        <w:rPr>
+          <w:rFonts w:hint="default" w:ascii="Times New Roman" w:hAnsi="Times New Roman" w:cs="Times New Roman"/>
+          <w:i w:val="0"/>
+          <w:iCs w:val="0"/>
+          <w:color w:val="000000"/>
+          <w:sz w:val="23"/>
+          <w:szCs w:val="23"/>
+          <w:u w:val="none"/>
+          <w:shd w:val="clear" w:fill="FFFFFF"/>
+          <w:vertAlign w:val="baseline"/>
+          <w:lang w:val="en-US"/>
+        </w:rPr>
+        <w:t>.</w:t>
+      </w:r>
+    </w:p>
+    <w:p>
+      <w:pPr>
+        <w:pStyle w:val="2"/>
+        <w:bidi w:val="0"/>
+        <w:spacing w:line="240" w:lineRule="auto"/>
+        <w:rPr>
+          <w:rFonts w:hint="default" w:ascii="Times New Roman" w:hAnsi="Times New Roman" w:cs="Times New Roman"/>
+          <w:lang w:val="en-US"/>
+        </w:rPr>
+      </w:pPr>
+      <w:r>
+        <w:rPr>
+          <w:rFonts w:hint="default" w:ascii="Times New Roman" w:hAnsi="Times New Roman" w:cs="Times New Roman"/>
+          <w:lang w:val="en-US"/>
+        </w:rPr>
+        <w:t>Part B: Project Overview</w:t>
+      </w:r>
+    </w:p>
+    <w:p>
+      <w:pPr>
+        <w:pStyle w:val="8"/>
+        <w:keepNext w:val="0"/>
+        <w:keepLines w:val="0"/>
+        <w:widowControl/>
+        <w:suppressLineNumbers w:val="0"/>
+        <w:bidi w:val="0"/>
+        <w:spacing w:before="240" w:beforeAutospacing="0" w:after="240" w:afterAutospacing="0" w:line="240" w:lineRule="auto"/>
+        <w:jc w:val="both"/>
+        <w:rPr>
+          <w:rFonts w:hint="default" w:ascii="Times New Roman" w:hAnsi="Times New Roman" w:cs="Times New Roman"/>
+          <w:sz w:val="23"/>
+          <w:szCs w:val="23"/>
+          <w:lang w:val="en-US"/>
+        </w:rPr>
+      </w:pPr>
+      <w:r>
+        <w:rPr>
+          <w:rFonts w:hint="default" w:ascii="Times New Roman" w:hAnsi="Times New Roman" w:eastAsia="SimSun" w:cs="Times New Roman"/>
+          <w:sz w:val="24"/>
+          <w:szCs w:val="24"/>
+        </w:rPr>
+        <w:t>The Software Requirements Specification (SRS) emphasizes the comprehensive functional and non-functional requirements for the Smart Fleet Management System (SmartFM) designed for ABC-Trans, one of Vietnam's most prominent logistics and transportation enterprises. Notably, ABC-Trans operates a nationwide network providing vital supply chain services to major department stores and supermarkets. In addition, the centralized ecosystem unifies enterprise-wide fleet tracking, driver allocations, booking pipelines, and financial transactions which overcome operational scaling limitations caused by legacy, disconnected, branch-specific software and manual record-keeping.</w:t>
+      </w:r>
+    </w:p>
+    <w:p>
+      <w:pPr>
+        <w:pStyle w:val="3"/>
+        <w:bidi w:val="0"/>
+        <w:spacing w:line="240" w:lineRule="auto"/>
+        <w:ind w:left="400" w:leftChars="100" w:firstLine="0" w:firstLineChars="0"/>
+        <w:rPr>
+          <w:rFonts w:hint="default" w:ascii="Times New Roman" w:hAnsi="Times New Roman" w:cs="Times New Roman"/>
+          <w:lang w:val="en-US"/>
+        </w:rPr>
+      </w:pPr>
+      <w:r>
+        <w:rPr>
+          <w:rFonts w:hint="default" w:ascii="Times New Roman" w:hAnsi="Times New Roman" w:cs="Times New Roman"/>
+          <w:lang w:val="en-US"/>
+        </w:rPr>
+        <w:t>2.1 Domain Vocabulary</w:t>
+      </w:r>
+    </w:p>
+    <w:p>
+      <w:pPr>
+        <w:spacing w:line="240" w:lineRule="auto"/>
+        <w:ind w:left="400" w:leftChars="100" w:firstLine="0" w:firstLineChars="0"/>
+        <w:jc w:val="both"/>
+        <w:rPr>
+          <w:rFonts w:hint="default" w:ascii="Times New Roman" w:hAnsi="Times New Roman" w:eastAsia="SimSun" w:cs="Times New Roman"/>
+          <w:i w:val="0"/>
+          <w:iCs w:val="0"/>
+          <w:color w:val="000000"/>
+          <w:sz w:val="23"/>
+          <w:szCs w:val="23"/>
+          <w:u w:val="none"/>
+          <w:shd w:val="clear" w:fill="FFFFFF"/>
+          <w:vertAlign w:val="baseline"/>
+          <w:lang w:val="en-US"/>
+        </w:rPr>
+      </w:pPr>
+      <w:r>
+        <w:rPr>
+          <w:rFonts w:hint="default" w:ascii="Times New Roman" w:hAnsi="Times New Roman" w:cs="Times New Roman"/>
+          <w:sz w:val="23"/>
+          <w:szCs w:val="23"/>
+          <w:lang w:val="en-US"/>
+        </w:rPr>
+        <w:t xml:space="preserve">The following </w:t>
+      </w:r>
+      <w:r>
+        <w:rPr>
+          <w:rFonts w:hint="default" w:ascii="Times New Roman" w:hAnsi="Times New Roman" w:eastAsia="SimSun" w:cs="Times New Roman"/>
+          <w:i w:val="0"/>
+          <w:iCs w:val="0"/>
+          <w:color w:val="000000"/>
+          <w:sz w:val="23"/>
+          <w:szCs w:val="23"/>
+          <w:u w:val="none"/>
+          <w:shd w:val="clear" w:fill="FFFFFF"/>
+          <w:vertAlign w:val="baseline"/>
+        </w:rPr>
+        <w:t> glossary defines the specialized business and technical terms foundational to the ABC-Trans operations and the SmartFM platform</w:t>
+      </w:r>
+      <w:r>
+        <w:rPr>
+          <w:rFonts w:hint="default" w:ascii="Times New Roman" w:hAnsi="Times New Roman" w:eastAsia="SimSun" w:cs="Times New Roman"/>
+          <w:i w:val="0"/>
+          <w:iCs w:val="0"/>
+          <w:color w:val="000000"/>
+          <w:sz w:val="23"/>
+          <w:szCs w:val="23"/>
+          <w:u w:val="none"/>
+          <w:shd w:val="clear" w:fill="FFFFFF"/>
+          <w:vertAlign w:val="baseline"/>
+          <w:lang w:val="en-US"/>
+        </w:rPr>
+        <w:t>:</w:t>
+      </w:r>
+    </w:p>
+    <w:p>
+      <w:pPr>
+        <w:numPr>
+          <w:ilvl w:val="0"/>
+          <w:numId w:val="1"/>
+        </w:numPr>
+        <w:tabs>
+          <w:tab w:val="clear" w:pos="420"/>
+        </w:tabs>
+        <w:spacing w:line="240" w:lineRule="auto"/>
+        <w:ind w:left="1200" w:leftChars="0" w:hanging="420" w:firstLineChars="0"/>
+        <w:jc w:val="both"/>
+        <w:rPr>
+          <w:rFonts w:hint="default" w:ascii="Times New Roman" w:hAnsi="Times New Roman" w:eastAsia="SimSun" w:cs="Times New Roman"/>
+          <w:i w:val="0"/>
+          <w:iCs w:val="0"/>
+          <w:color w:val="000000"/>
+          <w:sz w:val="23"/>
+          <w:szCs w:val="23"/>
+          <w:u w:val="none"/>
+          <w:shd w:val="clear" w:fill="FFFFFF"/>
+          <w:vertAlign w:val="baseline"/>
+          <w:lang w:val="en-US"/>
+        </w:rPr>
+      </w:pPr>
+      <w:r>
+        <w:rPr>
+          <w:rFonts w:hint="default" w:ascii="Times New Roman" w:hAnsi="Times New Roman" w:eastAsia="SimSun" w:cs="Times New Roman"/>
+          <w:i w:val="0"/>
+          <w:iCs w:val="0"/>
+          <w:color w:val="000000"/>
+          <w:sz w:val="23"/>
+          <w:szCs w:val="23"/>
+          <w:u w:val="none"/>
+          <w:shd w:val="clear" w:fill="FFFFFF"/>
+          <w:vertAlign w:val="baseline"/>
+          <w:lang w:val="en-US"/>
+        </w:rPr>
+        <w:t xml:space="preserve">SmartFM: A centralized system </w:t>
+      </w:r>
+      <w:r>
+        <w:rPr>
+          <w:rFonts w:hint="default" w:ascii="Times New Roman" w:hAnsi="Times New Roman" w:eastAsia="SimSun" w:cs="Times New Roman"/>
+          <w:sz w:val="24"/>
+          <w:szCs w:val="24"/>
+        </w:rPr>
+        <w:t>A centralized system integrating tracking, operations, and fleet management across all ABC-Trans branches.</w:t>
+      </w:r>
+    </w:p>
+    <w:p>
+      <w:pPr>
+        <w:numPr>
+          <w:ilvl w:val="0"/>
+          <w:numId w:val="1"/>
+        </w:numPr>
+        <w:tabs>
+          <w:tab w:val="clear" w:pos="420"/>
+        </w:tabs>
+        <w:spacing w:line="240" w:lineRule="auto"/>
+        <w:ind w:left="1200" w:leftChars="0" w:hanging="420" w:firstLineChars="0"/>
+        <w:jc w:val="both"/>
+        <w:rPr>
+          <w:rFonts w:hint="default" w:ascii="Times New Roman" w:hAnsi="Times New Roman" w:eastAsia="SimSun" w:cs="Times New Roman"/>
+          <w:i w:val="0"/>
+          <w:iCs w:val="0"/>
+          <w:color w:val="000000"/>
+          <w:sz w:val="23"/>
+          <w:szCs w:val="23"/>
+          <w:u w:val="none"/>
+          <w:shd w:val="clear" w:fill="FFFFFF"/>
+          <w:vertAlign w:val="baseline"/>
+          <w:lang w:val="en-US"/>
+        </w:rPr>
+      </w:pPr>
+      <w:r>
+        <w:rPr>
+          <w:rFonts w:hint="default" w:ascii="Times New Roman" w:hAnsi="Times New Roman" w:eastAsia="SimSun" w:cs="Times New Roman"/>
+          <w:sz w:val="24"/>
+          <w:szCs w:val="24"/>
+          <w:lang w:val="en-US"/>
+        </w:rPr>
+        <w:t xml:space="preserve">Shipment Offering: </w:t>
+      </w:r>
+      <w:r>
+        <w:rPr>
+          <w:rFonts w:hint="default" w:ascii="Times New Roman" w:hAnsi="Times New Roman" w:eastAsia="SimSun" w:cs="Times New Roman"/>
+          <w:sz w:val="24"/>
+          <w:szCs w:val="24"/>
+        </w:rPr>
+        <w:t>A defined transportation service option categorized by vehicle capacity, routes, and rates</w:t>
+      </w:r>
+      <w:r>
+        <w:rPr>
+          <w:rFonts w:hint="default" w:ascii="Times New Roman" w:hAnsi="Times New Roman" w:eastAsia="SimSun" w:cs="Times New Roman"/>
+          <w:sz w:val="24"/>
+          <w:szCs w:val="24"/>
+          <w:lang w:val="en-US"/>
+        </w:rPr>
+        <w:t>.</w:t>
+      </w:r>
+    </w:p>
+    <w:p>
+      <w:pPr>
+        <w:numPr>
+          <w:ilvl w:val="0"/>
+          <w:numId w:val="1"/>
+        </w:numPr>
+        <w:tabs>
+          <w:tab w:val="clear" w:pos="420"/>
+        </w:tabs>
+        <w:spacing w:line="240" w:lineRule="auto"/>
+        <w:ind w:left="1200" w:leftChars="0" w:hanging="420" w:firstLineChars="0"/>
+        <w:jc w:val="both"/>
+        <w:rPr>
+          <w:rFonts w:hint="default" w:ascii="Times New Roman" w:hAnsi="Times New Roman" w:eastAsia="SimSun" w:cs="Times New Roman"/>
+          <w:i w:val="0"/>
+          <w:iCs w:val="0"/>
+          <w:color w:val="000000"/>
+          <w:sz w:val="23"/>
+          <w:szCs w:val="23"/>
+          <w:u w:val="none"/>
+          <w:shd w:val="clear" w:fill="FFFFFF"/>
+          <w:vertAlign w:val="baseline"/>
+          <w:lang w:val="en-US"/>
+        </w:rPr>
+      </w:pPr>
+      <w:r>
+        <w:rPr>
+          <w:rFonts w:hint="default" w:ascii="Times New Roman" w:hAnsi="Times New Roman" w:eastAsia="SimSun" w:cs="Times New Roman"/>
+          <w:sz w:val="24"/>
+          <w:szCs w:val="24"/>
+          <w:lang w:val="en-US"/>
+        </w:rPr>
+        <w:t xml:space="preserve">B2B Corporate Order: </w:t>
+      </w:r>
+      <w:r>
+        <w:rPr>
+          <w:rFonts w:hint="default" w:ascii="Times New Roman" w:hAnsi="Times New Roman" w:eastAsia="SimSun" w:cs="Times New Roman"/>
+          <w:sz w:val="24"/>
+          <w:szCs w:val="24"/>
+        </w:rPr>
+        <w:t>A high-volume logistics request placed by enterprise clients for bulk cargo movement.</w:t>
+      </w:r>
+    </w:p>
+    <w:p>
+      <w:pPr>
+        <w:numPr>
+          <w:ilvl w:val="0"/>
+          <w:numId w:val="1"/>
+        </w:numPr>
+        <w:tabs>
+          <w:tab w:val="clear" w:pos="420"/>
+        </w:tabs>
+        <w:spacing w:line="240" w:lineRule="auto"/>
+        <w:ind w:left="1200" w:leftChars="0" w:hanging="420" w:firstLineChars="0"/>
+        <w:jc w:val="both"/>
+        <w:rPr>
+          <w:rFonts w:hint="default" w:ascii="Times New Roman" w:hAnsi="Times New Roman" w:eastAsia="SimSun" w:cs="Times New Roman"/>
+          <w:i w:val="0"/>
+          <w:iCs w:val="0"/>
+          <w:color w:val="000000"/>
+          <w:sz w:val="23"/>
+          <w:szCs w:val="23"/>
+          <w:u w:val="none"/>
+          <w:shd w:val="clear" w:fill="FFFFFF"/>
+          <w:vertAlign w:val="baseline"/>
+          <w:lang w:val="en-US"/>
+        </w:rPr>
+      </w:pPr>
+      <w:r>
+        <w:rPr>
+          <w:rFonts w:hint="default" w:ascii="Times New Roman" w:hAnsi="Times New Roman" w:eastAsia="SimSun" w:cs="Times New Roman"/>
+          <w:sz w:val="24"/>
+          <w:szCs w:val="24"/>
+          <w:lang w:val="en-US"/>
+        </w:rPr>
+        <w:t xml:space="preserve">Vehicle Assignment: </w:t>
+      </w:r>
+      <w:r>
+        <w:rPr>
+          <w:rFonts w:hint="default" w:ascii="Times New Roman" w:hAnsi="Times New Roman" w:eastAsia="SimSun" w:cs="Times New Roman"/>
+          <w:sz w:val="24"/>
+          <w:szCs w:val="24"/>
+        </w:rPr>
+        <w:t>The formal allocation of an available fleet vehicle to an active shipment order.</w:t>
+      </w:r>
+    </w:p>
+    <w:p>
+      <w:pPr>
+        <w:numPr>
+          <w:ilvl w:val="0"/>
+          <w:numId w:val="1"/>
+        </w:numPr>
+        <w:tabs>
+          <w:tab w:val="clear" w:pos="420"/>
+        </w:tabs>
+        <w:spacing w:line="240" w:lineRule="auto"/>
+        <w:ind w:left="1200" w:leftChars="0" w:hanging="420" w:firstLineChars="0"/>
+        <w:jc w:val="both"/>
+        <w:rPr>
+          <w:rFonts w:hint="default" w:ascii="Times New Roman" w:hAnsi="Times New Roman" w:eastAsia="SimSun" w:cs="Times New Roman"/>
+          <w:i w:val="0"/>
+          <w:iCs w:val="0"/>
+          <w:color w:val="000000"/>
+          <w:sz w:val="23"/>
+          <w:szCs w:val="23"/>
+          <w:u w:val="none"/>
+          <w:shd w:val="clear" w:fill="FFFFFF"/>
+          <w:vertAlign w:val="baseline"/>
+          <w:lang w:val="en-US"/>
+        </w:rPr>
+      </w:pPr>
+      <w:r>
+        <w:rPr>
+          <w:rFonts w:hint="default" w:ascii="Times New Roman" w:hAnsi="Times New Roman" w:eastAsia="SimSun" w:cs="Times New Roman"/>
+          <w:sz w:val="24"/>
+          <w:szCs w:val="24"/>
+          <w:lang w:val="en-US"/>
+        </w:rPr>
+        <w:t>Driver Management: Operational workflows dedicated to monitoring operator availability, active service hours, regulatory compliance, and safety credentials.</w:t>
+      </w:r>
+    </w:p>
+    <w:p>
+      <w:pPr>
+        <w:numPr>
+          <w:ilvl w:val="0"/>
+          <w:numId w:val="1"/>
+        </w:numPr>
+        <w:tabs>
+          <w:tab w:val="clear" w:pos="420"/>
+        </w:tabs>
+        <w:spacing w:line="240" w:lineRule="auto"/>
+        <w:ind w:left="1200" w:leftChars="0" w:hanging="420" w:firstLineChars="0"/>
+        <w:jc w:val="both"/>
+        <w:rPr>
+          <w:rFonts w:hint="default" w:ascii="Times New Roman" w:hAnsi="Times New Roman" w:eastAsia="SimSun" w:cs="Times New Roman"/>
+          <w:i w:val="0"/>
+          <w:iCs w:val="0"/>
+          <w:color w:val="000000"/>
+          <w:sz w:val="23"/>
+          <w:szCs w:val="23"/>
+          <w:u w:val="none"/>
+          <w:shd w:val="clear" w:fill="FFFFFF"/>
+          <w:vertAlign w:val="baseline"/>
+          <w:lang w:val="en-US"/>
+        </w:rPr>
+      </w:pPr>
+      <w:r>
+        <w:rPr>
+          <w:rFonts w:hint="default" w:ascii="Times New Roman" w:hAnsi="Times New Roman" w:eastAsia="SimSun" w:cs="Times New Roman"/>
+          <w:sz w:val="24"/>
+          <w:szCs w:val="24"/>
+          <w:lang w:val="en-US"/>
+        </w:rPr>
+        <w:t>Real-Time Shipment Tracking: Live telemetry streams integrated with digital mapping interfaces that enable dispatchers and customers to monitor current cargo coordinates and shifting ETAs instantly.</w:t>
+      </w:r>
+    </w:p>
+    <w:p>
+      <w:pPr>
+        <w:numPr>
+          <w:ilvl w:val="0"/>
+          <w:numId w:val="1"/>
+        </w:numPr>
+        <w:tabs>
+          <w:tab w:val="clear" w:pos="420"/>
+        </w:tabs>
+        <w:spacing w:line="240" w:lineRule="auto"/>
+        <w:ind w:left="1200" w:leftChars="0" w:hanging="420" w:firstLineChars="0"/>
+        <w:jc w:val="both"/>
+        <w:rPr>
+          <w:rFonts w:hint="default" w:ascii="Times New Roman" w:hAnsi="Times New Roman" w:eastAsia="SimSun" w:cs="Times New Roman"/>
+          <w:i w:val="0"/>
+          <w:iCs w:val="0"/>
+          <w:color w:val="000000"/>
+          <w:sz w:val="23"/>
+          <w:szCs w:val="23"/>
+          <w:u w:val="none"/>
+          <w:shd w:val="clear" w:fill="FFFFFF"/>
+          <w:vertAlign w:val="baseline"/>
+          <w:lang w:val="en-US"/>
+        </w:rPr>
+      </w:pPr>
+      <w:r>
+        <w:rPr>
+          <w:rFonts w:hint="default" w:ascii="Times New Roman" w:hAnsi="Times New Roman" w:eastAsia="SimSun" w:cs="Times New Roman"/>
+          <w:sz w:val="24"/>
+          <w:szCs w:val="24"/>
+          <w:lang w:val="en-US"/>
+        </w:rPr>
+        <w:t xml:space="preserve">Invoice: </w:t>
+      </w:r>
+      <w:r>
+        <w:rPr>
+          <w:rFonts w:hint="default" w:ascii="Times New Roman" w:hAnsi="Times New Roman" w:eastAsia="SimSun" w:cs="Times New Roman"/>
+          <w:i w:val="0"/>
+          <w:iCs w:val="0"/>
+          <w:color w:val="000000"/>
+          <w:sz w:val="24"/>
+          <w:szCs w:val="24"/>
+          <w:u w:val="none"/>
+          <w:shd w:val="clear" w:fill="FFFFFF"/>
+          <w:vertAlign w:val="baseline"/>
+        </w:rPr>
+        <w:t>A digital financial statement compiled by the system detailing services rendered and costs</w:t>
+      </w:r>
+      <w:r>
+        <w:rPr>
+          <w:rFonts w:hint="default" w:ascii="Times New Roman" w:hAnsi="Times New Roman" w:eastAsia="SimSun" w:cs="Times New Roman"/>
+          <w:i w:val="0"/>
+          <w:iCs w:val="0"/>
+          <w:color w:val="000000"/>
+          <w:sz w:val="24"/>
+          <w:szCs w:val="24"/>
+          <w:u w:val="none"/>
+          <w:shd w:val="clear" w:fill="FFFFFF"/>
+          <w:vertAlign w:val="baseline"/>
+          <w:lang w:val="en-US"/>
+        </w:rPr>
+        <w:t>.</w:t>
+      </w:r>
+    </w:p>
+    <w:p>
+      <w:pPr>
+        <w:numPr>
+          <w:ilvl w:val="0"/>
+          <w:numId w:val="1"/>
+        </w:numPr>
+        <w:tabs>
+          <w:tab w:val="clear" w:pos="420"/>
+        </w:tabs>
+        <w:spacing w:line="240" w:lineRule="auto"/>
+        <w:ind w:left="1200" w:leftChars="0" w:hanging="420" w:firstLineChars="0"/>
+        <w:jc w:val="both"/>
+        <w:rPr>
+          <w:rFonts w:hint="default" w:ascii="Times New Roman" w:hAnsi="Times New Roman" w:eastAsia="SimSun" w:cs="Times New Roman"/>
+          <w:i w:val="0"/>
+          <w:iCs w:val="0"/>
+          <w:color w:val="000000"/>
+          <w:sz w:val="23"/>
+          <w:szCs w:val="23"/>
+          <w:u w:val="none"/>
+          <w:shd w:val="clear" w:fill="FFFFFF"/>
+          <w:vertAlign w:val="baseline"/>
+          <w:lang w:val="en-US"/>
+        </w:rPr>
+      </w:pPr>
+      <w:r>
+        <w:rPr>
+          <w:rFonts w:hint="default" w:ascii="Times New Roman" w:hAnsi="Times New Roman" w:eastAsia="SimSun" w:cs="Times New Roman"/>
+          <w:i w:val="0"/>
+          <w:iCs w:val="0"/>
+          <w:color w:val="000000"/>
+          <w:sz w:val="24"/>
+          <w:szCs w:val="24"/>
+          <w:u w:val="none"/>
+          <w:shd w:val="clear" w:fill="FFFFFF"/>
+          <w:vertAlign w:val="baseline"/>
+          <w:lang w:val="en-US"/>
+        </w:rPr>
+        <w:t xml:space="preserve">Receipt: </w:t>
+      </w:r>
+      <w:r>
+        <w:rPr>
+          <w:rFonts w:hint="default" w:ascii="Times New Roman" w:hAnsi="Times New Roman" w:eastAsia="SimSun" w:cs="Times New Roman"/>
+          <w:i w:val="0"/>
+          <w:iCs w:val="0"/>
+          <w:color w:val="000000"/>
+          <w:sz w:val="24"/>
+          <w:szCs w:val="24"/>
+          <w:u w:val="none"/>
+          <w:shd w:val="clear" w:fill="FFFFFF"/>
+          <w:vertAlign w:val="baseline"/>
+        </w:rPr>
+        <w:t>An unalterable electronic document provided to clients as immediate proof of a completed payment.</w:t>
+      </w:r>
+    </w:p>
+    <w:p>
+      <w:pPr>
+        <w:numPr>
+          <w:ilvl w:val="0"/>
+          <w:numId w:val="1"/>
+        </w:numPr>
+        <w:tabs>
+          <w:tab w:val="clear" w:pos="420"/>
+        </w:tabs>
+        <w:spacing w:line="240" w:lineRule="auto"/>
+        <w:ind w:left="1200" w:leftChars="0" w:hanging="420" w:firstLineChars="0"/>
+        <w:jc w:val="both"/>
+        <w:rPr>
+          <w:rFonts w:hint="default" w:ascii="Times New Roman" w:hAnsi="Times New Roman" w:eastAsia="SimSun" w:cs="Times New Roman"/>
+          <w:i w:val="0"/>
+          <w:iCs w:val="0"/>
+          <w:color w:val="000000"/>
+          <w:sz w:val="23"/>
+          <w:szCs w:val="23"/>
+          <w:u w:val="none"/>
+          <w:shd w:val="clear" w:fill="FFFFFF"/>
+          <w:vertAlign w:val="baseline"/>
+          <w:lang w:val="en-US"/>
+        </w:rPr>
+      </w:pPr>
+      <w:r>
+        <w:rPr>
+          <w:rFonts w:hint="default" w:ascii="Times New Roman" w:hAnsi="Times New Roman" w:eastAsia="SimSun" w:cs="Times New Roman"/>
+          <w:i w:val="0"/>
+          <w:iCs w:val="0"/>
+          <w:color w:val="000000"/>
+          <w:sz w:val="24"/>
+          <w:szCs w:val="24"/>
+          <w:u w:val="none"/>
+          <w:shd w:val="clear" w:fill="FFFFFF"/>
+          <w:vertAlign w:val="baseline"/>
+          <w:lang w:val="en-US"/>
+        </w:rPr>
+        <w:t xml:space="preserve">Read Replica: </w:t>
+      </w:r>
+      <w:r>
+        <w:rPr>
+          <w:rFonts w:hint="default" w:ascii="Times New Roman" w:hAnsi="Times New Roman" w:eastAsia="SimSun" w:cs="Times New Roman"/>
+          <w:i w:val="0"/>
+          <w:iCs w:val="0"/>
+          <w:color w:val="000000"/>
+          <w:sz w:val="24"/>
+          <w:szCs w:val="24"/>
+          <w:u w:val="none"/>
+          <w:shd w:val="clear" w:fill="FFFFFF"/>
+          <w:vertAlign w:val="baseline"/>
+        </w:rPr>
+        <w:t>Dedicated database instances used to offload high-frequency tracking and search queries.</w:t>
+      </w:r>
+    </w:p>
+    <w:p>
+      <w:pPr>
+        <w:numPr>
+          <w:ilvl w:val="0"/>
+          <w:numId w:val="1"/>
+        </w:numPr>
+        <w:tabs>
+          <w:tab w:val="clear" w:pos="420"/>
+        </w:tabs>
+        <w:spacing w:line="240" w:lineRule="auto"/>
+        <w:ind w:left="1200" w:leftChars="0" w:hanging="420" w:firstLineChars="0"/>
+        <w:jc w:val="both"/>
+        <w:rPr>
+          <w:rFonts w:hint="default" w:ascii="Times New Roman" w:hAnsi="Times New Roman" w:eastAsia="SimSun" w:cs="Times New Roman"/>
+          <w:i w:val="0"/>
+          <w:iCs w:val="0"/>
+          <w:color w:val="000000"/>
+          <w:sz w:val="23"/>
+          <w:szCs w:val="23"/>
+          <w:u w:val="none"/>
+          <w:shd w:val="clear" w:fill="FFFFFF"/>
+          <w:vertAlign w:val="baseline"/>
+          <w:lang w:val="en-US"/>
+        </w:rPr>
+      </w:pPr>
+      <w:r>
+        <w:rPr>
+          <w:rFonts w:hint="default" w:ascii="Times New Roman" w:hAnsi="Times New Roman" w:eastAsia="SimSun" w:cs="Times New Roman"/>
+          <w:i w:val="0"/>
+          <w:iCs w:val="0"/>
+          <w:color w:val="000000"/>
+          <w:sz w:val="24"/>
+          <w:szCs w:val="24"/>
+          <w:u w:val="none"/>
+          <w:shd w:val="clear" w:fill="FFFFFF"/>
+          <w:vertAlign w:val="baseline"/>
+          <w:lang w:val="en-US"/>
+        </w:rPr>
+        <w:t xml:space="preserve">Perssimistic Row-Level Locking: </w:t>
+      </w:r>
+      <w:r>
+        <w:rPr>
+          <w:rFonts w:hint="default" w:ascii="Times New Roman" w:hAnsi="Times New Roman" w:eastAsia="SimSun" w:cs="Times New Roman"/>
+          <w:i w:val="0"/>
+          <w:iCs w:val="0"/>
+          <w:color w:val="000000"/>
+          <w:sz w:val="24"/>
+          <w:szCs w:val="24"/>
+          <w:u w:val="none"/>
+          <w:shd w:val="clear" w:fill="FFFFFF"/>
+          <w:vertAlign w:val="baseline"/>
+        </w:rPr>
+        <w:t>A database control that locks data rows during booking to prevent truck double-bookings.</w:t>
+      </w:r>
+    </w:p>
+    <w:p>
+      <w:pPr>
+        <w:numPr>
+          <w:ilvl w:val="0"/>
+          <w:numId w:val="1"/>
+        </w:numPr>
+        <w:tabs>
+          <w:tab w:val="clear" w:pos="420"/>
+        </w:tabs>
+        <w:spacing w:line="240" w:lineRule="auto"/>
+        <w:ind w:left="1200" w:leftChars="0" w:hanging="420" w:firstLineChars="0"/>
+        <w:jc w:val="both"/>
+        <w:rPr>
+          <w:rFonts w:hint="default" w:ascii="Times New Roman" w:hAnsi="Times New Roman" w:eastAsia="SimSun" w:cs="Times New Roman"/>
+          <w:i w:val="0"/>
+          <w:iCs w:val="0"/>
+          <w:color w:val="000000"/>
+          <w:sz w:val="23"/>
+          <w:szCs w:val="23"/>
+          <w:u w:val="none"/>
+          <w:shd w:val="clear" w:fill="FFFFFF"/>
+          <w:vertAlign w:val="baseline"/>
+          <w:lang w:val="en-US"/>
+        </w:rPr>
+      </w:pPr>
+      <w:r>
+        <w:rPr>
+          <w:rFonts w:hint="default" w:ascii="Times New Roman" w:hAnsi="Times New Roman" w:eastAsia="SimSun" w:cs="Times New Roman"/>
+          <w:i w:val="0"/>
+          <w:iCs w:val="0"/>
+          <w:color w:val="000000"/>
+          <w:sz w:val="24"/>
+          <w:szCs w:val="24"/>
+          <w:u w:val="none"/>
+          <w:shd w:val="clear" w:fill="FFFFFF"/>
+          <w:vertAlign w:val="baseline"/>
+          <w:lang w:val="en-US"/>
+        </w:rPr>
+        <w:t xml:space="preserve">CQRS: </w:t>
+      </w:r>
+      <w:r>
+        <w:rPr>
+          <w:rFonts w:hint="default" w:ascii="Times New Roman" w:hAnsi="Times New Roman" w:eastAsia="SimSun" w:cs="Times New Roman"/>
+          <w:i w:val="0"/>
+          <w:iCs w:val="0"/>
+          <w:color w:val="000000"/>
+          <w:sz w:val="24"/>
+          <w:szCs w:val="24"/>
+          <w:u w:val="none"/>
+          <w:shd w:val="clear" w:fill="FFFFFF"/>
+          <w:vertAlign w:val="baseline"/>
+        </w:rPr>
+        <w:t>An architectural pattern separating data writes from data lookups to maximize performance.</w:t>
+      </w:r>
+    </w:p>
+    <w:p>
+      <w:pPr>
+        <w:numPr>
+          <w:ilvl w:val="0"/>
+          <w:numId w:val="1"/>
+        </w:numPr>
+        <w:tabs>
+          <w:tab w:val="clear" w:pos="420"/>
+        </w:tabs>
+        <w:spacing w:line="240" w:lineRule="auto"/>
+        <w:ind w:left="1200" w:leftChars="0" w:hanging="420" w:firstLineChars="0"/>
+        <w:jc w:val="both"/>
+        <w:rPr>
+          <w:rFonts w:hint="default" w:ascii="Times New Roman" w:hAnsi="Times New Roman" w:cs="Times New Roman"/>
+          <w:b w:val="0"/>
+          <w:bCs w:val="0"/>
+          <w:sz w:val="23"/>
+          <w:szCs w:val="23"/>
+          <w:lang w:val="en-US"/>
+        </w:rPr>
+      </w:pPr>
+      <w:r>
+        <w:rPr>
+          <w:rFonts w:hint="default" w:ascii="Times New Roman" w:hAnsi="Times New Roman" w:eastAsia="SimSun" w:cs="Times New Roman"/>
+          <w:i w:val="0"/>
+          <w:iCs w:val="0"/>
+          <w:color w:val="000000"/>
+          <w:sz w:val="24"/>
+          <w:szCs w:val="24"/>
+          <w:u w:val="none"/>
+          <w:shd w:val="clear" w:fill="FFFFFF"/>
+          <w:vertAlign w:val="baseline"/>
+          <w:lang w:val="en-US"/>
+        </w:rPr>
+        <w:t xml:space="preserve">ACID Compliance: </w:t>
+      </w:r>
+      <w:r>
+        <w:rPr>
+          <w:rFonts w:hint="default" w:ascii="Times New Roman" w:hAnsi="Times New Roman" w:eastAsia="SimSun" w:cs="Times New Roman"/>
+          <w:i w:val="0"/>
+          <w:iCs w:val="0"/>
+          <w:color w:val="000000"/>
+          <w:sz w:val="24"/>
+          <w:szCs w:val="24"/>
+          <w:u w:val="none"/>
+          <w:shd w:val="clear" w:fill="FFFFFF"/>
+          <w:vertAlign w:val="baseline"/>
+        </w:rPr>
+        <w:t>Database properties ensuring multi-step workflows either succeed completely or roll back entirely</w:t>
+      </w:r>
+      <w:r>
+        <w:rPr>
+          <w:rFonts w:hint="default" w:ascii="Times New Roman" w:hAnsi="Times New Roman" w:eastAsia="SimSun" w:cs="Times New Roman"/>
+          <w:i w:val="0"/>
+          <w:iCs w:val="0"/>
+          <w:color w:val="000000"/>
+          <w:sz w:val="24"/>
+          <w:szCs w:val="24"/>
+          <w:u w:val="none"/>
+          <w:shd w:val="clear" w:fill="FFFFFF"/>
+          <w:vertAlign w:val="baseline"/>
+          <w:lang w:val="en-US"/>
+        </w:rPr>
+        <w:t>.</w:t>
+      </w:r>
+    </w:p>
+    <w:p>
+      <w:pPr>
+        <w:pStyle w:val="3"/>
+        <w:bidi w:val="0"/>
+        <w:spacing w:line="240" w:lineRule="auto"/>
+        <w:ind w:left="400" w:leftChars="100" w:firstLine="0" w:firstLineChars="0"/>
+        <w:rPr>
+          <w:rFonts w:hint="default" w:ascii="Times New Roman" w:hAnsi="Times New Roman" w:cs="Times New Roman"/>
+          <w:lang w:val="en-US"/>
+        </w:rPr>
+      </w:pPr>
+      <w:r>
+        <w:rPr>
+          <w:rFonts w:hint="default" w:ascii="Times New Roman" w:hAnsi="Times New Roman" w:cs="Times New Roman"/>
+          <w:lang w:val="en-US"/>
+        </w:rPr>
+        <w:t>2.</w:t>
+      </w:r>
+      <w:r>
+        <w:rPr>
+          <w:rFonts w:hint="default" w:cs="Times New Roman"/>
+          <w:lang w:val="en-US"/>
+        </w:rPr>
+        <w:t>2</w:t>
+      </w:r>
+      <w:r>
+        <w:rPr>
+          <w:rFonts w:hint="default" w:ascii="Times New Roman" w:hAnsi="Times New Roman" w:cs="Times New Roman"/>
+          <w:lang w:val="en-US"/>
+        </w:rPr>
+        <w:t xml:space="preserve"> </w:t>
+      </w:r>
+      <w:r>
+        <w:rPr>
+          <w:rFonts w:hint="default" w:cs="Times New Roman"/>
+          <w:lang w:val="en-US"/>
+        </w:rPr>
+        <w:t>Goals</w:t>
+      </w:r>
+      <w:bookmarkStart w:id="0" w:name="_GoBack"/>
+      <w:bookmarkEnd w:id="0"/>
+    </w:p>
+    <w:p>
+      <w:pPr>
+        <w:spacing w:line="240" w:lineRule="auto"/>
+        <w:rPr>
+          <w:rFonts w:hint="default" w:ascii="Times New Roman" w:hAnsi="Times New Roman" w:cs="Times New Roman"/>
+          <w:lang w:val="en-US"/>
+        </w:rPr>
+      </w:pPr>
+    </w:p>
+    <w:p>
+      <w:pPr>
+        <w:spacing w:line="240" w:lineRule="auto"/>
+        <w:rPr>
+          <w:rFonts w:hint="default" w:ascii="Times New Roman" w:hAnsi="Times New Roman" w:cs="Times New Roman"/>
+          <w:lang w:val="en-US"/>
+        </w:rPr>
+      </w:pPr>
+    </w:p>
+    <w:p>
+      <w:pPr>
+        <w:spacing w:line="240" w:lineRule="auto"/>
+        <w:rPr>
+          <w:rFonts w:hint="default" w:ascii="Times New Roman" w:hAnsi="Times New Roman" w:cs="Times New Roman"/>
+          <w:lang w:val="en-US"/>
+        </w:rPr>
+      </w:pPr>
+      <w:r>
+        <w:rPr>
+          <w:rFonts w:hint="default" w:ascii="Times New Roman" w:hAnsi="Times New Roman" w:cs="Times New Roman"/>
+        </w:rPr>
+        <w:fldChar w:fldCharType="end"/>
+      </w:r>
+    </w:p>
+    <w:p>
+      <w:pPr>
+        <w:spacing w:line="240" w:lineRule="auto"/>
+        <w:rPr>
+          <w:rFonts w:hint="default" w:ascii="Times New Roman" w:hAnsi="Times New Roman" w:cs="Times New Roman"/>
+          <w:lang w:val="en-US"/>
+        </w:rPr>
+      </w:pPr>
+    </w:p>
+    <w:p>
+      <w:pPr>
+        <w:spacing w:line="240" w:lineRule="auto"/>
+        <w:rPr>
+          <w:rFonts w:hint="default" w:ascii="Times New Roman" w:hAnsi="Times New Roman" w:cs="Times New Roman"/>
+          <w:lang w:val="en-US"/>
+        </w:rPr>
+      </w:pPr>
+    </w:p>
+    <w:p>
+      <w:pPr>
+        <w:spacing w:line="240" w:lineRule="auto"/>
+        <w:rPr>
+          <w:rFonts w:hint="default" w:ascii="Times New Roman" w:hAnsi="Times New Roman" w:cs="Times New Roman"/>
+          <w:lang w:val="en-US"/>
+        </w:rPr>
+      </w:pPr>
+    </w:p>
+    <w:p>
+      <w:pPr>
+        <w:spacing w:line="240" w:lineRule="auto"/>
+        <w:rPr>
+          <w:rFonts w:hint="default" w:ascii="Times New Roman" w:hAnsi="Times New Roman" w:cs="Times New Roman"/>
+          <w:lang w:val="en-US"/>
+        </w:rPr>
+      </w:pPr>
     </w:p>
     <w:p>
       <w:pPr>
@@ -925,412 +2865,16 @@
         <w:adjustRightInd/>
         <w:snapToGrid/>
         <w:spacing w:line="240" w:lineRule="auto"/>
-        <w:jc w:val="both"/>
         <w:textAlignment w:val="auto"/>
         <w:rPr>
-          <w:rFonts w:hint="default"/>
-          <w:lang w:val="en-US"/>
-        </w:rPr>
-      </w:pPr>
-      <w:r>
-        <w:fldChar w:fldCharType="begin"/>
-      </w:r>
-      <w:r>
-        <w:instrText xml:space="preserve">TOC \o "1-3" \h \u </w:instrText>
-      </w:r>
-      <w:r>
-        <w:fldChar w:fldCharType="separate"/>
-      </w:r>
-      <w:r>
-        <w:fldChar w:fldCharType="begin"/>
-      </w:r>
-      <w:r>
-        <w:instrText xml:space="preserve"> HYPERLINK \l _Toc25000 </w:instrText>
-      </w:r>
-      <w:r>
-        <w:fldChar w:fldCharType="separate"/>
-      </w:r>
-      <w:r>
-        <w:rPr>
-          <w:rFonts w:hint="default"/>
-          <w:lang w:val="en-US"/>
-        </w:rPr>
-        <w:t>Part A: Introduction</w:t>
-      </w:r>
-      <w:r>
-        <w:fldChar w:fldCharType="end"/>
-      </w:r>
-      <w:r>
-        <w:rPr>
-          <w:rFonts w:hint="default"/>
-          <w:lang w:val="en-US"/>
-        </w:rPr>
-        <w:tab/>
-        <w:t>..................................................................</w:t>
-      </w:r>
-      <w:r>
-        <w:rPr>
-          <w:rFonts w:hint="default"/>
-          <w:sz w:val="25"/>
-          <w:szCs w:val="25"/>
-          <w:lang w:val="en-US"/>
-        </w:rPr>
-        <w:t>3</w:t>
-      </w:r>
-    </w:p>
-    <w:p>
-      <w:pPr>
-        <w:pStyle w:val="2"/>
-        <w:keepNext w:val="0"/>
-        <w:keepLines w:val="0"/>
-        <w:pageBreakBefore w:val="0"/>
-        <w:widowControl/>
-        <w:tabs>
-          <w:tab w:val="right" w:leader="dot" w:pos="3360"/>
-        </w:tabs>
-        <w:kinsoku/>
-        <w:wordWrap/>
-        <w:overflowPunct/>
-        <w:topLinePunct w:val="0"/>
-        <w:autoSpaceDE/>
-        <w:autoSpaceDN/>
-        <w:bidi w:val="0"/>
-        <w:adjustRightInd/>
-        <w:snapToGrid/>
-        <w:spacing w:line="240" w:lineRule="auto"/>
-        <w:jc w:val="both"/>
-        <w:textAlignment w:val="auto"/>
-        <w:rPr>
-          <w:rFonts w:hint="default"/>
-          <w:sz w:val="32"/>
-          <w:szCs w:val="32"/>
-          <w:lang w:val="en-US"/>
-        </w:rPr>
-      </w:pPr>
-      <w:r>
-        <w:fldChar w:fldCharType="begin"/>
-      </w:r>
-      <w:r>
-        <w:instrText xml:space="preserve"> HYPERLINK \l _Toc25000 </w:instrText>
-      </w:r>
-      <w:r>
-        <w:fldChar w:fldCharType="separate"/>
-      </w:r>
-      <w:r>
-        <w:rPr>
-          <w:rFonts w:hint="default"/>
-          <w:lang w:val="en-US"/>
-        </w:rPr>
-        <w:t>Part B: Project O</w:t>
-      </w:r>
-      <w:r>
-        <w:fldChar w:fldCharType="end"/>
-      </w:r>
-      <w:r>
-        <w:rPr>
-          <w:rFonts w:hint="default"/>
-          <w:lang w:val="en-US"/>
-        </w:rPr>
-        <w:t>verview..........................................................</w:t>
-      </w:r>
-      <w:r>
-        <w:rPr>
-          <w:rFonts w:hint="default"/>
-          <w:sz w:val="25"/>
-          <w:szCs w:val="25"/>
-          <w:lang w:val="en-US"/>
-        </w:rPr>
-        <w:t>3</w:t>
-      </w:r>
-    </w:p>
-    <w:p>
-      <w:pPr>
-        <w:pStyle w:val="3"/>
-        <w:keepNext/>
-        <w:keepLines/>
-        <w:pageBreakBefore w:val="0"/>
-        <w:widowControl/>
-        <w:tabs>
-          <w:tab w:val="right" w:leader="dot" w:pos="3360"/>
-        </w:tabs>
-        <w:kinsoku/>
-        <w:wordWrap/>
-        <w:overflowPunct/>
-        <w:topLinePunct w:val="0"/>
-        <w:autoSpaceDE/>
-        <w:autoSpaceDN/>
-        <w:bidi w:val="0"/>
-        <w:adjustRightInd/>
-        <w:snapToGrid/>
-        <w:spacing w:line="240" w:lineRule="auto"/>
-        <w:ind w:left="400" w:leftChars="100" w:firstLine="0" w:firstLineChars="0"/>
-        <w:jc w:val="both"/>
-        <w:textAlignment w:val="auto"/>
-        <w:rPr>
-          <w:rFonts w:hint="default"/>
-          <w:lang w:val="en-US"/>
-        </w:rPr>
-      </w:pPr>
-      <w:r>
-        <w:rPr>
-          <w:rFonts w:hint="default"/>
-          <w:lang w:val="en-US"/>
-        </w:rPr>
-        <w:t>2.1 Domain Vocabulary......................................................................</w:t>
-      </w:r>
-      <w:r>
-        <w:rPr>
-          <w:rFonts w:hint="default"/>
-          <w:sz w:val="25"/>
-          <w:szCs w:val="25"/>
-          <w:lang w:val="en-US"/>
-        </w:rPr>
-        <w:t>3</w:t>
-      </w:r>
-    </w:p>
-    <w:p>
-      <w:pPr>
-        <w:pStyle w:val="3"/>
-        <w:keepNext/>
-        <w:keepLines/>
-        <w:pageBreakBefore w:val="0"/>
-        <w:widowControl/>
-        <w:tabs>
-          <w:tab w:val="right" w:leader="dot" w:pos="3360"/>
-        </w:tabs>
-        <w:kinsoku/>
-        <w:wordWrap/>
-        <w:overflowPunct/>
-        <w:topLinePunct w:val="0"/>
-        <w:autoSpaceDE/>
-        <w:autoSpaceDN/>
-        <w:bidi w:val="0"/>
-        <w:adjustRightInd/>
-        <w:snapToGrid/>
-        <w:spacing w:line="240" w:lineRule="auto"/>
-        <w:ind w:left="400" w:leftChars="100" w:firstLine="0" w:firstLineChars="0"/>
-        <w:jc w:val="both"/>
-        <w:textAlignment w:val="auto"/>
-        <w:rPr>
-          <w:rFonts w:hint="default"/>
-          <w:lang w:val="en-US"/>
-        </w:rPr>
-      </w:pPr>
-      <w:r>
-        <w:rPr>
-          <w:rFonts w:hint="default"/>
-          <w:lang w:val="en-US"/>
-        </w:rPr>
-        <w:t>2.2 Goals...............................................................................................</w:t>
-      </w:r>
-      <w:r>
-        <w:rPr>
-          <w:rFonts w:hint="default"/>
-          <w:sz w:val="25"/>
-          <w:szCs w:val="25"/>
-          <w:lang w:val="en-US"/>
-        </w:rPr>
-        <w:t>3</w:t>
-      </w:r>
-    </w:p>
-    <w:p>
-      <w:pPr>
-        <w:pStyle w:val="3"/>
-        <w:keepNext/>
-        <w:keepLines/>
-        <w:pageBreakBefore w:val="0"/>
-        <w:widowControl/>
-        <w:tabs>
-          <w:tab w:val="right" w:leader="dot" w:pos="3360"/>
-        </w:tabs>
-        <w:kinsoku/>
-        <w:wordWrap/>
-        <w:overflowPunct/>
-        <w:topLinePunct w:val="0"/>
-        <w:autoSpaceDE/>
-        <w:autoSpaceDN/>
-        <w:bidi w:val="0"/>
-        <w:adjustRightInd/>
-        <w:snapToGrid/>
-        <w:spacing w:line="240" w:lineRule="auto"/>
-        <w:ind w:left="400" w:leftChars="100" w:firstLine="0" w:firstLineChars="0"/>
-        <w:jc w:val="both"/>
-        <w:textAlignment w:val="auto"/>
-        <w:rPr>
-          <w:rFonts w:hint="default"/>
-          <w:lang w:val="en-US"/>
-        </w:rPr>
-      </w:pPr>
-      <w:r>
-        <w:rPr>
-          <w:rFonts w:hint="default"/>
-          <w:lang w:val="en-US"/>
-        </w:rPr>
-        <w:t>2.3 Assumptions..................................................</w:t>
-      </w:r>
-      <w:bookmarkStart w:id="0" w:name="_GoBack"/>
-      <w:bookmarkEnd w:id="0"/>
-      <w:r>
-        <w:rPr>
-          <w:rFonts w:hint="default"/>
-          <w:lang w:val="en-US"/>
-        </w:rPr>
-        <w:t>.................................</w:t>
-      </w:r>
-      <w:r>
-        <w:rPr>
-          <w:rFonts w:hint="default"/>
-          <w:sz w:val="25"/>
-          <w:szCs w:val="25"/>
-          <w:lang w:val="en-US"/>
-        </w:rPr>
-        <w:t>3</w:t>
-      </w:r>
-    </w:p>
-    <w:p>
-      <w:pPr>
-        <w:pStyle w:val="3"/>
-        <w:keepNext/>
-        <w:keepLines/>
-        <w:pageBreakBefore w:val="0"/>
-        <w:widowControl/>
-        <w:tabs>
-          <w:tab w:val="right" w:leader="dot" w:pos="3360"/>
-        </w:tabs>
-        <w:kinsoku/>
-        <w:wordWrap/>
-        <w:overflowPunct/>
-        <w:topLinePunct w:val="0"/>
-        <w:autoSpaceDE/>
-        <w:autoSpaceDN/>
-        <w:bidi w:val="0"/>
-        <w:adjustRightInd/>
-        <w:snapToGrid/>
-        <w:spacing w:line="240" w:lineRule="auto"/>
-        <w:ind w:left="400" w:leftChars="100" w:firstLine="0" w:firstLineChars="0"/>
-        <w:jc w:val="both"/>
-        <w:textAlignment w:val="auto"/>
-        <w:rPr>
-          <w:rFonts w:hint="default"/>
-          <w:lang w:val="en-US"/>
-        </w:rPr>
-      </w:pPr>
-      <w:r>
-        <w:rPr>
-          <w:rFonts w:hint="default"/>
-          <w:lang w:val="en-US"/>
-        </w:rPr>
-        <w:t>2.4 Scope...............................................................................................</w:t>
-      </w:r>
-      <w:r>
-        <w:rPr>
-          <w:rFonts w:hint="default"/>
-          <w:sz w:val="25"/>
-          <w:szCs w:val="25"/>
-          <w:lang w:val="en-US"/>
-        </w:rPr>
-        <w:t>3</w:t>
-      </w:r>
-    </w:p>
-    <w:p>
-      <w:pPr>
-        <w:spacing w:line="240" w:lineRule="auto"/>
-        <w:rPr>
-          <w:rFonts w:hint="default"/>
-          <w:lang w:val="en-US"/>
-        </w:rPr>
-      </w:pPr>
-    </w:p>
-    <w:p>
-      <w:pPr>
-        <w:spacing w:line="240" w:lineRule="auto"/>
-        <w:rPr>
-          <w:rFonts w:hint="default"/>
-          <w:lang w:val="en-US"/>
-        </w:rPr>
-      </w:pPr>
-    </w:p>
-    <w:p>
-      <w:pPr>
-        <w:spacing w:line="240" w:lineRule="auto"/>
-        <w:rPr>
-          <w:rFonts w:hint="default"/>
-          <w:lang w:val="en-US"/>
-        </w:rPr>
-      </w:pPr>
-    </w:p>
-    <w:p>
-      <w:pPr>
-        <w:spacing w:line="240" w:lineRule="auto"/>
-        <w:rPr>
-          <w:rFonts w:hint="default"/>
-          <w:lang w:val="en-US"/>
-        </w:rPr>
-      </w:pPr>
-    </w:p>
-    <w:p>
-      <w:pPr>
-        <w:spacing w:line="240" w:lineRule="auto"/>
-        <w:rPr>
-          <w:rFonts w:hint="default"/>
-          <w:lang w:val="en-US"/>
-        </w:rPr>
-      </w:pPr>
-    </w:p>
-    <w:p>
-      <w:pPr>
-        <w:spacing w:line="240" w:lineRule="auto"/>
-        <w:rPr>
-          <w:rFonts w:hint="default"/>
-          <w:lang w:val="en-US"/>
-        </w:rPr>
-      </w:pPr>
-    </w:p>
-    <w:p>
-      <w:pPr>
-        <w:spacing w:line="240" w:lineRule="auto"/>
-        <w:rPr>
-          <w:rFonts w:hint="default"/>
-          <w:lang w:val="en-US"/>
-        </w:rPr>
-      </w:pPr>
-    </w:p>
-    <w:p>
-      <w:pPr>
-        <w:spacing w:line="240" w:lineRule="auto"/>
-        <w:rPr>
-          <w:rFonts w:hint="default"/>
-          <w:lang w:val="en-US"/>
-        </w:rPr>
-      </w:pPr>
-    </w:p>
-    <w:p>
-      <w:pPr>
-        <w:pStyle w:val="2"/>
-        <w:keepNext w:val="0"/>
-        <w:keepLines w:val="0"/>
-        <w:pageBreakBefore w:val="0"/>
-        <w:widowControl/>
-        <w:tabs>
-          <w:tab w:val="right" w:leader="dot" w:pos="3360"/>
-        </w:tabs>
-        <w:kinsoku/>
-        <w:wordWrap/>
-        <w:overflowPunct/>
-        <w:topLinePunct w:val="0"/>
-        <w:autoSpaceDE/>
-        <w:autoSpaceDN/>
-        <w:bidi w:val="0"/>
-        <w:adjustRightInd/>
-        <w:snapToGrid/>
-        <w:spacing w:line="240" w:lineRule="auto"/>
-        <w:textAlignment w:val="auto"/>
-        <w:rPr>
-          <w:rFonts w:hint="default"/>
-          <w:lang w:val="en-US"/>
-        </w:rPr>
-      </w:pPr>
-      <w:r>
+          <w:rFonts w:hint="default" w:ascii="Times New Roman" w:hAnsi="Times New Roman" w:cs="Times New Roman"/>
+          <w:lang w:val="en-US"/>
+        </w:rPr>
+      </w:pPr>
+      <w:r>
+        <w:rPr>
+          <w:rFonts w:hint="default" w:ascii="Times New Roman" w:hAnsi="Times New Roman" w:cs="Times New Roman"/>
+        </w:rPr>
         <w:fldChar w:fldCharType="end"/>
       </w:r>
     </w:p>
@@ -1342,6 +2886,207 @@
     </w:sectPr>
   </w:body>
 </w:document>
+</file>
+
+<file path=word/footer1.xml><?xml version="1.0" encoding="utf-8"?>
+<w:ftr xmlns:wpc="http://schemas.microsoft.com/office/word/2010/wordprocessingCanvas" xmlns:mc="http://schemas.openxmlformats.org/markup-compatibility/2006" xmlns:o="urn:schemas-microsoft-com:office:office" xmlns:r="http://schemas.openxmlformats.org/officeDocument/2006/relationships" xmlns:m="http://schemas.openxmlformats.org/officeDocument/2006/math" xmlns:v="urn:schemas-microsoft-com:vml" xmlns:wp14="http://schemas.microsoft.com/office/word/2010/wordprocessingDrawing" xmlns:wp="http://schemas.openxmlformats.org/drawingml/2006/wordprocessingDrawing" xmlns:w10="urn:schemas-microsoft-com:office:word" xmlns:w="http://schemas.openxmlformats.org/wordprocessingml/2006/main" xmlns:w14="http://schemas.microsoft.com/office/word/2010/wordml" xmlns:w15="http://schemas.microsoft.com/office/word/2012/wordml" xmlns:wpg="http://schemas.microsoft.com/office/word/2010/wordprocessingGroup" xmlns:wpi="http://schemas.microsoft.com/office/word/2010/wordprocessingInk" xmlns:wne="http://schemas.microsoft.com/office/word/2006/wordml" xmlns:wps="http://schemas.microsoft.com/office/word/2010/wordprocessingShape" xmlns:wpsCustomData="http://www.wps.cn/officeDocument/2013/wpsCustomData" mc:Ignorable="w14 w15 wp14">
+  <w:p>
+    <w:pPr>
+      <w:pStyle w:val="6"/>
+    </w:pPr>
+    <w:r>
+      <w:rPr>
+        <w:sz w:val="18"/>
+      </w:rPr>
+      <mc:AlternateContent>
+        <mc:Choice Requires="wps">
+          <w:drawing>
+            <wp:anchor distT="0" distB="0" distL="114300" distR="114300" simplePos="0" relativeHeight="251659264" behindDoc="0" locked="0" layoutInCell="1" allowOverlap="1">
+              <wp:simplePos x="0" y="0"/>
+              <wp:positionH relativeFrom="margin">
+                <wp:align>center</wp:align>
+              </wp:positionH>
+              <wp:positionV relativeFrom="paragraph">
+                <wp:posOffset>0</wp:posOffset>
+              </wp:positionV>
+              <wp:extent cx="1828800" cy="1828800"/>
+              <wp:effectExtent l="0" t="0" r="0" b="0"/>
+              <wp:wrapNone/>
+              <wp:docPr id="2" name="Text Box 2"/>
+              <wp:cNvGraphicFramePr/>
+              <a:graphic xmlns:a="http://schemas.openxmlformats.org/drawingml/2006/main">
+                <a:graphicData uri="http://schemas.microsoft.com/office/word/2010/wordprocessingShape">
+                  <wps:wsp>
+                    <wps:cNvSpPr txBox="1"/>
+                    <wps:spPr>
+                      <a:xfrm>
+                        <a:off x="0" y="0"/>
+                        <a:ext cx="1828800" cy="1828800"/>
+                      </a:xfrm>
+                      <a:prstGeom prst="rect">
+                        <a:avLst/>
+                      </a:prstGeom>
+                      <a:noFill/>
+                      <a:ln w="6350">
+                        <a:noFill/>
+                      </a:ln>
+                      <a:extLst>
+                        <a:ext uri="{909E8E84-426E-40DD-AFC4-6F175D3DCCD1}">
+                          <a14:hiddenFill xmlns:a14="http://schemas.microsoft.com/office/drawing/2010/main">
+                            <a:solidFill>
+                              <a:schemeClr val="lt1"/>
+                            </a:solidFill>
+                          </a14:hiddenFill>
+                        </a:ext>
+                        <a:ext uri="{91240B29-F687-4F45-9708-019B960494DF}">
+                          <a14:hiddenLine xmlns:a14="http://schemas.microsoft.com/office/drawing/2010/main" w="6350">
+                            <a:solidFill>
+                              <a:prstClr val="black"/>
+                            </a:solidFill>
+                          </a14:hiddenLine>
+                        </a:ext>
+                      </a:extLst>
+                    </wps:spPr>
+                    <wps:style>
+                      <a:lnRef idx="0">
+                        <a:schemeClr val="accent1"/>
+                      </a:lnRef>
+                      <a:fillRef idx="0">
+                        <a:schemeClr val="accent1"/>
+                      </a:fillRef>
+                      <a:effectRef idx="0">
+                        <a:schemeClr val="accent1"/>
+                      </a:effectRef>
+                      <a:fontRef idx="minor">
+                        <a:schemeClr val="dk1"/>
+                      </a:fontRef>
+                    </wps:style>
+                    <wps:txbx>
+                      <w:txbxContent>
+                        <w:p>
+                          <w:pPr>
+                            <w:pStyle w:val="6"/>
+                          </w:pPr>
+                          <w:r>
+                            <w:fldChar w:fldCharType="begin"/>
+                          </w:r>
+                          <w:r>
+                            <w:instrText xml:space="preserve"> PAGE  \* MERGEFORMAT </w:instrText>
+                          </w:r>
+                          <w:r>
+                            <w:fldChar w:fldCharType="separate"/>
+                          </w:r>
+                          <w:r>
+                            <w:t>1</w:t>
+                          </w:r>
+                          <w:r>
+                            <w:fldChar w:fldCharType="end"/>
+                          </w:r>
+                        </w:p>
+                      </w:txbxContent>
+                    </wps:txbx>
+                    <wps:bodyPr rot="0" spcFirstLastPara="0" vertOverflow="overflow" horzOverflow="overflow" vert="horz" wrap="none" lIns="0" tIns="0" rIns="0" bIns="0" numCol="1" spcCol="0" rtlCol="0" fromWordArt="0" anchor="t" anchorCtr="0" forceAA="0" upright="0" compatLnSpc="1">
+                      <a:spAutoFit/>
+                    </wps:bodyPr>
+                  </wps:wsp>
+                </a:graphicData>
+              </a:graphic>
+            </wp:anchor>
+          </w:drawing>
+        </mc:Choice>
+        <mc:Fallback>
+          <w:pict>
+            <v:shape id="_x0000_s1026" o:spid="_x0000_s1026" o:spt="202" type="#_x0000_t202" style="position:absolute;left:0pt;margin-top:0pt;height:144pt;width:144pt;mso-position-horizontal:center;mso-position-horizontal-relative:margin;mso-wrap-style:none;z-index:251659264;mso-width-relative:page;mso-height-relative:page;" filled="f" stroked="f" coordsize="21600,21600" o:gfxdata="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">
+              <v:fill on="f" focussize="0,0"/>
+              <v:stroke on="f" weight="0.5pt"/>
+              <v:imagedata o:title=""/>
+              <o:lock v:ext="edit" aspectratio="f"/>
+              <v:textbox inset="0mm,0mm,0mm,0mm" style="mso-fit-shape-to-text:t;">
+                <w:txbxContent>
+                  <w:p>
+                    <w:pPr>
+                      <w:pStyle w:val="6"/>
+                    </w:pPr>
+                    <w:r>
+                      <w:fldChar w:fldCharType="begin"/>
+                    </w:r>
+                    <w:r>
+                      <w:instrText xml:space="preserve"> PAGE  \* MERGEFORMAT </w:instrText>
+                    </w:r>
+                    <w:r>
+                      <w:fldChar w:fldCharType="separate"/>
+                    </w:r>
+                    <w:r>
+                      <w:t>1</w:t>
+                    </w:r>
+                    <w:r>
+                      <w:fldChar w:fldCharType="end"/>
+                    </w:r>
+                  </w:p>
+                </w:txbxContent>
+              </v:textbox>
+            </v:shape>
+          </w:pict>
+        </mc:Fallback>
+      </mc:AlternateContent>
+    </w:r>
+  </w:p>
+</w:ftr>
+</file>
+
+<file path=word/header1.xml><?xml version="1.0" encoding="utf-8"?>
+<w:hdr xmlns:wpc="http://schemas.microsoft.com/office/word/2010/wordprocessingCanvas" xmlns:mc="http://schemas.openxmlformats.org/markup-compatibility/2006" xmlns:o="urn:schemas-microsoft-com:office:office" xmlns:r="http://schemas.openxmlformats.org/officeDocument/2006/relationships" xmlns:m="http://schemas.openxmlformats.org/officeDocument/2006/math" xmlns:v="urn:schemas-microsoft-com:vml" xmlns:wp14="http://schemas.microsoft.com/office/word/2010/wordprocessingDrawing" xmlns:wp="http://schemas.openxmlformats.org/drawingml/2006/wordprocessingDrawing" xmlns:w10="urn:schemas-microsoft-com:office:word" xmlns:w="http://schemas.openxmlformats.org/wordprocessingml/2006/main" xmlns:w14="http://schemas.microsoft.com/office/word/2010/wordml" xmlns:w15="http://schemas.microsoft.com/office/word/2012/wordml" xmlns:wpg="http://schemas.microsoft.com/office/word/2010/wordprocessingGroup" xmlns:wpi="http://schemas.microsoft.com/office/word/2010/wordprocessingInk" xmlns:wne="http://schemas.microsoft.com/office/word/2006/wordml" xmlns:wps="http://schemas.microsoft.com/office/word/2010/wordprocessingShape" xmlns:wpsCustomData="http://www.wps.cn/officeDocument/2013/wpsCustomData" mc:Ignorable="w14 w15 wp14">
+  <w:p>
+    <w:pPr>
+      <w:pStyle w:val="7"/>
+      <w:rPr>
+        <w:rFonts w:hint="default"/>
+        <w:sz w:val="18"/>
+        <w:szCs w:val="18"/>
+        <w:lang w:val="en-US"/>
+      </w:rPr>
+    </w:pPr>
+    <w:r>
+      <w:rPr>
+        <w:rFonts w:hint="default"/>
+        <w:sz w:val="18"/>
+        <w:szCs w:val="18"/>
+        <w:lang w:val="en-US"/>
+      </w:rPr>
+      <w:t>Software Architecture and Application                                                                                                   Assignment01</w:t>
+    </w:r>
+  </w:p>
+</w:hdr>
+</file>
+
+<file path=word/numbering.xml><?xml version="1.0" encoding="utf-8"?>
+<w:numbering xmlns:wpc="http://schemas.microsoft.com/office/word/2010/wordprocessingCanvas" xmlns:mc="http://schemas.openxmlformats.org/markup-compatibility/2006" xmlns:o="urn:schemas-microsoft-com:office:office" xmlns:r="http://schemas.openxmlformats.org/officeDocument/2006/relationships" xmlns:m="http://schemas.openxmlformats.org/officeDocument/2006/math" xmlns:v="urn:schemas-microsoft-com:vml" xmlns:wp14="http://schemas.microsoft.com/office/word/2010/wordprocessingDrawing" xmlns:wp="http://schemas.openxmlformats.org/drawingml/2006/wordprocessingDrawing" xmlns:w10="urn:schemas-microsoft-com:office:word" xmlns:w="http://schemas.openxmlformats.org/wordprocessingml/2006/main" xmlns:w14="http://schemas.microsoft.com/office/word/2010/wordml" xmlns:wpg="http://schemas.microsoft.com/office/word/2010/wordprocessingGroup" xmlns:wpi="http://schemas.microsoft.com/office/word/2010/wordprocessingInk" xmlns:wne="http://schemas.microsoft.com/office/word/2006/wordml" xmlns:wps="http://schemas.microsoft.com/office/word/2010/wordprocessingShape" xmlns:wpsCustomData="http://www.wps.cn/officeDocument/2013/wpsCustomData" mc:Ignorable="w14 wp14">
+  <w:abstractNum w:abstractNumId="0">
+    <w:nsid w:val="0C602426"/>
+    <w:multiLevelType w:val="singleLevel"/>
+    <w:tmpl w:val="0C602426"/>
+    <w:lvl w:ilvl="0" w:tentative="0">
+      <w:start w:val="1"/>
+      <w:numFmt w:val="bullet"/>
+      <w:lvlText w:val=""/>
+      <w:lvlJc w:val="left"/>
+      <w:pPr>
+        <w:tabs>
+          <w:tab w:val="left" w:pos="420"/>
+        </w:tabs>
+        <w:ind w:left="420" w:leftChars="0" w:hanging="420" w:firstLineChars="0"/>
+      </w:pPr>
+      <w:rPr>
+        <w:rFonts w:hint="default" w:ascii="Wingdings" w:hAnsi="Wingdings"/>
+        <w:sz w:val="15"/>
+        <w:szCs w:val="15"/>
+      </w:rPr>
+    </w:lvl>
+  </w:abstractNum>
+  <w:num w:numId="1">
+    <w:abstractNumId w:val="0"/>
+  </w:num>
+</w:numbering>
 </file>
 
 <file path=word/styles.xml><?xml version="1.0" encoding="utf-8"?>
@@ -1617,6 +3362,7 @@
   <w:style w:type="paragraph" w:styleId="2">
     <w:name w:val="heading 1"/>
     <w:next w:val="1"/>
+    <w:link w:val="12"/>
     <w:qFormat/>
     <w:uiPriority w:val="0"/>
     <w:pPr>
@@ -1674,6 +3420,39 @@
     </w:tblPr>
   </w:style>
   <w:style w:type="paragraph" w:styleId="6">
+    <w:name w:val="footer"/>
+    <w:basedOn w:val="1"/>
+    <w:uiPriority w:val="0"/>
+    <w:pPr>
+      <w:tabs>
+        <w:tab w:val="center" w:pos="4153"/>
+        <w:tab w:val="right" w:pos="8306"/>
+      </w:tabs>
+      <w:snapToGrid w:val="0"/>
+      <w:jc w:val="left"/>
+    </w:pPr>
+    <w:rPr>
+      <w:sz w:val="18"/>
+      <w:szCs w:val="18"/>
+    </w:rPr>
+  </w:style>
+  <w:style w:type="paragraph" w:styleId="7">
+    <w:name w:val="header"/>
+    <w:basedOn w:val="1"/>
+    <w:uiPriority w:val="0"/>
+    <w:pPr>
+      <w:tabs>
+        <w:tab w:val="center" w:pos="4153"/>
+        <w:tab w:val="right" w:pos="8306"/>
+      </w:tabs>
+      <w:snapToGrid w:val="0"/>
+    </w:pPr>
+    <w:rPr>
+      <w:sz w:val="18"/>
+      <w:szCs w:val="18"/>
+    </w:rPr>
+  </w:style>
+  <w:style w:type="paragraph" w:styleId="8">
     <w:name w:val="Normal (Web)"/>
     <w:qFormat/>
     <w:uiPriority w:val="0"/>
@@ -1690,9 +3469,10 @@
       <w:lang w:val="en-US" w:eastAsia="zh-CN" w:bidi="ar"/>
     </w:rPr>
   </w:style>
-  <w:style w:type="paragraph" w:styleId="7">
+  <w:style w:type="paragraph" w:styleId="9">
     <w:name w:val="toc 1"/>
     <w:basedOn w:val="1"/>
+    <w:link w:val="13"/>
     <w:qFormat/>
     <w:uiPriority w:val="1"/>
     <w:pPr>
@@ -1700,15 +3480,15 @@
       <w:ind w:left="947"/>
     </w:pPr>
     <w:rPr>
-      <w:rFonts w:eastAsia="Times New Roman" w:cs="Times New Roman"/>
+      <w:rFonts w:ascii="Times New Roman" w:hAnsi="Times New Roman" w:eastAsia="Times New Roman" w:cs="Times New Roman"/>
       <w:b/>
       <w:bCs/>
-      <w:sz w:val="36"/>
+      <w:sz w:val="40"/>
       <w:szCs w:val="32"/>
       <w:lang w:eastAsia="en-US"/>
     </w:rPr>
   </w:style>
-  <w:style w:type="paragraph" w:styleId="8">
+  <w:style w:type="paragraph" w:styleId="10">
     <w:name w:val="toc 2"/>
     <w:basedOn w:val="1"/>
     <w:qFormat/>
@@ -1726,7 +3506,7 @@
       <w:lang w:val="en-US" w:eastAsia="en-US" w:bidi="ar-SA"/>
     </w:rPr>
   </w:style>
-  <w:style w:type="paragraph" w:styleId="9">
+  <w:style w:type="paragraph" w:styleId="11">
     <w:name w:val="toc 3"/>
     <w:basedOn w:val="1"/>
     <w:qFormat/>
@@ -1742,6 +3522,33 @@
       <w:sz w:val="25"/>
       <w:szCs w:val="25"/>
       <w:lang w:val="en-US" w:eastAsia="en-US" w:bidi="ar-SA"/>
+    </w:rPr>
+  </w:style>
+  <w:style w:type="character" w:customStyle="1" w:styleId="12">
+    <w:name w:val="Heading 1 Char"/>
+    <w:link w:val="2"/>
+    <w:uiPriority w:val="0"/>
+    <w:rPr>
+      <w:rFonts w:hint="default" w:ascii="Times New Roman" w:hAnsi="Times New Roman" w:eastAsia="SimSun" w:cs="SimSun"/>
+      <w:b/>
+      <w:bCs/>
+      <w:kern w:val="44"/>
+      <w:sz w:val="32"/>
+      <w:szCs w:val="48"/>
+      <w:lang w:val="en-US" w:eastAsia="zh-CN" w:bidi="ar"/>
+    </w:rPr>
+  </w:style>
+  <w:style w:type="character" w:customStyle="1" w:styleId="13">
+    <w:name w:val="TOC 1 Char"/>
+    <w:link w:val="9"/>
+    <w:uiPriority w:val="1"/>
+    <w:rPr>
+      <w:rFonts w:ascii="Times New Roman" w:hAnsi="Times New Roman" w:eastAsia="Times New Roman" w:cs="Times New Roman"/>
+      <w:b/>
+      <w:bCs/>
+      <w:sz w:val="40"/>
+      <w:szCs w:val="32"/>
+      <w:lang w:eastAsia="en-US"/>
     </w:rPr>
   </w:style>
 </w:styles>
@@ -1996,7 +3803,9 @@
 
 <file path=customXml/item1.xml><?xml version="1.0" encoding="utf-8"?>
 <s:customData xmlns="http://www.wps.cn/officeDocument/2013/wpsCustomData" xmlns:s="http://www.wps.cn/officeDocument/2013/wpsCustomData">
-  <customSectProps/>
+  <customSectProps>
+    <customSectPr/>
+  </customSectProps>
   <customShpExts>
     <customShpInfo spid="_x0000_s1026" textRotate="1"/>
   </customShpExts>

</xml_diff>

<commit_message>
Finish Part C: Problem Domain
</commit_message>
<xml_diff>
--- a/Assignments/Assignment1/Team Report.docx
+++ b/Assignments/Assignment1/Team Report.docx
@@ -1281,7 +1281,7 @@
     <w:p>
       <w:pPr>
         <w:bidi w:val="0"/>
-        <w:spacing w:line="240" w:lineRule="auto"/>
+        <w:spacing w:line="360" w:lineRule="auto"/>
         <w:rPr>
           <w:rStyle w:val="15"/>
           <w:rFonts w:hint="default" w:ascii="Times New Roman" w:hAnsi="Times New Roman" w:cs="Times New Roman"/>
@@ -1299,58 +1299,102 @@
     </w:p>
     <w:p>
       <w:pPr>
+        <w:keepNext w:val="0"/>
+        <w:keepLines w:val="0"/>
+        <w:pageBreakBefore w:val="0"/>
+        <w:widowControl/>
+        <w:tabs>
+          <w:tab w:val="right" w:leader="dot" w:pos="3360"/>
+        </w:tabs>
+        <w:kinsoku/>
+        <w:wordWrap/>
+        <w:overflowPunct/>
+        <w:topLinePunct w:val="0"/>
+        <w:autoSpaceDE/>
+        <w:autoSpaceDN/>
         <w:bidi w:val="0"/>
-        <w:spacing w:line="240" w:lineRule="auto"/>
-        <w:rPr>
-          <w:rFonts w:hint="default" w:ascii="Times New Roman" w:hAnsi="Times New Roman" w:cs="Times New Roman"/>
-        </w:rPr>
-      </w:pPr>
-      <w:r>
-        <w:rPr>
-          <w:rFonts w:hint="default" w:ascii="Times New Roman" w:hAnsi="Times New Roman" w:cs="Times New Roman"/>
-        </w:rPr>
-        <w:fldChar w:fldCharType="begin"/>
-      </w:r>
-      <w:r>
-        <w:rPr>
-          <w:rFonts w:hint="default" w:ascii="Times New Roman" w:hAnsi="Times New Roman" w:cs="Times New Roman"/>
-        </w:rPr>
-        <w:instrText xml:space="preserve">TOC \o "1-3" \h \u </w:instrText>
-      </w:r>
-      <w:r>
-        <w:rPr>
-          <w:rFonts w:hint="default" w:ascii="Times New Roman" w:hAnsi="Times New Roman" w:cs="Times New Roman"/>
-        </w:rPr>
-        <w:fldChar w:fldCharType="separate"/>
-      </w:r>
-    </w:p>
-    <w:p>
-      <w:pPr>
+        <w:adjustRightInd/>
+        <w:snapToGrid/>
+        <w:spacing w:line="360" w:lineRule="auto"/>
+        <w:textAlignment w:val="auto"/>
+        <w:rPr>
+          <w:rStyle w:val="14"/>
+          <w:rFonts w:hint="default" w:ascii="Times New Roman" w:hAnsi="Times New Roman" w:cs="Times New Roman"/>
+          <w:sz w:val="25"/>
+          <w:szCs w:val="25"/>
+          <w:lang w:val="en-US"/>
+        </w:rPr>
+      </w:pPr>
+      <w:r>
+        <w:rPr>
+          <w:rStyle w:val="14"/>
+          <w:rFonts w:hint="default" w:ascii="Times New Roman" w:hAnsi="Times New Roman" w:cs="Times New Roman"/>
+          <w:lang w:val="en-US"/>
+        </w:rPr>
+        <w:t>Part A: Introduction</w:t>
+      </w:r>
+      <w:r>
+        <w:rPr>
+          <w:rStyle w:val="14"/>
+          <w:rFonts w:hint="default" w:ascii="Times New Roman" w:hAnsi="Times New Roman" w:cs="Times New Roman"/>
+          <w:lang w:val="en-US"/>
+        </w:rPr>
+        <w:tab/>
+        <w:t>…………………………………………..</w:t>
+      </w:r>
+      <w:r>
+        <w:rPr>
+          <w:rStyle w:val="14"/>
+          <w:rFonts w:hint="default" w:ascii="Times New Roman" w:hAnsi="Times New Roman" w:cs="Times New Roman"/>
+          <w:sz w:val="25"/>
+          <w:szCs w:val="25"/>
+          <w:lang w:val="en-US"/>
+        </w:rPr>
+        <w:t>4</w:t>
+      </w:r>
+    </w:p>
+    <w:p>
+      <w:pPr>
+        <w:keepNext w:val="0"/>
+        <w:keepLines w:val="0"/>
+        <w:pageBreakBefore w:val="0"/>
+        <w:widowControl/>
+        <w:tabs>
+          <w:tab w:val="right" w:leader="dot" w:pos="3360"/>
+        </w:tabs>
+        <w:kinsoku/>
+        <w:wordWrap/>
+        <w:overflowPunct/>
+        <w:topLinePunct w:val="0"/>
+        <w:autoSpaceDE/>
+        <w:autoSpaceDN/>
         <w:bidi w:val="0"/>
+        <w:adjustRightInd/>
+        <w:snapToGrid/>
         <w:spacing w:line="360" w:lineRule="auto"/>
-        <w:jc w:val="left"/>
-        <w:rPr>
-          <w:rFonts w:hint="default" w:ascii="Times New Roman" w:hAnsi="Times New Roman" w:cs="Times New Roman"/>
+        <w:textAlignment w:val="auto"/>
+        <w:rPr>
+          <w:rStyle w:val="14"/>
+          <w:rFonts w:hint="default" w:ascii="Times New Roman" w:hAnsi="Times New Roman" w:cs="Times New Roman"/>
+          <w:sz w:val="25"/>
           <w:szCs w:val="25"/>
           <w:lang w:val="en-US"/>
         </w:rPr>
       </w:pPr>
       <w:r>
         <w:rPr>
-          <w:rFonts w:hint="default" w:ascii="Times New Roman" w:hAnsi="Times New Roman" w:cs="Times New Roman"/>
-          <w:b/>
-          <w:bCs/>
+          <w:rStyle w:val="14"/>
+          <w:rFonts w:hint="default" w:ascii="Times New Roman" w:hAnsi="Times New Roman" w:cs="Times New Roman"/>
           <w:sz w:val="32"/>
           <w:szCs w:val="32"/>
           <w:lang w:val="en-US"/>
         </w:rPr>
-        <w:t>Part A: Introduction..................................................................</w:t>
-      </w:r>
-      <w:r>
-        <w:rPr>
-          <w:rFonts w:hint="default" w:ascii="Times New Roman" w:hAnsi="Times New Roman" w:cs="Times New Roman"/>
-          <w:b/>
-          <w:bCs/>
+        <w:t>Part B: Project Overview………………………………..……</w:t>
+      </w:r>
+      <w:r>
+        <w:rPr>
+          <w:rStyle w:val="14"/>
+          <w:rFonts w:hint="default" w:ascii="Times New Roman" w:hAnsi="Times New Roman" w:cs="Times New Roman"/>
           <w:sz w:val="25"/>
           <w:szCs w:val="25"/>
           <w:lang w:val="en-US"/>
@@ -1360,13 +1404,28 @@
     </w:p>
     <w:p>
       <w:pPr>
+        <w:keepNext w:val="0"/>
+        <w:keepLines w:val="0"/>
+        <w:pageBreakBefore w:val="0"/>
+        <w:widowControl/>
+        <w:tabs>
+          <w:tab w:val="right" w:leader="dot" w:pos="3360"/>
+        </w:tabs>
+        <w:kinsoku/>
+        <w:wordWrap/>
+        <w:overflowPunct/>
+        <w:topLinePunct w:val="0"/>
+        <w:autoSpaceDE/>
+        <w:autoSpaceDN/>
         <w:bidi w:val="0"/>
+        <w:adjustRightInd/>
+        <w:snapToGrid/>
         <w:spacing w:line="360" w:lineRule="auto"/>
-        <w:jc w:val="left"/>
-        <w:rPr>
-          <w:rFonts w:hint="default" w:ascii="Times New Roman" w:hAnsi="Times New Roman" w:cs="Times New Roman"/>
-          <w:b/>
-          <w:bCs/>
+        <w:ind w:left="400" w:leftChars="100" w:firstLine="0" w:firstLineChars="0"/>
+        <w:textAlignment w:val="auto"/>
+        <w:rPr>
+          <w:rStyle w:val="14"/>
+          <w:rFonts w:hint="default" w:ascii="Times New Roman" w:hAnsi="Times New Roman" w:cs="Times New Roman"/>
           <w:sz w:val="25"/>
           <w:szCs w:val="25"/>
           <w:lang w:val="en-US"/>
@@ -1374,25 +1433,112 @@
       </w:pPr>
       <w:r>
         <w:rPr>
-          <w:rFonts w:hint="default" w:ascii="Times New Roman" w:hAnsi="Times New Roman" w:cs="Times New Roman"/>
-          <w:b/>
-          <w:bCs/>
+          <w:rStyle w:val="14"/>
+          <w:rFonts w:hint="default" w:ascii="Times New Roman" w:hAnsi="Times New Roman" w:cs="Times New Roman"/>
+          <w:sz w:val="28"/>
+          <w:szCs w:val="28"/>
+          <w:lang w:val="en-US"/>
+        </w:rPr>
+        <w:t>2.1: Domain Vocabulary</w:t>
+      </w:r>
+      <w:r>
+        <w:rPr>
+          <w:rStyle w:val="14"/>
+          <w:rFonts w:hint="default" w:ascii="Times New Roman" w:hAnsi="Times New Roman" w:cs="Times New Roman"/>
           <w:sz w:val="32"/>
           <w:szCs w:val="32"/>
           <w:lang w:val="en-US"/>
         </w:rPr>
-        <w:t>Part B: Project Overview..........................................................</w:t>
-      </w:r>
-      <w:r>
-        <w:rPr>
-          <w:rFonts w:hint="default" w:ascii="Times New Roman" w:hAnsi="Times New Roman" w:cs="Times New Roman"/>
-          <w:b/>
-          <w:bCs/>
+        <w:t>………………………………………</w:t>
+      </w:r>
+      <w:r>
+        <w:rPr>
+          <w:rStyle w:val="14"/>
+          <w:rFonts w:hint="default" w:ascii="Times New Roman" w:hAnsi="Times New Roman" w:cs="Times New Roman"/>
           <w:sz w:val="25"/>
           <w:szCs w:val="25"/>
           <w:lang w:val="en-US"/>
         </w:rPr>
         <w:t>4</w:t>
+      </w:r>
+    </w:p>
+    <w:p>
+      <w:pPr>
+        <w:keepNext w:val="0"/>
+        <w:keepLines w:val="0"/>
+        <w:pageBreakBefore w:val="0"/>
+        <w:widowControl/>
+        <w:tabs>
+          <w:tab w:val="right" w:leader="dot" w:pos="3360"/>
+        </w:tabs>
+        <w:kinsoku/>
+        <w:wordWrap/>
+        <w:overflowPunct/>
+        <w:topLinePunct w:val="0"/>
+        <w:autoSpaceDE/>
+        <w:autoSpaceDN/>
+        <w:bidi w:val="0"/>
+        <w:adjustRightInd/>
+        <w:snapToGrid/>
+        <w:spacing w:line="360" w:lineRule="auto"/>
+        <w:ind w:left="400" w:leftChars="100" w:firstLine="0" w:firstLineChars="0"/>
+        <w:textAlignment w:val="auto"/>
+        <w:rPr>
+          <w:rFonts w:hint="default" w:ascii="Times New Roman" w:hAnsi="Times New Roman" w:cs="Times New Roman"/>
+          <w:b/>
+          <w:bCs/>
+          <w:sz w:val="25"/>
+          <w:szCs w:val="25"/>
+          <w:lang w:val="en-US"/>
+        </w:rPr>
+      </w:pPr>
+      <w:r>
+        <w:rPr>
+          <w:rStyle w:val="14"/>
+          <w:rFonts w:hint="default" w:ascii="Times New Roman" w:hAnsi="Times New Roman" w:cs="Times New Roman"/>
+          <w:sz w:val="28"/>
+          <w:szCs w:val="28"/>
+          <w:lang w:val="en-US"/>
+        </w:rPr>
+        <w:t>2.2: Project Goals</w:t>
+      </w:r>
+      <w:r>
+        <w:rPr>
+          <w:rStyle w:val="14"/>
+          <w:rFonts w:hint="default" w:ascii="Times New Roman" w:hAnsi="Times New Roman" w:cs="Times New Roman"/>
+          <w:sz w:val="32"/>
+          <w:szCs w:val="32"/>
+          <w:lang w:val="en-US"/>
+        </w:rPr>
+        <w:t>……………………………………………..</w:t>
+      </w:r>
+      <w:r>
+        <w:rPr>
+          <w:rStyle w:val="14"/>
+          <w:rFonts w:hint="default" w:ascii="Times New Roman" w:hAnsi="Times New Roman" w:cs="Times New Roman"/>
+          <w:sz w:val="25"/>
+          <w:szCs w:val="25"/>
+          <w:lang w:val="en-US"/>
+        </w:rPr>
+        <w:t>5</w:t>
+      </w:r>
+      <w:r>
+        <w:rPr>
+          <w:rFonts w:hint="default" w:ascii="Times New Roman" w:hAnsi="Times New Roman" w:cs="Times New Roman"/>
+        </w:rPr>
+        <w:fldChar w:fldCharType="begin"/>
+      </w:r>
+      <w:r>
+        <w:rPr>
+          <w:rFonts w:hint="default" w:ascii="Times New Roman" w:hAnsi="Times New Roman" w:cs="Times New Roman"/>
+        </w:rPr>
+        <w:instrText xml:space="preserve">TOC \o "1-3" \h \u </w:instrText>
+      </w:r>
+      <w:r>
+        <w:rPr>
+          <w:rFonts w:hint="default" w:ascii="Times New Roman" w:hAnsi="Times New Roman" w:cs="Times New Roman"/>
+        </w:rPr>
+        <w:fldChar w:fldCharType="separate"/>
       </w:r>
     </w:p>
     <w:p>
@@ -1400,33 +1546,183 @@
         <w:bidi w:val="0"/>
         <w:spacing w:line="360" w:lineRule="auto"/>
         <w:ind w:left="400" w:leftChars="100" w:firstLine="0" w:firstLineChars="0"/>
-        <w:jc w:val="left"/>
-        <w:rPr>
-          <w:rFonts w:hint="default" w:ascii="Times New Roman" w:hAnsi="Times New Roman" w:cs="Times New Roman"/>
-          <w:lang w:val="en-US"/>
-        </w:rPr>
-      </w:pPr>
-      <w:r>
-        <w:rPr>
-          <w:rFonts w:hint="default" w:ascii="Times New Roman" w:hAnsi="Times New Roman" w:cs="Times New Roman"/>
-          <w:b/>
-          <w:bCs/>
+        <w:rPr>
+          <w:rFonts w:hint="default" w:ascii="Times New Roman" w:hAnsi="Times New Roman" w:cs="Times New Roman"/>
+          <w:b/>
+          <w:bCs/>
+          <w:sz w:val="25"/>
+          <w:szCs w:val="25"/>
+          <w:lang w:val="en-US"/>
+        </w:rPr>
+      </w:pPr>
+      <w:r>
+        <w:rPr>
+          <w:rStyle w:val="14"/>
+          <w:rFonts w:hint="default" w:ascii="Times New Roman" w:hAnsi="Times New Roman" w:cs="Times New Roman"/>
           <w:sz w:val="28"/>
           <w:szCs w:val="28"/>
           <w:lang w:val="en-US"/>
         </w:rPr>
-        <w:t>2.1 Domain Vocabulary......................................................................</w:t>
-      </w:r>
-      <w:r>
-        <w:rPr>
-          <w:rFonts w:hint="default" w:ascii="Times New Roman" w:hAnsi="Times New Roman" w:cs="Times New Roman"/>
-          <w:b/>
-          <w:bCs/>
+        <w:t>2.3: Project Scope</w:t>
+      </w:r>
+      <w:r>
+        <w:rPr>
+          <w:rStyle w:val="14"/>
+          <w:rFonts w:hint="default" w:ascii="Times New Roman" w:hAnsi="Times New Roman" w:cs="Times New Roman"/>
+          <w:sz w:val="32"/>
+          <w:szCs w:val="32"/>
+          <w:lang w:val="en-US"/>
+        </w:rPr>
+        <w:t>……………………………………………..</w:t>
+      </w:r>
+      <w:r>
+        <w:rPr>
+          <w:rStyle w:val="14"/>
+          <w:rFonts w:hint="default" w:ascii="Times New Roman" w:hAnsi="Times New Roman" w:cs="Times New Roman"/>
           <w:sz w:val="25"/>
           <w:szCs w:val="25"/>
           <w:lang w:val="en-US"/>
         </w:rPr>
-        <w:t>4</w:t>
+        <w:t>6</w:t>
+      </w:r>
+    </w:p>
+    <w:p>
+      <w:pPr>
+        <w:bidi w:val="0"/>
+        <w:spacing w:line="360" w:lineRule="auto"/>
+        <w:ind w:left="800" w:leftChars="200" w:firstLine="0" w:firstLineChars="0"/>
+        <w:rPr>
+          <w:rFonts w:hint="default" w:ascii="Times New Roman" w:hAnsi="Times New Roman" w:cs="Times New Roman"/>
+          <w:b/>
+          <w:bCs/>
+          <w:sz w:val="25"/>
+          <w:szCs w:val="25"/>
+          <w:lang w:val="en-US"/>
+        </w:rPr>
+      </w:pPr>
+      <w:r>
+        <w:rPr>
+          <w:rStyle w:val="14"/>
+          <w:rFonts w:hint="default" w:ascii="Times New Roman" w:hAnsi="Times New Roman" w:cs="Times New Roman"/>
+          <w:sz w:val="28"/>
+          <w:szCs w:val="28"/>
+          <w:lang w:val="en-US"/>
+        </w:rPr>
+        <w:t>2.3.1 : In Scope</w:t>
+      </w:r>
+      <w:r>
+        <w:rPr>
+          <w:rStyle w:val="14"/>
+          <w:rFonts w:hint="default" w:ascii="Times New Roman" w:hAnsi="Times New Roman" w:cs="Times New Roman"/>
+          <w:sz w:val="32"/>
+          <w:szCs w:val="32"/>
+          <w:lang w:val="en-US"/>
+        </w:rPr>
+        <w:t>…………………………………………….</w:t>
+      </w:r>
+      <w:r>
+        <w:rPr>
+          <w:rStyle w:val="14"/>
+          <w:rFonts w:hint="default" w:ascii="Times New Roman" w:hAnsi="Times New Roman" w:cs="Times New Roman"/>
+          <w:sz w:val="25"/>
+          <w:szCs w:val="25"/>
+          <w:lang w:val="en-US"/>
+        </w:rPr>
+        <w:t>6</w:t>
+      </w:r>
+    </w:p>
+    <w:p>
+      <w:pPr>
+        <w:bidi w:val="0"/>
+        <w:spacing w:line="360" w:lineRule="auto"/>
+        <w:ind w:left="800" w:leftChars="200" w:firstLine="0" w:firstLineChars="0"/>
+        <w:rPr>
+          <w:rFonts w:hint="default" w:ascii="Times New Roman" w:hAnsi="Times New Roman" w:cs="Times New Roman"/>
+          <w:b/>
+          <w:bCs/>
+          <w:sz w:val="25"/>
+          <w:szCs w:val="25"/>
+          <w:lang w:val="en-US"/>
+        </w:rPr>
+      </w:pPr>
+      <w:r>
+        <w:rPr>
+          <w:rStyle w:val="14"/>
+          <w:rFonts w:hint="default" w:ascii="Times New Roman" w:hAnsi="Times New Roman" w:cs="Times New Roman"/>
+          <w:sz w:val="28"/>
+          <w:szCs w:val="28"/>
+          <w:lang w:val="en-US"/>
+        </w:rPr>
+        <w:t>2.3.1 : Out of  Scope</w:t>
+      </w:r>
+      <w:r>
+        <w:rPr>
+          <w:rStyle w:val="14"/>
+          <w:rFonts w:hint="default" w:ascii="Times New Roman" w:hAnsi="Times New Roman" w:cs="Times New Roman"/>
+          <w:sz w:val="32"/>
+          <w:szCs w:val="32"/>
+          <w:lang w:val="en-US"/>
+        </w:rPr>
+        <w:t>………………………………………..</w:t>
+      </w:r>
+      <w:r>
+        <w:rPr>
+          <w:rStyle w:val="14"/>
+          <w:rFonts w:hint="default" w:ascii="Times New Roman" w:hAnsi="Times New Roman" w:cs="Times New Roman"/>
+          <w:sz w:val="25"/>
+          <w:szCs w:val="25"/>
+          <w:lang w:val="en-US"/>
+        </w:rPr>
+        <w:t>6</w:t>
+      </w:r>
+    </w:p>
+    <w:p>
+      <w:pPr>
+        <w:keepNext w:val="0"/>
+        <w:keepLines w:val="0"/>
+        <w:pageBreakBefore w:val="0"/>
+        <w:widowControl/>
+        <w:tabs>
+          <w:tab w:val="right" w:leader="dot" w:pos="3360"/>
+        </w:tabs>
+        <w:kinsoku/>
+        <w:wordWrap/>
+        <w:overflowPunct/>
+        <w:topLinePunct w:val="0"/>
+        <w:autoSpaceDE/>
+        <w:autoSpaceDN/>
+        <w:bidi w:val="0"/>
+        <w:adjustRightInd/>
+        <w:snapToGrid/>
+        <w:spacing w:line="360" w:lineRule="auto"/>
+        <w:textAlignment w:val="auto"/>
+        <w:rPr>
+          <w:rStyle w:val="14"/>
+          <w:rFonts w:hint="default" w:ascii="Times New Roman" w:hAnsi="Times New Roman" w:cs="Times New Roman"/>
+          <w:sz w:val="25"/>
+          <w:szCs w:val="25"/>
+          <w:lang w:val="en-US"/>
+        </w:rPr>
+      </w:pPr>
+      <w:r>
+        <w:rPr>
+          <w:rStyle w:val="14"/>
+          <w:rFonts w:hint="default" w:ascii="Times New Roman" w:hAnsi="Times New Roman" w:cs="Times New Roman"/>
+          <w:sz w:val="32"/>
+          <w:szCs w:val="32"/>
+          <w:lang w:val="en-US"/>
+        </w:rPr>
+        <w:t>Part C: Problem Domain………………………………..…….</w:t>
+      </w:r>
+      <w:r>
+        <w:rPr>
+          <w:rStyle w:val="14"/>
+          <w:rFonts w:hint="default" w:ascii="Times New Roman" w:hAnsi="Times New Roman" w:cs="Times New Roman"/>
+          <w:sz w:val="25"/>
+          <w:szCs w:val="25"/>
+          <w:lang w:val="en-US"/>
+        </w:rPr>
+        <w:t>7</w:t>
       </w:r>
     </w:p>
     <w:p>
@@ -1434,7 +1730,6 @@
         <w:bidi w:val="0"/>
         <w:spacing w:line="360" w:lineRule="auto"/>
         <w:ind w:left="400" w:leftChars="100" w:firstLine="0" w:firstLineChars="0"/>
-        <w:jc w:val="left"/>
         <w:rPr>
           <w:rFonts w:hint="default" w:ascii="Times New Roman" w:hAnsi="Times New Roman" w:cs="Times New Roman"/>
           <w:b/>
@@ -1446,25 +1741,83 @@
       </w:pPr>
       <w:r>
         <w:rPr>
-          <w:rFonts w:hint="default" w:ascii="Times New Roman" w:hAnsi="Times New Roman" w:cs="Times New Roman"/>
-          <w:b/>
-          <w:bCs/>
+          <w:rStyle w:val="14"/>
+          <w:rFonts w:hint="default" w:ascii="Times New Roman" w:hAnsi="Times New Roman" w:cs="Times New Roman"/>
           <w:sz w:val="28"/>
           <w:szCs w:val="28"/>
           <w:lang w:val="en-US"/>
         </w:rPr>
-        <w:t>2.2 Project Goals.................................................................................</w:t>
-      </w:r>
-      <w:r>
-        <w:rPr>
-          <w:rFonts w:hint="default" w:ascii="Times New Roman" w:hAnsi="Times New Roman" w:cs="Times New Roman"/>
-          <w:b/>
-          <w:bCs/>
+        <w:t>3</w:t>
+      </w:r>
+      <w:r>
+        <w:rPr>
+          <w:rStyle w:val="14"/>
+          <w:rFonts w:hint="default" w:ascii="Times New Roman" w:hAnsi="Times New Roman" w:cs="Times New Roman"/>
+          <w:sz w:val="28"/>
+          <w:szCs w:val="28"/>
+          <w:lang w:val="en-US"/>
+        </w:rPr>
+        <w:t xml:space="preserve">.1: </w:t>
+      </w:r>
+      <w:r>
+        <w:rPr>
+          <w:rStyle w:val="14"/>
+          <w:rFonts w:hint="default" w:ascii="Times New Roman" w:hAnsi="Times New Roman" w:cs="Times New Roman"/>
+          <w:sz w:val="28"/>
+          <w:szCs w:val="28"/>
+          <w:lang w:val="en-US"/>
+        </w:rPr>
+        <w:t>Pain Points</w:t>
+      </w:r>
+      <w:r>
+        <w:rPr>
+          <w:rStyle w:val="14"/>
+          <w:rFonts w:hint="default" w:ascii="Times New Roman" w:hAnsi="Times New Roman" w:cs="Times New Roman"/>
+          <w:sz w:val="32"/>
+          <w:szCs w:val="32"/>
+          <w:lang w:val="en-US"/>
+        </w:rPr>
+        <w:t>…</w:t>
+      </w:r>
+      <w:r>
+        <w:rPr>
+          <w:rStyle w:val="14"/>
+          <w:rFonts w:hint="default" w:ascii="Times New Roman" w:hAnsi="Times New Roman" w:cs="Times New Roman"/>
+          <w:sz w:val="32"/>
+          <w:szCs w:val="32"/>
+          <w:lang w:val="en-US"/>
+        </w:rPr>
+        <w:t>...</w:t>
+      </w:r>
+      <w:r>
+        <w:rPr>
+          <w:rStyle w:val="14"/>
+          <w:rFonts w:hint="default" w:ascii="Times New Roman" w:hAnsi="Times New Roman" w:cs="Times New Roman"/>
+          <w:sz w:val="32"/>
+          <w:szCs w:val="32"/>
+          <w:lang w:val="en-US"/>
+        </w:rPr>
+        <w:t>…………………………………</w:t>
+      </w:r>
+      <w:r>
+        <w:rPr>
+          <w:rStyle w:val="14"/>
+          <w:rFonts w:hint="default" w:ascii="Times New Roman" w:hAnsi="Times New Roman" w:cs="Times New Roman"/>
+          <w:sz w:val="32"/>
+          <w:szCs w:val="32"/>
+          <w:lang w:val="en-US"/>
+        </w:rPr>
+        <w:t>..............</w:t>
+      </w:r>
+      <w:r>
+        <w:rPr>
+          <w:rStyle w:val="14"/>
+          <w:rFonts w:hint="default" w:ascii="Times New Roman" w:hAnsi="Times New Roman" w:cs="Times New Roman"/>
           <w:sz w:val="25"/>
           <w:szCs w:val="25"/>
           <w:lang w:val="en-US"/>
         </w:rPr>
-        <w:t>5</w:t>
+        <w:t>7</w:t>
       </w:r>
     </w:p>
     <w:p>
@@ -1472,7 +1825,6 @@
         <w:bidi w:val="0"/>
         <w:spacing w:line="360" w:lineRule="auto"/>
         <w:ind w:left="400" w:leftChars="100" w:firstLine="0" w:firstLineChars="0"/>
-        <w:jc w:val="left"/>
         <w:rPr>
           <w:rFonts w:hint="default" w:ascii="Times New Roman" w:hAnsi="Times New Roman" w:cs="Times New Roman"/>
           <w:b/>
@@ -1484,25 +1836,83 @@
       </w:pPr>
       <w:r>
         <w:rPr>
-          <w:rFonts w:hint="default" w:ascii="Times New Roman" w:hAnsi="Times New Roman" w:cs="Times New Roman"/>
-          <w:b/>
-          <w:bCs/>
+          <w:rStyle w:val="14"/>
+          <w:rFonts w:hint="default" w:ascii="Times New Roman" w:hAnsi="Times New Roman" w:cs="Times New Roman"/>
           <w:sz w:val="28"/>
           <w:szCs w:val="28"/>
           <w:lang w:val="en-US"/>
         </w:rPr>
-        <w:t>2.3 Assumptions...................................................................................</w:t>
-      </w:r>
-      <w:r>
-        <w:rPr>
-          <w:rFonts w:hint="default" w:ascii="Times New Roman" w:hAnsi="Times New Roman" w:cs="Times New Roman"/>
-          <w:b/>
-          <w:bCs/>
+        <w:t>3.</w:t>
+      </w:r>
+      <w:r>
+        <w:rPr>
+          <w:rStyle w:val="14"/>
+          <w:rFonts w:hint="default" w:ascii="Times New Roman" w:hAnsi="Times New Roman" w:cs="Times New Roman"/>
+          <w:sz w:val="28"/>
+          <w:szCs w:val="28"/>
+          <w:lang w:val="en-US"/>
+        </w:rPr>
+        <w:t>2</w:t>
+      </w:r>
+      <w:r>
+        <w:rPr>
+          <w:rStyle w:val="14"/>
+          <w:rFonts w:hint="default" w:ascii="Times New Roman" w:hAnsi="Times New Roman" w:cs="Times New Roman"/>
+          <w:sz w:val="28"/>
+          <w:szCs w:val="28"/>
+          <w:lang w:val="en-US"/>
+        </w:rPr>
+        <w:t xml:space="preserve">: </w:t>
+      </w:r>
+      <w:r>
+        <w:rPr>
+          <w:rStyle w:val="14"/>
+          <w:rFonts w:hint="default" w:ascii="Times New Roman" w:hAnsi="Times New Roman" w:cs="Times New Roman"/>
+          <w:sz w:val="28"/>
+          <w:szCs w:val="28"/>
+          <w:lang w:val="en-US"/>
+        </w:rPr>
+        <w:t>Domain Entities</w:t>
+      </w:r>
+      <w:r>
+        <w:rPr>
+          <w:rStyle w:val="14"/>
+          <w:rFonts w:hint="default" w:ascii="Times New Roman" w:hAnsi="Times New Roman" w:cs="Times New Roman"/>
+          <w:sz w:val="32"/>
+          <w:szCs w:val="32"/>
+          <w:lang w:val="en-US"/>
+        </w:rPr>
+        <w:t>…...………………………………….....</w:t>
+      </w:r>
+      <w:r>
+        <w:rPr>
+          <w:rStyle w:val="14"/>
+          <w:rFonts w:hint="default" w:ascii="Times New Roman" w:hAnsi="Times New Roman" w:cs="Times New Roman"/>
+          <w:sz w:val="32"/>
+          <w:szCs w:val="32"/>
+          <w:lang w:val="en-US"/>
+        </w:rPr>
+        <w:t>.</w:t>
+      </w:r>
+      <w:r>
+        <w:rPr>
+          <w:rStyle w:val="14"/>
+          <w:rFonts w:hint="default" w:ascii="Times New Roman" w:hAnsi="Times New Roman" w:cs="Times New Roman"/>
+          <w:sz w:val="32"/>
+          <w:szCs w:val="32"/>
+          <w:lang w:val="en-US"/>
+        </w:rPr>
+        <w:t>.</w:t>
+      </w:r>
+      <w:r>
+        <w:rPr>
+          <w:rStyle w:val="14"/>
+          <w:rFonts w:hint="default" w:ascii="Times New Roman" w:hAnsi="Times New Roman" w:cs="Times New Roman"/>
           <w:sz w:val="25"/>
           <w:szCs w:val="25"/>
           <w:lang w:val="en-US"/>
         </w:rPr>
-        <w:t>6</w:t>
+        <w:t>7</w:t>
       </w:r>
     </w:p>
     <w:p>
@@ -1510,7 +1920,6 @@
         <w:bidi w:val="0"/>
         <w:spacing w:line="360" w:lineRule="auto"/>
         <w:ind w:left="400" w:leftChars="100" w:firstLine="0" w:firstLineChars="0"/>
-        <w:jc w:val="left"/>
         <w:rPr>
           <w:rFonts w:hint="default" w:ascii="Times New Roman" w:hAnsi="Times New Roman" w:cs="Times New Roman"/>
           <w:b/>
@@ -1522,268 +1931,104 @@
       </w:pPr>
       <w:r>
         <w:rPr>
-          <w:rFonts w:hint="default" w:ascii="Times New Roman" w:hAnsi="Times New Roman" w:cs="Times New Roman"/>
-          <w:b/>
-          <w:bCs/>
+          <w:rStyle w:val="14"/>
+          <w:rFonts w:hint="default" w:ascii="Times New Roman" w:hAnsi="Times New Roman" w:cs="Times New Roman"/>
           <w:sz w:val="28"/>
           <w:szCs w:val="28"/>
           <w:lang w:val="en-US"/>
         </w:rPr>
-        <w:t xml:space="preserve">2.4 </w:t>
-      </w:r>
-      <w:r>
-        <w:rPr>
-          <w:rFonts w:hint="default" w:cs="Times New Roman"/>
-          <w:b/>
-          <w:bCs/>
+        <w:t>3.</w:t>
+      </w:r>
+      <w:r>
+        <w:rPr>
+          <w:rStyle w:val="14"/>
+          <w:rFonts w:hint="default" w:ascii="Times New Roman" w:hAnsi="Times New Roman" w:cs="Times New Roman"/>
           <w:sz w:val="28"/>
           <w:szCs w:val="28"/>
           <w:lang w:val="en-US"/>
         </w:rPr>
-        <w:t xml:space="preserve">Project </w:t>
-      </w:r>
-      <w:r>
-        <w:rPr>
-          <w:rFonts w:hint="default" w:ascii="Times New Roman" w:hAnsi="Times New Roman" w:cs="Times New Roman"/>
-          <w:b/>
-          <w:bCs/>
+        <w:t>3</w:t>
+      </w:r>
+      <w:r>
+        <w:rPr>
+          <w:rStyle w:val="14"/>
+          <w:rFonts w:hint="default" w:ascii="Times New Roman" w:hAnsi="Times New Roman" w:cs="Times New Roman"/>
           <w:sz w:val="28"/>
           <w:szCs w:val="28"/>
           <w:lang w:val="en-US"/>
         </w:rPr>
-        <w:t>Scope......................................................................</w:t>
-      </w:r>
-      <w:r>
-        <w:rPr>
-          <w:rFonts w:hint="default" w:cs="Times New Roman"/>
-          <w:b/>
-          <w:bCs/>
+        <w:t xml:space="preserve">: </w:t>
+      </w:r>
+      <w:r>
+        <w:rPr>
+          <w:rStyle w:val="14"/>
+          <w:rFonts w:hint="default" w:ascii="Times New Roman" w:hAnsi="Times New Roman" w:cs="Times New Roman"/>
           <w:sz w:val="28"/>
           <w:szCs w:val="28"/>
           <w:lang w:val="en-US"/>
         </w:rPr>
-        <w:t>...........</w:t>
-      </w:r>
-      <w:r>
-        <w:rPr>
-          <w:rFonts w:hint="default" w:ascii="Times New Roman" w:hAnsi="Times New Roman" w:cs="Times New Roman"/>
-          <w:b/>
-          <w:bCs/>
+        <w:t>Actors</w:t>
+      </w:r>
+      <w:r>
+        <w:rPr>
+          <w:rStyle w:val="14"/>
+          <w:rFonts w:hint="default" w:ascii="Times New Roman" w:hAnsi="Times New Roman" w:cs="Times New Roman"/>
+          <w:sz w:val="32"/>
+          <w:szCs w:val="32"/>
+          <w:lang w:val="en-US"/>
+        </w:rPr>
+        <w:t>…...…………</w:t>
+      </w:r>
+      <w:r>
+        <w:rPr>
+          <w:rStyle w:val="14"/>
+          <w:rFonts w:hint="default" w:ascii="Times New Roman" w:hAnsi="Times New Roman" w:cs="Times New Roman"/>
+          <w:sz w:val="32"/>
+          <w:szCs w:val="32"/>
+          <w:lang w:val="en-US"/>
+        </w:rPr>
+        <w:t>..............</w:t>
+      </w:r>
+      <w:r>
+        <w:rPr>
+          <w:rStyle w:val="14"/>
+          <w:rFonts w:hint="default" w:ascii="Times New Roman" w:hAnsi="Times New Roman" w:cs="Times New Roman"/>
+          <w:sz w:val="32"/>
+          <w:szCs w:val="32"/>
+          <w:lang w:val="en-US"/>
+        </w:rPr>
+        <w:t>……………………….....</w:t>
+      </w:r>
+      <w:r>
+        <w:rPr>
+          <w:rStyle w:val="14"/>
+          <w:rFonts w:hint="default" w:ascii="Times New Roman" w:hAnsi="Times New Roman" w:cs="Times New Roman"/>
+          <w:sz w:val="32"/>
+          <w:szCs w:val="32"/>
+          <w:lang w:val="en-US"/>
+        </w:rPr>
+        <w:t>.</w:t>
+      </w:r>
+      <w:r>
+        <w:rPr>
+          <w:rStyle w:val="14"/>
+          <w:rFonts w:hint="default" w:ascii="Times New Roman" w:hAnsi="Times New Roman" w:cs="Times New Roman"/>
+          <w:sz w:val="32"/>
+          <w:szCs w:val="32"/>
+          <w:lang w:val="en-US"/>
+        </w:rPr>
+        <w:t>.</w:t>
+      </w:r>
+      <w:r>
+        <w:rPr>
+          <w:rStyle w:val="14"/>
+          <w:rFonts w:hint="default" w:ascii="Times New Roman" w:hAnsi="Times New Roman" w:cs="Times New Roman"/>
           <w:sz w:val="25"/>
           <w:szCs w:val="25"/>
           <w:lang w:val="en-US"/>
         </w:rPr>
-        <w:t>6</w:t>
-      </w:r>
-    </w:p>
-    <w:p>
-      <w:pPr>
-        <w:bidi w:val="0"/>
-        <w:spacing w:line="360" w:lineRule="auto"/>
-        <w:ind w:left="800" w:leftChars="200" w:firstLine="0" w:firstLineChars="0"/>
-        <w:jc w:val="left"/>
-        <w:rPr>
-          <w:rFonts w:hint="default" w:ascii="Times New Roman" w:hAnsi="Times New Roman" w:cs="Times New Roman"/>
-          <w:b/>
-          <w:bCs/>
-          <w:sz w:val="25"/>
-          <w:szCs w:val="25"/>
-          <w:lang w:val="en-US"/>
-        </w:rPr>
-      </w:pPr>
-      <w:r>
-        <w:rPr>
-          <w:rFonts w:hint="default" w:ascii="Times New Roman" w:hAnsi="Times New Roman" w:cs="Times New Roman"/>
-          <w:b/>
-          <w:bCs/>
-          <w:sz w:val="25"/>
-          <w:szCs w:val="25"/>
-          <w:lang w:val="en-US"/>
-        </w:rPr>
-        <w:t>2.4</w:t>
-      </w:r>
-      <w:r>
-        <w:rPr>
-          <w:rFonts w:hint="default" w:cs="Times New Roman"/>
-          <w:b/>
-          <w:bCs/>
-          <w:sz w:val="25"/>
-          <w:szCs w:val="25"/>
-          <w:lang w:val="en-US"/>
-        </w:rPr>
-        <w:t>.1 In Scope</w:t>
-      </w:r>
-      <w:r>
-        <w:rPr>
-          <w:rFonts w:hint="default" w:ascii="Times New Roman" w:hAnsi="Times New Roman" w:cs="Times New Roman"/>
-          <w:b/>
-          <w:bCs/>
-          <w:sz w:val="25"/>
-          <w:szCs w:val="25"/>
-          <w:lang w:val="en-US"/>
-        </w:rPr>
-        <w:t>..........................................................................</w:t>
-      </w:r>
-      <w:r>
-        <w:rPr>
-          <w:rFonts w:hint="default" w:cs="Times New Roman"/>
-          <w:b/>
-          <w:bCs/>
-          <w:sz w:val="25"/>
-          <w:szCs w:val="25"/>
-          <w:lang w:val="en-US"/>
-        </w:rPr>
-        <w:t>....................6</w:t>
-      </w:r>
-    </w:p>
-    <w:p>
-      <w:pPr>
-        <w:bidi w:val="0"/>
-        <w:spacing w:line="360" w:lineRule="auto"/>
-        <w:ind w:left="800" w:leftChars="200" w:firstLine="0" w:firstLineChars="0"/>
-        <w:rPr>
-          <w:rFonts w:hint="default" w:cs="Times New Roman"/>
-          <w:b/>
-          <w:bCs/>
-          <w:sz w:val="25"/>
-          <w:szCs w:val="25"/>
-          <w:lang w:val="en-US"/>
-        </w:rPr>
-      </w:pPr>
-      <w:r>
-        <w:rPr>
-          <w:rFonts w:hint="default" w:ascii="Times New Roman" w:hAnsi="Times New Roman" w:cs="Times New Roman"/>
-          <w:b/>
-          <w:bCs/>
-          <w:sz w:val="25"/>
-          <w:szCs w:val="25"/>
-          <w:lang w:val="en-US"/>
-        </w:rPr>
-        <w:t>2.4</w:t>
-      </w:r>
-      <w:r>
-        <w:rPr>
-          <w:rFonts w:hint="default" w:cs="Times New Roman"/>
-          <w:b/>
-          <w:bCs/>
-          <w:sz w:val="25"/>
-          <w:szCs w:val="25"/>
-          <w:lang w:val="en-US"/>
-        </w:rPr>
-        <w:t>.2 Out of Scope</w:t>
-      </w:r>
-      <w:r>
-        <w:rPr>
-          <w:rFonts w:hint="default" w:ascii="Times New Roman" w:hAnsi="Times New Roman" w:cs="Times New Roman"/>
-          <w:b/>
-          <w:bCs/>
-          <w:sz w:val="25"/>
-          <w:szCs w:val="25"/>
-          <w:lang w:val="en-US"/>
-        </w:rPr>
-        <w:t>..........................................................................</w:t>
-      </w:r>
-      <w:r>
-        <w:rPr>
-          <w:rFonts w:hint="default" w:cs="Times New Roman"/>
-          <w:b/>
-          <w:bCs/>
-          <w:sz w:val="25"/>
-          <w:szCs w:val="25"/>
-          <w:lang w:val="en-US"/>
-        </w:rPr>
-        <w:t>.............6</w:t>
-      </w:r>
-    </w:p>
-    <w:p>
-      <w:pPr>
-        <w:bidi w:val="0"/>
-        <w:spacing w:line="360" w:lineRule="auto"/>
-        <w:ind w:left="400" w:leftChars="100" w:firstLine="0" w:firstLineChars="0"/>
-        <w:rPr>
-          <w:rFonts w:hint="default" w:ascii="Times New Roman" w:hAnsi="Times New Roman" w:cs="Times New Roman"/>
-          <w:b/>
-          <w:bCs/>
-          <w:sz w:val="25"/>
-          <w:szCs w:val="25"/>
-          <w:lang w:val="en-US"/>
-        </w:rPr>
-      </w:pPr>
-    </w:p>
-    <w:p>
-      <w:pPr>
-        <w:bidi w:val="0"/>
-        <w:spacing w:line="360" w:lineRule="auto"/>
-        <w:ind w:left="400" w:leftChars="100" w:firstLine="0" w:firstLineChars="0"/>
-        <w:rPr>
-          <w:rFonts w:hint="default" w:ascii="Times New Roman" w:hAnsi="Times New Roman" w:cs="Times New Roman"/>
-          <w:b/>
-          <w:bCs/>
-          <w:sz w:val="25"/>
-          <w:szCs w:val="25"/>
-          <w:lang w:val="en-US"/>
-        </w:rPr>
-      </w:pPr>
-    </w:p>
-    <w:p>
-      <w:pPr>
-        <w:bidi w:val="0"/>
-        <w:spacing w:line="360" w:lineRule="auto"/>
-        <w:ind w:left="400" w:leftChars="100" w:firstLine="0" w:firstLineChars="0"/>
-        <w:rPr>
-          <w:rFonts w:hint="default" w:ascii="Times New Roman" w:hAnsi="Times New Roman" w:cs="Times New Roman"/>
-          <w:b/>
-          <w:bCs/>
-          <w:sz w:val="25"/>
-          <w:szCs w:val="25"/>
-          <w:lang w:val="en-US"/>
-        </w:rPr>
-      </w:pPr>
-    </w:p>
-    <w:p>
-      <w:pPr>
-        <w:bidi w:val="0"/>
-        <w:spacing w:line="360" w:lineRule="auto"/>
-        <w:ind w:left="400" w:leftChars="100" w:firstLine="0" w:firstLineChars="0"/>
-        <w:rPr>
-          <w:rFonts w:hint="default" w:ascii="Times New Roman" w:hAnsi="Times New Roman" w:cs="Times New Roman"/>
-          <w:b/>
-          <w:bCs/>
-          <w:sz w:val="25"/>
-          <w:szCs w:val="25"/>
-          <w:lang w:val="en-US"/>
-        </w:rPr>
-      </w:pPr>
-    </w:p>
-    <w:p>
-      <w:pPr>
-        <w:bidi w:val="0"/>
-        <w:spacing w:line="360" w:lineRule="auto"/>
-        <w:ind w:left="400" w:leftChars="100" w:firstLine="0" w:firstLineChars="0"/>
-        <w:rPr>
-          <w:rFonts w:hint="default" w:ascii="Times New Roman" w:hAnsi="Times New Roman" w:cs="Times New Roman"/>
-          <w:b/>
-          <w:bCs/>
-          <w:sz w:val="25"/>
-          <w:szCs w:val="25"/>
-          <w:lang w:val="en-US"/>
-        </w:rPr>
-      </w:pPr>
-    </w:p>
-    <w:p>
-      <w:pPr>
-        <w:bidi w:val="0"/>
-        <w:spacing w:line="360" w:lineRule="auto"/>
-        <w:ind w:left="400" w:leftChars="100" w:firstLine="0" w:firstLineChars="0"/>
-        <w:rPr>
-          <w:rFonts w:hint="default" w:ascii="Times New Roman" w:hAnsi="Times New Roman" w:cs="Times New Roman"/>
-          <w:b/>
-          <w:bCs/>
-          <w:sz w:val="25"/>
-          <w:szCs w:val="25"/>
-          <w:lang w:val="en-US"/>
-        </w:rPr>
-      </w:pPr>
+        <w:t>8</w:t>
+      </w:r>
     </w:p>
     <w:p>
       <w:pPr>
@@ -2249,7 +2494,7 @@
       </w:r>
       <w:r>
         <w:rPr>
-          <w:rFonts w:hint="default" w:cs="Times New Roman"/>
+          <w:rFonts w:hint="default" w:ascii="Times New Roman" w:hAnsi="Times New Roman" w:cs="Times New Roman"/>
           <w:i w:val="0"/>
           <w:iCs w:val="0"/>
           <w:color w:val="000000"/>
@@ -2350,7 +2595,7 @@
       </w:pPr>
       <w:r>
         <w:rPr>
-          <w:rFonts w:hint="default" w:cs="Times New Roman"/>
+          <w:rFonts w:hint="default" w:ascii="Times New Roman" w:hAnsi="Times New Roman" w:cs="Times New Roman"/>
           <w:b w:val="0"/>
           <w:bCs w:val="0"/>
           <w:i w:val="0"/>
@@ -2581,7 +2826,7 @@
       </w:r>
       <w:r>
         <w:rPr>
-          <w:rFonts w:hint="default" w:cs="Times New Roman"/>
+          <w:rFonts w:hint="default" w:ascii="Times New Roman" w:hAnsi="Times New Roman" w:cs="Times New Roman"/>
           <w:sz w:val="24"/>
           <w:szCs w:val="24"/>
           <w:lang w:val="en-US"/>
@@ -3455,7 +3700,7 @@
       </w:r>
       <w:r>
         <w:rPr>
-          <w:rFonts w:hint="default" w:cs="Times New Roman"/>
+          <w:rFonts w:hint="default" w:ascii="Times New Roman" w:hAnsi="Times New Roman" w:cs="Times New Roman"/>
           <w:sz w:val="25"/>
           <w:szCs w:val="25"/>
           <w:lang w:val="en-US"/>
@@ -3472,7 +3717,7 @@
       </w:r>
       <w:r>
         <w:rPr>
-          <w:rFonts w:hint="default" w:cs="Times New Roman"/>
+          <w:rFonts w:hint="default" w:ascii="Times New Roman" w:hAnsi="Times New Roman" w:cs="Times New Roman"/>
           <w:sz w:val="25"/>
           <w:szCs w:val="25"/>
           <w:lang w:val="en-US"/>
@@ -3577,7 +3822,7 @@
       </w:r>
       <w:r>
         <w:rPr>
-          <w:rFonts w:hint="default" w:cs="Times New Roman"/>
+          <w:rFonts w:hint="default" w:ascii="Times New Roman" w:hAnsi="Times New Roman" w:cs="Times New Roman"/>
           <w:b w:val="0"/>
           <w:bCs w:val="0"/>
           <w:sz w:val="25"/>
@@ -3598,7 +3843,7 @@
       </w:r>
       <w:r>
         <w:rPr>
-          <w:rFonts w:hint="default" w:cs="Times New Roman"/>
+          <w:rFonts w:hint="default" w:ascii="Times New Roman" w:hAnsi="Times New Roman" w:cs="Times New Roman"/>
           <w:b w:val="0"/>
           <w:bCs w:val="0"/>
           <w:sz w:val="25"/>
@@ -3619,7 +3864,7 @@
       </w:r>
       <w:r>
         <w:rPr>
-          <w:rFonts w:hint="default" w:cs="Times New Roman"/>
+          <w:rFonts w:hint="default" w:ascii="Times New Roman" w:hAnsi="Times New Roman" w:cs="Times New Roman"/>
           <w:b w:val="0"/>
           <w:bCs w:val="0"/>
           <w:sz w:val="25"/>
@@ -3761,7 +4006,7 @@
       </w:r>
       <w:r>
         <w:rPr>
-          <w:rFonts w:hint="default" w:cs="Times New Roman"/>
+          <w:rFonts w:hint="default" w:ascii="Times New Roman" w:hAnsi="Times New Roman" w:cs="Times New Roman"/>
           <w:lang w:val="en-US"/>
         </w:rPr>
         <w:t xml:space="preserve">Project </w:t>
@@ -3820,13 +4065,13 @@
         <w:spacing w:line="240" w:lineRule="auto"/>
         <w:ind w:left="800" w:leftChars="200" w:firstLine="0" w:firstLineChars="0"/>
         <w:rPr>
-          <w:rFonts w:hint="default"/>
-          <w:lang w:val="en-US"/>
-        </w:rPr>
-      </w:pPr>
-      <w:r>
-        <w:rPr>
-          <w:rFonts w:hint="default"/>
+          <w:rFonts w:hint="default" w:ascii="Times New Roman" w:hAnsi="Times New Roman" w:cs="Times New Roman"/>
+          <w:lang w:val="en-US"/>
+        </w:rPr>
+      </w:pPr>
+      <w:r>
+        <w:rPr>
+          <w:rFonts w:hint="default" w:ascii="Times New Roman" w:hAnsi="Times New Roman" w:cs="Times New Roman"/>
           <w:lang w:val="en-US"/>
         </w:rPr>
         <w:t>2.4.1 In Scope</w:t>
@@ -3849,25 +4094,35 @@
         <w:spacing w:line="240" w:lineRule="auto"/>
         <w:ind w:left="1600" w:leftChars="0" w:right="0" w:rightChars="0" w:hanging="420" w:firstLineChars="0"/>
         <w:jc w:val="both"/>
-      </w:pPr>
-      <w:r>
-        <w:rPr>
+        <w:rPr>
+          <w:rFonts w:hint="default" w:ascii="Times New Roman" w:hAnsi="Times New Roman" w:cs="Times New Roman"/>
+        </w:rPr>
+      </w:pPr>
+      <w:r>
+        <w:rPr>
+          <w:rFonts w:hint="default" w:ascii="Times New Roman" w:hAnsi="Times New Roman" w:cs="Times New Roman"/>
           <w:b/>
           <w:bCs/>
         </w:rPr>
         <w:t>Secure Customer Web Portals:</w:t>
       </w:r>
       <w:r>
+        <w:rPr>
+          <w:rFonts w:hint="default" w:ascii="Times New Roman" w:hAnsi="Times New Roman" w:cs="Times New Roman"/>
+        </w:rPr>
         <w:t xml:space="preserve"> Architecture and deployment of a secure</w:t>
       </w:r>
       <w:r>
         <w:rPr>
-          <w:rFonts w:hint="default"/>
+          <w:rFonts w:hint="default" w:ascii="Times New Roman" w:hAnsi="Times New Roman" w:cs="Times New Roman"/>
           <w:lang w:val="en-US"/>
         </w:rPr>
         <w:t xml:space="preserve"> </w:t>
       </w:r>
       <w:r>
+        <w:rPr>
+          <w:rFonts w:hint="default" w:ascii="Times New Roman" w:hAnsi="Times New Roman" w:cs="Times New Roman"/>
+        </w:rPr>
         <w:t>web portal enabling clients to authenticate, manage corporate profiles, place cargo orders, and view real-time shipping manifests.</w:t>
       </w:r>
     </w:p>
@@ -3888,15 +4143,22 @@
         <w:spacing w:line="240" w:lineRule="auto"/>
         <w:ind w:left="1600" w:leftChars="0" w:right="0" w:rightChars="0" w:hanging="420" w:firstLineChars="0"/>
         <w:jc w:val="both"/>
-      </w:pPr>
-      <w:r>
-        <w:rPr>
+        <w:rPr>
+          <w:rFonts w:hint="default" w:ascii="Times New Roman" w:hAnsi="Times New Roman" w:cs="Times New Roman"/>
+        </w:rPr>
+      </w:pPr>
+      <w:r>
+        <w:rPr>
+          <w:rFonts w:hint="default" w:ascii="Times New Roman" w:hAnsi="Times New Roman" w:cs="Times New Roman"/>
           <w:b/>
           <w:bCs/>
         </w:rPr>
         <w:t>Mobile Cargo Tracking Interfaces:</w:t>
       </w:r>
       <w:r>
+        <w:rPr>
+          <w:rFonts w:hint="default" w:ascii="Times New Roman" w:hAnsi="Times New Roman" w:cs="Times New Roman"/>
+        </w:rPr>
         <w:t xml:space="preserve"> Design of cross-platform mobile interfaces engineered to process and render continuous telemetry data, allowing users to track consignment locations and estimated times of arrival (ETA).</w:t>
       </w:r>
     </w:p>
@@ -3917,9 +4179,13 @@
         <w:spacing w:line="240" w:lineRule="auto"/>
         <w:ind w:left="1600" w:leftChars="0" w:right="0" w:rightChars="0" w:hanging="420" w:firstLineChars="0"/>
         <w:jc w:val="both"/>
-      </w:pPr>
-      <w:r>
-        <w:rPr>
+        <w:rPr>
+          <w:rFonts w:hint="default" w:ascii="Times New Roman" w:hAnsi="Times New Roman" w:cs="Times New Roman"/>
+        </w:rPr>
+      </w:pPr>
+      <w:r>
+        <w:rPr>
+          <w:rFonts w:hint="default" w:ascii="Times New Roman" w:hAnsi="Times New Roman" w:cs="Times New Roman"/>
           <w:b/>
           <w:bCs/>
         </w:rPr>
@@ -3927,7 +4193,7 @@
       </w:r>
       <w:r>
         <w:rPr>
-          <w:rFonts w:hint="default"/>
+          <w:rFonts w:hint="default" w:ascii="Times New Roman" w:hAnsi="Times New Roman" w:cs="Times New Roman"/>
           <w:b/>
           <w:bCs/>
           <w:lang w:val="en-US"/>
@@ -3936,24 +4202,29 @@
       </w:r>
       <w:r>
         <w:rPr>
+          <w:rFonts w:hint="default" w:ascii="Times New Roman" w:hAnsi="Times New Roman" w:cs="Times New Roman"/>
           <w:b/>
           <w:bCs/>
         </w:rPr>
         <w:t>Assignment Dashboards:</w:t>
       </w:r>
       <w:r>
+        <w:rPr>
+          <w:rFonts w:hint="default" w:ascii="Times New Roman" w:hAnsi="Times New Roman" w:cs="Times New Roman"/>
+        </w:rPr>
         <w:t xml:space="preserve"> Implementation of a centralized, high-concurrency dashboard </w:t>
       </w:r>
       <w:r>
         <w:rPr>
-          <w:rFonts w:hint="default"/>
+          <w:rFonts w:hint="default" w:ascii="Times New Roman" w:hAnsi="Times New Roman" w:cs="Times New Roman"/>
           <w:lang w:val="en-US"/>
         </w:rPr>
         <w:t xml:space="preserve">with role-based access </w:t>
       </w:r>
-      <w:bookmarkStart w:id="0" w:name="_GoBack"/>
-      <w:bookmarkEnd w:id="0"/>
-      <w:r>
+      <w:r>
+        <w:rPr>
+          <w:rFonts w:hint="default" w:ascii="Times New Roman" w:hAnsi="Times New Roman" w:cs="Times New Roman"/>
+        </w:rPr>
         <w:t>for dispatchers to dynamically allocate fleet resources, assign drivers, and optimize regional transit routes.</w:t>
       </w:r>
     </w:p>
@@ -3974,15 +4245,22 @@
         <w:spacing w:line="240" w:lineRule="auto"/>
         <w:ind w:left="1600" w:leftChars="0" w:right="0" w:rightChars="0" w:hanging="420" w:firstLineChars="0"/>
         <w:jc w:val="both"/>
-      </w:pPr>
-      <w:r>
-        <w:rPr>
+        <w:rPr>
+          <w:rFonts w:hint="default" w:ascii="Times New Roman" w:hAnsi="Times New Roman" w:cs="Times New Roman"/>
+        </w:rPr>
+      </w:pPr>
+      <w:r>
+        <w:rPr>
+          <w:rFonts w:hint="default" w:ascii="Times New Roman" w:hAnsi="Times New Roman" w:cs="Times New Roman"/>
           <w:b/>
           <w:bCs/>
         </w:rPr>
         <w:t>Automated Invoicing Systems:</w:t>
       </w:r>
       <w:r>
+        <w:rPr>
+          <w:rFonts w:hint="default" w:ascii="Times New Roman" w:hAnsi="Times New Roman" w:cs="Times New Roman"/>
+        </w:rPr>
         <w:t xml:space="preserve"> Development of a backend billing engine that automatically aggregates trip data, calculates tariffs, generates digital invoices, and tracks payment statuses.</w:t>
       </w:r>
     </w:p>
@@ -4003,15 +4281,22 @@
         <w:spacing w:line="240" w:lineRule="auto"/>
         <w:ind w:left="1600" w:leftChars="0" w:right="0" w:rightChars="0" w:hanging="420" w:firstLineChars="0"/>
         <w:jc w:val="both"/>
-      </w:pPr>
-      <w:r>
-        <w:rPr>
+        <w:rPr>
+          <w:rFonts w:hint="default" w:ascii="Times New Roman" w:hAnsi="Times New Roman" w:cs="Times New Roman"/>
+        </w:rPr>
+      </w:pPr>
+      <w:r>
+        <w:rPr>
+          <w:rFonts w:hint="default" w:ascii="Times New Roman" w:hAnsi="Times New Roman" w:cs="Times New Roman"/>
           <w:b/>
           <w:bCs/>
         </w:rPr>
         <w:t>Regional Analytics Engines:</w:t>
       </w:r>
       <w:r>
+        <w:rPr>
+          <w:rFonts w:hint="default" w:ascii="Times New Roman" w:hAnsi="Times New Roman" w:cs="Times New Roman"/>
+        </w:rPr>
         <w:t xml:space="preserve"> Design of a data-processing pipeline capable of aggregating regional operational metrics to generate reports on fleet efficiency, delivery delays, and resource utilization.</w:t>
       </w:r>
     </w:p>
@@ -4022,13 +4307,13 @@
         <w:spacing w:line="240" w:lineRule="auto"/>
         <w:ind w:left="800" w:leftChars="200" w:firstLine="0" w:firstLineChars="0"/>
         <w:rPr>
-          <w:rFonts w:hint="default"/>
-          <w:lang w:val="en-US"/>
-        </w:rPr>
-      </w:pPr>
-      <w:r>
-        <w:rPr>
-          <w:rFonts w:hint="default"/>
+          <w:rFonts w:hint="default" w:ascii="Times New Roman" w:hAnsi="Times New Roman" w:cs="Times New Roman"/>
+          <w:lang w:val="en-US"/>
+        </w:rPr>
+      </w:pPr>
+      <w:r>
+        <w:rPr>
+          <w:rFonts w:hint="default" w:ascii="Times New Roman" w:hAnsi="Times New Roman" w:cs="Times New Roman"/>
           <w:lang w:val="en-US"/>
         </w:rPr>
         <w:t>2.4.2 Out of Scope</w:t>
@@ -4050,9 +4335,13 @@
         </w:tabs>
         <w:ind w:left="1600" w:leftChars="0" w:hanging="420" w:firstLineChars="0"/>
         <w:jc w:val="both"/>
-      </w:pPr>
-      <w:r>
-        <w:rPr>
+        <w:rPr>
+          <w:rFonts w:hint="default" w:ascii="Times New Roman" w:hAnsi="Times New Roman" w:cs="Times New Roman"/>
+        </w:rPr>
+      </w:pPr>
+      <w:r>
+        <w:rPr>
+          <w:rFonts w:hint="default" w:ascii="Times New Roman" w:hAnsi="Times New Roman" w:cs="Times New Roman"/>
           <w:b/>
           <w:bCs/>
         </w:rPr>
@@ -4060,7 +4349,7 @@
       </w:r>
       <w:r>
         <w:rPr>
-          <w:rFonts w:hint="default"/>
+          <w:rFonts w:hint="default" w:ascii="Times New Roman" w:hAnsi="Times New Roman" w:cs="Times New Roman"/>
           <w:b/>
           <w:bCs/>
           <w:lang w:val="en-US"/>
@@ -4069,12 +4358,16 @@
       </w:r>
       <w:r>
         <w:rPr>
+          <w:rFonts w:hint="default" w:ascii="Times New Roman" w:hAnsi="Times New Roman" w:cs="Times New Roman"/>
           <w:b/>
           <w:bCs/>
         </w:rPr>
         <w:t xml:space="preserve"> Manufacturing:</w:t>
       </w:r>
       <w:r>
+        <w:rPr>
+          <w:rFonts w:hint="default" w:ascii="Times New Roman" w:hAnsi="Times New Roman" w:cs="Times New Roman"/>
+        </w:rPr>
         <w:t xml:space="preserve"> Procurement, manufacturing, or low-level firmware engineering of physical GPS tracking hardware modules or telematics equipment.</w:t>
       </w:r>
     </w:p>
@@ -4094,15 +4387,22 @@
         </w:tabs>
         <w:ind w:left="1600" w:leftChars="0" w:hanging="420" w:firstLineChars="0"/>
         <w:jc w:val="both"/>
-      </w:pPr>
-      <w:r>
-        <w:rPr>
+        <w:rPr>
+          <w:rFonts w:hint="default" w:ascii="Times New Roman" w:hAnsi="Times New Roman" w:cs="Times New Roman"/>
+        </w:rPr>
+      </w:pPr>
+      <w:r>
+        <w:rPr>
+          <w:rFonts w:hint="default" w:ascii="Times New Roman" w:hAnsi="Times New Roman" w:cs="Times New Roman"/>
           <w:b/>
           <w:bCs/>
         </w:rPr>
         <w:t>Telecommunications Infrastructure:</w:t>
       </w:r>
       <w:r>
+        <w:rPr>
+          <w:rFonts w:hint="default" w:ascii="Times New Roman" w:hAnsi="Times New Roman" w:cs="Times New Roman"/>
+        </w:rPr>
         <w:t xml:space="preserve"> Maintenance, configuration, or operational management of cellular provider towers, cellular networks, or base stations.</w:t>
       </w:r>
     </w:p>
@@ -4122,28 +4422,81 @@
         </w:tabs>
         <w:ind w:left="1600" w:leftChars="0" w:hanging="420" w:firstLineChars="0"/>
         <w:jc w:val="both"/>
-      </w:pPr>
-      <w:r>
-        <w:rPr>
+        <w:rPr>
+          <w:rFonts w:hint="default" w:ascii="Times New Roman" w:hAnsi="Times New Roman" w:cs="Times New Roman"/>
+        </w:rPr>
+      </w:pPr>
+      <w:r>
+        <w:rPr>
+          <w:rFonts w:hint="default" w:ascii="Times New Roman" w:hAnsi="Times New Roman" w:cs="Times New Roman"/>
           <w:b/>
           <w:bCs/>
         </w:rPr>
         <w:t>Direct Financial Clearing Networks:</w:t>
       </w:r>
       <w:r>
+        <w:rPr>
+          <w:rFonts w:hint="default" w:ascii="Times New Roman" w:hAnsi="Times New Roman" w:cs="Times New Roman"/>
+        </w:rPr>
         <w:t xml:space="preserve"> Development of localized transaction-clearing software, banking ledger infrastructure, or direct credit card processing networks (relying instead on external third-party payment gateways).</w:t>
       </w:r>
     </w:p>
     <w:p>
       <w:pPr>
-        <w:rPr>
-          <w:rFonts w:hint="default"/>
-          <w:lang w:val="en-US"/>
-        </w:rPr>
-      </w:pPr>
-    </w:p>
-    <w:p>
-      <w:pPr>
+        <w:pStyle w:val="2"/>
+        <w:bidi w:val="0"/>
+        <w:rPr>
+          <w:rFonts w:hint="default" w:ascii="Times New Roman" w:hAnsi="Times New Roman" w:cs="Times New Roman"/>
+          <w:lang w:val="en-US"/>
+        </w:rPr>
+      </w:pPr>
+      <w:r>
+        <w:rPr>
+          <w:rFonts w:hint="default" w:ascii="Times New Roman" w:hAnsi="Times New Roman" w:cs="Times New Roman"/>
+          <w:lang w:val="en-US"/>
+        </w:rPr>
+        <w:t>Part C: Problem Domain</w:t>
+      </w:r>
+    </w:p>
+    <w:p>
+      <w:pPr>
+        <w:spacing w:line="240" w:lineRule="auto"/>
+        <w:jc w:val="both"/>
+        <w:rPr>
+          <w:rFonts w:hint="default" w:ascii="Times New Roman" w:hAnsi="Times New Roman" w:cs="Times New Roman"/>
+          <w:b w:val="0"/>
+          <w:bCs w:val="0"/>
+          <w:sz w:val="24"/>
+          <w:szCs w:val="24"/>
+          <w:lang w:val="en-US"/>
+        </w:rPr>
+      </w:pPr>
+      <w:r>
+        <w:rPr>
+          <w:rFonts w:hint="default" w:ascii="Times New Roman" w:hAnsi="Times New Roman" w:eastAsia="SimSun" w:cs="Times New Roman"/>
+          <w:b w:val="0"/>
+          <w:bCs w:val="0"/>
+          <w:sz w:val="24"/>
+          <w:szCs w:val="24"/>
+        </w:rPr>
+        <w:t>The Problem Domain section indicates the operational realities of ABC-Trans and translates them into rigorous software engineering requirements by systematically analyzing the structural bottlenecks and data synchronization vulnerabilities inherent in the legacy systems. In addition, this part highlights the Task and Support framework to explicitly map core user-driven workflows against advanced architectural mechanisms, thereby suggesting robust solutions for real-time high concurrency, data integrity, and cross-branch synchronization across the newly unified enterprise ecosystem</w:t>
+      </w:r>
+      <w:r>
+        <w:rPr>
+          <w:rFonts w:hint="default" w:ascii="Times New Roman" w:hAnsi="Times New Roman" w:eastAsia="SimSun" w:cs="Times New Roman"/>
+          <w:b w:val="0"/>
+          <w:bCs w:val="0"/>
+          <w:sz w:val="24"/>
+          <w:szCs w:val="24"/>
+          <w:lang w:val="en-US"/>
+        </w:rPr>
+        <w:t>.</w:t>
+      </w:r>
+    </w:p>
+    <w:p>
+      <w:pPr>
+        <w:pStyle w:val="3"/>
+        <w:bidi w:val="0"/>
         <w:spacing w:line="240" w:lineRule="auto"/>
         <w:ind w:left="400" w:leftChars="100" w:firstLine="0" w:firstLineChars="0"/>
         <w:rPr>
@@ -4151,90 +4504,2263 @@
           <w:lang w:val="en-US"/>
         </w:rPr>
       </w:pPr>
-    </w:p>
-    <w:p>
-      <w:pPr>
-        <w:numPr>
-          <w:ilvl w:val="0"/>
+      <w:r>
+        <w:rPr>
+          <w:rFonts w:hint="default" w:ascii="Times New Roman" w:hAnsi="Times New Roman" w:cs="Times New Roman"/>
+        </w:rPr>
+        <w:fldChar w:fldCharType="end"/>
+      </w:r>
+      <w:r>
+        <w:rPr>
+          <w:rFonts w:hint="default" w:ascii="Times New Roman" w:hAnsi="Times New Roman" w:cs="Times New Roman"/>
+          <w:lang w:val="en-US"/>
+        </w:rPr>
+        <w:t>3</w:t>
+      </w:r>
+      <w:r>
+        <w:rPr>
+          <w:rFonts w:hint="default" w:ascii="Times New Roman" w:hAnsi="Times New Roman" w:cs="Times New Roman"/>
+          <w:lang w:val="en-US"/>
+        </w:rPr>
+        <w:t xml:space="preserve">.1 </w:t>
+      </w:r>
+      <w:r>
+        <w:rPr>
+          <w:rFonts w:hint="default" w:ascii="Times New Roman" w:hAnsi="Times New Roman" w:cs="Times New Roman"/>
+          <w:lang w:val="en-US"/>
+        </w:rPr>
+        <w:t>Pain Points</w:t>
+      </w:r>
+    </w:p>
+    <w:p>
+      <w:pPr>
+        <w:numPr>
+          <w:ilvl w:val="0"/>
+          <w:numId w:val="4"/>
+        </w:numPr>
+        <w:tabs>
+          <w:tab w:val="clear" w:pos="420"/>
+        </w:tabs>
+        <w:ind w:left="1200" w:leftChars="0" w:hanging="420" w:firstLineChars="0"/>
+        <w:jc w:val="both"/>
+        <w:rPr>
+          <w:rFonts w:hint="default" w:ascii="Times New Roman" w:hAnsi="Times New Roman" w:cs="Times New Roman"/>
+          <w:b w:val="0"/>
+          <w:bCs w:val="0"/>
+          <w:lang w:val="en-US"/>
+        </w:rPr>
+      </w:pPr>
+      <w:r>
+        <w:rPr>
+          <w:rFonts w:hint="default" w:ascii="Times New Roman" w:hAnsi="Times New Roman" w:cs="Times New Roman"/>
+          <w:b w:val="0"/>
+          <w:bCs w:val="0"/>
+          <w:sz w:val="25"/>
+          <w:szCs w:val="25"/>
+          <w:lang w:val="en-US"/>
+        </w:rPr>
+        <w:t xml:space="preserve">Operational Fragmentation: ABC-Trans lacks extreme efficiency </w:t>
+      </w:r>
+      <w:r>
+        <w:rPr>
+          <w:rFonts w:hint="default" w:ascii="Times New Roman" w:hAnsi="Times New Roman" w:cs="Times New Roman"/>
+          <w:b w:val="0"/>
+          <w:bCs w:val="0"/>
+          <w:sz w:val="25"/>
+          <w:szCs w:val="25"/>
+          <w:lang w:val="en-US"/>
+        </w:rPr>
+        <w:t xml:space="preserve">during daily working operations because of </w:t>
+      </w:r>
+      <w:r>
+        <w:rPr>
+          <w:rFonts w:hint="default" w:ascii="Times New Roman" w:hAnsi="Times New Roman" w:eastAsia="SimSun" w:cs="Times New Roman"/>
+          <w:b w:val="0"/>
+          <w:bCs w:val="0"/>
+          <w:sz w:val="24"/>
+          <w:szCs w:val="24"/>
+        </w:rPr>
+        <w:t>a heavy reliance on physical paperwork, slow manual data entry, and the absence of a unified system to connect online orders with in-branch workflows.</w:t>
+      </w:r>
+    </w:p>
+    <w:p>
+      <w:pPr>
+        <w:numPr>
+          <w:ilvl w:val="0"/>
+          <w:numId w:val="4"/>
+        </w:numPr>
+        <w:tabs>
+          <w:tab w:val="clear" w:pos="420"/>
+        </w:tabs>
+        <w:ind w:left="1200" w:leftChars="0" w:hanging="420" w:firstLineChars="0"/>
+        <w:jc w:val="both"/>
+        <w:rPr>
+          <w:rFonts w:hint="default" w:ascii="Times New Roman" w:hAnsi="Times New Roman" w:cs="Times New Roman"/>
+          <w:b w:val="0"/>
+          <w:bCs w:val="0"/>
+        </w:rPr>
+      </w:pPr>
+      <w:r>
+        <w:rPr>
+          <w:rFonts w:hint="default" w:ascii="Times New Roman" w:hAnsi="Times New Roman" w:eastAsia="SimSun" w:cs="Times New Roman"/>
+          <w:b w:val="0"/>
+          <w:bCs w:val="0"/>
+          <w:sz w:val="24"/>
+          <w:szCs w:val="24"/>
+          <w:lang w:val="en-US"/>
+        </w:rPr>
+        <w:t xml:space="preserve">Lack of Branch </w:t>
+      </w:r>
+      <w:r>
+        <w:rPr>
+          <w:rFonts w:hint="default" w:ascii="Times New Roman" w:hAnsi="Times New Roman" w:eastAsia="SimSun" w:cs="Times New Roman"/>
+          <w:b w:val="0"/>
+          <w:bCs w:val="0"/>
+          <w:sz w:val="24"/>
+          <w:szCs w:val="24"/>
+        </w:rPr>
+        <w:t>Synchronization: The reliance on isolated regional branch software and local databases leaves systems disconnected, trapping vehicle logs, driver assignments, and customer orders in individual silos without company-wide sharing.</w:t>
+      </w:r>
+    </w:p>
+    <w:p>
+      <w:pPr>
+        <w:numPr>
+          <w:ilvl w:val="0"/>
+          <w:numId w:val="4"/>
+        </w:numPr>
+        <w:tabs>
+          <w:tab w:val="clear" w:pos="420"/>
+        </w:tabs>
+        <w:ind w:left="1200" w:leftChars="0" w:hanging="420" w:firstLineChars="0"/>
+        <w:jc w:val="both"/>
+        <w:rPr>
+          <w:rFonts w:hint="default" w:ascii="Times New Roman" w:hAnsi="Times New Roman" w:cs="Times New Roman"/>
+        </w:rPr>
+      </w:pPr>
+      <w:r>
+        <w:rPr>
+          <w:rFonts w:hint="default" w:ascii="Times New Roman" w:hAnsi="Times New Roman" w:eastAsia="SimSun" w:cs="Times New Roman"/>
+          <w:b w:val="0"/>
+          <w:bCs w:val="0"/>
+          <w:sz w:val="24"/>
+          <w:szCs w:val="24"/>
+        </w:rPr>
+        <w:t>Asset Scheduling Errors and Booking Conflicts: Frequent fleet shortages at busy distribution hubs alongside system errors that cause truck double-bookings and overlapping driver schedules due to a lack of shared multi-user systems.</w:t>
+      </w:r>
+    </w:p>
+    <w:p>
+      <w:pPr>
+        <w:numPr>
+          <w:ilvl w:val="0"/>
+          <w:numId w:val="4"/>
+        </w:numPr>
+        <w:tabs>
+          <w:tab w:val="clear" w:pos="420"/>
+        </w:tabs>
+        <w:ind w:left="1200" w:leftChars="0" w:hanging="420" w:firstLineChars="0"/>
+        <w:jc w:val="both"/>
+        <w:rPr>
+          <w:rFonts w:hint="default" w:ascii="Times New Roman" w:hAnsi="Times New Roman" w:cs="Times New Roman"/>
+          <w:b w:val="0"/>
+          <w:bCs w:val="0"/>
+          <w:sz w:val="24"/>
+          <w:szCs w:val="24"/>
+        </w:rPr>
+      </w:pPr>
+      <w:r>
+        <w:rPr>
+          <w:rFonts w:hint="default" w:ascii="Times New Roman" w:hAnsi="Times New Roman" w:cs="Times New Roman"/>
+          <w:b w:val="0"/>
+          <w:bCs w:val="0"/>
+          <w:sz w:val="24"/>
+          <w:szCs w:val="24"/>
+        </w:rPr>
+        <w:t>Visibility Gaps and Lack of Real-Time Tracking: Total absence of live GPS tracking systems, forcing staff to rely on manual phone calls with drivers and preventing the system from providing accurate arrival time updates to partner supermarkets.</w:t>
+      </w:r>
+    </w:p>
+    <w:p>
+      <w:pPr>
+        <w:numPr>
+          <w:ilvl w:val="0"/>
+          <w:numId w:val="4"/>
+        </w:numPr>
+        <w:tabs>
+          <w:tab w:val="clear" w:pos="420"/>
+        </w:tabs>
+        <w:ind w:left="1200" w:leftChars="0" w:hanging="420" w:firstLineChars="0"/>
+        <w:jc w:val="both"/>
+        <w:rPr>
+          <w:rFonts w:hint="default" w:ascii="Times New Roman" w:hAnsi="Times New Roman" w:cs="Times New Roman"/>
+          <w:b w:val="0"/>
+          <w:bCs w:val="0"/>
+          <w:sz w:val="24"/>
+          <w:szCs w:val="24"/>
+        </w:rPr>
+      </w:pPr>
+      <w:r>
+        <w:rPr>
+          <w:rFonts w:hint="default" w:ascii="Times New Roman" w:hAnsi="Times New Roman" w:cs="Times New Roman"/>
+          <w:b w:val="0"/>
+          <w:bCs w:val="0"/>
+          <w:sz w:val="24"/>
+          <w:szCs w:val="24"/>
+        </w:rPr>
+        <w:t>Slow Financial Processing and Billing Inefficiencies: Delayed invoicing cycles and a high risk of human errors in billing files because delivery data is completely separated from back-office accounting platforms and manual payment cross-referencing.</w:t>
+      </w:r>
+    </w:p>
+    <w:p>
+      <w:pPr>
+        <w:pStyle w:val="3"/>
+        <w:bidi w:val="0"/>
+        <w:spacing w:line="240" w:lineRule="auto"/>
+        <w:ind w:left="400" w:leftChars="100" w:firstLine="0" w:firstLineChars="0"/>
+        <w:rPr>
+          <w:rFonts w:hint="default" w:ascii="Times New Roman" w:hAnsi="Times New Roman" w:cs="Times New Roman"/>
+          <w:lang w:val="en-US"/>
+        </w:rPr>
+      </w:pPr>
+      <w:r>
+        <w:rPr>
+          <w:rFonts w:hint="default" w:ascii="Times New Roman" w:hAnsi="Times New Roman" w:cs="Times New Roman"/>
+          <w:lang w:val="en-US"/>
+        </w:rPr>
+        <w:t>3.</w:t>
+      </w:r>
+      <w:r>
+        <w:rPr>
+          <w:rFonts w:hint="default" w:ascii="Times New Roman" w:hAnsi="Times New Roman" w:cs="Times New Roman"/>
+          <w:lang w:val="en-US"/>
+        </w:rPr>
+        <w:t>2</w:t>
+      </w:r>
+      <w:r>
+        <w:rPr>
+          <w:rFonts w:hint="default" w:ascii="Times New Roman" w:hAnsi="Times New Roman" w:cs="Times New Roman"/>
+          <w:lang w:val="en-US"/>
+        </w:rPr>
+        <w:t xml:space="preserve"> </w:t>
+      </w:r>
+      <w:r>
+        <w:rPr>
+          <w:rFonts w:hint="default" w:ascii="Times New Roman" w:hAnsi="Times New Roman" w:cs="Times New Roman"/>
+          <w:lang w:val="en-US"/>
+        </w:rPr>
+        <w:t>Domain Entities</w:t>
+      </w:r>
+    </w:p>
+    <w:p>
+      <w:pPr>
+        <w:numPr>
+          <w:ilvl w:val="0"/>
+          <w:numId w:val="4"/>
+        </w:numPr>
+        <w:tabs>
+          <w:tab w:val="clear" w:pos="420"/>
+        </w:tabs>
+        <w:ind w:left="1200" w:leftChars="0" w:hanging="420" w:firstLineChars="0"/>
+        <w:jc w:val="both"/>
+        <w:rPr>
+          <w:rFonts w:hint="default" w:ascii="Times New Roman" w:hAnsi="Times New Roman" w:cs="Times New Roman"/>
+          <w:b w:val="0"/>
+          <w:bCs w:val="0"/>
+        </w:rPr>
+      </w:pPr>
+      <w:r>
+        <w:rPr>
+          <w:rFonts w:hint="default" w:ascii="Times New Roman" w:hAnsi="Times New Roman" w:cs="Times New Roman"/>
+          <w:b w:val="0"/>
+          <w:bCs w:val="0"/>
+          <w:sz w:val="24"/>
+          <w:szCs w:val="24"/>
+        </w:rPr>
+        <w:t xml:space="preserve">Branch: </w:t>
+      </w:r>
+      <w:r>
+        <w:rPr>
+          <w:rFonts w:hint="default" w:ascii="Times New Roman" w:hAnsi="Times New Roman" w:cs="Times New Roman"/>
+          <w:b w:val="0"/>
+          <w:bCs w:val="0"/>
+          <w:sz w:val="24"/>
+          <w:szCs w:val="24"/>
+          <w:lang w:val="en-US"/>
+        </w:rPr>
+        <w:t>Presents</w:t>
+      </w:r>
+      <w:r>
+        <w:rPr>
+          <w:rFonts w:hint="default" w:ascii="Times New Roman" w:hAnsi="Times New Roman" w:cs="Times New Roman"/>
+          <w:b w:val="0"/>
+          <w:bCs w:val="0"/>
+          <w:sz w:val="24"/>
+          <w:szCs w:val="24"/>
+        </w:rPr>
+        <w:t xml:space="preserve"> the regional distribution hubs and office locations across the nationwide network to manage localized resource allocation.</w:t>
+      </w:r>
+    </w:p>
+    <w:p>
+      <w:pPr>
+        <w:numPr>
+          <w:ilvl w:val="0"/>
+          <w:numId w:val="4"/>
+        </w:numPr>
+        <w:tabs>
+          <w:tab w:val="clear" w:pos="420"/>
+        </w:tabs>
+        <w:ind w:left="1200" w:leftChars="0" w:hanging="420" w:firstLineChars="0"/>
+        <w:jc w:val="both"/>
+        <w:rPr>
+          <w:rFonts w:hint="default" w:ascii="Times New Roman" w:hAnsi="Times New Roman" w:cs="Times New Roman"/>
+          <w:b w:val="0"/>
+          <w:bCs w:val="0"/>
+        </w:rPr>
+      </w:pPr>
+      <w:r>
+        <w:rPr>
+          <w:rFonts w:hint="default" w:ascii="Times New Roman" w:hAnsi="Times New Roman" w:cs="Times New Roman"/>
+          <w:b w:val="0"/>
+          <w:bCs w:val="0"/>
+          <w:sz w:val="24"/>
+          <w:szCs w:val="24"/>
+        </w:rPr>
+        <w:t>Order: Represents the B2B corporate shipping requests submitted by partner supermarkets, containing cargo details, delivery destinations, and fulfillment status.</w:t>
+      </w:r>
+    </w:p>
+    <w:p>
+      <w:pPr>
+        <w:numPr>
+          <w:ilvl w:val="0"/>
+          <w:numId w:val="4"/>
+        </w:numPr>
+        <w:tabs>
+          <w:tab w:val="clear" w:pos="420"/>
+        </w:tabs>
+        <w:ind w:left="1200" w:leftChars="0" w:hanging="420" w:firstLineChars="0"/>
+        <w:jc w:val="both"/>
+        <w:rPr>
+          <w:rFonts w:hint="default" w:ascii="Times New Roman" w:hAnsi="Times New Roman" w:cs="Times New Roman"/>
+          <w:b w:val="0"/>
+          <w:bCs w:val="0"/>
+        </w:rPr>
+      </w:pPr>
+      <w:r>
+        <w:rPr>
+          <w:rFonts w:hint="default" w:ascii="Times New Roman" w:hAnsi="Times New Roman" w:cs="Times New Roman"/>
+          <w:b w:val="0"/>
+          <w:bCs w:val="0"/>
+          <w:sz w:val="24"/>
+          <w:szCs w:val="24"/>
+        </w:rPr>
+        <w:t>Vehicle: Tracks the physical assets within the fleet, including truck metrics, real-time availability, and localized branch assignments.</w:t>
+      </w:r>
+    </w:p>
+    <w:p>
+      <w:pPr>
+        <w:numPr>
+          <w:ilvl w:val="0"/>
+          <w:numId w:val="4"/>
+        </w:numPr>
+        <w:tabs>
+          <w:tab w:val="clear" w:pos="420"/>
+        </w:tabs>
+        <w:ind w:left="1200" w:leftChars="0" w:hanging="420" w:firstLineChars="0"/>
+        <w:jc w:val="both"/>
+        <w:rPr>
+          <w:rFonts w:hint="default" w:ascii="Times New Roman" w:hAnsi="Times New Roman" w:cs="Times New Roman"/>
+          <w:b w:val="0"/>
+          <w:bCs w:val="0"/>
+        </w:rPr>
+      </w:pPr>
+      <w:r>
+        <w:rPr>
+          <w:rFonts w:hint="default" w:ascii="Times New Roman" w:hAnsi="Times New Roman" w:cs="Times New Roman"/>
+          <w:b w:val="0"/>
+          <w:bCs w:val="0"/>
+          <w:sz w:val="24"/>
+          <w:szCs w:val="24"/>
+        </w:rPr>
+        <w:t xml:space="preserve">Driver: Manages the personnel records, active schedules, and compliance timelines </w:t>
+      </w:r>
+      <w:r>
+        <w:rPr>
+          <w:rFonts w:hint="default" w:ascii="Times New Roman" w:hAnsi="Times New Roman" w:cs="Times New Roman"/>
+          <w:b w:val="0"/>
+          <w:bCs w:val="0"/>
+          <w:sz w:val="24"/>
+          <w:szCs w:val="24"/>
+          <w:lang w:val="en-US"/>
+        </w:rPr>
+        <w:t>including</w:t>
+      </w:r>
+      <w:r>
+        <w:rPr>
+          <w:rFonts w:hint="default" w:ascii="Times New Roman" w:hAnsi="Times New Roman" w:cs="Times New Roman"/>
+          <w:b w:val="0"/>
+          <w:bCs w:val="0"/>
+          <w:sz w:val="24"/>
+          <w:szCs w:val="24"/>
+        </w:rPr>
+        <w:t xml:space="preserve"> driver certification and license validity statuses.</w:t>
+      </w:r>
+    </w:p>
+    <w:p>
+      <w:pPr>
+        <w:numPr>
+          <w:ilvl w:val="0"/>
+          <w:numId w:val="4"/>
+        </w:numPr>
+        <w:tabs>
+          <w:tab w:val="clear" w:pos="420"/>
+        </w:tabs>
+        <w:ind w:left="1200" w:leftChars="0" w:hanging="420" w:firstLineChars="0"/>
+        <w:jc w:val="both"/>
+        <w:rPr>
+          <w:rFonts w:hint="default" w:ascii="Times New Roman" w:hAnsi="Times New Roman" w:cs="Times New Roman"/>
+          <w:b w:val="0"/>
+          <w:bCs w:val="0"/>
+        </w:rPr>
+      </w:pPr>
+      <w:r>
+        <w:rPr>
+          <w:rFonts w:hint="default" w:ascii="Times New Roman" w:hAnsi="Times New Roman" w:cs="Times New Roman"/>
+          <w:b w:val="0"/>
+          <w:bCs w:val="0"/>
+          <w:sz w:val="24"/>
+          <w:szCs w:val="24"/>
+        </w:rPr>
+        <w:t>Shipment: Handles the active transit lifecycle of an order, linking specific vehicles and drivers to designated delivery routes.</w:t>
+      </w:r>
+    </w:p>
+    <w:p>
+      <w:pPr>
+        <w:numPr>
+          <w:ilvl w:val="0"/>
+          <w:numId w:val="4"/>
+        </w:numPr>
+        <w:tabs>
+          <w:tab w:val="clear" w:pos="420"/>
+        </w:tabs>
+        <w:ind w:left="1200" w:leftChars="0" w:hanging="420" w:firstLineChars="0"/>
+        <w:jc w:val="both"/>
+        <w:rPr>
+          <w:rFonts w:hint="default" w:ascii="Times New Roman" w:hAnsi="Times New Roman" w:cs="Times New Roman"/>
+          <w:b w:val="0"/>
+          <w:bCs w:val="0"/>
+          <w:sz w:val="24"/>
+          <w:szCs w:val="24"/>
+        </w:rPr>
+      </w:pPr>
+      <w:r>
+        <w:rPr>
+          <w:rFonts w:hint="default" w:ascii="Times New Roman" w:hAnsi="Times New Roman" w:cs="Times New Roman"/>
+          <w:b w:val="0"/>
+          <w:bCs w:val="0"/>
+          <w:sz w:val="24"/>
+          <w:szCs w:val="24"/>
+        </w:rPr>
+        <w:t>Telemetry Log: Captures real-time GPS coordinates and time telemetry data streams to provide live cargo tracking and accurate arrival updates.</w:t>
+      </w:r>
+    </w:p>
+    <w:p>
+      <w:pPr>
+        <w:numPr>
+          <w:ilvl w:val="0"/>
+          <w:numId w:val="4"/>
+        </w:numPr>
+        <w:tabs>
+          <w:tab w:val="clear" w:pos="420"/>
+        </w:tabs>
+        <w:ind w:left="1200" w:leftChars="0" w:hanging="420" w:firstLineChars="0"/>
+        <w:jc w:val="both"/>
+        <w:rPr>
+          <w:rFonts w:hint="default" w:ascii="Times New Roman" w:hAnsi="Times New Roman" w:cs="Times New Roman"/>
+          <w:b w:val="0"/>
+          <w:bCs w:val="0"/>
+          <w:sz w:val="24"/>
+          <w:szCs w:val="24"/>
+        </w:rPr>
+      </w:pPr>
+      <w:r>
+        <w:rPr>
+          <w:rFonts w:hint="default" w:ascii="Times New Roman" w:hAnsi="Times New Roman" w:cs="Times New Roman"/>
+          <w:b w:val="0"/>
+          <w:bCs w:val="0"/>
+          <w:sz w:val="24"/>
+          <w:szCs w:val="24"/>
+        </w:rPr>
+        <w:t>Invoice: Compiles the automated financial records, billing calculations, and transparent transaction receipts generated upon successful delivery fulfillment.</w:t>
+      </w:r>
+    </w:p>
+    <w:p>
+      <w:pPr>
+        <w:numPr>
+          <w:ilvl w:val="0"/>
+          <w:numId w:val="4"/>
+        </w:numPr>
+        <w:tabs>
+          <w:tab w:val="clear" w:pos="420"/>
+        </w:tabs>
+        <w:ind w:left="1200" w:leftChars="0" w:hanging="420" w:firstLineChars="0"/>
+        <w:jc w:val="both"/>
+        <w:rPr>
+          <w:rFonts w:hint="default" w:ascii="Times New Roman" w:hAnsi="Times New Roman" w:cs="Times New Roman"/>
+          <w:b w:val="0"/>
+          <w:bCs w:val="0"/>
+          <w:sz w:val="24"/>
+          <w:szCs w:val="24"/>
+        </w:rPr>
+      </w:pPr>
+      <w:r>
+        <w:rPr>
+          <w:rFonts w:hint="default" w:ascii="Times New Roman" w:hAnsi="Times New Roman" w:cs="Times New Roman"/>
+          <w:b w:val="0"/>
+          <w:bCs w:val="0"/>
+          <w:sz w:val="24"/>
+          <w:szCs w:val="24"/>
+        </w:rPr>
+        <w:t>Payment: Stores transaction histories, payment methods, and reconciliation statuses to ensure unalterable financial logging</w:t>
+      </w:r>
+      <w:r>
+        <w:rPr>
+          <w:rFonts w:hint="default" w:ascii="Times New Roman" w:hAnsi="Times New Roman" w:cs="Times New Roman"/>
+          <w:sz w:val="24"/>
+          <w:szCs w:val="24"/>
+        </w:rPr>
+        <w:t>.</w:t>
+      </w:r>
+    </w:p>
+    <w:p>
+      <w:pPr>
+        <w:pStyle w:val="3"/>
+        <w:bidi w:val="0"/>
+        <w:spacing w:line="240" w:lineRule="auto"/>
+        <w:ind w:left="400" w:leftChars="100" w:firstLine="0" w:firstLineChars="0"/>
+        <w:rPr>
+          <w:rFonts w:hint="default" w:ascii="Times New Roman" w:hAnsi="Times New Roman" w:cs="Times New Roman"/>
+          <w:b w:val="0"/>
+          <w:bCs w:val="0"/>
+          <w:sz w:val="24"/>
+          <w:szCs w:val="24"/>
+        </w:rPr>
+      </w:pPr>
+      <w:r>
+        <w:rPr>
+          <w:rFonts w:hint="default" w:ascii="Times New Roman" w:hAnsi="Times New Roman" w:cs="Times New Roman"/>
+          <w:lang w:val="en-US"/>
+        </w:rPr>
+        <w:t>3.</w:t>
+      </w:r>
+      <w:r>
+        <w:rPr>
+          <w:rFonts w:hint="default" w:ascii="Times New Roman" w:hAnsi="Times New Roman" w:cs="Times New Roman"/>
+          <w:lang w:val="en-US"/>
+        </w:rPr>
+        <w:t>3</w:t>
+      </w:r>
+      <w:r>
+        <w:rPr>
+          <w:rFonts w:hint="default" w:ascii="Times New Roman" w:hAnsi="Times New Roman" w:cs="Times New Roman"/>
+          <w:lang w:val="en-US"/>
+        </w:rPr>
+        <w:t xml:space="preserve"> </w:t>
+      </w:r>
+      <w:r>
+        <w:rPr>
+          <w:rFonts w:hint="default" w:ascii="Times New Roman" w:hAnsi="Times New Roman" w:cs="Times New Roman"/>
+          <w:lang w:val="en-US"/>
+        </w:rPr>
+        <w:t>Actors</w:t>
+      </w:r>
+    </w:p>
+    <w:p>
+      <w:pPr>
+        <w:numPr>
+          <w:ilvl w:val="0"/>
+          <w:numId w:val="4"/>
+        </w:numPr>
+        <w:tabs>
+          <w:tab w:val="clear" w:pos="420"/>
+        </w:tabs>
+        <w:ind w:left="1200" w:leftChars="0" w:hanging="420" w:firstLineChars="0"/>
+        <w:jc w:val="both"/>
+        <w:rPr>
+          <w:rFonts w:hint="default" w:ascii="Times New Roman" w:hAnsi="Times New Roman" w:cs="Times New Roman"/>
+          <w:b w:val="0"/>
+          <w:bCs w:val="0"/>
+          <w:sz w:val="24"/>
+          <w:szCs w:val="24"/>
+        </w:rPr>
+      </w:pPr>
+      <w:r>
+        <w:rPr>
+          <w:rFonts w:hint="default" w:ascii="Times New Roman" w:hAnsi="Times New Roman" w:eastAsia="SimSun" w:cs="Times New Roman"/>
+          <w:b w:val="0"/>
+          <w:bCs w:val="0"/>
+          <w:sz w:val="24"/>
+          <w:szCs w:val="24"/>
+        </w:rPr>
+        <w:t>System Administrator: Oversees the entire SmartFM platform, manages user accounts, configures branch settings, and maintains overall system security and data backups</w:t>
+      </w:r>
+      <w:r>
+        <w:rPr>
+          <w:rFonts w:hint="default" w:ascii="Times New Roman" w:hAnsi="Times New Roman" w:eastAsia="SimSun" w:cs="Times New Roman"/>
+          <w:sz w:val="24"/>
+          <w:szCs w:val="24"/>
+        </w:rPr>
+        <w:t>.</w:t>
+      </w:r>
+    </w:p>
+    <w:p>
+      <w:pPr>
+        <w:numPr>
+          <w:ilvl w:val="0"/>
+          <w:numId w:val="4"/>
+        </w:numPr>
+        <w:tabs>
+          <w:tab w:val="clear" w:pos="420"/>
+        </w:tabs>
+        <w:ind w:left="1200" w:leftChars="0" w:hanging="420" w:firstLineChars="0"/>
+        <w:jc w:val="both"/>
+        <w:rPr>
+          <w:rFonts w:hint="default" w:ascii="Times New Roman" w:hAnsi="Times New Roman" w:cs="Times New Roman"/>
+        </w:rPr>
+      </w:pPr>
+      <w:r>
+        <w:rPr>
+          <w:rFonts w:hint="default" w:ascii="Times New Roman" w:hAnsi="Times New Roman" w:eastAsia="SimSun" w:cs="Times New Roman"/>
+          <w:b w:val="0"/>
+          <w:bCs w:val="0"/>
+          <w:sz w:val="24"/>
+          <w:szCs w:val="24"/>
+        </w:rPr>
+        <w:t>Branch Manager: Monitors localized branch operations, reviews regional delivery reports, and handles local resource exceptions or disputes.</w:t>
+      </w:r>
+    </w:p>
+    <w:p>
+      <w:pPr>
+        <w:numPr>
+          <w:ilvl w:val="0"/>
+          <w:numId w:val="4"/>
+        </w:numPr>
+        <w:tabs>
+          <w:tab w:val="clear" w:pos="420"/>
+        </w:tabs>
+        <w:ind w:left="1200" w:leftChars="0" w:hanging="420" w:firstLineChars="0"/>
+        <w:jc w:val="both"/>
+        <w:rPr>
+          <w:rFonts w:hint="default" w:ascii="Times New Roman" w:hAnsi="Times New Roman" w:cs="Times New Roman"/>
+          <w:b w:val="0"/>
+          <w:bCs w:val="0"/>
+          <w:sz w:val="24"/>
+          <w:szCs w:val="24"/>
+        </w:rPr>
+      </w:pPr>
+      <w:r>
+        <w:rPr>
+          <w:rFonts w:hint="default" w:ascii="Times New Roman" w:hAnsi="Times New Roman" w:cs="Times New Roman"/>
+          <w:b w:val="0"/>
+          <w:bCs w:val="0"/>
+          <w:sz w:val="24"/>
+          <w:szCs w:val="24"/>
+        </w:rPr>
+        <w:t>Dispatcher: Assigns daily shipping orders to available vehicles, schedules driver shifts, and manages real-time route adjustments.</w:t>
+      </w:r>
+    </w:p>
+    <w:p>
+      <w:pPr>
+        <w:numPr>
+          <w:ilvl w:val="0"/>
+          <w:numId w:val="4"/>
+        </w:numPr>
+        <w:tabs>
+          <w:tab w:val="clear" w:pos="420"/>
+        </w:tabs>
+        <w:ind w:left="1200" w:leftChars="0" w:hanging="420" w:firstLineChars="0"/>
+        <w:jc w:val="both"/>
+        <w:rPr>
+          <w:rFonts w:hint="default" w:ascii="Times New Roman" w:hAnsi="Times New Roman" w:cs="Times New Roman"/>
+          <w:b w:val="0"/>
+          <w:bCs w:val="0"/>
+          <w:sz w:val="24"/>
+          <w:szCs w:val="24"/>
+        </w:rPr>
+      </w:pPr>
+      <w:r>
+        <w:rPr>
+          <w:rFonts w:hint="default" w:ascii="Times New Roman" w:hAnsi="Times New Roman" w:cs="Times New Roman"/>
+          <w:b w:val="0"/>
+          <w:bCs w:val="0"/>
+          <w:sz w:val="24"/>
+          <w:szCs w:val="24"/>
+        </w:rPr>
+        <w:t>Driver: Accesses the mobile interface to view assigned delivery schedules, updates shipment progress milestones, and reports delivery fulfillment statuses.</w:t>
+      </w:r>
+    </w:p>
+    <w:p>
+      <w:pPr>
+        <w:numPr>
+          <w:ilvl w:val="0"/>
+          <w:numId w:val="4"/>
+        </w:numPr>
+        <w:tabs>
+          <w:tab w:val="clear" w:pos="420"/>
+        </w:tabs>
+        <w:ind w:left="1200" w:leftChars="0" w:hanging="420" w:firstLineChars="0"/>
+        <w:jc w:val="both"/>
+        <w:rPr>
+          <w:rFonts w:hint="default" w:ascii="Times New Roman" w:hAnsi="Times New Roman" w:cs="Times New Roman"/>
+          <w:b w:val="0"/>
+          <w:bCs w:val="0"/>
+          <w:sz w:val="24"/>
+          <w:szCs w:val="24"/>
+        </w:rPr>
+      </w:pPr>
+      <w:r>
+        <w:rPr>
+          <w:rFonts w:hint="default" w:ascii="Times New Roman" w:hAnsi="Times New Roman" w:cs="Times New Roman"/>
+          <w:b w:val="0"/>
+          <w:bCs w:val="0"/>
+          <w:sz w:val="24"/>
+          <w:szCs w:val="24"/>
+        </w:rPr>
+        <w:t>Accountant: Manages the automated invoicing pipeline, cross-references payment reconciliation files, and handles billing discrepancies.</w:t>
+      </w:r>
+    </w:p>
+    <w:p>
+      <w:pPr>
+        <w:numPr>
+          <w:ilvl w:val="0"/>
+          <w:numId w:val="4"/>
+        </w:numPr>
+        <w:tabs>
+          <w:tab w:val="clear" w:pos="420"/>
+        </w:tabs>
+        <w:ind w:left="1200" w:leftChars="0" w:hanging="420" w:firstLineChars="0"/>
+        <w:jc w:val="both"/>
+        <w:rPr>
+          <w:rFonts w:hint="default" w:ascii="Times New Roman" w:hAnsi="Times New Roman" w:cs="Times New Roman"/>
+        </w:rPr>
+      </w:pPr>
+      <w:r>
+        <w:rPr>
+          <w:rFonts w:hint="default" w:ascii="Times New Roman" w:hAnsi="Times New Roman" w:eastAsia="SimSun" w:cs="Times New Roman"/>
+          <w:b w:val="0"/>
+          <w:bCs w:val="0"/>
+          <w:sz w:val="24"/>
+          <w:szCs w:val="24"/>
+        </w:rPr>
+        <w:t>Partner Supermarket (Corporate Client): Logs into the client portal to submit bulk B2B shipping requests, tracks active cargo locations, and views estimated arrival times.</w:t>
+      </w:r>
+      <w:bookmarkStart w:id="0" w:name="_GoBack"/>
+      <w:bookmarkEnd w:id="0"/>
+    </w:p>
+    <w:p>
+      <w:pPr>
+        <w:numPr>
+          <w:ilvl w:val="0"/>
+          <w:numId w:val="4"/>
+        </w:numPr>
+        <w:tabs>
+          <w:tab w:val="clear" w:pos="420"/>
+        </w:tabs>
+        <w:ind w:left="1200" w:leftChars="0" w:hanging="420" w:firstLineChars="0"/>
+        <w:jc w:val="both"/>
+        <w:rPr>
+          <w:rFonts w:hint="default" w:ascii="Times New Roman" w:hAnsi="Times New Roman" w:cs="Times New Roman"/>
+          <w:b w:val="0"/>
+          <w:bCs w:val="0"/>
+          <w:sz w:val="24"/>
+          <w:szCs w:val="24"/>
+        </w:rPr>
+      </w:pPr>
+      <w:r>
+        <w:rPr>
+          <w:rFonts w:hint="default" w:ascii="Times New Roman" w:hAnsi="Times New Roman" w:cs="Times New Roman"/>
+          <w:b w:val="0"/>
+          <w:bCs w:val="0"/>
+          <w:sz w:val="24"/>
+          <w:szCs w:val="24"/>
+        </w:rPr>
+        <w:t>External GPS Telemetry System: An external hardware integration system that automatically streams real-time truck location coordinates and time tracking logs into the database.</w:t>
+      </w:r>
+    </w:p>
+    <w:p>
+      <w:pPr>
+        <w:numPr>
+          <w:ilvl w:val="0"/>
+          <w:numId w:val="4"/>
+        </w:numPr>
+        <w:tabs>
+          <w:tab w:val="clear" w:pos="420"/>
+        </w:tabs>
+        <w:ind w:left="1200" w:leftChars="0" w:hanging="420" w:firstLineChars="0"/>
+        <w:jc w:val="both"/>
+        <w:rPr>
+          <w:rFonts w:hint="default" w:ascii="Times New Roman" w:hAnsi="Times New Roman" w:cs="Times New Roman"/>
+          <w:b w:val="0"/>
+          <w:bCs w:val="0"/>
+          <w:sz w:val="24"/>
+          <w:szCs w:val="24"/>
+        </w:rPr>
+      </w:pPr>
+      <w:r>
+        <w:rPr>
+          <w:rFonts w:hint="default" w:ascii="Times New Roman" w:hAnsi="Times New Roman" w:cs="Times New Roman"/>
+          <w:b w:val="0"/>
+          <w:bCs w:val="0"/>
+          <w:sz w:val="24"/>
+          <w:szCs w:val="24"/>
+        </w:rPr>
+        <w:t>External Accounting System: A third-party financial platform that exchanges billing data and payment status updates with SmartFM to ensure automated ledger reconciliation.</w:t>
+      </w:r>
+    </w:p>
+    <w:p>
+      <w:pPr>
+        <w:pStyle w:val="3"/>
+        <w:bidi w:val="0"/>
+        <w:spacing w:line="240" w:lineRule="auto"/>
+        <w:ind w:left="400" w:leftChars="100" w:firstLine="0" w:firstLineChars="0"/>
+        <w:rPr>
+          <w:rFonts w:hint="default" w:ascii="Times New Roman" w:hAnsi="Times New Roman" w:cs="Times New Roman"/>
+          <w:lang w:val="en-US"/>
+        </w:rPr>
+      </w:pPr>
+      <w:r>
+        <w:rPr>
+          <w:rFonts w:hint="default" w:ascii="Times New Roman" w:hAnsi="Times New Roman" w:cs="Times New Roman"/>
+          <w:lang w:val="en-US"/>
+        </w:rPr>
+        <w:t>3.</w:t>
+      </w:r>
+      <w:r>
+        <w:rPr>
+          <w:rFonts w:hint="default" w:ascii="Times New Roman" w:hAnsi="Times New Roman" w:cs="Times New Roman"/>
+          <w:lang w:val="en-US"/>
+        </w:rPr>
+        <w:t>4</w:t>
+      </w:r>
+      <w:r>
+        <w:rPr>
+          <w:rFonts w:hint="default" w:ascii="Times New Roman" w:hAnsi="Times New Roman" w:cs="Times New Roman"/>
+          <w:lang w:val="en-US"/>
+        </w:rPr>
+        <w:t xml:space="preserve"> </w:t>
+      </w:r>
+      <w:r>
+        <w:rPr>
+          <w:rFonts w:hint="default" w:ascii="Times New Roman" w:hAnsi="Times New Roman" w:cs="Times New Roman"/>
+          <w:lang w:val="en-US"/>
+        </w:rPr>
+        <w:t>Tasks</w:t>
+      </w:r>
+    </w:p>
+    <w:p>
+      <w:pPr>
+        <w:numPr>
+          <w:ilvl w:val="0"/>
+          <w:numId w:val="4"/>
+        </w:numPr>
+        <w:tabs>
+          <w:tab w:val="clear" w:pos="420"/>
+        </w:tabs>
+        <w:ind w:left="1200" w:leftChars="0" w:hanging="420" w:firstLineChars="0"/>
+        <w:jc w:val="both"/>
+        <w:rPr>
+          <w:rFonts w:hint="default" w:ascii="Times New Roman" w:hAnsi="Times New Roman" w:cs="Times New Roman"/>
+          <w:b w:val="0"/>
+          <w:bCs w:val="0"/>
+          <w:sz w:val="24"/>
+          <w:szCs w:val="24"/>
+        </w:rPr>
+      </w:pPr>
+      <w:r>
+        <w:rPr>
+          <w:rFonts w:hint="default" w:ascii="Times New Roman" w:hAnsi="Times New Roman" w:cs="Times New Roman"/>
+          <w:b w:val="0"/>
+          <w:bCs w:val="0"/>
+          <w:sz w:val="24"/>
+          <w:szCs w:val="24"/>
+          <w:lang w:val="en-US"/>
+        </w:rPr>
+        <w:t>User and Access Management:</w:t>
+      </w:r>
+    </w:p>
+    <w:p>
+      <w:pPr>
+        <w:numPr>
+          <w:ilvl w:val="0"/>
+          <w:numId w:val="5"/>
+        </w:numPr>
+        <w:tabs>
+          <w:tab w:val="clear" w:pos="420"/>
+        </w:tabs>
+        <w:ind w:left="1600" w:leftChars="0" w:hanging="420" w:firstLineChars="0"/>
+        <w:jc w:val="both"/>
+        <w:rPr>
+          <w:rFonts w:hint="default" w:ascii="Times New Roman" w:hAnsi="Times New Roman" w:cs="Times New Roman"/>
+          <w:b w:val="0"/>
+          <w:bCs w:val="0"/>
+          <w:sz w:val="24"/>
+          <w:szCs w:val="24"/>
+          <w:lang w:val="en-US"/>
+        </w:rPr>
+      </w:pPr>
+      <w:r>
+        <w:rPr>
+          <w:rFonts w:hint="default" w:ascii="Times New Roman" w:hAnsi="Times New Roman" w:cs="Times New Roman"/>
+          <w:b w:val="0"/>
+          <w:bCs w:val="0"/>
+          <w:sz w:val="24"/>
+          <w:szCs w:val="24"/>
+          <w:lang w:val="en-US"/>
+        </w:rPr>
+        <w:t>Actor: System Administrator</w:t>
+      </w:r>
+    </w:p>
+    <w:p>
+      <w:pPr>
+        <w:numPr>
+          <w:ilvl w:val="0"/>
+          <w:numId w:val="5"/>
+        </w:numPr>
+        <w:tabs>
+          <w:tab w:val="clear" w:pos="420"/>
+        </w:tabs>
+        <w:ind w:left="1600" w:leftChars="0" w:hanging="420" w:firstLineChars="0"/>
+        <w:jc w:val="both"/>
+        <w:rPr>
+          <w:rFonts w:hint="default" w:ascii="Times New Roman" w:hAnsi="Times New Roman" w:cs="Times New Roman"/>
+          <w:b w:val="0"/>
+          <w:bCs w:val="0"/>
+          <w:sz w:val="24"/>
+          <w:szCs w:val="24"/>
+          <w:lang w:val="en-US"/>
+        </w:rPr>
+      </w:pPr>
+      <w:r>
+        <w:rPr>
+          <w:rFonts w:hint="default" w:ascii="Times New Roman" w:hAnsi="Times New Roman" w:cs="Times New Roman"/>
+          <w:b w:val="0"/>
+          <w:bCs w:val="0"/>
+          <w:sz w:val="24"/>
+          <w:szCs w:val="24"/>
+          <w:lang w:val="en-US"/>
+        </w:rPr>
+        <w:t xml:space="preserve">Description: Manages </w:t>
+      </w:r>
+      <w:r>
+        <w:rPr>
+          <w:rFonts w:hint="default" w:ascii="Times New Roman" w:hAnsi="Times New Roman" w:eastAsia="SimSun" w:cs="Times New Roman"/>
+          <w:sz w:val="24"/>
+          <w:szCs w:val="24"/>
+        </w:rPr>
+        <w:t>employee accounts, configures role-based access controls, and updates system security permissions to protect company data.</w:t>
+      </w:r>
+    </w:p>
+    <w:p>
+      <w:pPr>
+        <w:numPr>
+          <w:ilvl w:val="0"/>
+          <w:numId w:val="4"/>
+        </w:numPr>
+        <w:tabs>
+          <w:tab w:val="clear" w:pos="420"/>
+        </w:tabs>
+        <w:ind w:left="1200" w:leftChars="0" w:hanging="420" w:firstLineChars="0"/>
+        <w:jc w:val="both"/>
+        <w:rPr>
+          <w:rFonts w:hint="default" w:ascii="Times New Roman" w:hAnsi="Times New Roman" w:cs="Times New Roman"/>
+          <w:b w:val="0"/>
+          <w:bCs w:val="0"/>
+          <w:sz w:val="24"/>
+          <w:szCs w:val="24"/>
+        </w:rPr>
+      </w:pPr>
+      <w:r>
+        <w:rPr>
+          <w:rFonts w:hint="default" w:ascii="Times New Roman" w:hAnsi="Times New Roman" w:cs="Times New Roman"/>
+          <w:b w:val="0"/>
+          <w:bCs w:val="0"/>
+          <w:sz w:val="24"/>
+          <w:szCs w:val="24"/>
+          <w:lang w:val="en-US"/>
+        </w:rPr>
+        <w:t>Branch and Hub Setup</w:t>
+      </w:r>
+      <w:r>
+        <w:rPr>
+          <w:rFonts w:hint="default" w:ascii="Times New Roman" w:hAnsi="Times New Roman" w:cs="Times New Roman"/>
+          <w:b w:val="0"/>
+          <w:bCs w:val="0"/>
+          <w:sz w:val="24"/>
+          <w:szCs w:val="24"/>
+          <w:lang w:val="en-US"/>
+        </w:rPr>
+        <w:t>:</w:t>
+      </w:r>
+    </w:p>
+    <w:p>
+      <w:pPr>
+        <w:numPr>
+          <w:ilvl w:val="0"/>
+          <w:numId w:val="5"/>
+        </w:numPr>
+        <w:tabs>
+          <w:tab w:val="clear" w:pos="420"/>
+        </w:tabs>
+        <w:ind w:left="1600" w:leftChars="0" w:hanging="420" w:firstLineChars="0"/>
+        <w:jc w:val="both"/>
+        <w:rPr>
+          <w:rFonts w:hint="default" w:ascii="Times New Roman" w:hAnsi="Times New Roman" w:cs="Times New Roman"/>
+          <w:b w:val="0"/>
+          <w:bCs w:val="0"/>
+          <w:sz w:val="24"/>
+          <w:szCs w:val="24"/>
+          <w:lang w:val="en-US"/>
+        </w:rPr>
+      </w:pPr>
+      <w:r>
+        <w:rPr>
+          <w:rFonts w:hint="default" w:ascii="Times New Roman" w:hAnsi="Times New Roman" w:cs="Times New Roman"/>
+          <w:b w:val="0"/>
+          <w:bCs w:val="0"/>
+          <w:sz w:val="24"/>
+          <w:szCs w:val="24"/>
+          <w:lang w:val="en-US"/>
+        </w:rPr>
+        <w:t>Actor: System Administrator</w:t>
+      </w:r>
+      <w:r>
+        <w:rPr>
+          <w:rFonts w:hint="default" w:ascii="Times New Roman" w:hAnsi="Times New Roman" w:cs="Times New Roman"/>
+          <w:b w:val="0"/>
+          <w:bCs w:val="0"/>
+          <w:sz w:val="24"/>
+          <w:szCs w:val="24"/>
+          <w:lang w:val="en-US"/>
+        </w:rPr>
+        <w:t>, Branch Manager</w:t>
+      </w:r>
+    </w:p>
+    <w:p>
+      <w:pPr>
+        <w:numPr>
+          <w:ilvl w:val="0"/>
+          <w:numId w:val="5"/>
+        </w:numPr>
+        <w:tabs>
+          <w:tab w:val="clear" w:pos="420"/>
+        </w:tabs>
+        <w:ind w:left="1600" w:leftChars="0" w:hanging="420" w:firstLineChars="0"/>
+        <w:jc w:val="both"/>
+        <w:rPr>
+          <w:rFonts w:hint="default" w:ascii="Times New Roman" w:hAnsi="Times New Roman" w:cs="Times New Roman"/>
+          <w:b w:val="0"/>
+          <w:bCs w:val="0"/>
+          <w:sz w:val="24"/>
+          <w:szCs w:val="24"/>
+          <w:lang w:val="en-US"/>
+        </w:rPr>
+      </w:pPr>
+      <w:r>
+        <w:rPr>
+          <w:rFonts w:hint="default" w:ascii="Times New Roman" w:hAnsi="Times New Roman" w:cs="Times New Roman"/>
+          <w:b w:val="0"/>
+          <w:bCs w:val="0"/>
+          <w:sz w:val="24"/>
+          <w:szCs w:val="24"/>
+          <w:lang w:val="en-US"/>
+        </w:rPr>
+        <w:t xml:space="preserve">Description: </w:t>
+      </w:r>
+      <w:r>
+        <w:rPr>
+          <w:rFonts w:hint="default" w:ascii="Times New Roman" w:hAnsi="Times New Roman" w:eastAsia="SimSun" w:cs="Times New Roman"/>
+          <w:sz w:val="24"/>
+          <w:szCs w:val="24"/>
+        </w:rPr>
+        <w:t>Configures regional distribution hub parameters, local database synchronization settings, and geographical boundaries for resource mapping.</w:t>
+      </w:r>
+    </w:p>
+    <w:p>
+      <w:pPr>
+        <w:numPr>
+          <w:ilvl w:val="0"/>
+          <w:numId w:val="4"/>
+        </w:numPr>
+        <w:tabs>
+          <w:tab w:val="clear" w:pos="420"/>
+        </w:tabs>
+        <w:ind w:left="1200" w:leftChars="0" w:hanging="420" w:firstLineChars="0"/>
+        <w:jc w:val="both"/>
+        <w:rPr>
+          <w:rFonts w:hint="default" w:ascii="Times New Roman" w:hAnsi="Times New Roman" w:cs="Times New Roman"/>
+          <w:b w:val="0"/>
+          <w:bCs w:val="0"/>
+          <w:sz w:val="24"/>
+          <w:szCs w:val="24"/>
+        </w:rPr>
+      </w:pPr>
+      <w:r>
+        <w:rPr>
+          <w:rFonts w:hint="default" w:ascii="Times New Roman" w:hAnsi="Times New Roman" w:cs="Times New Roman"/>
+          <w:b w:val="0"/>
+          <w:bCs w:val="0"/>
+          <w:sz w:val="24"/>
+          <w:szCs w:val="24"/>
+          <w:lang w:val="en-US"/>
+        </w:rPr>
+        <w:t>Fleet Asset Management</w:t>
+      </w:r>
+      <w:r>
+        <w:rPr>
+          <w:rFonts w:hint="default" w:ascii="Times New Roman" w:hAnsi="Times New Roman" w:cs="Times New Roman"/>
+          <w:b w:val="0"/>
+          <w:bCs w:val="0"/>
+          <w:sz w:val="24"/>
+          <w:szCs w:val="24"/>
+          <w:lang w:val="en-US"/>
+        </w:rPr>
+        <w:t>:</w:t>
+      </w:r>
+    </w:p>
+    <w:p>
+      <w:pPr>
+        <w:numPr>
+          <w:ilvl w:val="0"/>
+          <w:numId w:val="5"/>
+        </w:numPr>
+        <w:tabs>
+          <w:tab w:val="clear" w:pos="420"/>
+        </w:tabs>
+        <w:ind w:left="1600" w:leftChars="0" w:hanging="420" w:firstLineChars="0"/>
+        <w:jc w:val="both"/>
+        <w:rPr>
+          <w:rFonts w:hint="default" w:ascii="Times New Roman" w:hAnsi="Times New Roman" w:cs="Times New Roman"/>
+          <w:b w:val="0"/>
+          <w:bCs w:val="0"/>
+          <w:sz w:val="24"/>
+          <w:szCs w:val="24"/>
+          <w:lang w:val="en-US"/>
+        </w:rPr>
+      </w:pPr>
+      <w:r>
+        <w:rPr>
+          <w:rFonts w:hint="default" w:ascii="Times New Roman" w:hAnsi="Times New Roman" w:cs="Times New Roman"/>
+          <w:b w:val="0"/>
+          <w:bCs w:val="0"/>
+          <w:sz w:val="24"/>
+          <w:szCs w:val="24"/>
+          <w:lang w:val="en-US"/>
+        </w:rPr>
+        <w:t>Actor: System Administrator, Branch Manager</w:t>
+      </w:r>
+    </w:p>
+    <w:p>
+      <w:pPr>
+        <w:numPr>
+          <w:ilvl w:val="0"/>
+          <w:numId w:val="5"/>
+        </w:numPr>
+        <w:tabs>
+          <w:tab w:val="clear" w:pos="420"/>
+        </w:tabs>
+        <w:ind w:left="1600" w:leftChars="0" w:hanging="420" w:firstLineChars="0"/>
+        <w:jc w:val="both"/>
+        <w:rPr>
+          <w:rFonts w:hint="default" w:ascii="Times New Roman" w:hAnsi="Times New Roman" w:cs="Times New Roman"/>
+          <w:b w:val="0"/>
+          <w:bCs w:val="0"/>
+          <w:sz w:val="24"/>
+          <w:szCs w:val="24"/>
+          <w:lang w:val="en-US"/>
+        </w:rPr>
+      </w:pPr>
+      <w:r>
+        <w:rPr>
+          <w:rFonts w:hint="default" w:ascii="Times New Roman" w:hAnsi="Times New Roman" w:cs="Times New Roman"/>
+          <w:b w:val="0"/>
+          <w:bCs w:val="0"/>
+          <w:sz w:val="24"/>
+          <w:szCs w:val="24"/>
+          <w:lang w:val="en-US"/>
+        </w:rPr>
+        <w:t xml:space="preserve">Description: </w:t>
+      </w:r>
+      <w:r>
+        <w:rPr>
+          <w:rFonts w:hint="default" w:ascii="Times New Roman" w:hAnsi="Times New Roman" w:eastAsia="SimSun" w:cs="Times New Roman"/>
+          <w:sz w:val="24"/>
+          <w:szCs w:val="24"/>
+        </w:rPr>
+        <w:t>Registers and updates physical transport assets, inputs vehicle technical specifications, and tracks localized truck availability.</w:t>
+      </w:r>
+    </w:p>
+    <w:p>
+      <w:pPr>
+        <w:numPr>
+          <w:ilvl w:val="0"/>
+          <w:numId w:val="4"/>
+        </w:numPr>
+        <w:tabs>
+          <w:tab w:val="clear" w:pos="420"/>
+        </w:tabs>
+        <w:ind w:left="1200" w:leftChars="0" w:hanging="420" w:firstLineChars="0"/>
+        <w:jc w:val="both"/>
+        <w:rPr>
+          <w:rFonts w:hint="default" w:ascii="Times New Roman" w:hAnsi="Times New Roman" w:cs="Times New Roman"/>
+          <w:b w:val="0"/>
+          <w:bCs w:val="0"/>
+          <w:sz w:val="24"/>
+          <w:szCs w:val="24"/>
+        </w:rPr>
+      </w:pPr>
+      <w:r>
+        <w:rPr>
+          <w:rFonts w:hint="default" w:ascii="Times New Roman" w:hAnsi="Times New Roman" w:cs="Times New Roman"/>
+          <w:b w:val="0"/>
+          <w:bCs w:val="0"/>
+          <w:sz w:val="24"/>
+          <w:szCs w:val="24"/>
+          <w:lang w:val="en-US"/>
+        </w:rPr>
+        <w:t>Order Management</w:t>
+      </w:r>
+      <w:r>
+        <w:rPr>
+          <w:rFonts w:hint="default" w:ascii="Times New Roman" w:hAnsi="Times New Roman" w:cs="Times New Roman"/>
+          <w:b w:val="0"/>
+          <w:bCs w:val="0"/>
+          <w:sz w:val="24"/>
+          <w:szCs w:val="24"/>
+          <w:lang w:val="en-US"/>
+        </w:rPr>
+        <w:t>:</w:t>
+      </w:r>
+    </w:p>
+    <w:p>
+      <w:pPr>
+        <w:numPr>
+          <w:ilvl w:val="0"/>
+          <w:numId w:val="5"/>
+        </w:numPr>
+        <w:tabs>
+          <w:tab w:val="clear" w:pos="420"/>
+        </w:tabs>
+        <w:ind w:left="1600" w:leftChars="0" w:hanging="420" w:firstLineChars="0"/>
+        <w:jc w:val="both"/>
+        <w:rPr>
+          <w:rFonts w:hint="default" w:ascii="Times New Roman" w:hAnsi="Times New Roman" w:cs="Times New Roman"/>
+          <w:b w:val="0"/>
+          <w:bCs w:val="0"/>
+          <w:sz w:val="24"/>
+          <w:szCs w:val="24"/>
+          <w:lang w:val="en-US"/>
+        </w:rPr>
+      </w:pPr>
+      <w:r>
+        <w:rPr>
+          <w:rFonts w:hint="default" w:ascii="Times New Roman" w:hAnsi="Times New Roman" w:cs="Times New Roman"/>
+          <w:b w:val="0"/>
+          <w:bCs w:val="0"/>
+          <w:sz w:val="24"/>
+          <w:szCs w:val="24"/>
+          <w:lang w:val="en-US"/>
+        </w:rPr>
+        <w:t xml:space="preserve">Actor: </w:t>
+      </w:r>
+      <w:r>
+        <w:rPr>
+          <w:rFonts w:hint="default" w:ascii="Times New Roman" w:hAnsi="Times New Roman" w:eastAsia="SimSun" w:cs="Times New Roman"/>
+          <w:sz w:val="24"/>
+          <w:szCs w:val="24"/>
+        </w:rPr>
+        <w:t>Partner Supermarket (Corporate Client), Dispatcher</w:t>
+      </w:r>
+    </w:p>
+    <w:p>
+      <w:pPr>
+        <w:numPr>
+          <w:ilvl w:val="0"/>
+          <w:numId w:val="5"/>
+        </w:numPr>
+        <w:tabs>
+          <w:tab w:val="clear" w:pos="420"/>
+        </w:tabs>
+        <w:ind w:left="1600" w:leftChars="0" w:hanging="420" w:firstLineChars="0"/>
+        <w:jc w:val="both"/>
+        <w:rPr>
+          <w:rFonts w:hint="default" w:ascii="Times New Roman" w:hAnsi="Times New Roman" w:cs="Times New Roman"/>
+          <w:b w:val="0"/>
+          <w:bCs w:val="0"/>
+          <w:sz w:val="24"/>
+          <w:szCs w:val="24"/>
+          <w:lang w:val="en-US"/>
+        </w:rPr>
+      </w:pPr>
+      <w:r>
+        <w:rPr>
+          <w:rFonts w:hint="default" w:ascii="Times New Roman" w:hAnsi="Times New Roman" w:cs="Times New Roman"/>
+          <w:b w:val="0"/>
+          <w:bCs w:val="0"/>
+          <w:sz w:val="24"/>
+          <w:szCs w:val="24"/>
+          <w:lang w:val="en-US"/>
+        </w:rPr>
+        <w:t xml:space="preserve">Description: </w:t>
+      </w:r>
+      <w:r>
+        <w:rPr>
+          <w:rFonts w:hint="default" w:ascii="Times New Roman" w:hAnsi="Times New Roman" w:eastAsia="SimSun" w:cs="Times New Roman"/>
+          <w:sz w:val="24"/>
+          <w:szCs w:val="24"/>
+        </w:rPr>
+        <w:t>Handles the submission of bulk B2B shipping requests, details cargo dimensions, and logs specific delivery destination requests.</w:t>
+      </w:r>
+    </w:p>
+    <w:p>
+      <w:pPr>
+        <w:numPr>
+          <w:ilvl w:val="0"/>
+          <w:numId w:val="4"/>
+        </w:numPr>
+        <w:tabs>
+          <w:tab w:val="clear" w:pos="420"/>
+        </w:tabs>
+        <w:ind w:left="1200" w:leftChars="0" w:hanging="420" w:firstLineChars="0"/>
+        <w:jc w:val="both"/>
+        <w:rPr>
+          <w:rFonts w:hint="default" w:ascii="Times New Roman" w:hAnsi="Times New Roman" w:cs="Times New Roman"/>
+          <w:b w:val="0"/>
+          <w:bCs w:val="0"/>
+          <w:sz w:val="24"/>
+          <w:szCs w:val="24"/>
+        </w:rPr>
+      </w:pPr>
+      <w:r>
+        <w:rPr>
+          <w:rFonts w:hint="default" w:ascii="Times New Roman" w:hAnsi="Times New Roman" w:eastAsia="SimSun" w:cs="Times New Roman"/>
+          <w:sz w:val="24"/>
+          <w:szCs w:val="24"/>
+        </w:rPr>
+        <w:t>Shipment Scheduling and Dispatch</w:t>
+      </w:r>
+      <w:r>
+        <w:rPr>
+          <w:rFonts w:hint="default" w:ascii="Times New Roman" w:hAnsi="Times New Roman" w:cs="Times New Roman"/>
+          <w:b w:val="0"/>
+          <w:bCs w:val="0"/>
+          <w:sz w:val="24"/>
+          <w:szCs w:val="24"/>
+          <w:lang w:val="en-US"/>
+        </w:rPr>
+        <w:t>:</w:t>
+      </w:r>
+    </w:p>
+    <w:p>
+      <w:pPr>
+        <w:numPr>
+          <w:ilvl w:val="0"/>
+          <w:numId w:val="5"/>
+        </w:numPr>
+        <w:tabs>
+          <w:tab w:val="clear" w:pos="420"/>
+        </w:tabs>
+        <w:ind w:left="1600" w:leftChars="0" w:hanging="420" w:firstLineChars="0"/>
+        <w:jc w:val="both"/>
+        <w:rPr>
+          <w:rFonts w:hint="default" w:ascii="Times New Roman" w:hAnsi="Times New Roman" w:cs="Times New Roman"/>
+          <w:b w:val="0"/>
+          <w:bCs w:val="0"/>
+          <w:sz w:val="24"/>
+          <w:szCs w:val="24"/>
+          <w:lang w:val="en-US"/>
+        </w:rPr>
+      </w:pPr>
+      <w:r>
+        <w:rPr>
+          <w:rFonts w:hint="default" w:ascii="Times New Roman" w:hAnsi="Times New Roman" w:cs="Times New Roman"/>
+          <w:b w:val="0"/>
+          <w:bCs w:val="0"/>
+          <w:sz w:val="24"/>
+          <w:szCs w:val="24"/>
+          <w:lang w:val="en-US"/>
+        </w:rPr>
+        <w:t xml:space="preserve">Actor: </w:t>
+      </w:r>
+      <w:r>
+        <w:rPr>
+          <w:rFonts w:hint="default" w:ascii="Times New Roman" w:hAnsi="Times New Roman" w:eastAsia="SimSun" w:cs="Times New Roman"/>
+          <w:sz w:val="24"/>
+          <w:szCs w:val="24"/>
+        </w:rPr>
+        <w:t>Dispatcher, Driver</w:t>
+      </w:r>
+    </w:p>
+    <w:p>
+      <w:pPr>
+        <w:numPr>
+          <w:ilvl w:val="0"/>
+          <w:numId w:val="5"/>
+        </w:numPr>
+        <w:tabs>
+          <w:tab w:val="clear" w:pos="420"/>
+        </w:tabs>
+        <w:ind w:left="1600" w:leftChars="0" w:hanging="420" w:firstLineChars="0"/>
+        <w:jc w:val="both"/>
+        <w:rPr>
+          <w:rFonts w:hint="default" w:ascii="Times New Roman" w:hAnsi="Times New Roman" w:cs="Times New Roman"/>
+          <w:b w:val="0"/>
+          <w:bCs w:val="0"/>
+          <w:sz w:val="24"/>
+          <w:szCs w:val="24"/>
+          <w:lang w:val="en-US"/>
+        </w:rPr>
+      </w:pPr>
+      <w:r>
+        <w:rPr>
+          <w:rFonts w:hint="default" w:ascii="Times New Roman" w:hAnsi="Times New Roman" w:cs="Times New Roman"/>
+          <w:b w:val="0"/>
+          <w:bCs w:val="0"/>
+          <w:sz w:val="24"/>
+          <w:szCs w:val="24"/>
+          <w:lang w:val="en-US"/>
+        </w:rPr>
+        <w:t xml:space="preserve">Description: </w:t>
+      </w:r>
+      <w:r>
+        <w:rPr>
+          <w:rFonts w:hint="default" w:ascii="Times New Roman" w:hAnsi="Times New Roman" w:eastAsia="SimSun" w:cs="Times New Roman"/>
+          <w:sz w:val="24"/>
+          <w:szCs w:val="24"/>
+        </w:rPr>
+        <w:t>Assigns pending logistics orders to available trucks, schedules driver duty shifts, and resolves real-time routing changes.</w:t>
+      </w:r>
+    </w:p>
+    <w:p>
+      <w:pPr>
+        <w:numPr>
+          <w:ilvl w:val="0"/>
+          <w:numId w:val="4"/>
+        </w:numPr>
+        <w:tabs>
+          <w:tab w:val="clear" w:pos="420"/>
+        </w:tabs>
+        <w:ind w:left="1200" w:leftChars="0" w:hanging="420" w:firstLineChars="0"/>
+        <w:jc w:val="both"/>
+        <w:rPr>
+          <w:rFonts w:hint="default" w:ascii="Times New Roman" w:hAnsi="Times New Roman" w:cs="Times New Roman"/>
+          <w:b w:val="0"/>
+          <w:bCs w:val="0"/>
+          <w:sz w:val="24"/>
+          <w:szCs w:val="24"/>
+        </w:rPr>
+      </w:pPr>
+      <w:r>
+        <w:rPr>
+          <w:rFonts w:hint="default" w:ascii="Times New Roman" w:hAnsi="Times New Roman" w:eastAsia="SimSun" w:cs="Times New Roman"/>
+          <w:sz w:val="24"/>
+          <w:szCs w:val="24"/>
+        </w:rPr>
+        <w:t>Real-Time Transit Tracking</w:t>
+      </w:r>
+      <w:r>
+        <w:rPr>
+          <w:rFonts w:hint="default" w:ascii="Times New Roman" w:hAnsi="Times New Roman" w:cs="Times New Roman"/>
+          <w:b w:val="0"/>
+          <w:bCs w:val="0"/>
+          <w:sz w:val="24"/>
+          <w:szCs w:val="24"/>
+          <w:lang w:val="en-US"/>
+        </w:rPr>
+        <w:t>:</w:t>
+      </w:r>
+    </w:p>
+    <w:p>
+      <w:pPr>
+        <w:numPr>
+          <w:ilvl w:val="0"/>
+          <w:numId w:val="5"/>
+        </w:numPr>
+        <w:tabs>
+          <w:tab w:val="clear" w:pos="420"/>
+        </w:tabs>
+        <w:ind w:left="1600" w:leftChars="0" w:hanging="420" w:firstLineChars="0"/>
+        <w:jc w:val="both"/>
+        <w:rPr>
+          <w:rFonts w:hint="default" w:ascii="Times New Roman" w:hAnsi="Times New Roman" w:cs="Times New Roman"/>
+          <w:b w:val="0"/>
+          <w:bCs w:val="0"/>
+          <w:sz w:val="24"/>
+          <w:szCs w:val="24"/>
+          <w:lang w:val="en-US"/>
+        </w:rPr>
+      </w:pPr>
+      <w:r>
+        <w:rPr>
+          <w:rFonts w:hint="default" w:ascii="Times New Roman" w:hAnsi="Times New Roman" w:cs="Times New Roman"/>
+          <w:b w:val="0"/>
+          <w:bCs w:val="0"/>
+          <w:sz w:val="24"/>
+          <w:szCs w:val="24"/>
+          <w:lang w:val="en-US"/>
+        </w:rPr>
+        <w:t xml:space="preserve">Actor: </w:t>
+      </w:r>
+      <w:r>
+        <w:rPr>
+          <w:rFonts w:hint="default" w:ascii="Times New Roman" w:hAnsi="Times New Roman" w:eastAsia="SimSun" w:cs="Times New Roman"/>
+          <w:sz w:val="24"/>
+          <w:szCs w:val="24"/>
+        </w:rPr>
+        <w:t>Driver, External GPS Telemetry System, Dispatcher</w:t>
+      </w:r>
+    </w:p>
+    <w:p>
+      <w:pPr>
+        <w:numPr>
+          <w:ilvl w:val="0"/>
+          <w:numId w:val="5"/>
+        </w:numPr>
+        <w:tabs>
+          <w:tab w:val="clear" w:pos="420"/>
+        </w:tabs>
+        <w:ind w:left="1600" w:leftChars="0" w:hanging="420" w:firstLineChars="0"/>
+        <w:jc w:val="both"/>
+        <w:rPr>
+          <w:rFonts w:hint="default" w:ascii="Times New Roman" w:hAnsi="Times New Roman" w:cs="Times New Roman"/>
+          <w:b w:val="0"/>
+          <w:bCs w:val="0"/>
+          <w:sz w:val="24"/>
+          <w:szCs w:val="24"/>
+          <w:lang w:val="en-US"/>
+        </w:rPr>
+      </w:pPr>
+      <w:r>
+        <w:rPr>
+          <w:rFonts w:hint="default" w:ascii="Times New Roman" w:hAnsi="Times New Roman" w:cs="Times New Roman"/>
+          <w:b w:val="0"/>
+          <w:bCs w:val="0"/>
+          <w:sz w:val="24"/>
+          <w:szCs w:val="24"/>
+          <w:lang w:val="en-US"/>
+        </w:rPr>
+        <w:t xml:space="preserve">Description: </w:t>
+      </w:r>
+      <w:r>
+        <w:rPr>
+          <w:rFonts w:hint="default" w:ascii="Times New Roman" w:hAnsi="Times New Roman" w:eastAsia="SimSun" w:cs="Times New Roman"/>
+          <w:sz w:val="24"/>
+          <w:szCs w:val="24"/>
+        </w:rPr>
+        <w:t>Captures and records live GPS coordinates automatically while allowing drivers to log transit milestones manually.</w:t>
+      </w:r>
+    </w:p>
+    <w:p>
+      <w:pPr>
+        <w:numPr>
+          <w:ilvl w:val="0"/>
+          <w:numId w:val="4"/>
+        </w:numPr>
+        <w:tabs>
+          <w:tab w:val="clear" w:pos="420"/>
+        </w:tabs>
+        <w:ind w:left="1200" w:leftChars="0" w:hanging="420" w:firstLineChars="0"/>
+        <w:jc w:val="both"/>
+        <w:rPr>
+          <w:rFonts w:hint="default" w:ascii="Times New Roman" w:hAnsi="Times New Roman" w:cs="Times New Roman"/>
+          <w:b w:val="0"/>
+          <w:bCs w:val="0"/>
+          <w:sz w:val="24"/>
+          <w:szCs w:val="24"/>
+        </w:rPr>
+      </w:pPr>
+      <w:r>
+        <w:rPr>
+          <w:rFonts w:hint="default" w:ascii="Times New Roman" w:hAnsi="Times New Roman" w:eastAsia="SimSun" w:cs="Times New Roman"/>
+          <w:sz w:val="24"/>
+          <w:szCs w:val="24"/>
+        </w:rPr>
+        <w:t>Handle Delivery Exceptions</w:t>
+      </w:r>
+      <w:r>
+        <w:rPr>
+          <w:rFonts w:hint="default" w:ascii="Times New Roman" w:hAnsi="Times New Roman" w:cs="Times New Roman"/>
+          <w:b w:val="0"/>
+          <w:bCs w:val="0"/>
+          <w:sz w:val="24"/>
+          <w:szCs w:val="24"/>
+          <w:lang w:val="en-US"/>
+        </w:rPr>
+        <w:t>:</w:t>
+      </w:r>
+    </w:p>
+    <w:p>
+      <w:pPr>
+        <w:numPr>
+          <w:ilvl w:val="0"/>
+          <w:numId w:val="5"/>
+        </w:numPr>
+        <w:tabs>
+          <w:tab w:val="clear" w:pos="420"/>
+        </w:tabs>
+        <w:ind w:left="1600" w:leftChars="0" w:hanging="420" w:firstLineChars="0"/>
+        <w:jc w:val="both"/>
+        <w:rPr>
+          <w:rFonts w:hint="default" w:ascii="Times New Roman" w:hAnsi="Times New Roman" w:cs="Times New Roman"/>
+          <w:b w:val="0"/>
+          <w:bCs w:val="0"/>
+          <w:sz w:val="24"/>
+          <w:szCs w:val="24"/>
+          <w:lang w:val="en-US"/>
+        </w:rPr>
+      </w:pPr>
+      <w:r>
+        <w:rPr>
+          <w:rFonts w:hint="default" w:ascii="Times New Roman" w:hAnsi="Times New Roman" w:cs="Times New Roman"/>
+          <w:b w:val="0"/>
+          <w:bCs w:val="0"/>
+          <w:sz w:val="24"/>
+          <w:szCs w:val="24"/>
+          <w:lang w:val="en-US"/>
+        </w:rPr>
+        <w:t xml:space="preserve">Actor: </w:t>
+      </w:r>
+      <w:r>
+        <w:rPr>
+          <w:rFonts w:hint="default" w:ascii="Times New Roman" w:hAnsi="Times New Roman" w:eastAsia="SimSun" w:cs="Times New Roman"/>
+          <w:sz w:val="24"/>
+          <w:szCs w:val="24"/>
+        </w:rPr>
+        <w:t>Driver, Dispatcher</w:t>
+      </w:r>
+    </w:p>
+    <w:p>
+      <w:pPr>
+        <w:numPr>
+          <w:ilvl w:val="0"/>
+          <w:numId w:val="5"/>
+        </w:numPr>
+        <w:tabs>
+          <w:tab w:val="clear" w:pos="420"/>
+        </w:tabs>
+        <w:ind w:left="1600" w:leftChars="0" w:hanging="420" w:firstLineChars="0"/>
+        <w:jc w:val="both"/>
+        <w:rPr>
+          <w:rFonts w:hint="default" w:ascii="Times New Roman" w:hAnsi="Times New Roman" w:cs="Times New Roman"/>
+          <w:b w:val="0"/>
+          <w:bCs w:val="0"/>
+          <w:sz w:val="24"/>
+          <w:szCs w:val="24"/>
+          <w:lang w:val="en-US"/>
+        </w:rPr>
+      </w:pPr>
+      <w:r>
+        <w:rPr>
+          <w:rFonts w:hint="default" w:ascii="Times New Roman" w:hAnsi="Times New Roman" w:cs="Times New Roman"/>
+          <w:b w:val="0"/>
+          <w:bCs w:val="0"/>
+          <w:sz w:val="24"/>
+          <w:szCs w:val="24"/>
+          <w:lang w:val="en-US"/>
+        </w:rPr>
+        <w:t xml:space="preserve">Description: </w:t>
+      </w:r>
+      <w:r>
+        <w:rPr>
+          <w:rFonts w:hint="default" w:ascii="Times New Roman" w:hAnsi="Times New Roman" w:eastAsia="SimSun" w:cs="Times New Roman"/>
+          <w:sz w:val="24"/>
+          <w:szCs w:val="24"/>
+        </w:rPr>
+        <w:t>Manages unexpected transit issues such as vehicle breakdowns or traffic delays, allowing staff to reroute assets and notify supermarkets immediately.</w:t>
+      </w:r>
+    </w:p>
+    <w:p>
+      <w:pPr>
+        <w:numPr>
+          <w:ilvl w:val="0"/>
+          <w:numId w:val="4"/>
+        </w:numPr>
+        <w:tabs>
+          <w:tab w:val="clear" w:pos="420"/>
+        </w:tabs>
+        <w:ind w:left="1200" w:leftChars="0" w:hanging="420" w:firstLineChars="0"/>
+        <w:jc w:val="both"/>
+        <w:rPr>
+          <w:rFonts w:hint="default" w:ascii="Times New Roman" w:hAnsi="Times New Roman" w:cs="Times New Roman"/>
+          <w:b w:val="0"/>
+          <w:bCs w:val="0"/>
+          <w:sz w:val="24"/>
+          <w:szCs w:val="24"/>
+        </w:rPr>
+      </w:pPr>
+      <w:r>
+        <w:rPr>
+          <w:rFonts w:hint="default" w:ascii="Times New Roman" w:hAnsi="Times New Roman" w:eastAsia="SimSun" w:cs="Times New Roman"/>
+          <w:sz w:val="24"/>
+          <w:szCs w:val="24"/>
+        </w:rPr>
+        <w:t>Process Order Modifications and Cancellations</w:t>
+      </w:r>
+      <w:r>
+        <w:rPr>
+          <w:rFonts w:hint="default" w:ascii="Times New Roman" w:hAnsi="Times New Roman" w:cs="Times New Roman"/>
+          <w:b w:val="0"/>
+          <w:bCs w:val="0"/>
+          <w:sz w:val="24"/>
+          <w:szCs w:val="24"/>
+          <w:lang w:val="en-US"/>
+        </w:rPr>
+        <w:t>:</w:t>
+      </w:r>
+    </w:p>
+    <w:p>
+      <w:pPr>
+        <w:numPr>
+          <w:ilvl w:val="0"/>
+          <w:numId w:val="5"/>
+        </w:numPr>
+        <w:tabs>
+          <w:tab w:val="clear" w:pos="420"/>
+        </w:tabs>
+        <w:ind w:left="1600" w:leftChars="0" w:hanging="420" w:firstLineChars="0"/>
+        <w:jc w:val="both"/>
+        <w:rPr>
+          <w:rFonts w:hint="default" w:ascii="Times New Roman" w:hAnsi="Times New Roman" w:cs="Times New Roman"/>
+          <w:b w:val="0"/>
+          <w:bCs w:val="0"/>
+          <w:sz w:val="24"/>
+          <w:szCs w:val="24"/>
+          <w:lang w:val="en-US"/>
+        </w:rPr>
+      </w:pPr>
+      <w:r>
+        <w:rPr>
+          <w:rFonts w:hint="default" w:ascii="Times New Roman" w:hAnsi="Times New Roman" w:cs="Times New Roman"/>
+          <w:b w:val="0"/>
+          <w:bCs w:val="0"/>
+          <w:sz w:val="24"/>
+          <w:szCs w:val="24"/>
+          <w:lang w:val="en-US"/>
+        </w:rPr>
+        <w:t>Actor:</w:t>
+      </w:r>
+      <w:r>
+        <w:rPr>
+          <w:rFonts w:hint="default" w:ascii="Times New Roman" w:hAnsi="Times New Roman" w:cs="Times New Roman"/>
+          <w:b w:val="0"/>
+          <w:bCs w:val="0"/>
+          <w:sz w:val="24"/>
+          <w:szCs w:val="24"/>
+          <w:lang w:val="en-US"/>
+        </w:rPr>
+        <w:t xml:space="preserve"> </w:t>
+      </w:r>
+      <w:r>
+        <w:rPr>
+          <w:rFonts w:hint="default" w:ascii="Times New Roman" w:hAnsi="Times New Roman" w:eastAsia="SimSun" w:cs="Times New Roman"/>
+          <w:sz w:val="24"/>
+          <w:szCs w:val="24"/>
+        </w:rPr>
+        <w:t>Partner Supermarket (Corporate Client), Dispatcher</w:t>
+      </w:r>
+    </w:p>
+    <w:p>
+      <w:pPr>
+        <w:numPr>
+          <w:ilvl w:val="0"/>
+          <w:numId w:val="5"/>
+        </w:numPr>
+        <w:tabs>
+          <w:tab w:val="clear" w:pos="420"/>
+        </w:tabs>
+        <w:ind w:left="1600" w:leftChars="0" w:hanging="420" w:firstLineChars="0"/>
+        <w:jc w:val="both"/>
+        <w:rPr>
+          <w:rFonts w:hint="default" w:ascii="Times New Roman" w:hAnsi="Times New Roman" w:cs="Times New Roman"/>
+          <w:b w:val="0"/>
+          <w:bCs w:val="0"/>
+          <w:sz w:val="24"/>
+          <w:szCs w:val="24"/>
+          <w:lang w:val="en-US"/>
+        </w:rPr>
+      </w:pPr>
+      <w:r>
+        <w:rPr>
+          <w:rFonts w:hint="default" w:ascii="Times New Roman" w:hAnsi="Times New Roman" w:cs="Times New Roman"/>
+          <w:b w:val="0"/>
+          <w:bCs w:val="0"/>
+          <w:sz w:val="24"/>
+          <w:szCs w:val="24"/>
+          <w:lang w:val="en-US"/>
+        </w:rPr>
+        <w:t xml:space="preserve">Description: </w:t>
+      </w:r>
+      <w:r>
+        <w:rPr>
+          <w:rFonts w:hint="default" w:ascii="Times New Roman" w:hAnsi="Times New Roman" w:eastAsia="SimSun" w:cs="Times New Roman"/>
+          <w:sz w:val="24"/>
+          <w:szCs w:val="24"/>
+        </w:rPr>
+        <w:t>Processes real-time updates or cancellations of submitted orders before dispatch, updating vehicle allocation statuses instantly.</w:t>
+      </w:r>
+    </w:p>
+    <w:p>
+      <w:pPr>
+        <w:numPr>
+          <w:ilvl w:val="0"/>
+          <w:numId w:val="4"/>
+        </w:numPr>
+        <w:tabs>
+          <w:tab w:val="clear" w:pos="420"/>
+        </w:tabs>
+        <w:ind w:left="1200" w:leftChars="0" w:hanging="420" w:firstLineChars="0"/>
+        <w:jc w:val="both"/>
+        <w:rPr>
+          <w:rFonts w:hint="default" w:ascii="Times New Roman" w:hAnsi="Times New Roman" w:cs="Times New Roman"/>
+          <w:b w:val="0"/>
+          <w:bCs w:val="0"/>
+          <w:sz w:val="24"/>
+          <w:szCs w:val="24"/>
+        </w:rPr>
+      </w:pPr>
+      <w:r>
+        <w:rPr>
+          <w:rFonts w:hint="default" w:ascii="Times New Roman" w:hAnsi="Times New Roman" w:eastAsia="SimSun" w:cs="Times New Roman"/>
+          <w:sz w:val="24"/>
+          <w:szCs w:val="24"/>
+        </w:rPr>
+        <w:t>Automated Invoice Generation</w:t>
+      </w:r>
+      <w:r>
+        <w:rPr>
+          <w:rFonts w:hint="default" w:ascii="Times New Roman" w:hAnsi="Times New Roman" w:cs="Times New Roman"/>
+          <w:b w:val="0"/>
+          <w:bCs w:val="0"/>
+          <w:sz w:val="24"/>
+          <w:szCs w:val="24"/>
+          <w:lang w:val="en-US"/>
+        </w:rPr>
+        <w:t>:</w:t>
+      </w:r>
+    </w:p>
+    <w:p>
+      <w:pPr>
+        <w:numPr>
+          <w:ilvl w:val="0"/>
+          <w:numId w:val="5"/>
+        </w:numPr>
+        <w:tabs>
+          <w:tab w:val="clear" w:pos="420"/>
+        </w:tabs>
+        <w:ind w:left="1600" w:leftChars="0" w:hanging="420" w:firstLineChars="0"/>
+        <w:jc w:val="both"/>
+        <w:rPr>
+          <w:rFonts w:hint="default" w:ascii="Times New Roman" w:hAnsi="Times New Roman" w:cs="Times New Roman"/>
+          <w:b w:val="0"/>
+          <w:bCs w:val="0"/>
+          <w:sz w:val="24"/>
+          <w:szCs w:val="24"/>
+          <w:lang w:val="en-US"/>
+        </w:rPr>
+      </w:pPr>
+      <w:r>
+        <w:rPr>
+          <w:rFonts w:hint="default" w:ascii="Times New Roman" w:hAnsi="Times New Roman" w:cs="Times New Roman"/>
+          <w:b w:val="0"/>
+          <w:bCs w:val="0"/>
+          <w:sz w:val="24"/>
+          <w:szCs w:val="24"/>
+          <w:lang w:val="en-US"/>
+        </w:rPr>
+        <w:t>Actor:</w:t>
+      </w:r>
+      <w:r>
+        <w:rPr>
+          <w:rFonts w:hint="default" w:ascii="Times New Roman" w:hAnsi="Times New Roman" w:cs="Times New Roman"/>
+          <w:b w:val="0"/>
+          <w:bCs w:val="0"/>
+          <w:sz w:val="24"/>
+          <w:szCs w:val="24"/>
+          <w:lang w:val="en-US"/>
+        </w:rPr>
+        <w:t xml:space="preserve"> </w:t>
+      </w:r>
+      <w:r>
+        <w:rPr>
+          <w:rFonts w:hint="default" w:ascii="Times New Roman" w:hAnsi="Times New Roman" w:eastAsia="SimSun" w:cs="Times New Roman"/>
+          <w:sz w:val="24"/>
+          <w:szCs w:val="24"/>
+        </w:rPr>
+        <w:t>Accountant, External Accounting System</w:t>
+      </w:r>
+    </w:p>
+    <w:p>
+      <w:pPr>
+        <w:numPr>
+          <w:ilvl w:val="0"/>
+          <w:numId w:val="5"/>
+        </w:numPr>
+        <w:tabs>
+          <w:tab w:val="clear" w:pos="420"/>
+        </w:tabs>
+        <w:ind w:left="1600" w:leftChars="0" w:hanging="420" w:firstLineChars="0"/>
+        <w:jc w:val="both"/>
+        <w:rPr>
+          <w:rFonts w:hint="default" w:ascii="Times New Roman" w:hAnsi="Times New Roman" w:cs="Times New Roman"/>
+          <w:b w:val="0"/>
+          <w:bCs w:val="0"/>
+          <w:sz w:val="24"/>
+          <w:szCs w:val="24"/>
+          <w:lang w:val="en-US"/>
+        </w:rPr>
+      </w:pPr>
+      <w:r>
+        <w:rPr>
+          <w:rFonts w:hint="default" w:ascii="Times New Roman" w:hAnsi="Times New Roman" w:cs="Times New Roman"/>
+          <w:b w:val="0"/>
+          <w:bCs w:val="0"/>
+          <w:sz w:val="24"/>
+          <w:szCs w:val="24"/>
+          <w:lang w:val="en-US"/>
+        </w:rPr>
+        <w:t xml:space="preserve">Description: </w:t>
+      </w:r>
+      <w:r>
+        <w:rPr>
+          <w:rFonts w:hint="default" w:ascii="Times New Roman" w:hAnsi="Times New Roman" w:eastAsia="SimSun" w:cs="Times New Roman"/>
+          <w:sz w:val="24"/>
+          <w:szCs w:val="24"/>
+        </w:rPr>
+        <w:t>Compiles automated financial summaries immediately upon delivery completion, calculating precise shipping costs and fees.</w:t>
+      </w:r>
+    </w:p>
+    <w:p>
+      <w:pPr>
+        <w:numPr>
+          <w:ilvl w:val="0"/>
+          <w:numId w:val="4"/>
+        </w:numPr>
+        <w:tabs>
+          <w:tab w:val="clear" w:pos="420"/>
+        </w:tabs>
+        <w:ind w:left="1200" w:leftChars="0" w:hanging="420" w:firstLineChars="0"/>
+        <w:jc w:val="both"/>
+        <w:rPr>
+          <w:rFonts w:hint="default" w:ascii="Times New Roman" w:hAnsi="Times New Roman" w:cs="Times New Roman"/>
+          <w:b w:val="0"/>
+          <w:bCs w:val="0"/>
+          <w:sz w:val="24"/>
+          <w:szCs w:val="24"/>
+        </w:rPr>
+      </w:pPr>
+      <w:r>
+        <w:rPr>
+          <w:rFonts w:hint="default" w:ascii="Times New Roman" w:hAnsi="Times New Roman" w:eastAsia="SimSun" w:cs="Times New Roman"/>
+          <w:sz w:val="24"/>
+          <w:szCs w:val="24"/>
+        </w:rPr>
+        <w:t>Payment Reconciliation</w:t>
+      </w:r>
+      <w:r>
+        <w:rPr>
+          <w:rFonts w:hint="default" w:ascii="Times New Roman" w:hAnsi="Times New Roman" w:cs="Times New Roman"/>
+          <w:b w:val="0"/>
+          <w:bCs w:val="0"/>
+          <w:sz w:val="24"/>
+          <w:szCs w:val="24"/>
+          <w:lang w:val="en-US"/>
+        </w:rPr>
+        <w:t>:</w:t>
+      </w:r>
+    </w:p>
+    <w:p>
+      <w:pPr>
+        <w:numPr>
+          <w:ilvl w:val="0"/>
+          <w:numId w:val="5"/>
+        </w:numPr>
+        <w:tabs>
+          <w:tab w:val="clear" w:pos="420"/>
+        </w:tabs>
+        <w:ind w:left="1600" w:leftChars="0" w:hanging="420" w:firstLineChars="0"/>
+        <w:jc w:val="both"/>
+        <w:rPr>
+          <w:rFonts w:hint="default" w:ascii="Times New Roman" w:hAnsi="Times New Roman" w:cs="Times New Roman"/>
+          <w:b w:val="0"/>
+          <w:bCs w:val="0"/>
+          <w:sz w:val="24"/>
+          <w:szCs w:val="24"/>
+          <w:lang w:val="en-US"/>
+        </w:rPr>
+      </w:pPr>
+      <w:r>
+        <w:rPr>
+          <w:rFonts w:hint="default" w:ascii="Times New Roman" w:hAnsi="Times New Roman" w:cs="Times New Roman"/>
+          <w:b w:val="0"/>
+          <w:bCs w:val="0"/>
+          <w:sz w:val="24"/>
+          <w:szCs w:val="24"/>
+          <w:lang w:val="en-US"/>
+        </w:rPr>
+        <w:t>Actor:</w:t>
+      </w:r>
+      <w:r>
+        <w:rPr>
+          <w:rFonts w:hint="default" w:ascii="Times New Roman" w:hAnsi="Times New Roman" w:cs="Times New Roman"/>
+          <w:b w:val="0"/>
+          <w:bCs w:val="0"/>
+          <w:sz w:val="24"/>
+          <w:szCs w:val="24"/>
+          <w:lang w:val="en-US"/>
+        </w:rPr>
+        <w:t xml:space="preserve"> </w:t>
+      </w:r>
+      <w:r>
+        <w:rPr>
+          <w:rFonts w:hint="default" w:ascii="Times New Roman" w:hAnsi="Times New Roman" w:eastAsia="SimSun" w:cs="Times New Roman"/>
+          <w:sz w:val="24"/>
+          <w:szCs w:val="24"/>
+        </w:rPr>
+        <w:t>Accountant, External Accounting System</w:t>
+      </w:r>
+    </w:p>
+    <w:p>
+      <w:pPr>
+        <w:numPr>
+          <w:ilvl w:val="0"/>
+          <w:numId w:val="5"/>
+        </w:numPr>
+        <w:tabs>
+          <w:tab w:val="clear" w:pos="420"/>
+        </w:tabs>
+        <w:ind w:left="1600" w:leftChars="0" w:hanging="420" w:firstLineChars="0"/>
+        <w:jc w:val="both"/>
+        <w:rPr>
+          <w:rFonts w:hint="default" w:ascii="Times New Roman" w:hAnsi="Times New Roman" w:cs="Times New Roman"/>
+          <w:b w:val="0"/>
+          <w:bCs w:val="0"/>
+          <w:sz w:val="24"/>
+          <w:szCs w:val="24"/>
+          <w:lang w:val="en-US"/>
+        </w:rPr>
+      </w:pPr>
+      <w:r>
+        <w:rPr>
+          <w:rFonts w:hint="default" w:ascii="Times New Roman" w:hAnsi="Times New Roman" w:cs="Times New Roman"/>
+          <w:b w:val="0"/>
+          <w:bCs w:val="0"/>
+          <w:sz w:val="24"/>
+          <w:szCs w:val="24"/>
+          <w:lang w:val="en-US"/>
+        </w:rPr>
+        <w:t xml:space="preserve">Description: </w:t>
+      </w:r>
+      <w:r>
+        <w:rPr>
+          <w:rFonts w:hint="default" w:ascii="Times New Roman" w:hAnsi="Times New Roman" w:eastAsia="SimSun" w:cs="Times New Roman"/>
+          <w:sz w:val="24"/>
+          <w:szCs w:val="24"/>
+        </w:rPr>
+        <w:t>Cross-references automated billing files with third-party transaction logs to confirm payments and resolve invoicing errors.</w:t>
+      </w:r>
+    </w:p>
+    <w:p>
+      <w:pPr>
+        <w:numPr>
           <w:numId w:val="0"/>
         </w:numPr>
-        <w:spacing w:line="240" w:lineRule="auto"/>
-        <w:jc w:val="both"/>
-        <w:rPr>
-          <w:rFonts w:hint="default" w:ascii="Times New Roman" w:hAnsi="Times New Roman" w:cs="Times New Roman"/>
-          <w:b w:val="0"/>
-          <w:bCs w:val="0"/>
-          <w:sz w:val="23"/>
-          <w:szCs w:val="23"/>
-          <w:lang w:val="en-US"/>
-        </w:rPr>
-      </w:pPr>
-    </w:p>
-    <w:p>
-      <w:pPr>
-        <w:spacing w:line="240" w:lineRule="auto"/>
-        <w:rPr>
-          <w:rFonts w:hint="default" w:ascii="Times New Roman" w:hAnsi="Times New Roman" w:cs="Times New Roman"/>
-          <w:lang w:val="en-US"/>
-        </w:rPr>
-      </w:pPr>
-    </w:p>
-    <w:p>
-      <w:pPr>
-        <w:spacing w:line="240" w:lineRule="auto"/>
-        <w:rPr>
-          <w:rFonts w:hint="default" w:ascii="Times New Roman" w:hAnsi="Times New Roman" w:cs="Times New Roman"/>
-          <w:lang w:val="en-US"/>
-        </w:rPr>
-      </w:pPr>
-    </w:p>
-    <w:p>
-      <w:pPr>
-        <w:spacing w:line="240" w:lineRule="auto"/>
-        <w:rPr>
-          <w:rFonts w:hint="default" w:ascii="Times New Roman" w:hAnsi="Times New Roman" w:cs="Times New Roman"/>
-          <w:lang w:val="en-US"/>
-        </w:rPr>
-      </w:pPr>
-      <w:r>
-        <w:rPr>
-          <w:rFonts w:hint="default" w:ascii="Times New Roman" w:hAnsi="Times New Roman" w:cs="Times New Roman"/>
-        </w:rPr>
-        <w:fldChar w:fldCharType="end"/>
-      </w:r>
-    </w:p>
-    <w:p>
-      <w:pPr>
-        <w:spacing w:line="240" w:lineRule="auto"/>
-        <w:rPr>
-          <w:rFonts w:hint="default" w:ascii="Times New Roman" w:hAnsi="Times New Roman" w:cs="Times New Roman"/>
-          <w:lang w:val="en-US"/>
-        </w:rPr>
-      </w:pPr>
-    </w:p>
-    <w:p>
-      <w:pPr>
-        <w:spacing w:line="240" w:lineRule="auto"/>
-        <w:rPr>
-          <w:rFonts w:hint="default" w:ascii="Times New Roman" w:hAnsi="Times New Roman" w:cs="Times New Roman"/>
-          <w:lang w:val="en-US"/>
-        </w:rPr>
-      </w:pPr>
-    </w:p>
-    <w:p>
-      <w:pPr>
-        <w:spacing w:line="240" w:lineRule="auto"/>
-        <w:rPr>
-          <w:rFonts w:hint="default" w:ascii="Times New Roman" w:hAnsi="Times New Roman" w:cs="Times New Roman"/>
-          <w:lang w:val="en-US"/>
-        </w:rPr>
-      </w:pPr>
-    </w:p>
-    <w:p>
-      <w:pPr>
-        <w:spacing w:line="240" w:lineRule="auto"/>
-        <w:rPr>
-          <w:rFonts w:hint="default" w:ascii="Times New Roman" w:hAnsi="Times New Roman" w:cs="Times New Roman"/>
+        <w:jc w:val="both"/>
+        <w:rPr>
+          <w:rFonts w:hint="default" w:ascii="Times New Roman" w:hAnsi="Times New Roman" w:cs="Times New Roman"/>
+          <w:b w:val="0"/>
+          <w:bCs w:val="0"/>
+          <w:sz w:val="24"/>
+          <w:szCs w:val="24"/>
+          <w:lang w:val="en-US"/>
+        </w:rPr>
+      </w:pPr>
+    </w:p>
+    <w:p>
+      <w:pPr>
+        <w:numPr>
+          <w:numId w:val="0"/>
+        </w:numPr>
+        <w:jc w:val="both"/>
+        <w:rPr>
+          <w:rFonts w:hint="default" w:ascii="Times New Roman" w:hAnsi="Times New Roman" w:cs="Times New Roman"/>
+          <w:b w:val="0"/>
+          <w:bCs w:val="0"/>
+          <w:sz w:val="24"/>
+          <w:szCs w:val="24"/>
+          <w:lang w:val="en-US"/>
+        </w:rPr>
+      </w:pPr>
+    </w:p>
+    <w:p>
+      <w:pPr>
+        <w:numPr>
+          <w:numId w:val="0"/>
+        </w:numPr>
+        <w:jc w:val="both"/>
+        <w:rPr>
+          <w:rFonts w:hint="default" w:ascii="Times New Roman" w:hAnsi="Times New Roman" w:cs="Times New Roman"/>
+          <w:b w:val="0"/>
+          <w:bCs w:val="0"/>
+          <w:sz w:val="24"/>
+          <w:szCs w:val="24"/>
+          <w:lang w:val="en-US"/>
+        </w:rPr>
+      </w:pPr>
+    </w:p>
+    <w:p>
+      <w:pPr>
+        <w:numPr>
+          <w:numId w:val="0"/>
+        </w:numPr>
+        <w:jc w:val="both"/>
+        <w:rPr>
+          <w:rFonts w:hint="default" w:ascii="Times New Roman" w:hAnsi="Times New Roman" w:cs="Times New Roman"/>
+          <w:b w:val="0"/>
+          <w:bCs w:val="0"/>
+          <w:sz w:val="24"/>
+          <w:szCs w:val="24"/>
+          <w:lang w:val="en-US"/>
+        </w:rPr>
+      </w:pPr>
+    </w:p>
+    <w:p>
+      <w:pPr>
+        <w:rPr>
+          <w:rFonts w:hint="default" w:ascii="Times New Roman" w:hAnsi="Times New Roman" w:cs="Times New Roman"/>
+          <w:lang w:val="en-US"/>
+        </w:rPr>
+      </w:pPr>
+    </w:p>
+    <w:p>
+      <w:pPr>
+        <w:rPr>
+          <w:rFonts w:hint="default" w:ascii="Times New Roman" w:hAnsi="Times New Roman" w:cs="Times New Roman"/>
+          <w:lang w:val="en-US"/>
+        </w:rPr>
+      </w:pPr>
+    </w:p>
+    <w:p>
+      <w:pPr>
+        <w:numPr>
+          <w:numId w:val="0"/>
+        </w:numPr>
+        <w:jc w:val="both"/>
+        <w:rPr>
+          <w:rFonts w:hint="default" w:ascii="Times New Roman" w:hAnsi="Times New Roman" w:cs="Times New Roman"/>
+          <w:b w:val="0"/>
+          <w:bCs w:val="0"/>
+          <w:sz w:val="24"/>
+          <w:szCs w:val="24"/>
+        </w:rPr>
+      </w:pPr>
+    </w:p>
+    <w:p>
+      <w:pPr>
+        <w:numPr>
+          <w:numId w:val="0"/>
+        </w:numPr>
+        <w:jc w:val="both"/>
+        <w:rPr>
+          <w:rFonts w:hint="default" w:ascii="Times New Roman" w:hAnsi="Times New Roman" w:cs="Times New Roman"/>
+          <w:b w:val="0"/>
+          <w:bCs w:val="0"/>
+          <w:sz w:val="24"/>
+          <w:szCs w:val="24"/>
+        </w:rPr>
+      </w:pPr>
+    </w:p>
+    <w:p>
+      <w:pPr>
+        <w:numPr>
+          <w:numId w:val="0"/>
+        </w:numPr>
+        <w:jc w:val="both"/>
+        <w:rPr>
+          <w:rFonts w:hint="default" w:ascii="Times New Roman" w:hAnsi="Times New Roman" w:cs="Times New Roman"/>
+          <w:b w:val="0"/>
+          <w:bCs w:val="0"/>
+          <w:sz w:val="24"/>
+          <w:szCs w:val="24"/>
+        </w:rPr>
+      </w:pPr>
+    </w:p>
+    <w:p>
+      <w:pPr>
+        <w:rPr>
+          <w:rFonts w:hint="default" w:ascii="Times New Roman" w:hAnsi="Times New Roman" w:cs="Times New Roman"/>
+          <w:lang w:val="en-US"/>
+        </w:rPr>
+      </w:pPr>
+    </w:p>
+    <w:p>
+      <w:pPr>
+        <w:numPr>
+          <w:numId w:val="0"/>
+        </w:numPr>
+        <w:jc w:val="both"/>
+        <w:rPr>
+          <w:rFonts w:hint="default" w:ascii="Times New Roman" w:hAnsi="Times New Roman" w:cs="Times New Roman"/>
+          <w:b w:val="0"/>
+          <w:bCs w:val="0"/>
+          <w:sz w:val="24"/>
+          <w:szCs w:val="24"/>
+        </w:rPr>
+      </w:pPr>
+    </w:p>
+    <w:p>
+      <w:pPr>
+        <w:numPr>
+          <w:numId w:val="0"/>
+        </w:numPr>
+        <w:ind w:left="780" w:leftChars="0"/>
+        <w:jc w:val="both"/>
+        <w:rPr>
+          <w:rFonts w:hint="default" w:ascii="Times New Roman" w:hAnsi="Times New Roman" w:cs="Times New Roman"/>
+          <w:sz w:val="24"/>
+          <w:szCs w:val="24"/>
+          <w:lang w:val="en-US"/>
+        </w:rPr>
+      </w:pPr>
+      <w:r>
+        <w:rPr>
+          <w:rFonts w:hint="default" w:ascii="Times New Roman" w:hAnsi="Times New Roman" w:eastAsia="Symbol" w:cs="Times New Roman"/>
+          <w:sz w:val="24"/>
+          <w:szCs w:val="24"/>
+        </w:rPr>
+        <w:t>·</w:t>
+      </w:r>
+      <w:r>
+        <w:rPr>
+          <w:rFonts w:hint="default" w:ascii="Times New Roman" w:hAnsi="Times New Roman" w:eastAsia="SimSun" w:cs="Times New Roman"/>
+          <w:sz w:val="24"/>
+          <w:szCs w:val="24"/>
+        </w:rPr>
+        <w:t xml:space="preserve">  </w:t>
+      </w:r>
+    </w:p>
+    <w:p>
+      <w:pPr>
+        <w:spacing w:line="240" w:lineRule="auto"/>
+        <w:rPr>
+          <w:rFonts w:hint="default" w:ascii="Times New Roman" w:hAnsi="Times New Roman" w:cs="Times New Roman"/>
+          <w:sz w:val="24"/>
+          <w:szCs w:val="24"/>
+          <w:lang w:val="en-US"/>
+        </w:rPr>
+      </w:pPr>
+    </w:p>
+    <w:p>
+      <w:pPr>
+        <w:spacing w:line="240" w:lineRule="auto"/>
+        <w:rPr>
+          <w:rFonts w:hint="default" w:ascii="Times New Roman" w:hAnsi="Times New Roman" w:cs="Times New Roman"/>
+          <w:sz w:val="24"/>
+          <w:szCs w:val="24"/>
           <w:lang w:val="en-US"/>
         </w:rPr>
       </w:pPr>
@@ -4440,6 +6966,50 @@
 <file path=word/numbering.xml><?xml version="1.0" encoding="utf-8"?>
 <w:numbering xmlns:wpc="http://schemas.microsoft.com/office/word/2010/wordprocessingCanvas" xmlns:mc="http://schemas.openxmlformats.org/markup-compatibility/2006" xmlns:o="urn:schemas-microsoft-com:office:office" xmlns:r="http://schemas.openxmlformats.org/officeDocument/2006/relationships" xmlns:m="http://schemas.openxmlformats.org/officeDocument/2006/math" xmlns:v="urn:schemas-microsoft-com:vml" xmlns:wp14="http://schemas.microsoft.com/office/word/2010/wordprocessingDrawing" xmlns:wp="http://schemas.openxmlformats.org/drawingml/2006/wordprocessingDrawing" xmlns:w10="urn:schemas-microsoft-com:office:word" xmlns:w="http://schemas.openxmlformats.org/wordprocessingml/2006/main" xmlns:w14="http://schemas.microsoft.com/office/word/2010/wordml" xmlns:wpg="http://schemas.microsoft.com/office/word/2010/wordprocessingGroup" xmlns:wpi="http://schemas.microsoft.com/office/word/2010/wordprocessingInk" xmlns:wne="http://schemas.microsoft.com/office/word/2006/wordml" xmlns:wps="http://schemas.microsoft.com/office/word/2010/wordprocessingShape" xmlns:wpsCustomData="http://www.wps.cn/officeDocument/2013/wpsCustomData" mc:Ignorable="w14 wp14">
   <w:abstractNum w:abstractNumId="0">
+    <w:nsid w:val="885082D2"/>
+    <w:multiLevelType w:val="singleLevel"/>
+    <w:tmpl w:val="885082D2"/>
+    <w:lvl w:ilvl="0" w:tentative="0">
+      <w:start w:val="1"/>
+      <w:numFmt w:val="bullet"/>
+      <w:lvlText w:val=""/>
+      <w:lvlJc w:val="left"/>
+      <w:pPr>
+        <w:tabs>
+          <w:tab w:val="left" w:pos="420"/>
+        </w:tabs>
+        <w:ind w:left="420" w:leftChars="0" w:hanging="420" w:firstLineChars="0"/>
+      </w:pPr>
+      <w:rPr>
+        <w:rFonts w:hint="default" w:ascii="Wingdings" w:hAnsi="Wingdings"/>
+        <w:sz w:val="15"/>
+        <w:szCs w:val="15"/>
+      </w:rPr>
+    </w:lvl>
+  </w:abstractNum>
+  <w:abstractNum w:abstractNumId="1">
+    <w:nsid w:val="AE377A29"/>
+    <w:multiLevelType w:val="singleLevel"/>
+    <w:tmpl w:val="AE377A29"/>
+    <w:lvl w:ilvl="0" w:tentative="0">
+      <w:start w:val="1"/>
+      <w:numFmt w:val="bullet"/>
+      <w:lvlText w:val=""/>
+      <w:lvlJc w:val="left"/>
+      <w:pPr>
+        <w:tabs>
+          <w:tab w:val="left" w:pos="420"/>
+        </w:tabs>
+        <w:ind w:left="420" w:leftChars="0" w:hanging="420" w:firstLineChars="0"/>
+      </w:pPr>
+      <w:rPr>
+        <w:rFonts w:hint="default" w:ascii="Wingdings" w:hAnsi="Wingdings"/>
+        <w:sz w:val="15"/>
+        <w:szCs w:val="15"/>
+      </w:rPr>
+    </w:lvl>
+  </w:abstractNum>
+  <w:abstractNum w:abstractNumId="2">
     <w:nsid w:val="0C602426"/>
     <w:multiLevelType w:val="singleLevel"/>
     <w:tmpl w:val="0C602426"/>
@@ -4461,7 +7031,7 @@
       </w:rPr>
     </w:lvl>
   </w:abstractNum>
-  <w:abstractNum w:abstractNumId="1">
+  <w:abstractNum w:abstractNumId="3">
     <w:nsid w:val="66DBB6E0"/>
     <w:multiLevelType w:val="singleLevel"/>
     <w:tmpl w:val="66DBB6E0"/>
@@ -4483,7 +7053,7 @@
       </w:rPr>
     </w:lvl>
   </w:abstractNum>
-  <w:abstractNum w:abstractNumId="2">
+  <w:abstractNum w:abstractNumId="4">
     <w:nsid w:val="7C9548D4"/>
     <w:multiLevelType w:val="singleLevel"/>
     <w:tmpl w:val="7C9548D4"/>
@@ -4506,13 +7076,19 @@
     </w:lvl>
   </w:abstractNum>
   <w:num w:numId="1">
-    <w:abstractNumId w:val="0"/>
+    <w:abstractNumId w:val="2"/>
   </w:num>
   <w:num w:numId="2">
-    <w:abstractNumId w:val="2"/>
+    <w:abstractNumId w:val="4"/>
   </w:num>
   <w:num w:numId="3">
+    <w:abstractNumId w:val="3"/>
+  </w:num>
+  <w:num w:numId="4">
     <w:abstractNumId w:val="1"/>
+  </w:num>
+  <w:num w:numId="5">
+    <w:abstractNumId w:val="0"/>
   </w:num>
 </w:numbering>
 </file>

</xml_diff>

<commit_message>
Add PART d sTRUCTURE
</commit_message>
<xml_diff>
--- a/Assignments/Assignment1/Team Report.docx
+++ b/Assignments/Assignment1/Team Report.docx
@@ -1340,6 +1340,13 @@
           <w:lang w:val="en-US"/>
         </w:rPr>
         <w:tab/>
+      </w:r>
+      <w:r>
+        <w:rPr>
+          <w:rStyle w:val="14"/>
+          <w:rFonts w:hint="default" w:ascii="Times New Roman" w:hAnsi="Times New Roman" w:cs="Times New Roman"/>
+          <w:lang w:val="en-US"/>
+        </w:rPr>
         <w:t>…………………………………………..</w:t>
       </w:r>
       <w:r>
@@ -1747,27 +1754,7 @@
           <w:szCs w:val="28"/>
           <w:lang w:val="en-US"/>
         </w:rPr>
-        <w:t>3</w:t>
-      </w:r>
-      <w:r>
-        <w:rPr>
-          <w:rStyle w:val="14"/>
-          <w:rFonts w:hint="default" w:ascii="Times New Roman" w:hAnsi="Times New Roman" w:cs="Times New Roman"/>
-          <w:sz w:val="28"/>
-          <w:szCs w:val="28"/>
-          <w:lang w:val="en-US"/>
-        </w:rPr>
-        <w:t xml:space="preserve">.1: </w:t>
-      </w:r>
-      <w:r>
-        <w:rPr>
-          <w:rStyle w:val="14"/>
-          <w:rFonts w:hint="default" w:ascii="Times New Roman" w:hAnsi="Times New Roman" w:cs="Times New Roman"/>
-          <w:sz w:val="28"/>
-          <w:szCs w:val="28"/>
-          <w:lang w:val="en-US"/>
-        </w:rPr>
-        <w:t>Pain Points</w:t>
+        <w:t>3.1: Pain Points</w:t>
       </w:r>
       <w:r>
         <w:rPr>
@@ -1777,37 +1764,7 @@
           <w:szCs w:val="32"/>
           <w:lang w:val="en-US"/>
         </w:rPr>
-        <w:t>…</w:t>
-      </w:r>
-      <w:r>
-        <w:rPr>
-          <w:rStyle w:val="14"/>
-          <w:rFonts w:hint="default" w:ascii="Times New Roman" w:hAnsi="Times New Roman" w:cs="Times New Roman"/>
-          <w:sz w:val="32"/>
-          <w:szCs w:val="32"/>
-          <w:lang w:val="en-US"/>
-        </w:rPr>
-        <w:t>...</w:t>
-      </w:r>
-      <w:r>
-        <w:rPr>
-          <w:rStyle w:val="14"/>
-          <w:rFonts w:hint="default" w:ascii="Times New Roman" w:hAnsi="Times New Roman" w:cs="Times New Roman"/>
-          <w:sz w:val="32"/>
-          <w:szCs w:val="32"/>
-          <w:lang w:val="en-US"/>
-        </w:rPr>
-        <w:t>…………………………………</w:t>
-      </w:r>
-      <w:r>
-        <w:rPr>
-          <w:rStyle w:val="14"/>
-          <w:rFonts w:hint="default" w:ascii="Times New Roman" w:hAnsi="Times New Roman" w:cs="Times New Roman"/>
-          <w:sz w:val="32"/>
-          <w:szCs w:val="32"/>
-          <w:lang w:val="en-US"/>
-        </w:rPr>
-        <w:t>..............</w:t>
+        <w:t>…...…………………………………..............</w:t>
       </w:r>
       <w:r>
         <w:rPr>
@@ -1842,37 +1799,7 @@
           <w:szCs w:val="28"/>
           <w:lang w:val="en-US"/>
         </w:rPr>
-        <w:t>3.</w:t>
-      </w:r>
-      <w:r>
-        <w:rPr>
-          <w:rStyle w:val="14"/>
-          <w:rFonts w:hint="default" w:ascii="Times New Roman" w:hAnsi="Times New Roman" w:cs="Times New Roman"/>
-          <w:sz w:val="28"/>
-          <w:szCs w:val="28"/>
-          <w:lang w:val="en-US"/>
-        </w:rPr>
-        <w:t>2</w:t>
-      </w:r>
-      <w:r>
-        <w:rPr>
-          <w:rStyle w:val="14"/>
-          <w:rFonts w:hint="default" w:ascii="Times New Roman" w:hAnsi="Times New Roman" w:cs="Times New Roman"/>
-          <w:sz w:val="28"/>
-          <w:szCs w:val="28"/>
-          <w:lang w:val="en-US"/>
-        </w:rPr>
-        <w:t xml:space="preserve">: </w:t>
-      </w:r>
-      <w:r>
-        <w:rPr>
-          <w:rStyle w:val="14"/>
-          <w:rFonts w:hint="default" w:ascii="Times New Roman" w:hAnsi="Times New Roman" w:cs="Times New Roman"/>
-          <w:sz w:val="28"/>
-          <w:szCs w:val="28"/>
-          <w:lang w:val="en-US"/>
-        </w:rPr>
-        <w:t>Domain Entities</w:t>
+        <w:t>3.2: Domain Entities</w:t>
       </w:r>
       <w:r>
         <w:rPr>
@@ -1882,27 +1809,7 @@
           <w:szCs w:val="32"/>
           <w:lang w:val="en-US"/>
         </w:rPr>
-        <w:t>…...………………………………….....</w:t>
-      </w:r>
-      <w:r>
-        <w:rPr>
-          <w:rStyle w:val="14"/>
-          <w:rFonts w:hint="default" w:ascii="Times New Roman" w:hAnsi="Times New Roman" w:cs="Times New Roman"/>
-          <w:sz w:val="32"/>
-          <w:szCs w:val="32"/>
-          <w:lang w:val="en-US"/>
-        </w:rPr>
-        <w:t>.</w:t>
-      </w:r>
-      <w:r>
-        <w:rPr>
-          <w:rStyle w:val="14"/>
-          <w:rFonts w:hint="default" w:ascii="Times New Roman" w:hAnsi="Times New Roman" w:cs="Times New Roman"/>
-          <w:sz w:val="32"/>
-          <w:szCs w:val="32"/>
-          <w:lang w:val="en-US"/>
-        </w:rPr>
-        <w:t>.</w:t>
+        <w:t>…...………………………………….......</w:t>
       </w:r>
       <w:r>
         <w:rPr>
@@ -1937,37 +1844,7 @@
           <w:szCs w:val="28"/>
           <w:lang w:val="en-US"/>
         </w:rPr>
-        <w:t>3.</w:t>
-      </w:r>
-      <w:r>
-        <w:rPr>
-          <w:rStyle w:val="14"/>
-          <w:rFonts w:hint="default" w:ascii="Times New Roman" w:hAnsi="Times New Roman" w:cs="Times New Roman"/>
-          <w:sz w:val="28"/>
-          <w:szCs w:val="28"/>
-          <w:lang w:val="en-US"/>
-        </w:rPr>
-        <w:t>3</w:t>
-      </w:r>
-      <w:r>
-        <w:rPr>
-          <w:rStyle w:val="14"/>
-          <w:rFonts w:hint="default" w:ascii="Times New Roman" w:hAnsi="Times New Roman" w:cs="Times New Roman"/>
-          <w:sz w:val="28"/>
-          <w:szCs w:val="28"/>
-          <w:lang w:val="en-US"/>
-        </w:rPr>
-        <w:t xml:space="preserve">: </w:t>
-      </w:r>
-      <w:r>
-        <w:rPr>
-          <w:rStyle w:val="14"/>
-          <w:rFonts w:hint="default" w:ascii="Times New Roman" w:hAnsi="Times New Roman" w:cs="Times New Roman"/>
-          <w:sz w:val="28"/>
-          <w:szCs w:val="28"/>
-          <w:lang w:val="en-US"/>
-        </w:rPr>
-        <w:t>Actors</w:t>
+        <w:t>3.3: Actors</w:t>
       </w:r>
       <w:r>
         <w:rPr>
@@ -1977,47 +1854,7 @@
           <w:szCs w:val="32"/>
           <w:lang w:val="en-US"/>
         </w:rPr>
-        <w:t>…...…………</w:t>
-      </w:r>
-      <w:r>
-        <w:rPr>
-          <w:rStyle w:val="14"/>
-          <w:rFonts w:hint="default" w:ascii="Times New Roman" w:hAnsi="Times New Roman" w:cs="Times New Roman"/>
-          <w:sz w:val="32"/>
-          <w:szCs w:val="32"/>
-          <w:lang w:val="en-US"/>
-        </w:rPr>
-        <w:t>..............</w:t>
-      </w:r>
-      <w:r>
-        <w:rPr>
-          <w:rStyle w:val="14"/>
-          <w:rFonts w:hint="default" w:ascii="Times New Roman" w:hAnsi="Times New Roman" w:cs="Times New Roman"/>
-          <w:sz w:val="32"/>
-          <w:szCs w:val="32"/>
-          <w:lang w:val="en-US"/>
-        </w:rPr>
-        <w:t>……………………….....</w:t>
-      </w:r>
-      <w:r>
-        <w:rPr>
-          <w:rStyle w:val="14"/>
-          <w:rFonts w:hint="default" w:ascii="Times New Roman" w:hAnsi="Times New Roman" w:cs="Times New Roman"/>
-          <w:sz w:val="32"/>
-          <w:szCs w:val="32"/>
-          <w:lang w:val="en-US"/>
-        </w:rPr>
-        <w:t>.</w:t>
-      </w:r>
-      <w:r>
-        <w:rPr>
-          <w:rStyle w:val="14"/>
-          <w:rFonts w:hint="default" w:ascii="Times New Roman" w:hAnsi="Times New Roman" w:cs="Times New Roman"/>
-          <w:sz w:val="32"/>
-          <w:szCs w:val="32"/>
-          <w:lang w:val="en-US"/>
-        </w:rPr>
-        <w:t>.</w:t>
+        <w:t>…...…………..............……………………….......</w:t>
       </w:r>
       <w:r>
         <w:rPr>
@@ -2034,7 +1871,7 @@
       <w:pPr>
         <w:bidi w:val="0"/>
         <w:spacing w:line="360" w:lineRule="auto"/>
-        <w:ind w:left="400" w:leftChars="100" w:firstLine="0" w:firstLineChars="0"/>
+        <w:ind w:left="0" w:leftChars="0" w:firstLine="0" w:firstLineChars="0"/>
         <w:rPr>
           <w:rFonts w:hint="default" w:ascii="Times New Roman" w:hAnsi="Times New Roman" w:cs="Times New Roman"/>
           <w:b/>
@@ -2044,6 +1881,76 @@
           <w:lang w:val="en-US"/>
         </w:rPr>
       </w:pPr>
+      <w:r>
+        <w:rPr>
+          <w:rStyle w:val="14"/>
+          <w:rFonts w:hint="default" w:ascii="Times New Roman" w:hAnsi="Times New Roman" w:cs="Times New Roman"/>
+          <w:sz w:val="32"/>
+          <w:szCs w:val="32"/>
+          <w:lang w:val="en-US"/>
+        </w:rPr>
+        <w:t xml:space="preserve">Part </w:t>
+      </w:r>
+      <w:r>
+        <w:rPr>
+          <w:rStyle w:val="14"/>
+          <w:rFonts w:hint="default" w:cs="Times New Roman"/>
+          <w:sz w:val="32"/>
+          <w:szCs w:val="32"/>
+          <w:lang w:val="en-US"/>
+        </w:rPr>
+        <w:t>D</w:t>
+      </w:r>
+      <w:r>
+        <w:rPr>
+          <w:rStyle w:val="14"/>
+          <w:rFonts w:hint="default" w:ascii="Times New Roman" w:hAnsi="Times New Roman" w:cs="Times New Roman"/>
+          <w:sz w:val="32"/>
+          <w:szCs w:val="32"/>
+          <w:lang w:val="en-US"/>
+        </w:rPr>
+        <w:t xml:space="preserve">: </w:t>
+      </w:r>
+      <w:r>
+        <w:rPr>
+          <w:rStyle w:val="14"/>
+          <w:rFonts w:hint="default" w:cs="Times New Roman"/>
+          <w:sz w:val="32"/>
+          <w:szCs w:val="32"/>
+          <w:lang w:val="en-US"/>
+        </w:rPr>
+        <w:t>Functional Requirements and Task Descriptions</w:t>
+      </w:r>
+      <w:r>
+        <w:rPr>
+          <w:rStyle w:val="14"/>
+          <w:rFonts w:hint="default" w:ascii="Times New Roman" w:hAnsi="Times New Roman" w:cs="Times New Roman"/>
+          <w:sz w:val="32"/>
+          <w:szCs w:val="32"/>
+          <w:lang w:val="en-US"/>
+        </w:rPr>
+        <w:t>…</w:t>
+      </w:r>
+      <w:r>
+        <w:rPr>
+          <w:rStyle w:val="14"/>
+          <w:rFonts w:hint="default" w:cs="Times New Roman"/>
+          <w:sz w:val="32"/>
+          <w:szCs w:val="32"/>
+          <w:lang w:val="en-US"/>
+        </w:rPr>
+        <w:t>.</w:t>
+      </w:r>
+      <w:r>
+        <w:rPr>
+          <w:rStyle w:val="14"/>
+          <w:rFonts w:hint="default" w:cs="Times New Roman"/>
+          <w:sz w:val="25"/>
+          <w:szCs w:val="25"/>
+          <w:lang w:val="en-US"/>
+        </w:rPr>
+        <w:t>9</w:t>
+      </w:r>
     </w:p>
     <w:p>
       <w:pPr>
@@ -2059,6 +1966,56 @@
           <w:lang w:val="en-US"/>
         </w:rPr>
       </w:pPr>
+      <w:r>
+        <w:rPr>
+          <w:rStyle w:val="14"/>
+          <w:rFonts w:hint="default" w:cs="Times New Roman"/>
+          <w:sz w:val="28"/>
+          <w:szCs w:val="28"/>
+          <w:lang w:val="en-US"/>
+        </w:rPr>
+        <w:t>4</w:t>
+      </w:r>
+      <w:r>
+        <w:rPr>
+          <w:rStyle w:val="14"/>
+          <w:rFonts w:hint="default" w:ascii="Times New Roman" w:hAnsi="Times New Roman" w:cs="Times New Roman"/>
+          <w:sz w:val="28"/>
+          <w:szCs w:val="28"/>
+          <w:lang w:val="en-US"/>
+        </w:rPr>
+        <w:t xml:space="preserve">.1: </w:t>
+      </w:r>
+      <w:r>
+        <w:rPr>
+          <w:rStyle w:val="14"/>
+          <w:rFonts w:hint="default" w:cs="Times New Roman"/>
+          <w:sz w:val="28"/>
+          <w:szCs w:val="28"/>
+          <w:lang w:val="en-US"/>
+        </w:rPr>
+        <w:t>User and Access Management</w:t>
+      </w:r>
+      <w:r>
+        <w:rPr>
+          <w:rStyle w:val="14"/>
+          <w:rFonts w:hint="default" w:ascii="Times New Roman" w:hAnsi="Times New Roman" w:cs="Times New Roman"/>
+          <w:sz w:val="32"/>
+          <w:szCs w:val="32"/>
+          <w:lang w:val="en-US"/>
+        </w:rPr>
+        <w:t>…………………………</w:t>
+      </w:r>
+      <w:r>
+        <w:rPr>
+          <w:rStyle w:val="14"/>
+          <w:rFonts w:hint="default" w:cs="Times New Roman"/>
+          <w:sz w:val="32"/>
+          <w:szCs w:val="32"/>
+          <w:lang w:val="en-US"/>
+        </w:rPr>
+        <w:t>.....x</w:t>
+      </w:r>
     </w:p>
     <w:p>
       <w:pPr>
@@ -2074,6 +2031,76 @@
           <w:lang w:val="en-US"/>
         </w:rPr>
       </w:pPr>
+      <w:r>
+        <w:rPr>
+          <w:rStyle w:val="14"/>
+          <w:rFonts w:hint="default" w:cs="Times New Roman"/>
+          <w:sz w:val="28"/>
+          <w:szCs w:val="28"/>
+          <w:lang w:val="en-US"/>
+        </w:rPr>
+        <w:t>4</w:t>
+      </w:r>
+      <w:r>
+        <w:rPr>
+          <w:rStyle w:val="14"/>
+          <w:rFonts w:hint="default" w:ascii="Times New Roman" w:hAnsi="Times New Roman" w:cs="Times New Roman"/>
+          <w:sz w:val="28"/>
+          <w:szCs w:val="28"/>
+          <w:lang w:val="en-US"/>
+        </w:rPr>
+        <w:t>.</w:t>
+      </w:r>
+      <w:r>
+        <w:rPr>
+          <w:rStyle w:val="14"/>
+          <w:rFonts w:hint="default" w:cs="Times New Roman"/>
+          <w:sz w:val="28"/>
+          <w:szCs w:val="28"/>
+          <w:lang w:val="en-US"/>
+        </w:rPr>
+        <w:t>2</w:t>
+      </w:r>
+      <w:r>
+        <w:rPr>
+          <w:rStyle w:val="14"/>
+          <w:rFonts w:hint="default" w:ascii="Times New Roman" w:hAnsi="Times New Roman" w:cs="Times New Roman"/>
+          <w:sz w:val="28"/>
+          <w:szCs w:val="28"/>
+          <w:lang w:val="en-US"/>
+        </w:rPr>
+        <w:t xml:space="preserve">: </w:t>
+      </w:r>
+      <w:r>
+        <w:rPr>
+          <w:rStyle w:val="14"/>
+          <w:rFonts w:hint="default" w:cs="Times New Roman"/>
+          <w:sz w:val="28"/>
+          <w:szCs w:val="28"/>
+          <w:lang w:val="en-US"/>
+        </w:rPr>
+        <w:t xml:space="preserve">Branch and Hub Setup........... </w:t>
+      </w:r>
+      <w:r>
+        <w:rPr>
+          <w:rStyle w:val="14"/>
+          <w:rFonts w:hint="default" w:ascii="Times New Roman" w:hAnsi="Times New Roman" w:cs="Times New Roman"/>
+          <w:sz w:val="32"/>
+          <w:szCs w:val="32"/>
+          <w:lang w:val="en-US"/>
+        </w:rPr>
+        <w:t>…………………………</w:t>
+      </w:r>
+      <w:r>
+        <w:rPr>
+          <w:rStyle w:val="14"/>
+          <w:rFonts w:hint="default" w:cs="Times New Roman"/>
+          <w:sz w:val="32"/>
+          <w:szCs w:val="32"/>
+          <w:lang w:val="en-US"/>
+        </w:rPr>
+        <w:t>.....x</w:t>
+      </w:r>
     </w:p>
     <w:p>
       <w:pPr>
@@ -2089,6 +2116,76 @@
           <w:lang w:val="en-US"/>
         </w:rPr>
       </w:pPr>
+      <w:r>
+        <w:rPr>
+          <w:rStyle w:val="14"/>
+          <w:rFonts w:hint="default" w:cs="Times New Roman"/>
+          <w:sz w:val="28"/>
+          <w:szCs w:val="28"/>
+          <w:lang w:val="en-US"/>
+        </w:rPr>
+        <w:t>4</w:t>
+      </w:r>
+      <w:r>
+        <w:rPr>
+          <w:rStyle w:val="14"/>
+          <w:rFonts w:hint="default" w:ascii="Times New Roman" w:hAnsi="Times New Roman" w:cs="Times New Roman"/>
+          <w:sz w:val="28"/>
+          <w:szCs w:val="28"/>
+          <w:lang w:val="en-US"/>
+        </w:rPr>
+        <w:t>.</w:t>
+      </w:r>
+      <w:r>
+        <w:rPr>
+          <w:rStyle w:val="14"/>
+          <w:rFonts w:hint="default" w:cs="Times New Roman"/>
+          <w:sz w:val="28"/>
+          <w:szCs w:val="28"/>
+          <w:lang w:val="en-US"/>
+        </w:rPr>
+        <w:t>3</w:t>
+      </w:r>
+      <w:r>
+        <w:rPr>
+          <w:rStyle w:val="14"/>
+          <w:rFonts w:hint="default" w:ascii="Times New Roman" w:hAnsi="Times New Roman" w:cs="Times New Roman"/>
+          <w:sz w:val="28"/>
+          <w:szCs w:val="28"/>
+          <w:lang w:val="en-US"/>
+        </w:rPr>
+        <w:t xml:space="preserve">: </w:t>
+      </w:r>
+      <w:r>
+        <w:rPr>
+          <w:rStyle w:val="14"/>
+          <w:rFonts w:hint="default" w:cs="Times New Roman"/>
+          <w:sz w:val="28"/>
+          <w:szCs w:val="28"/>
+          <w:lang w:val="en-US"/>
+        </w:rPr>
+        <w:t>Fleet Asset Management.........</w:t>
+      </w:r>
+      <w:r>
+        <w:rPr>
+          <w:rStyle w:val="14"/>
+          <w:rFonts w:hint="default" w:ascii="Times New Roman" w:hAnsi="Times New Roman" w:cs="Times New Roman"/>
+          <w:sz w:val="32"/>
+          <w:szCs w:val="32"/>
+          <w:lang w:val="en-US"/>
+        </w:rPr>
+        <w:t>…………………………</w:t>
+      </w:r>
+      <w:r>
+        <w:rPr>
+          <w:rStyle w:val="14"/>
+          <w:rFonts w:hint="default" w:cs="Times New Roman"/>
+          <w:sz w:val="32"/>
+          <w:szCs w:val="32"/>
+          <w:lang w:val="en-US"/>
+        </w:rPr>
+        <w:t>.....x</w:t>
+      </w:r>
     </w:p>
     <w:p>
       <w:pPr>
@@ -2104,6 +2201,96 @@
           <w:lang w:val="en-US"/>
         </w:rPr>
       </w:pPr>
+      <w:r>
+        <w:rPr>
+          <w:rStyle w:val="14"/>
+          <w:rFonts w:hint="default" w:cs="Times New Roman"/>
+          <w:sz w:val="28"/>
+          <w:szCs w:val="28"/>
+          <w:lang w:val="en-US"/>
+        </w:rPr>
+        <w:t>4</w:t>
+      </w:r>
+      <w:r>
+        <w:rPr>
+          <w:rStyle w:val="14"/>
+          <w:rFonts w:hint="default" w:ascii="Times New Roman" w:hAnsi="Times New Roman" w:cs="Times New Roman"/>
+          <w:sz w:val="28"/>
+          <w:szCs w:val="28"/>
+          <w:lang w:val="en-US"/>
+        </w:rPr>
+        <w:t>.</w:t>
+      </w:r>
+      <w:r>
+        <w:rPr>
+          <w:rStyle w:val="14"/>
+          <w:rFonts w:hint="default" w:cs="Times New Roman"/>
+          <w:sz w:val="28"/>
+          <w:szCs w:val="28"/>
+          <w:lang w:val="en-US"/>
+        </w:rPr>
+        <w:t>4</w:t>
+      </w:r>
+      <w:r>
+        <w:rPr>
+          <w:rStyle w:val="14"/>
+          <w:rFonts w:hint="default" w:ascii="Times New Roman" w:hAnsi="Times New Roman" w:cs="Times New Roman"/>
+          <w:sz w:val="28"/>
+          <w:szCs w:val="28"/>
+          <w:lang w:val="en-US"/>
+        </w:rPr>
+        <w:t xml:space="preserve">: </w:t>
+      </w:r>
+      <w:r>
+        <w:rPr>
+          <w:rStyle w:val="14"/>
+          <w:rFonts w:hint="default" w:cs="Times New Roman"/>
+          <w:sz w:val="28"/>
+          <w:szCs w:val="28"/>
+          <w:lang w:val="en-US"/>
+        </w:rPr>
+        <w:t>Order Management.........</w:t>
+      </w:r>
+      <w:r>
+        <w:rPr>
+          <w:rStyle w:val="14"/>
+          <w:rFonts w:hint="default" w:ascii="Times New Roman" w:hAnsi="Times New Roman" w:cs="Times New Roman"/>
+          <w:sz w:val="32"/>
+          <w:szCs w:val="32"/>
+          <w:lang w:val="en-US"/>
+        </w:rPr>
+        <w:t>……</w:t>
+      </w:r>
+      <w:r>
+        <w:rPr>
+          <w:rStyle w:val="14"/>
+          <w:rFonts w:hint="default" w:cs="Times New Roman"/>
+          <w:sz w:val="32"/>
+          <w:szCs w:val="32"/>
+          <w:lang w:val="en-US"/>
+        </w:rPr>
+        <w:t>.......</w:t>
+      </w:r>
+      <w:r>
+        <w:rPr>
+          <w:rStyle w:val="14"/>
+          <w:rFonts w:hint="default" w:ascii="Times New Roman" w:hAnsi="Times New Roman" w:cs="Times New Roman"/>
+          <w:sz w:val="32"/>
+          <w:szCs w:val="32"/>
+          <w:lang w:val="en-US"/>
+        </w:rPr>
+        <w:t>……………………</w:t>
+      </w:r>
+      <w:r>
+        <w:rPr>
+          <w:rStyle w:val="14"/>
+          <w:rFonts w:hint="default" w:cs="Times New Roman"/>
+          <w:sz w:val="32"/>
+          <w:szCs w:val="32"/>
+          <w:lang w:val="en-US"/>
+        </w:rPr>
+        <w:t>.....x</w:t>
+      </w:r>
     </w:p>
     <w:p>
       <w:pPr>
@@ -2119,6 +2306,76 @@
           <w:lang w:val="en-US"/>
         </w:rPr>
       </w:pPr>
+      <w:r>
+        <w:rPr>
+          <w:rStyle w:val="14"/>
+          <w:rFonts w:hint="default" w:cs="Times New Roman"/>
+          <w:sz w:val="28"/>
+          <w:szCs w:val="28"/>
+          <w:lang w:val="en-US"/>
+        </w:rPr>
+        <w:t>4</w:t>
+      </w:r>
+      <w:r>
+        <w:rPr>
+          <w:rStyle w:val="14"/>
+          <w:rFonts w:hint="default" w:ascii="Times New Roman" w:hAnsi="Times New Roman" w:cs="Times New Roman"/>
+          <w:sz w:val="28"/>
+          <w:szCs w:val="28"/>
+          <w:lang w:val="en-US"/>
+        </w:rPr>
+        <w:t>.</w:t>
+      </w:r>
+      <w:r>
+        <w:rPr>
+          <w:rStyle w:val="14"/>
+          <w:rFonts w:hint="default" w:cs="Times New Roman"/>
+          <w:sz w:val="28"/>
+          <w:szCs w:val="28"/>
+          <w:lang w:val="en-US"/>
+        </w:rPr>
+        <w:t>5</w:t>
+      </w:r>
+      <w:r>
+        <w:rPr>
+          <w:rStyle w:val="14"/>
+          <w:rFonts w:hint="default" w:ascii="Times New Roman" w:hAnsi="Times New Roman" w:cs="Times New Roman"/>
+          <w:sz w:val="28"/>
+          <w:szCs w:val="28"/>
+          <w:lang w:val="en-US"/>
+        </w:rPr>
+        <w:t xml:space="preserve">: </w:t>
+      </w:r>
+      <w:r>
+        <w:rPr>
+          <w:rStyle w:val="14"/>
+          <w:rFonts w:hint="default" w:cs="Times New Roman"/>
+          <w:sz w:val="28"/>
+          <w:szCs w:val="28"/>
+          <w:lang w:val="en-US"/>
+        </w:rPr>
+        <w:t>Shipment Scheduling and Dispatch..............</w:t>
+      </w:r>
+      <w:r>
+        <w:rPr>
+          <w:rStyle w:val="14"/>
+          <w:rFonts w:hint="default" w:ascii="Times New Roman" w:hAnsi="Times New Roman" w:cs="Times New Roman"/>
+          <w:sz w:val="32"/>
+          <w:szCs w:val="32"/>
+          <w:lang w:val="en-US"/>
+        </w:rPr>
+        <w:t>……………</w:t>
+      </w:r>
+      <w:r>
+        <w:rPr>
+          <w:rStyle w:val="14"/>
+          <w:rFonts w:hint="default" w:cs="Times New Roman"/>
+          <w:sz w:val="32"/>
+          <w:szCs w:val="32"/>
+          <w:lang w:val="en-US"/>
+        </w:rPr>
+        <w:t>.....x</w:t>
+      </w:r>
     </w:p>
     <w:p>
       <w:pPr>
@@ -2134,6 +2391,428 @@
           <w:lang w:val="en-US"/>
         </w:rPr>
       </w:pPr>
+      <w:r>
+        <w:rPr>
+          <w:rStyle w:val="14"/>
+          <w:rFonts w:hint="default" w:cs="Times New Roman"/>
+          <w:sz w:val="28"/>
+          <w:szCs w:val="28"/>
+          <w:lang w:val="en-US"/>
+        </w:rPr>
+        <w:t>4</w:t>
+      </w:r>
+      <w:r>
+        <w:rPr>
+          <w:rStyle w:val="14"/>
+          <w:rFonts w:hint="default" w:ascii="Times New Roman" w:hAnsi="Times New Roman" w:cs="Times New Roman"/>
+          <w:sz w:val="28"/>
+          <w:szCs w:val="28"/>
+          <w:lang w:val="en-US"/>
+        </w:rPr>
+        <w:t>.</w:t>
+      </w:r>
+      <w:r>
+        <w:rPr>
+          <w:rStyle w:val="14"/>
+          <w:rFonts w:hint="default" w:cs="Times New Roman"/>
+          <w:sz w:val="28"/>
+          <w:szCs w:val="28"/>
+          <w:lang w:val="en-US"/>
+        </w:rPr>
+        <w:t>6</w:t>
+      </w:r>
+      <w:r>
+        <w:rPr>
+          <w:rStyle w:val="14"/>
+          <w:rFonts w:hint="default" w:ascii="Times New Roman" w:hAnsi="Times New Roman" w:cs="Times New Roman"/>
+          <w:sz w:val="28"/>
+          <w:szCs w:val="28"/>
+          <w:lang w:val="en-US"/>
+        </w:rPr>
+        <w:t xml:space="preserve">: </w:t>
+      </w:r>
+      <w:r>
+        <w:rPr>
+          <w:rStyle w:val="14"/>
+          <w:rFonts w:hint="default" w:cs="Times New Roman"/>
+          <w:sz w:val="28"/>
+          <w:szCs w:val="28"/>
+          <w:lang w:val="en-US"/>
+        </w:rPr>
+        <w:t>Real-Time Transit Tracking..........................</w:t>
+      </w:r>
+      <w:r>
+        <w:rPr>
+          <w:rStyle w:val="14"/>
+          <w:rFonts w:hint="default" w:ascii="Times New Roman" w:hAnsi="Times New Roman" w:cs="Times New Roman"/>
+          <w:sz w:val="32"/>
+          <w:szCs w:val="32"/>
+          <w:lang w:val="en-US"/>
+        </w:rPr>
+        <w:t>……………</w:t>
+      </w:r>
+      <w:r>
+        <w:rPr>
+          <w:rStyle w:val="14"/>
+          <w:rFonts w:hint="default" w:cs="Times New Roman"/>
+          <w:sz w:val="32"/>
+          <w:szCs w:val="32"/>
+          <w:lang w:val="en-US"/>
+        </w:rPr>
+        <w:t>.....x</w:t>
+      </w:r>
+    </w:p>
+    <w:p>
+      <w:pPr>
+        <w:bidi w:val="0"/>
+        <w:spacing w:line="360" w:lineRule="auto"/>
+        <w:ind w:left="400" w:leftChars="100" w:firstLine="0" w:firstLineChars="0"/>
+        <w:rPr>
+          <w:rFonts w:hint="default" w:ascii="Times New Roman" w:hAnsi="Times New Roman" w:cs="Times New Roman"/>
+          <w:b/>
+          <w:bCs/>
+          <w:sz w:val="25"/>
+          <w:szCs w:val="25"/>
+          <w:lang w:val="en-US"/>
+        </w:rPr>
+      </w:pPr>
+      <w:r>
+        <w:rPr>
+          <w:rStyle w:val="14"/>
+          <w:rFonts w:hint="default" w:cs="Times New Roman"/>
+          <w:sz w:val="28"/>
+          <w:szCs w:val="28"/>
+          <w:lang w:val="en-US"/>
+        </w:rPr>
+        <w:t>4</w:t>
+      </w:r>
+      <w:r>
+        <w:rPr>
+          <w:rStyle w:val="14"/>
+          <w:rFonts w:hint="default" w:ascii="Times New Roman" w:hAnsi="Times New Roman" w:cs="Times New Roman"/>
+          <w:sz w:val="28"/>
+          <w:szCs w:val="28"/>
+          <w:lang w:val="en-US"/>
+        </w:rPr>
+        <w:t>.</w:t>
+      </w:r>
+      <w:r>
+        <w:rPr>
+          <w:rStyle w:val="14"/>
+          <w:rFonts w:hint="default" w:cs="Times New Roman"/>
+          <w:sz w:val="28"/>
+          <w:szCs w:val="28"/>
+          <w:lang w:val="en-US"/>
+        </w:rPr>
+        <w:t>7</w:t>
+      </w:r>
+      <w:r>
+        <w:rPr>
+          <w:rStyle w:val="14"/>
+          <w:rFonts w:hint="default" w:ascii="Times New Roman" w:hAnsi="Times New Roman" w:cs="Times New Roman"/>
+          <w:sz w:val="28"/>
+          <w:szCs w:val="28"/>
+          <w:lang w:val="en-US"/>
+        </w:rPr>
+        <w:t xml:space="preserve">: </w:t>
+      </w:r>
+      <w:r>
+        <w:rPr>
+          <w:rStyle w:val="14"/>
+          <w:rFonts w:hint="default" w:cs="Times New Roman"/>
+          <w:sz w:val="28"/>
+          <w:szCs w:val="28"/>
+          <w:lang w:val="en-US"/>
+        </w:rPr>
+        <w:t>Handle Delivery Exceptions...........................</w:t>
+      </w:r>
+      <w:r>
+        <w:rPr>
+          <w:rStyle w:val="14"/>
+          <w:rFonts w:hint="default" w:ascii="Times New Roman" w:hAnsi="Times New Roman" w:cs="Times New Roman"/>
+          <w:sz w:val="32"/>
+          <w:szCs w:val="32"/>
+          <w:lang w:val="en-US"/>
+        </w:rPr>
+        <w:t>……………</w:t>
+      </w:r>
+      <w:r>
+        <w:rPr>
+          <w:rStyle w:val="14"/>
+          <w:rFonts w:hint="default" w:cs="Times New Roman"/>
+          <w:sz w:val="32"/>
+          <w:szCs w:val="32"/>
+          <w:lang w:val="en-US"/>
+        </w:rPr>
+        <w:t>.....x</w:t>
+      </w:r>
+    </w:p>
+    <w:p>
+      <w:pPr>
+        <w:bidi w:val="0"/>
+        <w:spacing w:line="360" w:lineRule="auto"/>
+        <w:ind w:left="400" w:leftChars="100" w:firstLine="0" w:firstLineChars="0"/>
+        <w:rPr>
+          <w:rFonts w:hint="default" w:ascii="Times New Roman" w:hAnsi="Times New Roman" w:cs="Times New Roman"/>
+          <w:b/>
+          <w:bCs/>
+          <w:sz w:val="25"/>
+          <w:szCs w:val="25"/>
+          <w:lang w:val="en-US"/>
+        </w:rPr>
+      </w:pPr>
+      <w:r>
+        <w:rPr>
+          <w:rStyle w:val="14"/>
+          <w:rFonts w:hint="default" w:cs="Times New Roman"/>
+          <w:sz w:val="28"/>
+          <w:szCs w:val="28"/>
+          <w:lang w:val="en-US"/>
+        </w:rPr>
+        <w:t>4</w:t>
+      </w:r>
+      <w:r>
+        <w:rPr>
+          <w:rStyle w:val="14"/>
+          <w:rFonts w:hint="default" w:ascii="Times New Roman" w:hAnsi="Times New Roman" w:cs="Times New Roman"/>
+          <w:sz w:val="28"/>
+          <w:szCs w:val="28"/>
+          <w:lang w:val="en-US"/>
+        </w:rPr>
+        <w:t>.</w:t>
+      </w:r>
+      <w:r>
+        <w:rPr>
+          <w:rStyle w:val="14"/>
+          <w:rFonts w:hint="default" w:cs="Times New Roman"/>
+          <w:sz w:val="28"/>
+          <w:szCs w:val="28"/>
+          <w:lang w:val="en-US"/>
+        </w:rPr>
+        <w:t>8</w:t>
+      </w:r>
+      <w:r>
+        <w:rPr>
+          <w:rStyle w:val="14"/>
+          <w:rFonts w:hint="default" w:ascii="Times New Roman" w:hAnsi="Times New Roman" w:cs="Times New Roman"/>
+          <w:sz w:val="28"/>
+          <w:szCs w:val="28"/>
+          <w:lang w:val="en-US"/>
+        </w:rPr>
+        <w:t xml:space="preserve">: </w:t>
+      </w:r>
+      <w:r>
+        <w:rPr>
+          <w:rStyle w:val="14"/>
+          <w:rFonts w:hint="default" w:cs="Times New Roman"/>
+          <w:sz w:val="28"/>
+          <w:szCs w:val="28"/>
+          <w:lang w:val="en-US"/>
+        </w:rPr>
+        <w:t>Process order Modifications..........................</w:t>
+      </w:r>
+      <w:r>
+        <w:rPr>
+          <w:rStyle w:val="14"/>
+          <w:rFonts w:hint="default" w:ascii="Times New Roman" w:hAnsi="Times New Roman" w:cs="Times New Roman"/>
+          <w:sz w:val="32"/>
+          <w:szCs w:val="32"/>
+          <w:lang w:val="en-US"/>
+        </w:rPr>
+        <w:t>……………</w:t>
+      </w:r>
+      <w:r>
+        <w:rPr>
+          <w:rStyle w:val="14"/>
+          <w:rFonts w:hint="default" w:cs="Times New Roman"/>
+          <w:sz w:val="32"/>
+          <w:szCs w:val="32"/>
+          <w:lang w:val="en-US"/>
+        </w:rPr>
+        <w:t>.....x</w:t>
+      </w:r>
+    </w:p>
+    <w:p>
+      <w:pPr>
+        <w:bidi w:val="0"/>
+        <w:spacing w:line="360" w:lineRule="auto"/>
+        <w:ind w:left="400" w:leftChars="100" w:firstLine="0" w:firstLineChars="0"/>
+        <w:rPr>
+          <w:rFonts w:hint="default" w:ascii="Times New Roman" w:hAnsi="Times New Roman" w:cs="Times New Roman"/>
+          <w:b/>
+          <w:bCs/>
+          <w:sz w:val="25"/>
+          <w:szCs w:val="25"/>
+          <w:lang w:val="en-US"/>
+        </w:rPr>
+      </w:pPr>
+      <w:r>
+        <w:rPr>
+          <w:rStyle w:val="14"/>
+          <w:rFonts w:hint="default" w:cs="Times New Roman"/>
+          <w:sz w:val="28"/>
+          <w:szCs w:val="28"/>
+          <w:lang w:val="en-US"/>
+        </w:rPr>
+        <w:t>4</w:t>
+      </w:r>
+      <w:r>
+        <w:rPr>
+          <w:rStyle w:val="14"/>
+          <w:rFonts w:hint="default" w:ascii="Times New Roman" w:hAnsi="Times New Roman" w:cs="Times New Roman"/>
+          <w:sz w:val="28"/>
+          <w:szCs w:val="28"/>
+          <w:lang w:val="en-US"/>
+        </w:rPr>
+        <w:t>.</w:t>
+      </w:r>
+      <w:r>
+        <w:rPr>
+          <w:rStyle w:val="14"/>
+          <w:rFonts w:hint="default" w:cs="Times New Roman"/>
+          <w:sz w:val="28"/>
+          <w:szCs w:val="28"/>
+          <w:lang w:val="en-US"/>
+        </w:rPr>
+        <w:t>9</w:t>
+      </w:r>
+      <w:r>
+        <w:rPr>
+          <w:rStyle w:val="14"/>
+          <w:rFonts w:hint="default" w:ascii="Times New Roman" w:hAnsi="Times New Roman" w:cs="Times New Roman"/>
+          <w:sz w:val="28"/>
+          <w:szCs w:val="28"/>
+          <w:lang w:val="en-US"/>
+        </w:rPr>
+        <w:t xml:space="preserve">: </w:t>
+      </w:r>
+      <w:r>
+        <w:rPr>
+          <w:rStyle w:val="14"/>
+          <w:rFonts w:hint="default" w:cs="Times New Roman"/>
+          <w:sz w:val="28"/>
+          <w:szCs w:val="28"/>
+          <w:lang w:val="en-US"/>
+        </w:rPr>
+        <w:t>Automated Invoice Generation.....................</w:t>
+      </w:r>
+      <w:r>
+        <w:rPr>
+          <w:rStyle w:val="14"/>
+          <w:rFonts w:hint="default" w:ascii="Times New Roman" w:hAnsi="Times New Roman" w:cs="Times New Roman"/>
+          <w:sz w:val="32"/>
+          <w:szCs w:val="32"/>
+          <w:lang w:val="en-US"/>
+        </w:rPr>
+        <w:t>……………</w:t>
+      </w:r>
+      <w:r>
+        <w:rPr>
+          <w:rStyle w:val="14"/>
+          <w:rFonts w:hint="default" w:cs="Times New Roman"/>
+          <w:sz w:val="32"/>
+          <w:szCs w:val="32"/>
+          <w:lang w:val="en-US"/>
+        </w:rPr>
+        <w:t>.....x</w:t>
+      </w:r>
+    </w:p>
+    <w:p>
+      <w:pPr>
+        <w:bidi w:val="0"/>
+        <w:spacing w:line="360" w:lineRule="auto"/>
+        <w:ind w:left="400" w:leftChars="100" w:firstLine="0" w:firstLineChars="0"/>
+        <w:rPr>
+          <w:rFonts w:hint="default" w:ascii="Times New Roman" w:hAnsi="Times New Roman" w:cs="Times New Roman"/>
+          <w:b/>
+          <w:bCs/>
+          <w:sz w:val="25"/>
+          <w:szCs w:val="25"/>
+          <w:lang w:val="en-US"/>
+        </w:rPr>
+      </w:pPr>
+      <w:r>
+        <w:rPr>
+          <w:rStyle w:val="14"/>
+          <w:rFonts w:hint="default" w:cs="Times New Roman"/>
+          <w:sz w:val="28"/>
+          <w:szCs w:val="28"/>
+          <w:lang w:val="en-US"/>
+        </w:rPr>
+        <w:t>4</w:t>
+      </w:r>
+      <w:r>
+        <w:rPr>
+          <w:rStyle w:val="14"/>
+          <w:rFonts w:hint="default" w:ascii="Times New Roman" w:hAnsi="Times New Roman" w:cs="Times New Roman"/>
+          <w:sz w:val="28"/>
+          <w:szCs w:val="28"/>
+          <w:lang w:val="en-US"/>
+        </w:rPr>
+        <w:t>.</w:t>
+      </w:r>
+      <w:r>
+        <w:rPr>
+          <w:rStyle w:val="14"/>
+          <w:rFonts w:hint="default" w:cs="Times New Roman"/>
+          <w:sz w:val="28"/>
+          <w:szCs w:val="28"/>
+          <w:lang w:val="en-US"/>
+        </w:rPr>
+        <w:t>10</w:t>
+      </w:r>
+      <w:r>
+        <w:rPr>
+          <w:rStyle w:val="14"/>
+          <w:rFonts w:hint="default" w:ascii="Times New Roman" w:hAnsi="Times New Roman" w:cs="Times New Roman"/>
+          <w:sz w:val="28"/>
+          <w:szCs w:val="28"/>
+          <w:lang w:val="en-US"/>
+        </w:rPr>
+        <w:t xml:space="preserve">: </w:t>
+      </w:r>
+      <w:r>
+        <w:rPr>
+          <w:rStyle w:val="14"/>
+          <w:rFonts w:hint="default" w:cs="Times New Roman"/>
+          <w:sz w:val="28"/>
+          <w:szCs w:val="28"/>
+          <w:lang w:val="en-US"/>
+        </w:rPr>
+        <w:t>Payment Reconciliation...........</w:t>
+      </w:r>
+      <w:bookmarkStart w:id="0" w:name="_GoBack"/>
+      <w:bookmarkEnd w:id="0"/>
+      <w:r>
+        <w:rPr>
+          <w:rStyle w:val="14"/>
+          <w:rFonts w:hint="default" w:cs="Times New Roman"/>
+          <w:sz w:val="28"/>
+          <w:szCs w:val="28"/>
+          <w:lang w:val="en-US"/>
+        </w:rPr>
+        <w:t>.....................</w:t>
+      </w:r>
+      <w:r>
+        <w:rPr>
+          <w:rStyle w:val="14"/>
+          <w:rFonts w:hint="default" w:ascii="Times New Roman" w:hAnsi="Times New Roman" w:cs="Times New Roman"/>
+          <w:sz w:val="32"/>
+          <w:szCs w:val="32"/>
+          <w:lang w:val="en-US"/>
+        </w:rPr>
+        <w:t>……………</w:t>
+      </w:r>
+      <w:r>
+        <w:rPr>
+          <w:rStyle w:val="14"/>
+          <w:rFonts w:hint="default" w:cs="Times New Roman"/>
+          <w:sz w:val="32"/>
+          <w:szCs w:val="32"/>
+          <w:lang w:val="en-US"/>
+        </w:rPr>
+        <w:t>.....x</w:t>
+      </w:r>
     </w:p>
     <w:p>
       <w:pPr>
@@ -2490,11 +3169,11 @@
           <w:vertAlign w:val="baseline"/>
           <w:lang w:val="en-US"/>
         </w:rPr>
-        <w:t xml:space="preserve"> which overcome</w:t>
-      </w:r>
-      <w:r>
-        <w:rPr>
-          <w:rFonts w:hint="default" w:ascii="Times New Roman" w:hAnsi="Times New Roman" w:cs="Times New Roman"/>
+        <w:t xml:space="preserve"> which overcomes </w:t>
+      </w:r>
+      <w:r>
+        <w:rPr>
+          <w:rFonts w:hint="default" w:ascii="Times New Roman" w:hAnsi="Times New Roman" w:eastAsia="SimSun" w:cs="Times New Roman"/>
           <w:i w:val="0"/>
           <w:iCs w:val="0"/>
           <w:color w:val="000000"/>
@@ -2503,13 +3182,14 @@
           <w:u w:val="none"/>
           <w:shd w:val="clear" w:fill="FFFFFF"/>
           <w:vertAlign w:val="baseline"/>
-          <w:lang w:val="en-US"/>
-        </w:rPr>
-        <w:t>s</w:t>
-      </w:r>
-      <w:r>
-        <w:rPr>
-          <w:rFonts w:hint="default" w:ascii="Times New Roman" w:hAnsi="Times New Roman" w:cs="Times New Roman"/>
+        </w:rPr>
+        <w:t xml:space="preserve">operational scaling limitations </w:t>
+      </w:r>
+      <w:r>
+        <w:rPr>
+          <w:rFonts w:hint="default" w:ascii="Times New Roman" w:hAnsi="Times New Roman" w:eastAsia="SimSun" w:cs="Times New Roman"/>
+          <w:b w:val="0"/>
+          <w:bCs w:val="0"/>
           <w:i w:val="0"/>
           <w:iCs w:val="0"/>
           <w:color w:val="000000"/>
@@ -2518,13 +3198,14 @@
           <w:u w:val="none"/>
           <w:shd w:val="clear" w:fill="FFFFFF"/>
           <w:vertAlign w:val="baseline"/>
-          <w:lang w:val="en-US"/>
-        </w:rPr>
-        <w:t xml:space="preserve"> </w:t>
-      </w:r>
-      <w:r>
-        <w:rPr>
-          <w:rFonts w:hint="default" w:ascii="Times New Roman" w:hAnsi="Times New Roman" w:eastAsia="SimSun" w:cs="Times New Roman"/>
+        </w:rPr>
+        <w:t>caused by legacy, disconnected, branch-specific software and manual record-keeping</w:t>
+      </w:r>
+      <w:r>
+        <w:rPr>
+          <w:rFonts w:hint="default" w:ascii="Times New Roman" w:hAnsi="Times New Roman" w:cs="Times New Roman"/>
+          <w:b w:val="0"/>
+          <w:bCs w:val="0"/>
           <w:i w:val="0"/>
           <w:iCs w:val="0"/>
           <w:color w:val="000000"/>
@@ -2533,14 +3214,23 @@
           <w:u w:val="none"/>
           <w:shd w:val="clear" w:fill="FFFFFF"/>
           <w:vertAlign w:val="baseline"/>
-        </w:rPr>
-        <w:t xml:space="preserve">operational scaling limitations </w:t>
-      </w:r>
-      <w:r>
-        <w:rPr>
-          <w:rFonts w:hint="default" w:ascii="Times New Roman" w:hAnsi="Times New Roman" w:eastAsia="SimSun" w:cs="Times New Roman"/>
-          <w:b w:val="0"/>
-          <w:bCs w:val="0"/>
+          <w:lang w:val="en-US"/>
+        </w:rPr>
+        <w:t>.</w:t>
+      </w:r>
+    </w:p>
+    <w:p>
+      <w:pPr>
+        <w:pStyle w:val="10"/>
+        <w:keepNext w:val="0"/>
+        <w:keepLines w:val="0"/>
+        <w:widowControl/>
+        <w:suppressLineNumbers w:val="0"/>
+        <w:bidi w:val="0"/>
+        <w:spacing w:before="240" w:beforeAutospacing="0" w:after="240" w:afterAutospacing="0" w:line="240" w:lineRule="auto"/>
+        <w:jc w:val="both"/>
+        <w:rPr>
+          <w:rFonts w:hint="default" w:ascii="Times New Roman" w:hAnsi="Times New Roman" w:cs="Times New Roman"/>
           <w:i w:val="0"/>
           <w:iCs w:val="0"/>
           <w:color w:val="000000"/>
@@ -2549,9 +3239,9 @@
           <w:u w:val="none"/>
           <w:shd w:val="clear" w:fill="FFFFFF"/>
           <w:vertAlign w:val="baseline"/>
-        </w:rPr>
-        <w:t>caused by legacy, disconnected, branch-specific software and manual record-keeping</w:t>
-      </w:r>
+          <w:lang w:val="en-US"/>
+        </w:rPr>
+      </w:pPr>
       <w:r>
         <w:rPr>
           <w:rFonts w:hint="default" w:ascii="Times New Roman" w:hAnsi="Times New Roman" w:cs="Times New Roman"/>
@@ -2567,21 +3257,13 @@
           <w:vertAlign w:val="baseline"/>
           <w:lang w:val="en-US"/>
         </w:rPr>
-        <w:t>.</w:t>
-      </w:r>
-    </w:p>
-    <w:p>
-      <w:pPr>
-        <w:pStyle w:val="10"/>
-        <w:keepNext w:val="0"/>
-        <w:keepLines w:val="0"/>
-        <w:widowControl/>
-        <w:suppressLineNumbers w:val="0"/>
-        <w:bidi w:val="0"/>
-        <w:spacing w:before="240" w:beforeAutospacing="0" w:after="240" w:afterAutospacing="0" w:line="240" w:lineRule="auto"/>
-        <w:jc w:val="both"/>
-        <w:rPr>
-          <w:rFonts w:hint="default" w:ascii="Times New Roman" w:hAnsi="Times New Roman" w:cs="Times New Roman"/>
+        <w:t xml:space="preserve">Consequently, the main purpose of this report is to </w:t>
+      </w:r>
+      <w:r>
+        <w:rPr>
+          <w:rFonts w:hint="default" w:ascii="Times New Roman" w:hAnsi="Times New Roman" w:eastAsia="SimSun" w:cs="Times New Roman"/>
+          <w:b w:val="0"/>
+          <w:bCs w:val="0"/>
           <w:i w:val="0"/>
           <w:iCs w:val="0"/>
           <w:color w:val="000000"/>
@@ -2590,9 +3272,9 @@
           <w:u w:val="none"/>
           <w:shd w:val="clear" w:fill="FFFFFF"/>
           <w:vertAlign w:val="baseline"/>
-          <w:lang w:val="en-US"/>
-        </w:rPr>
-      </w:pPr>
+        </w:rPr>
+        <w:t xml:space="preserve">map out the system boundaries and business processes using the Tasks </w:t>
+      </w:r>
       <w:r>
         <w:rPr>
           <w:rFonts w:hint="default" w:ascii="Times New Roman" w:hAnsi="Times New Roman" w:cs="Times New Roman"/>
@@ -2608,11 +3290,11 @@
           <w:vertAlign w:val="baseline"/>
           <w:lang w:val="en-US"/>
         </w:rPr>
-        <w:t>Consequently</w:t>
-      </w:r>
-      <w:r>
-        <w:rPr>
-          <w:rFonts w:hint="default" w:ascii="Times New Roman" w:hAnsi="Times New Roman" w:cs="Times New Roman"/>
+        <w:t>and</w:t>
+      </w:r>
+      <w:r>
+        <w:rPr>
+          <w:rFonts w:hint="default" w:ascii="Times New Roman" w:hAnsi="Times New Roman" w:eastAsia="SimSun" w:cs="Times New Roman"/>
           <w:b w:val="0"/>
           <w:bCs w:val="0"/>
           <w:i w:val="0"/>
@@ -2623,13 +3305,12 @@
           <w:u w:val="none"/>
           <w:shd w:val="clear" w:fill="FFFFFF"/>
           <w:vertAlign w:val="baseline"/>
-          <w:lang w:val="en-US"/>
-        </w:rPr>
-        <w:t xml:space="preserve">, the main purpose of this report is to </w:t>
-      </w:r>
-      <w:r>
-        <w:rPr>
-          <w:rFonts w:hint="default" w:ascii="Times New Roman" w:hAnsi="Times New Roman" w:eastAsia="SimSun" w:cs="Times New Roman"/>
+        </w:rPr>
+        <w:t xml:space="preserve"> Support approach</w:t>
+      </w:r>
+      <w:r>
+        <w:rPr>
+          <w:rFonts w:hint="default" w:ascii="Times New Roman" w:hAnsi="Times New Roman" w:cs="Times New Roman"/>
           <w:b w:val="0"/>
           <w:bCs w:val="0"/>
           <w:i w:val="0"/>
@@ -2640,14 +3321,13 @@
           <w:u w:val="none"/>
           <w:shd w:val="clear" w:fill="FFFFFF"/>
           <w:vertAlign w:val="baseline"/>
-        </w:rPr>
-        <w:t xml:space="preserve">map out the system boundaries and business processes using the Tasks </w:t>
-      </w:r>
-      <w:r>
-        <w:rPr>
-          <w:rFonts w:hint="default" w:ascii="Times New Roman" w:hAnsi="Times New Roman" w:cs="Times New Roman"/>
-          <w:b w:val="0"/>
-          <w:bCs w:val="0"/>
+          <w:lang w:val="en-US"/>
+        </w:rPr>
+        <w:t>. B</w:t>
+      </w:r>
+      <w:r>
+        <w:rPr>
+          <w:rFonts w:hint="default" w:ascii="Times New Roman" w:hAnsi="Times New Roman" w:eastAsia="SimSun" w:cs="Times New Roman"/>
           <w:i w:val="0"/>
           <w:iCs w:val="0"/>
           <w:color w:val="000000"/>
@@ -2656,15 +3336,12 @@
           <w:u w:val="none"/>
           <w:shd w:val="clear" w:fill="FFFFFF"/>
           <w:vertAlign w:val="baseline"/>
-          <w:lang w:val="en-US"/>
-        </w:rPr>
-        <w:t>and</w:t>
-      </w:r>
-      <w:r>
-        <w:rPr>
-          <w:rFonts w:hint="default" w:ascii="Times New Roman" w:hAnsi="Times New Roman" w:eastAsia="SimSun" w:cs="Times New Roman"/>
-          <w:b w:val="0"/>
-          <w:bCs w:val="0"/>
+        </w:rPr>
+        <w:t xml:space="preserve">y focusing heavily on domain-level interactions and user workflows rather than pre-emptive database architecture, this specification ensures that the developed software natively resolves the technical challenges of high-volume, concurrent read operations </w:t>
+      </w:r>
+      <w:r>
+        <w:rPr>
+          <w:rFonts w:hint="default" w:ascii="Times New Roman" w:hAnsi="Times New Roman" w:cs="Times New Roman"/>
           <w:i w:val="0"/>
           <w:iCs w:val="0"/>
           <w:color w:val="000000"/>
@@ -2673,14 +3350,13 @@
           <w:u w:val="none"/>
           <w:shd w:val="clear" w:fill="FFFFFF"/>
           <w:vertAlign w:val="baseline"/>
-        </w:rPr>
-        <w:t xml:space="preserve"> Support approach</w:t>
-      </w:r>
-      <w:r>
-        <w:rPr>
-          <w:rFonts w:hint="default" w:ascii="Times New Roman" w:hAnsi="Times New Roman" w:cs="Times New Roman"/>
-          <w:b w:val="0"/>
-          <w:bCs w:val="0"/>
+          <w:lang w:val="en-US"/>
+        </w:rPr>
+        <w:t>including</w:t>
+      </w:r>
+      <w:r>
+        <w:rPr>
+          <w:rFonts w:hint="default" w:ascii="Times New Roman" w:hAnsi="Times New Roman" w:eastAsia="SimSun" w:cs="Times New Roman"/>
           <w:i w:val="0"/>
           <w:iCs w:val="0"/>
           <w:color w:val="000000"/>
@@ -2689,13 +3365,12 @@
           <w:u w:val="none"/>
           <w:shd w:val="clear" w:fill="FFFFFF"/>
           <w:vertAlign w:val="baseline"/>
-          <w:lang w:val="en-US"/>
-        </w:rPr>
-        <w:t>. B</w:t>
-      </w:r>
-      <w:r>
-        <w:rPr>
-          <w:rFonts w:hint="default" w:ascii="Times New Roman" w:hAnsi="Times New Roman" w:eastAsia="SimSun" w:cs="Times New Roman"/>
+        </w:rPr>
+        <w:t xml:space="preserve"> real-time tracking</w:t>
+      </w:r>
+      <w:r>
+        <w:rPr>
+          <w:rFonts w:hint="default" w:ascii="Times New Roman" w:hAnsi="Times New Roman" w:cs="Times New Roman"/>
           <w:i w:val="0"/>
           <w:iCs w:val="0"/>
           <w:color w:val="000000"/>
@@ -2704,12 +3379,13 @@
           <w:u w:val="none"/>
           <w:shd w:val="clear" w:fill="FFFFFF"/>
           <w:vertAlign w:val="baseline"/>
-        </w:rPr>
-        <w:t xml:space="preserve">y focusing heavily on domain-level interactions and user workflows rather than pre-emptive database architecture, this specification ensures that the developed software natively resolves the technical challenges of high-volume, concurrent read operations </w:t>
-      </w:r>
-      <w:r>
-        <w:rPr>
-          <w:rFonts w:hint="default" w:ascii="Times New Roman" w:hAnsi="Times New Roman" w:cs="Times New Roman"/>
+          <w:lang w:val="en-US"/>
+        </w:rPr>
+        <w:t xml:space="preserve"> </w:t>
+      </w:r>
+      <w:r>
+        <w:rPr>
+          <w:rFonts w:hint="default" w:ascii="Times New Roman" w:hAnsi="Times New Roman" w:eastAsia="SimSun" w:cs="Times New Roman"/>
           <w:i w:val="0"/>
           <w:iCs w:val="0"/>
           <w:color w:val="000000"/>
@@ -2718,13 +3394,12 @@
           <w:u w:val="none"/>
           <w:shd w:val="clear" w:fill="FFFFFF"/>
           <w:vertAlign w:val="baseline"/>
-          <w:lang w:val="en-US"/>
-        </w:rPr>
-        <w:t>including</w:t>
-      </w:r>
-      <w:r>
-        <w:rPr>
-          <w:rFonts w:hint="default" w:ascii="Times New Roman" w:hAnsi="Times New Roman" w:eastAsia="SimSun" w:cs="Times New Roman"/>
+        </w:rPr>
+        <w:t>and high-integrity write transactions across all regional branches</w:t>
+      </w:r>
+      <w:r>
+        <w:rPr>
+          <w:rFonts w:hint="default" w:ascii="Times New Roman" w:hAnsi="Times New Roman" w:cs="Times New Roman"/>
           <w:i w:val="0"/>
           <w:iCs w:val="0"/>
           <w:color w:val="000000"/>
@@ -2733,12 +3408,98 @@
           <w:u w:val="none"/>
           <w:shd w:val="clear" w:fill="FFFFFF"/>
           <w:vertAlign w:val="baseline"/>
-        </w:rPr>
-        <w:t xml:space="preserve"> real-time tracking</w:t>
-      </w:r>
-      <w:r>
-        <w:rPr>
-          <w:rFonts w:hint="default" w:ascii="Times New Roman" w:hAnsi="Times New Roman" w:cs="Times New Roman"/>
+          <w:lang w:val="en-US"/>
+        </w:rPr>
+        <w:t>.</w:t>
+      </w:r>
+    </w:p>
+    <w:p>
+      <w:pPr>
+        <w:pStyle w:val="2"/>
+        <w:bidi w:val="0"/>
+        <w:spacing w:line="240" w:lineRule="auto"/>
+        <w:rPr>
+          <w:rFonts w:hint="default" w:ascii="Times New Roman" w:hAnsi="Times New Roman" w:cs="Times New Roman"/>
+          <w:lang w:val="en-US"/>
+        </w:rPr>
+      </w:pPr>
+      <w:r>
+        <w:rPr>
+          <w:rFonts w:hint="default" w:ascii="Times New Roman" w:hAnsi="Times New Roman" w:cs="Times New Roman"/>
+          <w:lang w:val="en-US"/>
+        </w:rPr>
+        <w:t>Part B: Project Overview</w:t>
+      </w:r>
+    </w:p>
+    <w:p>
+      <w:pPr>
+        <w:pStyle w:val="10"/>
+        <w:keepNext w:val="0"/>
+        <w:keepLines w:val="0"/>
+        <w:widowControl/>
+        <w:suppressLineNumbers w:val="0"/>
+        <w:bidi w:val="0"/>
+        <w:spacing w:before="240" w:beforeAutospacing="0" w:after="240" w:afterAutospacing="0" w:line="240" w:lineRule="auto"/>
+        <w:jc w:val="both"/>
+        <w:rPr>
+          <w:rFonts w:hint="default" w:ascii="Times New Roman" w:hAnsi="Times New Roman" w:cs="Times New Roman"/>
+          <w:sz w:val="23"/>
+          <w:szCs w:val="23"/>
+          <w:lang w:val="en-US"/>
+        </w:rPr>
+      </w:pPr>
+      <w:r>
+        <w:rPr>
+          <w:rFonts w:hint="default" w:ascii="Times New Roman" w:hAnsi="Times New Roman" w:eastAsia="SimSun" w:cs="Times New Roman"/>
+          <w:sz w:val="24"/>
+          <w:szCs w:val="24"/>
+        </w:rPr>
+        <w:t>The Software Requirements Specification (SRS) emphasizes the comprehensive functional and non-functional requirements for the Smart Fleet Management System (SmartFM) designed for ABC-Trans, one of Vietnam's most prominent logistics and transportation enterprises. Notably, ABC-Trans operates a nationwide network providing vital supply chain services to major department stores and supermarkets. In addition, the centralized ecosystem unifies enterprise-wide fleet tracking, driver allocations, booking pipelines, and financial transactions</w:t>
+      </w:r>
+      <w:r>
+        <w:rPr>
+          <w:rFonts w:hint="default" w:ascii="Times New Roman" w:hAnsi="Times New Roman" w:cs="Times New Roman"/>
+          <w:sz w:val="24"/>
+          <w:szCs w:val="24"/>
+          <w:lang w:val="en-US"/>
+        </w:rPr>
+        <w:t xml:space="preserve">, effectively resolving </w:t>
+      </w:r>
+      <w:r>
+        <w:rPr>
+          <w:rFonts w:hint="default" w:ascii="Times New Roman" w:hAnsi="Times New Roman" w:eastAsia="SimSun" w:cs="Times New Roman"/>
+          <w:sz w:val="24"/>
+          <w:szCs w:val="24"/>
+        </w:rPr>
+        <w:t>operational scaling limitations caused by legacy, disconnected, branch-specific software and manual record-keeping.</w:t>
+      </w:r>
+    </w:p>
+    <w:p>
+      <w:pPr>
+        <w:pStyle w:val="3"/>
+        <w:bidi w:val="0"/>
+        <w:spacing w:line="240" w:lineRule="auto"/>
+        <w:ind w:left="400" w:leftChars="100" w:firstLine="0" w:firstLineChars="0"/>
+        <w:rPr>
+          <w:rFonts w:hint="default" w:ascii="Times New Roman" w:hAnsi="Times New Roman" w:cs="Times New Roman"/>
+          <w:lang w:val="en-US"/>
+        </w:rPr>
+      </w:pPr>
+      <w:r>
+        <w:rPr>
+          <w:rFonts w:hint="default" w:ascii="Times New Roman" w:hAnsi="Times New Roman" w:cs="Times New Roman"/>
+          <w:lang w:val="en-US"/>
+        </w:rPr>
+        <w:t>2.1 Domain Vocabulary</w:t>
+      </w:r>
+    </w:p>
+    <w:p>
+      <w:pPr>
+        <w:spacing w:line="240" w:lineRule="auto"/>
+        <w:ind w:left="400" w:leftChars="100" w:firstLine="0" w:firstLineChars="0"/>
+        <w:jc w:val="both"/>
+        <w:rPr>
+          <w:rFonts w:hint="default" w:ascii="Times New Roman" w:hAnsi="Times New Roman" w:eastAsia="SimSun" w:cs="Times New Roman"/>
           <w:i w:val="0"/>
           <w:iCs w:val="0"/>
           <w:color w:val="000000"/>
@@ -2749,7 +3510,15 @@
           <w:vertAlign w:val="baseline"/>
           <w:lang w:val="en-US"/>
         </w:rPr>
-        <w:t xml:space="preserve"> </w:t>
+      </w:pPr>
+      <w:r>
+        <w:rPr>
+          <w:rFonts w:hint="default" w:ascii="Times New Roman" w:hAnsi="Times New Roman" w:cs="Times New Roman"/>
+          <w:sz w:val="23"/>
+          <w:szCs w:val="23"/>
+          <w:lang w:val="en-US"/>
+        </w:rPr>
+        <w:t xml:space="preserve">The following </w:t>
       </w:r>
       <w:r>
         <w:rPr>
@@ -2763,11 +3532,11 @@
           <w:shd w:val="clear" w:fill="FFFFFF"/>
           <w:vertAlign w:val="baseline"/>
         </w:rPr>
-        <w:t>and high-integrity write transactions across all regional branches</w:t>
-      </w:r>
-      <w:r>
-        <w:rPr>
-          <w:rFonts w:hint="default" w:ascii="Times New Roman" w:hAnsi="Times New Roman" w:cs="Times New Roman"/>
+        <w:t>glossary defines the specialized business and technical terms foundational to the ABC-Trans operations and the SmartFM platform</w:t>
+      </w:r>
+      <w:r>
+        <w:rPr>
+          <w:rFonts w:hint="default" w:ascii="Times New Roman" w:hAnsi="Times New Roman" w:eastAsia="SimSun" w:cs="Times New Roman"/>
           <w:i w:val="0"/>
           <w:iCs w:val="0"/>
           <w:color w:val="000000"/>
@@ -2778,93 +3547,20 @@
           <w:vertAlign w:val="baseline"/>
           <w:lang w:val="en-US"/>
         </w:rPr>
-        <w:t>.</w:t>
-      </w:r>
-    </w:p>
-    <w:p>
-      <w:pPr>
-        <w:pStyle w:val="2"/>
-        <w:bidi w:val="0"/>
-        <w:spacing w:line="240" w:lineRule="auto"/>
-        <w:rPr>
-          <w:rFonts w:hint="default" w:ascii="Times New Roman" w:hAnsi="Times New Roman" w:cs="Times New Roman"/>
-          <w:lang w:val="en-US"/>
-        </w:rPr>
-      </w:pPr>
-      <w:r>
-        <w:rPr>
-          <w:rFonts w:hint="default" w:ascii="Times New Roman" w:hAnsi="Times New Roman" w:cs="Times New Roman"/>
-          <w:lang w:val="en-US"/>
-        </w:rPr>
-        <w:t>Part B: Project Overview</w:t>
-      </w:r>
-    </w:p>
-    <w:p>
-      <w:pPr>
-        <w:pStyle w:val="10"/>
-        <w:keepNext w:val="0"/>
-        <w:keepLines w:val="0"/>
-        <w:widowControl/>
-        <w:suppressLineNumbers w:val="0"/>
-        <w:bidi w:val="0"/>
-        <w:spacing w:before="240" w:beforeAutospacing="0" w:after="240" w:afterAutospacing="0" w:line="240" w:lineRule="auto"/>
-        <w:jc w:val="both"/>
-        <w:rPr>
-          <w:rFonts w:hint="default" w:ascii="Times New Roman" w:hAnsi="Times New Roman" w:cs="Times New Roman"/>
-          <w:sz w:val="23"/>
-          <w:szCs w:val="23"/>
-          <w:lang w:val="en-US"/>
-        </w:rPr>
-      </w:pPr>
-      <w:r>
-        <w:rPr>
-          <w:rFonts w:hint="default" w:ascii="Times New Roman" w:hAnsi="Times New Roman" w:eastAsia="SimSun" w:cs="Times New Roman"/>
-          <w:sz w:val="24"/>
-          <w:szCs w:val="24"/>
-        </w:rPr>
-        <w:t>The Software Requirements Specification (SRS) emphasizes the comprehensive functional and non-functional requirements for the Smart Fleet Management System (SmartFM) designed for ABC-Trans, one of Vietnam's most prominent logistics and transportation enterprises. Notably, ABC-Trans operates a nationwide network providing vital supply chain services to major department stores and supermarkets. In addition, the centralized ecosystem unifies enterprise-wide fleet tracking, driver allocations, booking pipelines, and financial transactions</w:t>
-      </w:r>
-      <w:r>
-        <w:rPr>
-          <w:rFonts w:hint="default" w:ascii="Times New Roman" w:hAnsi="Times New Roman" w:cs="Times New Roman"/>
-          <w:sz w:val="24"/>
-          <w:szCs w:val="24"/>
-          <w:lang w:val="en-US"/>
-        </w:rPr>
-        <w:t xml:space="preserve">, effectively resolving </w:t>
-      </w:r>
-      <w:r>
-        <w:rPr>
-          <w:rFonts w:hint="default" w:ascii="Times New Roman" w:hAnsi="Times New Roman" w:eastAsia="SimSun" w:cs="Times New Roman"/>
-          <w:sz w:val="24"/>
-          <w:szCs w:val="24"/>
-        </w:rPr>
-        <w:t>operational scaling limitations caused by legacy, disconnected, branch-specific software and manual record-keeping.</w:t>
-      </w:r>
-    </w:p>
-    <w:p>
-      <w:pPr>
-        <w:pStyle w:val="3"/>
-        <w:bidi w:val="0"/>
-        <w:spacing w:line="240" w:lineRule="auto"/>
-        <w:ind w:left="400" w:leftChars="100" w:firstLine="0" w:firstLineChars="0"/>
-        <w:rPr>
-          <w:rFonts w:hint="default" w:ascii="Times New Roman" w:hAnsi="Times New Roman" w:cs="Times New Roman"/>
-          <w:lang w:val="en-US"/>
-        </w:rPr>
-      </w:pPr>
-      <w:r>
-        <w:rPr>
-          <w:rFonts w:hint="default" w:ascii="Times New Roman" w:hAnsi="Times New Roman" w:cs="Times New Roman"/>
-          <w:lang w:val="en-US"/>
-        </w:rPr>
-        <w:t>2.1 Domain Vocabulary</w:t>
-      </w:r>
-    </w:p>
-    <w:p>
-      <w:pPr>
-        <w:spacing w:line="240" w:lineRule="auto"/>
-        <w:ind w:left="400" w:leftChars="100" w:firstLine="0" w:firstLineChars="0"/>
+        <w:t>:</w:t>
+      </w:r>
+    </w:p>
+    <w:p>
+      <w:pPr>
+        <w:numPr>
+          <w:ilvl w:val="0"/>
+          <w:numId w:val="1"/>
+        </w:numPr>
+        <w:tabs>
+          <w:tab w:val="clear" w:pos="420"/>
+        </w:tabs>
+        <w:spacing w:line="240" w:lineRule="auto"/>
+        <w:ind w:left="1200" w:leftChars="0" w:hanging="420" w:firstLineChars="0"/>
         <w:jc w:val="both"/>
         <w:rPr>
           <w:rFonts w:hint="default" w:ascii="Times New Roman" w:hAnsi="Times New Roman" w:eastAsia="SimSun" w:cs="Times New Roman"/>
@@ -2881,15 +3577,6 @@
       </w:pPr>
       <w:r>
         <w:rPr>
-          <w:rFonts w:hint="default" w:ascii="Times New Roman" w:hAnsi="Times New Roman" w:cs="Times New Roman"/>
-          <w:sz w:val="23"/>
-          <w:szCs w:val="23"/>
-          <w:lang w:val="en-US"/>
-        </w:rPr>
-        <w:t xml:space="preserve">The following </w:t>
-      </w:r>
-      <w:r>
-        <w:rPr>
           <w:rFonts w:hint="default" w:ascii="Times New Roman" w:hAnsi="Times New Roman" w:eastAsia="SimSun" w:cs="Times New Roman"/>
           <w:i w:val="0"/>
           <w:iCs w:val="0"/>
@@ -2899,10 +3586,31 @@
           <w:u w:val="none"/>
           <w:shd w:val="clear" w:fill="FFFFFF"/>
           <w:vertAlign w:val="baseline"/>
-        </w:rPr>
-        <w:t>glossary defines the specialized business and technical terms foundational to the ABC-Trans operations and the SmartFM platform</w:t>
-      </w:r>
-      <w:r>
+          <w:lang w:val="en-US"/>
+        </w:rPr>
+        <w:t xml:space="preserve">SmartFM: </w:t>
+      </w:r>
+      <w:r>
+        <w:rPr>
+          <w:rFonts w:hint="default" w:ascii="Times New Roman" w:hAnsi="Times New Roman" w:eastAsia="SimSun" w:cs="Times New Roman"/>
+          <w:sz w:val="24"/>
+          <w:szCs w:val="24"/>
+        </w:rPr>
+        <w:t>A centralized system integrating tracking, operations, and fleet management across all ABC-Trans branches.</w:t>
+      </w:r>
+    </w:p>
+    <w:p>
+      <w:pPr>
+        <w:numPr>
+          <w:ilvl w:val="0"/>
+          <w:numId w:val="1"/>
+        </w:numPr>
+        <w:tabs>
+          <w:tab w:val="clear" w:pos="420"/>
+        </w:tabs>
+        <w:spacing w:line="240" w:lineRule="auto"/>
+        <w:ind w:left="1200" w:leftChars="0" w:hanging="420" w:firstLineChars="0"/>
+        <w:jc w:val="both"/>
         <w:rPr>
           <w:rFonts w:hint="default" w:ascii="Times New Roman" w:hAnsi="Times New Roman" w:eastAsia="SimSun" w:cs="Times New Roman"/>
           <w:i w:val="0"/>
@@ -2915,7 +3623,32 @@
           <w:vertAlign w:val="baseline"/>
           <w:lang w:val="en-US"/>
         </w:rPr>
-        <w:t>:</w:t>
+      </w:pPr>
+      <w:r>
+        <w:rPr>
+          <w:rFonts w:hint="default" w:ascii="Times New Roman" w:hAnsi="Times New Roman" w:eastAsia="SimSun" w:cs="Times New Roman"/>
+          <w:sz w:val="24"/>
+          <w:szCs w:val="24"/>
+          <w:lang w:val="en-US"/>
+        </w:rPr>
+        <w:t xml:space="preserve">Shipment Offering: </w:t>
+      </w:r>
+      <w:r>
+        <w:rPr>
+          <w:rFonts w:hint="default" w:ascii="Times New Roman" w:hAnsi="Times New Roman" w:eastAsia="SimSun" w:cs="Times New Roman"/>
+          <w:sz w:val="24"/>
+          <w:szCs w:val="24"/>
+        </w:rPr>
+        <w:t>A defined transportation service option categorized by vehicle capacity, routes, and rates</w:t>
+      </w:r>
+      <w:r>
+        <w:rPr>
+          <w:rFonts w:hint="default" w:ascii="Times New Roman" w:hAnsi="Times New Roman" w:eastAsia="SimSun" w:cs="Times New Roman"/>
+          <w:sz w:val="24"/>
+          <w:szCs w:val="24"/>
+          <w:lang w:val="en-US"/>
+        </w:rPr>
+        <w:t>.</w:t>
       </w:r>
     </w:p>
     <w:p>
@@ -2946,6 +3679,35 @@
       <w:r>
         <w:rPr>
           <w:rFonts w:hint="default" w:ascii="Times New Roman" w:hAnsi="Times New Roman" w:eastAsia="SimSun" w:cs="Times New Roman"/>
+          <w:sz w:val="24"/>
+          <w:szCs w:val="24"/>
+          <w:lang w:val="en-US"/>
+        </w:rPr>
+        <w:t xml:space="preserve">B2B Corporate Order: </w:t>
+      </w:r>
+      <w:r>
+        <w:rPr>
+          <w:rFonts w:hint="default" w:ascii="Times New Roman" w:hAnsi="Times New Roman" w:eastAsia="SimSun" w:cs="Times New Roman"/>
+          <w:sz w:val="24"/>
+          <w:szCs w:val="24"/>
+        </w:rPr>
+        <w:t>A high-volume logistics request placed by enterprise clients for bulk cargo movement.</w:t>
+      </w:r>
+    </w:p>
+    <w:p>
+      <w:pPr>
+        <w:numPr>
+          <w:ilvl w:val="0"/>
+          <w:numId w:val="1"/>
+        </w:numPr>
+        <w:tabs>
+          <w:tab w:val="clear" w:pos="420"/>
+        </w:tabs>
+        <w:spacing w:line="240" w:lineRule="auto"/>
+        <w:ind w:left="1200" w:leftChars="0" w:hanging="420" w:firstLineChars="0"/>
+        <w:jc w:val="both"/>
+        <w:rPr>
+          <w:rFonts w:hint="default" w:ascii="Times New Roman" w:hAnsi="Times New Roman" w:eastAsia="SimSun" w:cs="Times New Roman"/>
           <w:i w:val="0"/>
           <w:iCs w:val="0"/>
           <w:color w:val="000000"/>
@@ -2956,15 +3718,23 @@
           <w:vertAlign w:val="baseline"/>
           <w:lang w:val="en-US"/>
         </w:rPr>
-        <w:t xml:space="preserve">SmartFM: </w:t>
-      </w:r>
-      <w:r>
-        <w:rPr>
-          <w:rFonts w:hint="default" w:ascii="Times New Roman" w:hAnsi="Times New Roman" w:eastAsia="SimSun" w:cs="Times New Roman"/>
-          <w:sz w:val="24"/>
-          <w:szCs w:val="24"/>
-        </w:rPr>
-        <w:t>A centralized system integrating tracking, operations, and fleet management across all ABC-Trans branches.</w:t>
+      </w:pPr>
+      <w:r>
+        <w:rPr>
+          <w:rFonts w:hint="default" w:ascii="Times New Roman" w:hAnsi="Times New Roman" w:eastAsia="SimSun" w:cs="Times New Roman"/>
+          <w:sz w:val="24"/>
+          <w:szCs w:val="24"/>
+          <w:lang w:val="en-US"/>
+        </w:rPr>
+        <w:t xml:space="preserve">Vehicle Assignment: </w:t>
+      </w:r>
+      <w:r>
+        <w:rPr>
+          <w:rFonts w:hint="default" w:ascii="Times New Roman" w:hAnsi="Times New Roman" w:eastAsia="SimSun" w:cs="Times New Roman"/>
+          <w:sz w:val="24"/>
+          <w:szCs w:val="24"/>
+        </w:rPr>
+        <w:t>The formal allocation of an available fleet vehicle to an active shipment order.</w:t>
       </w:r>
     </w:p>
     <w:p>
@@ -2999,24 +3769,7 @@
           <w:szCs w:val="24"/>
           <w:lang w:val="en-US"/>
         </w:rPr>
-        <w:t xml:space="preserve">Shipment Offering: </w:t>
-      </w:r>
-      <w:r>
-        <w:rPr>
-          <w:rFonts w:hint="default" w:ascii="Times New Roman" w:hAnsi="Times New Roman" w:eastAsia="SimSun" w:cs="Times New Roman"/>
-          <w:sz w:val="24"/>
-          <w:szCs w:val="24"/>
-        </w:rPr>
-        <w:t>A defined transportation service option categorized by vehicle capacity, routes, and rates</w:t>
-      </w:r>
-      <w:r>
-        <w:rPr>
-          <w:rFonts w:hint="default" w:ascii="Times New Roman" w:hAnsi="Times New Roman" w:eastAsia="SimSun" w:cs="Times New Roman"/>
-          <w:sz w:val="24"/>
-          <w:szCs w:val="24"/>
-          <w:lang w:val="en-US"/>
-        </w:rPr>
-        <w:t>.</w:t>
+        <w:t>Driver Management: Operational workflows dedicated to monitoring operator availability, active service hours, regulatory compliance, and safety credentials.</w:t>
       </w:r>
     </w:p>
     <w:p>
@@ -3051,15 +3804,7 @@
           <w:szCs w:val="24"/>
           <w:lang w:val="en-US"/>
         </w:rPr>
-        <w:t xml:space="preserve">B2B Corporate Order: </w:t>
-      </w:r>
-      <w:r>
-        <w:rPr>
-          <w:rFonts w:hint="default" w:ascii="Times New Roman" w:hAnsi="Times New Roman" w:eastAsia="SimSun" w:cs="Times New Roman"/>
-          <w:sz w:val="24"/>
-          <w:szCs w:val="24"/>
-        </w:rPr>
-        <w:t>A high-volume logistics request placed by enterprise clients for bulk cargo movement.</w:t>
+        <w:t>Real-Time Shipment Tracking: Live telemetry streams integrated with digital mapping interfaces that enable dispatchers and customers to monitor current cargo coordinates and shifting ETAs instantly.</w:t>
       </w:r>
     </w:p>
     <w:p>
@@ -3094,15 +3839,36 @@
           <w:szCs w:val="24"/>
           <w:lang w:val="en-US"/>
         </w:rPr>
-        <w:t xml:space="preserve">Vehicle Assignment: </w:t>
-      </w:r>
-      <w:r>
-        <w:rPr>
-          <w:rFonts w:hint="default" w:ascii="Times New Roman" w:hAnsi="Times New Roman" w:eastAsia="SimSun" w:cs="Times New Roman"/>
-          <w:sz w:val="24"/>
-          <w:szCs w:val="24"/>
-        </w:rPr>
-        <w:t>The formal allocation of an available fleet vehicle to an active shipment order.</w:t>
+        <w:t xml:space="preserve">Invoice: </w:t>
+      </w:r>
+      <w:r>
+        <w:rPr>
+          <w:rFonts w:hint="default" w:ascii="Times New Roman" w:hAnsi="Times New Roman" w:eastAsia="SimSun" w:cs="Times New Roman"/>
+          <w:i w:val="0"/>
+          <w:iCs w:val="0"/>
+          <w:color w:val="000000"/>
+          <w:sz w:val="24"/>
+          <w:szCs w:val="24"/>
+          <w:u w:val="none"/>
+          <w:shd w:val="clear" w:fill="FFFFFF"/>
+          <w:vertAlign w:val="baseline"/>
+        </w:rPr>
+        <w:t>A digital financial statement compiled by the system detailing services rendered and costs</w:t>
+      </w:r>
+      <w:r>
+        <w:rPr>
+          <w:rFonts w:hint="default" w:ascii="Times New Roman" w:hAnsi="Times New Roman" w:eastAsia="SimSun" w:cs="Times New Roman"/>
+          <w:i w:val="0"/>
+          <w:iCs w:val="0"/>
+          <w:color w:val="000000"/>
+          <w:sz w:val="24"/>
+          <w:szCs w:val="24"/>
+          <w:u w:val="none"/>
+          <w:shd w:val="clear" w:fill="FFFFFF"/>
+          <w:vertAlign w:val="baseline"/>
+          <w:lang w:val="en-US"/>
+        </w:rPr>
+        <w:t>.</w:t>
       </w:r>
     </w:p>
     <w:p>
@@ -3133,11 +3899,31 @@
       <w:r>
         <w:rPr>
           <w:rFonts w:hint="default" w:ascii="Times New Roman" w:hAnsi="Times New Roman" w:eastAsia="SimSun" w:cs="Times New Roman"/>
-          <w:sz w:val="24"/>
-          <w:szCs w:val="24"/>
-          <w:lang w:val="en-US"/>
-        </w:rPr>
-        <w:t>Driver Management: Operational workflows dedicated to monitoring operator availability, active service hours, regulatory compliance, and safety credentials.</w:t>
+          <w:i w:val="0"/>
+          <w:iCs w:val="0"/>
+          <w:color w:val="000000"/>
+          <w:sz w:val="24"/>
+          <w:szCs w:val="24"/>
+          <w:u w:val="none"/>
+          <w:shd w:val="clear" w:fill="FFFFFF"/>
+          <w:vertAlign w:val="baseline"/>
+          <w:lang w:val="en-US"/>
+        </w:rPr>
+        <w:t xml:space="preserve">Receipt: </w:t>
+      </w:r>
+      <w:r>
+        <w:rPr>
+          <w:rFonts w:hint="default" w:ascii="Times New Roman" w:hAnsi="Times New Roman" w:eastAsia="SimSun" w:cs="Times New Roman"/>
+          <w:i w:val="0"/>
+          <w:iCs w:val="0"/>
+          <w:color w:val="000000"/>
+          <w:sz w:val="24"/>
+          <w:szCs w:val="24"/>
+          <w:u w:val="none"/>
+          <w:shd w:val="clear" w:fill="FFFFFF"/>
+          <w:vertAlign w:val="baseline"/>
+        </w:rPr>
+        <w:t>An unalterable electronic document provided to clients as immediate proof of a completed payment.</w:t>
       </w:r>
     </w:p>
     <w:p>
@@ -3168,11 +3954,31 @@
       <w:r>
         <w:rPr>
           <w:rFonts w:hint="default" w:ascii="Times New Roman" w:hAnsi="Times New Roman" w:eastAsia="SimSun" w:cs="Times New Roman"/>
-          <w:sz w:val="24"/>
-          <w:szCs w:val="24"/>
-          <w:lang w:val="en-US"/>
-        </w:rPr>
-        <w:t>Real-Time Shipment Tracking: Live telemetry streams integrated with digital mapping interfaces that enable dispatchers and customers to monitor current cargo coordinates and shifting ETAs instantly.</w:t>
+          <w:i w:val="0"/>
+          <w:iCs w:val="0"/>
+          <w:color w:val="000000"/>
+          <w:sz w:val="24"/>
+          <w:szCs w:val="24"/>
+          <w:u w:val="none"/>
+          <w:shd w:val="clear" w:fill="FFFFFF"/>
+          <w:vertAlign w:val="baseline"/>
+          <w:lang w:val="en-US"/>
+        </w:rPr>
+        <w:t xml:space="preserve">Read Replica: </w:t>
+      </w:r>
+      <w:r>
+        <w:rPr>
+          <w:rFonts w:hint="default" w:ascii="Times New Roman" w:hAnsi="Times New Roman" w:eastAsia="SimSun" w:cs="Times New Roman"/>
+          <w:i w:val="0"/>
+          <w:iCs w:val="0"/>
+          <w:color w:val="000000"/>
+          <w:sz w:val="24"/>
+          <w:szCs w:val="24"/>
+          <w:u w:val="none"/>
+          <w:shd w:val="clear" w:fill="FFFFFF"/>
+          <w:vertAlign w:val="baseline"/>
+        </w:rPr>
+        <w:t>Dedicated database instances used to offload high-frequency tracking and search queries.</w:t>
       </w:r>
     </w:p>
     <w:p>
@@ -3203,15 +4009,6 @@
       <w:r>
         <w:rPr>
           <w:rFonts w:hint="default" w:ascii="Times New Roman" w:hAnsi="Times New Roman" w:eastAsia="SimSun" w:cs="Times New Roman"/>
-          <w:sz w:val="24"/>
-          <w:szCs w:val="24"/>
-          <w:lang w:val="en-US"/>
-        </w:rPr>
-        <w:t xml:space="preserve">Invoice: </w:t>
-      </w:r>
-      <w:r>
-        <w:rPr>
-          <w:rFonts w:hint="default" w:ascii="Times New Roman" w:hAnsi="Times New Roman" w:eastAsia="SimSun" w:cs="Times New Roman"/>
           <w:i w:val="0"/>
           <w:iCs w:val="0"/>
           <w:color w:val="000000"/>
@@ -3220,8 +4017,9 @@
           <w:u w:val="none"/>
           <w:shd w:val="clear" w:fill="FFFFFF"/>
           <w:vertAlign w:val="baseline"/>
-        </w:rPr>
-        <w:t>A digital financial statement compiled by the system detailing services rendered and costs</w:t>
+          <w:lang w:val="en-US"/>
+        </w:rPr>
+        <w:t xml:space="preserve">Persimistic Row-Level Locking: </w:t>
       </w:r>
       <w:r>
         <w:rPr>
@@ -3234,9 +4032,8 @@
           <w:u w:val="none"/>
           <w:shd w:val="clear" w:fill="FFFFFF"/>
           <w:vertAlign w:val="baseline"/>
-          <w:lang w:val="en-US"/>
-        </w:rPr>
-        <w:t>.</w:t>
+        </w:rPr>
+        <w:t>A database control that locks data rows during booking to prevent truck double-bookings.</w:t>
       </w:r>
     </w:p>
     <w:p>
@@ -3277,7 +4074,7 @@
           <w:vertAlign w:val="baseline"/>
           <w:lang w:val="en-US"/>
         </w:rPr>
-        <w:t xml:space="preserve">Receipt: </w:t>
+        <w:t xml:space="preserve">CQRS: </w:t>
       </w:r>
       <w:r>
         <w:rPr>
@@ -3291,7 +4088,7 @@
           <w:shd w:val="clear" w:fill="FFFFFF"/>
           <w:vertAlign w:val="baseline"/>
         </w:rPr>
-        <w:t>An unalterable electronic document provided to clients as immediate proof of a completed payment.</w:t>
+        <w:t>An architectural pattern separating data writes from data lookups to maximize performance.</w:t>
       </w:r>
     </w:p>
     <w:p>
@@ -3306,19 +4103,30 @@
         <w:spacing w:line="240" w:lineRule="auto"/>
         <w:ind w:left="1200" w:leftChars="0" w:hanging="420" w:firstLineChars="0"/>
         <w:jc w:val="both"/>
+        <w:rPr>
+          <w:rFonts w:hint="default" w:ascii="Times New Roman" w:hAnsi="Times New Roman" w:cs="Times New Roman"/>
+          <w:b w:val="0"/>
+          <w:bCs w:val="0"/>
+          <w:sz w:val="23"/>
+          <w:szCs w:val="23"/>
+          <w:lang w:val="en-US"/>
+        </w:rPr>
+      </w:pPr>
+      <w:r>
         <w:rPr>
           <w:rFonts w:hint="default" w:ascii="Times New Roman" w:hAnsi="Times New Roman" w:eastAsia="SimSun" w:cs="Times New Roman"/>
           <w:i w:val="0"/>
           <w:iCs w:val="0"/>
           <w:color w:val="000000"/>
-          <w:sz w:val="23"/>
-          <w:szCs w:val="23"/>
+          <w:sz w:val="24"/>
+          <w:szCs w:val="24"/>
           <w:u w:val="none"/>
           <w:shd w:val="clear" w:fill="FFFFFF"/>
           <w:vertAlign w:val="baseline"/>
           <w:lang w:val="en-US"/>
         </w:rPr>
-      </w:pPr>
+        <w:t xml:space="preserve">ACID Compliance: </w:t>
+      </w:r>
       <w:r>
         <w:rPr>
           <w:rFonts w:hint="default" w:ascii="Times New Roman" w:hAnsi="Times New Roman" w:eastAsia="SimSun" w:cs="Times New Roman"/>
@@ -3330,9 +4138,8 @@
           <w:u w:val="none"/>
           <w:shd w:val="clear" w:fill="FFFFFF"/>
           <w:vertAlign w:val="baseline"/>
-          <w:lang w:val="en-US"/>
-        </w:rPr>
-        <w:t xml:space="preserve">Read Replica: </w:t>
+        </w:rPr>
+        <w:t>Database properties ensuring multi-step workflows either succeed completely or roll back entirely</w:t>
       </w:r>
       <w:r>
         <w:rPr>
@@ -3345,181 +4152,6 @@
           <w:u w:val="none"/>
           <w:shd w:val="clear" w:fill="FFFFFF"/>
           <w:vertAlign w:val="baseline"/>
-        </w:rPr>
-        <w:t>Dedicated database instances used to offload high-frequency tracking and search queries.</w:t>
-      </w:r>
-    </w:p>
-    <w:p>
-      <w:pPr>
-        <w:numPr>
-          <w:ilvl w:val="0"/>
-          <w:numId w:val="1"/>
-        </w:numPr>
-        <w:tabs>
-          <w:tab w:val="clear" w:pos="420"/>
-        </w:tabs>
-        <w:spacing w:line="240" w:lineRule="auto"/>
-        <w:ind w:left="1200" w:leftChars="0" w:hanging="420" w:firstLineChars="0"/>
-        <w:jc w:val="both"/>
-        <w:rPr>
-          <w:rFonts w:hint="default" w:ascii="Times New Roman" w:hAnsi="Times New Roman" w:eastAsia="SimSun" w:cs="Times New Roman"/>
-          <w:i w:val="0"/>
-          <w:iCs w:val="0"/>
-          <w:color w:val="000000"/>
-          <w:sz w:val="23"/>
-          <w:szCs w:val="23"/>
-          <w:u w:val="none"/>
-          <w:shd w:val="clear" w:fill="FFFFFF"/>
-          <w:vertAlign w:val="baseline"/>
-          <w:lang w:val="en-US"/>
-        </w:rPr>
-      </w:pPr>
-      <w:r>
-        <w:rPr>
-          <w:rFonts w:hint="default" w:ascii="Times New Roman" w:hAnsi="Times New Roman" w:eastAsia="SimSun" w:cs="Times New Roman"/>
-          <w:i w:val="0"/>
-          <w:iCs w:val="0"/>
-          <w:color w:val="000000"/>
-          <w:sz w:val="24"/>
-          <w:szCs w:val="24"/>
-          <w:u w:val="none"/>
-          <w:shd w:val="clear" w:fill="FFFFFF"/>
-          <w:vertAlign w:val="baseline"/>
-          <w:lang w:val="en-US"/>
-        </w:rPr>
-        <w:t xml:space="preserve">Persimistic Row-Level Locking: </w:t>
-      </w:r>
-      <w:r>
-        <w:rPr>
-          <w:rFonts w:hint="default" w:ascii="Times New Roman" w:hAnsi="Times New Roman" w:eastAsia="SimSun" w:cs="Times New Roman"/>
-          <w:i w:val="0"/>
-          <w:iCs w:val="0"/>
-          <w:color w:val="000000"/>
-          <w:sz w:val="24"/>
-          <w:szCs w:val="24"/>
-          <w:u w:val="none"/>
-          <w:shd w:val="clear" w:fill="FFFFFF"/>
-          <w:vertAlign w:val="baseline"/>
-        </w:rPr>
-        <w:t>A database control that locks data rows during booking to prevent truck double-bookings.</w:t>
-      </w:r>
-    </w:p>
-    <w:p>
-      <w:pPr>
-        <w:numPr>
-          <w:ilvl w:val="0"/>
-          <w:numId w:val="1"/>
-        </w:numPr>
-        <w:tabs>
-          <w:tab w:val="clear" w:pos="420"/>
-        </w:tabs>
-        <w:spacing w:line="240" w:lineRule="auto"/>
-        <w:ind w:left="1200" w:leftChars="0" w:hanging="420" w:firstLineChars="0"/>
-        <w:jc w:val="both"/>
-        <w:rPr>
-          <w:rFonts w:hint="default" w:ascii="Times New Roman" w:hAnsi="Times New Roman" w:eastAsia="SimSun" w:cs="Times New Roman"/>
-          <w:i w:val="0"/>
-          <w:iCs w:val="0"/>
-          <w:color w:val="000000"/>
-          <w:sz w:val="23"/>
-          <w:szCs w:val="23"/>
-          <w:u w:val="none"/>
-          <w:shd w:val="clear" w:fill="FFFFFF"/>
-          <w:vertAlign w:val="baseline"/>
-          <w:lang w:val="en-US"/>
-        </w:rPr>
-      </w:pPr>
-      <w:r>
-        <w:rPr>
-          <w:rFonts w:hint="default" w:ascii="Times New Roman" w:hAnsi="Times New Roman" w:eastAsia="SimSun" w:cs="Times New Roman"/>
-          <w:i w:val="0"/>
-          <w:iCs w:val="0"/>
-          <w:color w:val="000000"/>
-          <w:sz w:val="24"/>
-          <w:szCs w:val="24"/>
-          <w:u w:val="none"/>
-          <w:shd w:val="clear" w:fill="FFFFFF"/>
-          <w:vertAlign w:val="baseline"/>
-          <w:lang w:val="en-US"/>
-        </w:rPr>
-        <w:t xml:space="preserve">CQRS: </w:t>
-      </w:r>
-      <w:r>
-        <w:rPr>
-          <w:rFonts w:hint="default" w:ascii="Times New Roman" w:hAnsi="Times New Roman" w:eastAsia="SimSun" w:cs="Times New Roman"/>
-          <w:i w:val="0"/>
-          <w:iCs w:val="0"/>
-          <w:color w:val="000000"/>
-          <w:sz w:val="24"/>
-          <w:szCs w:val="24"/>
-          <w:u w:val="none"/>
-          <w:shd w:val="clear" w:fill="FFFFFF"/>
-          <w:vertAlign w:val="baseline"/>
-        </w:rPr>
-        <w:t>An architectural pattern separating data writes from data lookups to maximize performance.</w:t>
-      </w:r>
-    </w:p>
-    <w:p>
-      <w:pPr>
-        <w:numPr>
-          <w:ilvl w:val="0"/>
-          <w:numId w:val="1"/>
-        </w:numPr>
-        <w:tabs>
-          <w:tab w:val="clear" w:pos="420"/>
-        </w:tabs>
-        <w:spacing w:line="240" w:lineRule="auto"/>
-        <w:ind w:left="1200" w:leftChars="0" w:hanging="420" w:firstLineChars="0"/>
-        <w:jc w:val="both"/>
-        <w:rPr>
-          <w:rFonts w:hint="default" w:ascii="Times New Roman" w:hAnsi="Times New Roman" w:cs="Times New Roman"/>
-          <w:b w:val="0"/>
-          <w:bCs w:val="0"/>
-          <w:sz w:val="23"/>
-          <w:szCs w:val="23"/>
-          <w:lang w:val="en-US"/>
-        </w:rPr>
-      </w:pPr>
-      <w:r>
-        <w:rPr>
-          <w:rFonts w:hint="default" w:ascii="Times New Roman" w:hAnsi="Times New Roman" w:eastAsia="SimSun" w:cs="Times New Roman"/>
-          <w:i w:val="0"/>
-          <w:iCs w:val="0"/>
-          <w:color w:val="000000"/>
-          <w:sz w:val="24"/>
-          <w:szCs w:val="24"/>
-          <w:u w:val="none"/>
-          <w:shd w:val="clear" w:fill="FFFFFF"/>
-          <w:vertAlign w:val="baseline"/>
-          <w:lang w:val="en-US"/>
-        </w:rPr>
-        <w:t xml:space="preserve">ACID Compliance: </w:t>
-      </w:r>
-      <w:r>
-        <w:rPr>
-          <w:rFonts w:hint="default" w:ascii="Times New Roman" w:hAnsi="Times New Roman" w:eastAsia="SimSun" w:cs="Times New Roman"/>
-          <w:i w:val="0"/>
-          <w:iCs w:val="0"/>
-          <w:color w:val="000000"/>
-          <w:sz w:val="24"/>
-          <w:szCs w:val="24"/>
-          <w:u w:val="none"/>
-          <w:shd w:val="clear" w:fill="FFFFFF"/>
-          <w:vertAlign w:val="baseline"/>
-        </w:rPr>
-        <w:t>Database properties ensuring multi-step workflows either succeed completely or roll back entirely</w:t>
-      </w:r>
-      <w:r>
-        <w:rPr>
-          <w:rFonts w:hint="default" w:ascii="Times New Roman" w:hAnsi="Times New Roman" w:eastAsia="SimSun" w:cs="Times New Roman"/>
-          <w:i w:val="0"/>
-          <w:iCs w:val="0"/>
-          <w:color w:val="000000"/>
-          <w:sz w:val="24"/>
-          <w:szCs w:val="24"/>
-          <w:u w:val="none"/>
-          <w:shd w:val="clear" w:fill="FFFFFF"/>
-          <w:vertAlign w:val="baseline"/>
           <w:lang w:val="en-US"/>
         </w:rPr>
         <w:t>.</w:t>
@@ -4002,21 +4634,7 @@
           <w:rFonts w:hint="default" w:ascii="Times New Roman" w:hAnsi="Times New Roman" w:cs="Times New Roman"/>
           <w:lang w:val="en-US"/>
         </w:rPr>
-        <w:t xml:space="preserve">2.4 </w:t>
-      </w:r>
-      <w:r>
-        <w:rPr>
-          <w:rFonts w:hint="default" w:ascii="Times New Roman" w:hAnsi="Times New Roman" w:cs="Times New Roman"/>
-          <w:lang w:val="en-US"/>
-        </w:rPr>
-        <w:t xml:space="preserve">Project </w:t>
-      </w:r>
-      <w:r>
-        <w:rPr>
-          <w:rFonts w:hint="default" w:ascii="Times New Roman" w:hAnsi="Times New Roman" w:cs="Times New Roman"/>
-          <w:lang w:val="en-US"/>
-        </w:rPr>
-        <w:t>Scope</w:t>
+        <w:t>2.4 Project Scope</w:t>
       </w:r>
     </w:p>
     <w:p>
@@ -4515,21 +5133,7 @@
           <w:rFonts w:hint="default" w:ascii="Times New Roman" w:hAnsi="Times New Roman" w:cs="Times New Roman"/>
           <w:lang w:val="en-US"/>
         </w:rPr>
-        <w:t>3</w:t>
-      </w:r>
-      <w:r>
-        <w:rPr>
-          <w:rFonts w:hint="default" w:ascii="Times New Roman" w:hAnsi="Times New Roman" w:cs="Times New Roman"/>
-          <w:lang w:val="en-US"/>
-        </w:rPr>
-        <w:t xml:space="preserve">.1 </w:t>
-      </w:r>
-      <w:r>
-        <w:rPr>
-          <w:rFonts w:hint="default" w:ascii="Times New Roman" w:hAnsi="Times New Roman" w:cs="Times New Roman"/>
-          <w:lang w:val="en-US"/>
-        </w:rPr>
-        <w:t>Pain Points</w:t>
+        <w:t>3.1 Pain Points</w:t>
       </w:r>
     </w:p>
     <w:p>
@@ -4559,18 +5163,7 @@
           <w:szCs w:val="25"/>
           <w:lang w:val="en-US"/>
         </w:rPr>
-        <w:t xml:space="preserve">Operational Fragmentation: ABC-Trans lacks extreme efficiency </w:t>
-      </w:r>
-      <w:r>
-        <w:rPr>
-          <w:rFonts w:hint="default" w:ascii="Times New Roman" w:hAnsi="Times New Roman" w:cs="Times New Roman"/>
-          <w:b w:val="0"/>
-          <w:bCs w:val="0"/>
-          <w:sz w:val="25"/>
-          <w:szCs w:val="25"/>
-          <w:lang w:val="en-US"/>
-        </w:rPr>
-        <w:t xml:space="preserve">during daily working operations because of </w:t>
+        <w:t xml:space="preserve">Operational Fragmentation: ABC-Trans lacks extreme efficiency during daily working operations because of </w:t>
       </w:r>
       <w:r>
         <w:rPr>
@@ -4724,28 +5317,7 @@
           <w:rFonts w:hint="default" w:ascii="Times New Roman" w:hAnsi="Times New Roman" w:cs="Times New Roman"/>
           <w:lang w:val="en-US"/>
         </w:rPr>
-        <w:t>3.</w:t>
-      </w:r>
-      <w:r>
-        <w:rPr>
-          <w:rFonts w:hint="default" w:ascii="Times New Roman" w:hAnsi="Times New Roman" w:cs="Times New Roman"/>
-          <w:lang w:val="en-US"/>
-        </w:rPr>
-        <w:t>2</w:t>
-      </w:r>
-      <w:r>
-        <w:rPr>
-          <w:rFonts w:hint="default" w:ascii="Times New Roman" w:hAnsi="Times New Roman" w:cs="Times New Roman"/>
-          <w:lang w:val="en-US"/>
-        </w:rPr>
-        <w:t xml:space="preserve"> </w:t>
-      </w:r>
-      <w:r>
-        <w:rPr>
-          <w:rFonts w:hint="default" w:ascii="Times New Roman" w:hAnsi="Times New Roman" w:cs="Times New Roman"/>
-          <w:lang w:val="en-US"/>
-        </w:rPr>
-        <w:t>Domain Entities</w:t>
+        <w:t>3.2 Domain Entities</w:t>
       </w:r>
     </w:p>
     <w:p>
@@ -5047,28 +5619,7 @@
           <w:rFonts w:hint="default" w:ascii="Times New Roman" w:hAnsi="Times New Roman" w:cs="Times New Roman"/>
           <w:lang w:val="en-US"/>
         </w:rPr>
-        <w:t>3.</w:t>
-      </w:r>
-      <w:r>
-        <w:rPr>
-          <w:rFonts w:hint="default" w:ascii="Times New Roman" w:hAnsi="Times New Roman" w:cs="Times New Roman"/>
-          <w:lang w:val="en-US"/>
-        </w:rPr>
-        <w:t>3</w:t>
-      </w:r>
-      <w:r>
-        <w:rPr>
-          <w:rFonts w:hint="default" w:ascii="Times New Roman" w:hAnsi="Times New Roman" w:cs="Times New Roman"/>
-          <w:lang w:val="en-US"/>
-        </w:rPr>
-        <w:t xml:space="preserve"> </w:t>
-      </w:r>
-      <w:r>
-        <w:rPr>
-          <w:rFonts w:hint="default" w:ascii="Times New Roman" w:hAnsi="Times New Roman" w:cs="Times New Roman"/>
-          <w:lang w:val="en-US"/>
-        </w:rPr>
-        <w:t>Actors</w:t>
+        <w:t>3.3 Actors</w:t>
       </w:r>
     </w:p>
     <w:p>
@@ -5250,8 +5801,6 @@
         </w:rPr>
         <w:t>Partner Supermarket (Corporate Client): Logs into the client portal to submit bulk B2B shipping requests, tracks active cargo locations, and views estimated arrival times.</w:t>
       </w:r>
-      <w:bookmarkStart w:id="0" w:name="_GoBack"/>
-      <w:bookmarkEnd w:id="0"/>
     </w:p>
     <w:p>
       <w:pPr>
@@ -5329,28 +5878,7 @@
           <w:rFonts w:hint="default" w:ascii="Times New Roman" w:hAnsi="Times New Roman" w:cs="Times New Roman"/>
           <w:lang w:val="en-US"/>
         </w:rPr>
-        <w:t>3.</w:t>
-      </w:r>
-      <w:r>
-        <w:rPr>
-          <w:rFonts w:hint="default" w:ascii="Times New Roman" w:hAnsi="Times New Roman" w:cs="Times New Roman"/>
-          <w:lang w:val="en-US"/>
-        </w:rPr>
-        <w:t>4</w:t>
-      </w:r>
-      <w:r>
-        <w:rPr>
-          <w:rFonts w:hint="default" w:ascii="Times New Roman" w:hAnsi="Times New Roman" w:cs="Times New Roman"/>
-          <w:lang w:val="en-US"/>
-        </w:rPr>
-        <w:t xml:space="preserve"> </w:t>
-      </w:r>
-      <w:r>
-        <w:rPr>
-          <w:rFonts w:hint="default" w:ascii="Times New Roman" w:hAnsi="Times New Roman" w:cs="Times New Roman"/>
-          <w:lang w:val="en-US"/>
-        </w:rPr>
-        <w:t>Tasks</w:t>
+        <w:t>3.4 Tasks</w:t>
       </w:r>
     </w:p>
     <w:p>
@@ -5484,7 +6012,321 @@
           <w:szCs w:val="24"/>
           <w:lang w:val="en-US"/>
         </w:rPr>
-        <w:t>Branch and Hub Setup</w:t>
+        <w:t>Branch and Hub Setup:</w:t>
+      </w:r>
+    </w:p>
+    <w:p>
+      <w:pPr>
+        <w:numPr>
+          <w:ilvl w:val="0"/>
+          <w:numId w:val="5"/>
+        </w:numPr>
+        <w:tabs>
+          <w:tab w:val="clear" w:pos="420"/>
+        </w:tabs>
+        <w:ind w:left="1600" w:leftChars="0" w:hanging="420" w:firstLineChars="0"/>
+        <w:jc w:val="both"/>
+        <w:rPr>
+          <w:rFonts w:hint="default" w:ascii="Times New Roman" w:hAnsi="Times New Roman" w:cs="Times New Roman"/>
+          <w:b w:val="0"/>
+          <w:bCs w:val="0"/>
+          <w:sz w:val="24"/>
+          <w:szCs w:val="24"/>
+          <w:lang w:val="en-US"/>
+        </w:rPr>
+      </w:pPr>
+      <w:r>
+        <w:rPr>
+          <w:rFonts w:hint="default" w:ascii="Times New Roman" w:hAnsi="Times New Roman" w:cs="Times New Roman"/>
+          <w:b w:val="0"/>
+          <w:bCs w:val="0"/>
+          <w:sz w:val="24"/>
+          <w:szCs w:val="24"/>
+          <w:lang w:val="en-US"/>
+        </w:rPr>
+        <w:t>Actor: System Administrator, Branch Manager</w:t>
+      </w:r>
+    </w:p>
+    <w:p>
+      <w:pPr>
+        <w:numPr>
+          <w:ilvl w:val="0"/>
+          <w:numId w:val="5"/>
+        </w:numPr>
+        <w:tabs>
+          <w:tab w:val="clear" w:pos="420"/>
+        </w:tabs>
+        <w:ind w:left="1600" w:leftChars="0" w:hanging="420" w:firstLineChars="0"/>
+        <w:jc w:val="both"/>
+        <w:rPr>
+          <w:rFonts w:hint="default" w:ascii="Times New Roman" w:hAnsi="Times New Roman" w:cs="Times New Roman"/>
+          <w:b w:val="0"/>
+          <w:bCs w:val="0"/>
+          <w:sz w:val="24"/>
+          <w:szCs w:val="24"/>
+          <w:lang w:val="en-US"/>
+        </w:rPr>
+      </w:pPr>
+      <w:r>
+        <w:rPr>
+          <w:rFonts w:hint="default" w:ascii="Times New Roman" w:hAnsi="Times New Roman" w:cs="Times New Roman"/>
+          <w:b w:val="0"/>
+          <w:bCs w:val="0"/>
+          <w:sz w:val="24"/>
+          <w:szCs w:val="24"/>
+          <w:lang w:val="en-US"/>
+        </w:rPr>
+        <w:t xml:space="preserve">Description: </w:t>
+      </w:r>
+      <w:r>
+        <w:rPr>
+          <w:rFonts w:hint="default" w:ascii="Times New Roman" w:hAnsi="Times New Roman" w:eastAsia="SimSun" w:cs="Times New Roman"/>
+          <w:sz w:val="24"/>
+          <w:szCs w:val="24"/>
+        </w:rPr>
+        <w:t>Configures regional distribution hub parameters, local database synchronization settings, and geographical boundaries for resource mapping.</w:t>
+      </w:r>
+    </w:p>
+    <w:p>
+      <w:pPr>
+        <w:numPr>
+          <w:ilvl w:val="0"/>
+          <w:numId w:val="4"/>
+        </w:numPr>
+        <w:tabs>
+          <w:tab w:val="clear" w:pos="420"/>
+        </w:tabs>
+        <w:ind w:left="1200" w:leftChars="0" w:hanging="420" w:firstLineChars="0"/>
+        <w:jc w:val="both"/>
+        <w:rPr>
+          <w:rFonts w:hint="default" w:ascii="Times New Roman" w:hAnsi="Times New Roman" w:cs="Times New Roman"/>
+          <w:b w:val="0"/>
+          <w:bCs w:val="0"/>
+          <w:sz w:val="24"/>
+          <w:szCs w:val="24"/>
+        </w:rPr>
+      </w:pPr>
+      <w:r>
+        <w:rPr>
+          <w:rFonts w:hint="default" w:ascii="Times New Roman" w:hAnsi="Times New Roman" w:cs="Times New Roman"/>
+          <w:b w:val="0"/>
+          <w:bCs w:val="0"/>
+          <w:sz w:val="24"/>
+          <w:szCs w:val="24"/>
+          <w:lang w:val="en-US"/>
+        </w:rPr>
+        <w:t>Fleet Asset Management:</w:t>
+      </w:r>
+    </w:p>
+    <w:p>
+      <w:pPr>
+        <w:numPr>
+          <w:ilvl w:val="0"/>
+          <w:numId w:val="5"/>
+        </w:numPr>
+        <w:tabs>
+          <w:tab w:val="clear" w:pos="420"/>
+        </w:tabs>
+        <w:ind w:left="1600" w:leftChars="0" w:hanging="420" w:firstLineChars="0"/>
+        <w:jc w:val="both"/>
+        <w:rPr>
+          <w:rFonts w:hint="default" w:ascii="Times New Roman" w:hAnsi="Times New Roman" w:cs="Times New Roman"/>
+          <w:b w:val="0"/>
+          <w:bCs w:val="0"/>
+          <w:sz w:val="24"/>
+          <w:szCs w:val="24"/>
+          <w:lang w:val="en-US"/>
+        </w:rPr>
+      </w:pPr>
+      <w:r>
+        <w:rPr>
+          <w:rFonts w:hint="default" w:ascii="Times New Roman" w:hAnsi="Times New Roman" w:cs="Times New Roman"/>
+          <w:b w:val="0"/>
+          <w:bCs w:val="0"/>
+          <w:sz w:val="24"/>
+          <w:szCs w:val="24"/>
+          <w:lang w:val="en-US"/>
+        </w:rPr>
+        <w:t>Actor: System Administrator, Branch Manager</w:t>
+      </w:r>
+    </w:p>
+    <w:p>
+      <w:pPr>
+        <w:numPr>
+          <w:ilvl w:val="0"/>
+          <w:numId w:val="5"/>
+        </w:numPr>
+        <w:tabs>
+          <w:tab w:val="clear" w:pos="420"/>
+        </w:tabs>
+        <w:ind w:left="1600" w:leftChars="0" w:hanging="420" w:firstLineChars="0"/>
+        <w:jc w:val="both"/>
+        <w:rPr>
+          <w:rFonts w:hint="default" w:ascii="Times New Roman" w:hAnsi="Times New Roman" w:cs="Times New Roman"/>
+          <w:b w:val="0"/>
+          <w:bCs w:val="0"/>
+          <w:sz w:val="24"/>
+          <w:szCs w:val="24"/>
+          <w:lang w:val="en-US"/>
+        </w:rPr>
+      </w:pPr>
+      <w:r>
+        <w:rPr>
+          <w:rFonts w:hint="default" w:ascii="Times New Roman" w:hAnsi="Times New Roman" w:cs="Times New Roman"/>
+          <w:b w:val="0"/>
+          <w:bCs w:val="0"/>
+          <w:sz w:val="24"/>
+          <w:szCs w:val="24"/>
+          <w:lang w:val="en-US"/>
+        </w:rPr>
+        <w:t xml:space="preserve">Description: </w:t>
+      </w:r>
+      <w:r>
+        <w:rPr>
+          <w:rFonts w:hint="default" w:ascii="Times New Roman" w:hAnsi="Times New Roman" w:eastAsia="SimSun" w:cs="Times New Roman"/>
+          <w:sz w:val="24"/>
+          <w:szCs w:val="24"/>
+        </w:rPr>
+        <w:t>Registers and updates physical transport assets, inputs vehicle technical specifications, and tracks localized truck availability.</w:t>
+      </w:r>
+    </w:p>
+    <w:p>
+      <w:pPr>
+        <w:numPr>
+          <w:ilvl w:val="0"/>
+          <w:numId w:val="4"/>
+        </w:numPr>
+        <w:tabs>
+          <w:tab w:val="clear" w:pos="420"/>
+        </w:tabs>
+        <w:ind w:left="1200" w:leftChars="0" w:hanging="420" w:firstLineChars="0"/>
+        <w:jc w:val="both"/>
+        <w:rPr>
+          <w:rFonts w:hint="default" w:ascii="Times New Roman" w:hAnsi="Times New Roman" w:cs="Times New Roman"/>
+          <w:b w:val="0"/>
+          <w:bCs w:val="0"/>
+          <w:sz w:val="24"/>
+          <w:szCs w:val="24"/>
+        </w:rPr>
+      </w:pPr>
+      <w:r>
+        <w:rPr>
+          <w:rFonts w:hint="default" w:ascii="Times New Roman" w:hAnsi="Times New Roman" w:cs="Times New Roman"/>
+          <w:b w:val="0"/>
+          <w:bCs w:val="0"/>
+          <w:sz w:val="24"/>
+          <w:szCs w:val="24"/>
+          <w:lang w:val="en-US"/>
+        </w:rPr>
+        <w:t>Order Management:</w:t>
+      </w:r>
+    </w:p>
+    <w:p>
+      <w:pPr>
+        <w:numPr>
+          <w:ilvl w:val="0"/>
+          <w:numId w:val="5"/>
+        </w:numPr>
+        <w:tabs>
+          <w:tab w:val="clear" w:pos="420"/>
+        </w:tabs>
+        <w:ind w:left="1600" w:leftChars="0" w:hanging="420" w:firstLineChars="0"/>
+        <w:jc w:val="both"/>
+        <w:rPr>
+          <w:rFonts w:hint="default" w:ascii="Times New Roman" w:hAnsi="Times New Roman" w:cs="Times New Roman"/>
+          <w:b w:val="0"/>
+          <w:bCs w:val="0"/>
+          <w:sz w:val="24"/>
+          <w:szCs w:val="24"/>
+          <w:lang w:val="en-US"/>
+        </w:rPr>
+      </w:pPr>
+      <w:r>
+        <w:rPr>
+          <w:rFonts w:hint="default" w:ascii="Times New Roman" w:hAnsi="Times New Roman" w:cs="Times New Roman"/>
+          <w:b w:val="0"/>
+          <w:bCs w:val="0"/>
+          <w:sz w:val="24"/>
+          <w:szCs w:val="24"/>
+          <w:lang w:val="en-US"/>
+        </w:rPr>
+        <w:t xml:space="preserve">Actor: </w:t>
+      </w:r>
+      <w:r>
+        <w:rPr>
+          <w:rFonts w:hint="default" w:ascii="Times New Roman" w:hAnsi="Times New Roman" w:eastAsia="SimSun" w:cs="Times New Roman"/>
+          <w:sz w:val="24"/>
+          <w:szCs w:val="24"/>
+        </w:rPr>
+        <w:t>Partner Supermarket (Corporate Client), Dispatcher</w:t>
+      </w:r>
+    </w:p>
+    <w:p>
+      <w:pPr>
+        <w:numPr>
+          <w:ilvl w:val="0"/>
+          <w:numId w:val="5"/>
+        </w:numPr>
+        <w:tabs>
+          <w:tab w:val="clear" w:pos="420"/>
+        </w:tabs>
+        <w:ind w:left="1600" w:leftChars="0" w:hanging="420" w:firstLineChars="0"/>
+        <w:jc w:val="both"/>
+        <w:rPr>
+          <w:rFonts w:hint="default" w:ascii="Times New Roman" w:hAnsi="Times New Roman" w:cs="Times New Roman"/>
+          <w:b w:val="0"/>
+          <w:bCs w:val="0"/>
+          <w:sz w:val="24"/>
+          <w:szCs w:val="24"/>
+          <w:lang w:val="en-US"/>
+        </w:rPr>
+      </w:pPr>
+      <w:r>
+        <w:rPr>
+          <w:rFonts w:hint="default" w:ascii="Times New Roman" w:hAnsi="Times New Roman" w:cs="Times New Roman"/>
+          <w:b w:val="0"/>
+          <w:bCs w:val="0"/>
+          <w:sz w:val="24"/>
+          <w:szCs w:val="24"/>
+          <w:lang w:val="en-US"/>
+        </w:rPr>
+        <w:t xml:space="preserve">Description: </w:t>
+      </w:r>
+      <w:r>
+        <w:rPr>
+          <w:rFonts w:hint="default" w:ascii="Times New Roman" w:hAnsi="Times New Roman" w:eastAsia="SimSun" w:cs="Times New Roman"/>
+          <w:sz w:val="24"/>
+          <w:szCs w:val="24"/>
+        </w:rPr>
+        <w:t>Handles the submission of bulk B2B shipping requests, details cargo dimensions, and logs specific delivery destination requests.</w:t>
+      </w:r>
+    </w:p>
+    <w:p>
+      <w:pPr>
+        <w:numPr>
+          <w:ilvl w:val="0"/>
+          <w:numId w:val="4"/>
+        </w:numPr>
+        <w:tabs>
+          <w:tab w:val="clear" w:pos="420"/>
+        </w:tabs>
+        <w:ind w:left="1200" w:leftChars="0" w:hanging="420" w:firstLineChars="0"/>
+        <w:jc w:val="both"/>
+        <w:rPr>
+          <w:rFonts w:hint="default" w:ascii="Times New Roman" w:hAnsi="Times New Roman" w:cs="Times New Roman"/>
+          <w:b w:val="0"/>
+          <w:bCs w:val="0"/>
+          <w:sz w:val="24"/>
+          <w:szCs w:val="24"/>
+        </w:rPr>
+      </w:pPr>
+      <w:r>
+        <w:rPr>
+          <w:rFonts w:hint="default" w:ascii="Times New Roman" w:hAnsi="Times New Roman" w:eastAsia="SimSun" w:cs="Times New Roman"/>
+          <w:sz w:val="24"/>
+          <w:szCs w:val="24"/>
+        </w:rPr>
+        <w:t>Shipment Scheduling and Dispatch</w:t>
       </w:r>
       <w:r>
         <w:rPr>
@@ -5527,18 +6369,15 @@
           <w:szCs w:val="24"/>
           <w:lang w:val="en-US"/>
         </w:rPr>
-        <w:t>Actor: System Administrator</w:t>
-      </w:r>
-      <w:r>
-        <w:rPr>
-          <w:rFonts w:hint="default" w:ascii="Times New Roman" w:hAnsi="Times New Roman" w:cs="Times New Roman"/>
-          <w:b w:val="0"/>
-          <w:bCs w:val="0"/>
-          <w:sz w:val="24"/>
-          <w:szCs w:val="24"/>
-          <w:lang w:val="en-US"/>
-        </w:rPr>
-        <w:t>, Branch Manager</w:t>
+        <w:t xml:space="preserve">Actor: </w:t>
+      </w:r>
+      <w:r>
+        <w:rPr>
+          <w:rFonts w:hint="default" w:ascii="Times New Roman" w:hAnsi="Times New Roman" w:eastAsia="SimSun" w:cs="Times New Roman"/>
+          <w:sz w:val="24"/>
+          <w:szCs w:val="24"/>
+        </w:rPr>
+        <w:t>Dispatcher, Driver</w:t>
       </w:r>
     </w:p>
     <w:p>
@@ -5578,7 +6417,7 @@
           <w:sz w:val="24"/>
           <w:szCs w:val="24"/>
         </w:rPr>
-        <w:t>Configures regional distribution hub parameters, local database synchronization settings, and geographical boundaries for resource mapping.</w:t>
+        <w:t>Assigns pending logistics orders to available trucks, schedules driver duty shifts, and resolves real-time routing changes.</w:t>
       </w:r>
     </w:p>
     <w:p>
@@ -5602,14 +6441,11 @@
       </w:pPr>
       <w:r>
         <w:rPr>
-          <w:rFonts w:hint="default" w:ascii="Times New Roman" w:hAnsi="Times New Roman" w:cs="Times New Roman"/>
-          <w:b w:val="0"/>
-          <w:bCs w:val="0"/>
-          <w:sz w:val="24"/>
-          <w:szCs w:val="24"/>
-          <w:lang w:val="en-US"/>
-        </w:rPr>
-        <w:t>Fleet Asset Management</w:t>
+          <w:rFonts w:hint="default" w:ascii="Times New Roman" w:hAnsi="Times New Roman" w:eastAsia="SimSun" w:cs="Times New Roman"/>
+          <w:sz w:val="24"/>
+          <w:szCs w:val="24"/>
+        </w:rPr>
+        <w:t>Real-Time Transit Tracking</w:t>
       </w:r>
       <w:r>
         <w:rPr>
@@ -5652,7 +6488,15 @@
           <w:szCs w:val="24"/>
           <w:lang w:val="en-US"/>
         </w:rPr>
-        <w:t>Actor: System Administrator, Branch Manager</w:t>
+        <w:t xml:space="preserve">Actor: </w:t>
+      </w:r>
+      <w:r>
+        <w:rPr>
+          <w:rFonts w:hint="default" w:ascii="Times New Roman" w:hAnsi="Times New Roman" w:eastAsia="SimSun" w:cs="Times New Roman"/>
+          <w:sz w:val="24"/>
+          <w:szCs w:val="24"/>
+        </w:rPr>
+        <w:t>Driver, External GPS Telemetry System, Dispatcher</w:t>
       </w:r>
     </w:p>
     <w:p>
@@ -5692,7 +6536,7 @@
           <w:sz w:val="24"/>
           <w:szCs w:val="24"/>
         </w:rPr>
-        <w:t>Registers and updates physical transport assets, inputs vehicle technical specifications, and tracks localized truck availability.</w:t>
+        <w:t>Captures and records live GPS coordinates automatically while allowing drivers to log transit milestones manually.</w:t>
       </w:r>
     </w:p>
     <w:p>
@@ -5716,14 +6560,11 @@
       </w:pPr>
       <w:r>
         <w:rPr>
-          <w:rFonts w:hint="default" w:ascii="Times New Roman" w:hAnsi="Times New Roman" w:cs="Times New Roman"/>
-          <w:b w:val="0"/>
-          <w:bCs w:val="0"/>
-          <w:sz w:val="24"/>
-          <w:szCs w:val="24"/>
-          <w:lang w:val="en-US"/>
-        </w:rPr>
-        <w:t>Order Management</w:t>
+          <w:rFonts w:hint="default" w:ascii="Times New Roman" w:hAnsi="Times New Roman" w:eastAsia="SimSun" w:cs="Times New Roman"/>
+          <w:sz w:val="24"/>
+          <w:szCs w:val="24"/>
+        </w:rPr>
+        <w:t>Handle Delivery Exceptions</w:t>
       </w:r>
       <w:r>
         <w:rPr>
@@ -5774,6 +6615,125 @@
           <w:sz w:val="24"/>
           <w:szCs w:val="24"/>
         </w:rPr>
+        <w:t>Driver, Dispatcher</w:t>
+      </w:r>
+    </w:p>
+    <w:p>
+      <w:pPr>
+        <w:numPr>
+          <w:ilvl w:val="0"/>
+          <w:numId w:val="5"/>
+        </w:numPr>
+        <w:tabs>
+          <w:tab w:val="clear" w:pos="420"/>
+        </w:tabs>
+        <w:ind w:left="1600" w:leftChars="0" w:hanging="420" w:firstLineChars="0"/>
+        <w:jc w:val="both"/>
+        <w:rPr>
+          <w:rFonts w:hint="default" w:ascii="Times New Roman" w:hAnsi="Times New Roman" w:cs="Times New Roman"/>
+          <w:b w:val="0"/>
+          <w:bCs w:val="0"/>
+          <w:sz w:val="24"/>
+          <w:szCs w:val="24"/>
+          <w:lang w:val="en-US"/>
+        </w:rPr>
+      </w:pPr>
+      <w:r>
+        <w:rPr>
+          <w:rFonts w:hint="default" w:ascii="Times New Roman" w:hAnsi="Times New Roman" w:cs="Times New Roman"/>
+          <w:b w:val="0"/>
+          <w:bCs w:val="0"/>
+          <w:sz w:val="24"/>
+          <w:szCs w:val="24"/>
+          <w:lang w:val="en-US"/>
+        </w:rPr>
+        <w:t xml:space="preserve">Description: </w:t>
+      </w:r>
+      <w:r>
+        <w:rPr>
+          <w:rFonts w:hint="default" w:ascii="Times New Roman" w:hAnsi="Times New Roman" w:eastAsia="SimSun" w:cs="Times New Roman"/>
+          <w:sz w:val="24"/>
+          <w:szCs w:val="24"/>
+        </w:rPr>
+        <w:t>Manages unexpected transit issues such as vehicle breakdowns or traffic delays, allowing staff to reroute assets and notify supermarkets immediately.</w:t>
+      </w:r>
+    </w:p>
+    <w:p>
+      <w:pPr>
+        <w:numPr>
+          <w:ilvl w:val="0"/>
+          <w:numId w:val="4"/>
+        </w:numPr>
+        <w:tabs>
+          <w:tab w:val="clear" w:pos="420"/>
+        </w:tabs>
+        <w:ind w:left="1200" w:leftChars="0" w:hanging="420" w:firstLineChars="0"/>
+        <w:jc w:val="both"/>
+        <w:rPr>
+          <w:rFonts w:hint="default" w:ascii="Times New Roman" w:hAnsi="Times New Roman" w:cs="Times New Roman"/>
+          <w:b w:val="0"/>
+          <w:bCs w:val="0"/>
+          <w:sz w:val="24"/>
+          <w:szCs w:val="24"/>
+        </w:rPr>
+      </w:pPr>
+      <w:r>
+        <w:rPr>
+          <w:rFonts w:hint="default" w:ascii="Times New Roman" w:hAnsi="Times New Roman" w:eastAsia="SimSun" w:cs="Times New Roman"/>
+          <w:sz w:val="24"/>
+          <w:szCs w:val="24"/>
+        </w:rPr>
+        <w:t>Process Order Modifications and Cancellations</w:t>
+      </w:r>
+      <w:r>
+        <w:rPr>
+          <w:rFonts w:hint="default" w:ascii="Times New Roman" w:hAnsi="Times New Roman" w:cs="Times New Roman"/>
+          <w:b w:val="0"/>
+          <w:bCs w:val="0"/>
+          <w:sz w:val="24"/>
+          <w:szCs w:val="24"/>
+          <w:lang w:val="en-US"/>
+        </w:rPr>
+        <w:t>:</w:t>
+      </w:r>
+    </w:p>
+    <w:p>
+      <w:pPr>
+        <w:numPr>
+          <w:ilvl w:val="0"/>
+          <w:numId w:val="5"/>
+        </w:numPr>
+        <w:tabs>
+          <w:tab w:val="clear" w:pos="420"/>
+        </w:tabs>
+        <w:ind w:left="1600" w:leftChars="0" w:hanging="420" w:firstLineChars="0"/>
+        <w:jc w:val="both"/>
+        <w:rPr>
+          <w:rFonts w:hint="default" w:ascii="Times New Roman" w:hAnsi="Times New Roman" w:cs="Times New Roman"/>
+          <w:b w:val="0"/>
+          <w:bCs w:val="0"/>
+          <w:sz w:val="24"/>
+          <w:szCs w:val="24"/>
+          <w:lang w:val="en-US"/>
+        </w:rPr>
+      </w:pPr>
+      <w:r>
+        <w:rPr>
+          <w:rFonts w:hint="default" w:ascii="Times New Roman" w:hAnsi="Times New Roman" w:cs="Times New Roman"/>
+          <w:b w:val="0"/>
+          <w:bCs w:val="0"/>
+          <w:sz w:val="24"/>
+          <w:szCs w:val="24"/>
+          <w:lang w:val="en-US"/>
+        </w:rPr>
+        <w:t xml:space="preserve">Actor: </w:t>
+      </w:r>
+      <w:r>
+        <w:rPr>
+          <w:rFonts w:hint="default" w:ascii="Times New Roman" w:hAnsi="Times New Roman" w:eastAsia="SimSun" w:cs="Times New Roman"/>
+          <w:sz w:val="24"/>
+          <w:szCs w:val="24"/>
+        </w:rPr>
         <w:t>Partner Supermarket (Corporate Client), Dispatcher</w:t>
       </w:r>
     </w:p>
@@ -5814,7 +6774,7 @@
           <w:sz w:val="24"/>
           <w:szCs w:val="24"/>
         </w:rPr>
-        <w:t>Handles the submission of bulk B2B shipping requests, details cargo dimensions, and logs specific delivery destination requests.</w:t>
+        <w:t>Processes real-time updates or cancellations of submitted orders before dispatch, updating vehicle allocation statuses instantly.</w:t>
       </w:r>
     </w:p>
     <w:p>
@@ -5842,7 +6802,7 @@
           <w:sz w:val="24"/>
           <w:szCs w:val="24"/>
         </w:rPr>
-        <w:t>Shipment Scheduling and Dispatch</w:t>
+        <w:t>Automated Invoice Generation</w:t>
       </w:r>
       <w:r>
         <w:rPr>
@@ -5893,7 +6853,7 @@
           <w:sz w:val="24"/>
           <w:szCs w:val="24"/>
         </w:rPr>
-        <w:t>Dispatcher, Driver</w:t>
+        <w:t>Accountant, External Accounting System</w:t>
       </w:r>
     </w:p>
     <w:p>
@@ -5933,7 +6893,7 @@
           <w:sz w:val="24"/>
           <w:szCs w:val="24"/>
         </w:rPr>
-        <w:t>Assigns pending logistics orders to available trucks, schedules driver duty shifts, and resolves real-time routing changes.</w:t>
+        <w:t>Compiles automated financial summaries immediately upon delivery completion, calculating precise shipping costs and fees.</w:t>
       </w:r>
     </w:p>
     <w:p>
@@ -5961,7 +6921,7 @@
           <w:sz w:val="24"/>
           <w:szCs w:val="24"/>
         </w:rPr>
-        <w:t>Real-Time Transit Tracking</w:t>
+        <w:t>Payment Reconciliation</w:t>
       </w:r>
       <w:r>
         <w:rPr>
@@ -6012,7 +6972,7 @@
           <w:sz w:val="24"/>
           <w:szCs w:val="24"/>
         </w:rPr>
-        <w:t>Driver, External GPS Telemetry System, Dispatcher</w:t>
+        <w:t>Accountant, External Accounting System</w:t>
       </w:r>
     </w:p>
     <w:p>
@@ -6052,521 +7012,51 @@
           <w:sz w:val="24"/>
           <w:szCs w:val="24"/>
         </w:rPr>
-        <w:t>Captures and records live GPS coordinates automatically while allowing drivers to log transit milestones manually.</w:t>
-      </w:r>
-    </w:p>
-    <w:p>
-      <w:pPr>
-        <w:numPr>
-          <w:ilvl w:val="0"/>
-          <w:numId w:val="4"/>
-        </w:numPr>
-        <w:tabs>
-          <w:tab w:val="clear" w:pos="420"/>
-        </w:tabs>
-        <w:ind w:left="1200" w:leftChars="0" w:hanging="420" w:firstLineChars="0"/>
-        <w:jc w:val="both"/>
-        <w:rPr>
-          <w:rFonts w:hint="default" w:ascii="Times New Roman" w:hAnsi="Times New Roman" w:cs="Times New Roman"/>
-          <w:b w:val="0"/>
-          <w:bCs w:val="0"/>
-          <w:sz w:val="24"/>
-          <w:szCs w:val="24"/>
-        </w:rPr>
-      </w:pPr>
-      <w:r>
-        <w:rPr>
-          <w:rFonts w:hint="default" w:ascii="Times New Roman" w:hAnsi="Times New Roman" w:eastAsia="SimSun" w:cs="Times New Roman"/>
-          <w:sz w:val="24"/>
-          <w:szCs w:val="24"/>
-        </w:rPr>
-        <w:t>Handle Delivery Exceptions</w:t>
-      </w:r>
-      <w:r>
-        <w:rPr>
-          <w:rFonts w:hint="default" w:ascii="Times New Roman" w:hAnsi="Times New Roman" w:cs="Times New Roman"/>
-          <w:b w:val="0"/>
-          <w:bCs w:val="0"/>
-          <w:sz w:val="24"/>
-          <w:szCs w:val="24"/>
-          <w:lang w:val="en-US"/>
-        </w:rPr>
-        <w:t>:</w:t>
-      </w:r>
-    </w:p>
-    <w:p>
-      <w:pPr>
-        <w:numPr>
-          <w:ilvl w:val="0"/>
-          <w:numId w:val="5"/>
-        </w:numPr>
-        <w:tabs>
-          <w:tab w:val="clear" w:pos="420"/>
-        </w:tabs>
-        <w:ind w:left="1600" w:leftChars="0" w:hanging="420" w:firstLineChars="0"/>
-        <w:jc w:val="both"/>
-        <w:rPr>
-          <w:rFonts w:hint="default" w:ascii="Times New Roman" w:hAnsi="Times New Roman" w:cs="Times New Roman"/>
-          <w:b w:val="0"/>
-          <w:bCs w:val="0"/>
-          <w:sz w:val="24"/>
-          <w:szCs w:val="24"/>
-          <w:lang w:val="en-US"/>
-        </w:rPr>
-      </w:pPr>
-      <w:r>
-        <w:rPr>
-          <w:rFonts w:hint="default" w:ascii="Times New Roman" w:hAnsi="Times New Roman" w:cs="Times New Roman"/>
-          <w:b w:val="0"/>
-          <w:bCs w:val="0"/>
-          <w:sz w:val="24"/>
-          <w:szCs w:val="24"/>
-          <w:lang w:val="en-US"/>
-        </w:rPr>
-        <w:t xml:space="preserve">Actor: </w:t>
-      </w:r>
-      <w:r>
-        <w:rPr>
-          <w:rFonts w:hint="default" w:ascii="Times New Roman" w:hAnsi="Times New Roman" w:eastAsia="SimSun" w:cs="Times New Roman"/>
-          <w:sz w:val="24"/>
-          <w:szCs w:val="24"/>
-        </w:rPr>
-        <w:t>Driver, Dispatcher</w:t>
-      </w:r>
-    </w:p>
-    <w:p>
-      <w:pPr>
-        <w:numPr>
-          <w:ilvl w:val="0"/>
-          <w:numId w:val="5"/>
-        </w:numPr>
-        <w:tabs>
-          <w:tab w:val="clear" w:pos="420"/>
-        </w:tabs>
-        <w:ind w:left="1600" w:leftChars="0" w:hanging="420" w:firstLineChars="0"/>
-        <w:jc w:val="both"/>
-        <w:rPr>
-          <w:rFonts w:hint="default" w:ascii="Times New Roman" w:hAnsi="Times New Roman" w:cs="Times New Roman"/>
-          <w:b w:val="0"/>
-          <w:bCs w:val="0"/>
-          <w:sz w:val="24"/>
-          <w:szCs w:val="24"/>
-          <w:lang w:val="en-US"/>
-        </w:rPr>
-      </w:pPr>
-      <w:r>
-        <w:rPr>
-          <w:rFonts w:hint="default" w:ascii="Times New Roman" w:hAnsi="Times New Roman" w:cs="Times New Roman"/>
-          <w:b w:val="0"/>
-          <w:bCs w:val="0"/>
-          <w:sz w:val="24"/>
-          <w:szCs w:val="24"/>
-          <w:lang w:val="en-US"/>
-        </w:rPr>
-        <w:t xml:space="preserve">Description: </w:t>
-      </w:r>
-      <w:r>
-        <w:rPr>
-          <w:rFonts w:hint="default" w:ascii="Times New Roman" w:hAnsi="Times New Roman" w:eastAsia="SimSun" w:cs="Times New Roman"/>
-          <w:sz w:val="24"/>
-          <w:szCs w:val="24"/>
-        </w:rPr>
-        <w:t>Manages unexpected transit issues such as vehicle breakdowns or traffic delays, allowing staff to reroute assets and notify supermarkets immediately.</w:t>
-      </w:r>
-    </w:p>
-    <w:p>
-      <w:pPr>
-        <w:numPr>
-          <w:ilvl w:val="0"/>
-          <w:numId w:val="4"/>
-        </w:numPr>
-        <w:tabs>
-          <w:tab w:val="clear" w:pos="420"/>
-        </w:tabs>
-        <w:ind w:left="1200" w:leftChars="0" w:hanging="420" w:firstLineChars="0"/>
-        <w:jc w:val="both"/>
-        <w:rPr>
-          <w:rFonts w:hint="default" w:ascii="Times New Roman" w:hAnsi="Times New Roman" w:cs="Times New Roman"/>
-          <w:b w:val="0"/>
-          <w:bCs w:val="0"/>
-          <w:sz w:val="24"/>
-          <w:szCs w:val="24"/>
-        </w:rPr>
-      </w:pPr>
-      <w:r>
-        <w:rPr>
-          <w:rFonts w:hint="default" w:ascii="Times New Roman" w:hAnsi="Times New Roman" w:eastAsia="SimSun" w:cs="Times New Roman"/>
-          <w:sz w:val="24"/>
-          <w:szCs w:val="24"/>
-        </w:rPr>
-        <w:t>Process Order Modifications and Cancellations</w:t>
-      </w:r>
-      <w:r>
-        <w:rPr>
-          <w:rFonts w:hint="default" w:ascii="Times New Roman" w:hAnsi="Times New Roman" w:cs="Times New Roman"/>
-          <w:b w:val="0"/>
-          <w:bCs w:val="0"/>
-          <w:sz w:val="24"/>
-          <w:szCs w:val="24"/>
-          <w:lang w:val="en-US"/>
-        </w:rPr>
-        <w:t>:</w:t>
-      </w:r>
-    </w:p>
-    <w:p>
-      <w:pPr>
-        <w:numPr>
-          <w:ilvl w:val="0"/>
-          <w:numId w:val="5"/>
-        </w:numPr>
-        <w:tabs>
-          <w:tab w:val="clear" w:pos="420"/>
-        </w:tabs>
-        <w:ind w:left="1600" w:leftChars="0" w:hanging="420" w:firstLineChars="0"/>
-        <w:jc w:val="both"/>
-        <w:rPr>
-          <w:rFonts w:hint="default" w:ascii="Times New Roman" w:hAnsi="Times New Roman" w:cs="Times New Roman"/>
-          <w:b w:val="0"/>
-          <w:bCs w:val="0"/>
-          <w:sz w:val="24"/>
-          <w:szCs w:val="24"/>
-          <w:lang w:val="en-US"/>
-        </w:rPr>
-      </w:pPr>
-      <w:r>
-        <w:rPr>
-          <w:rFonts w:hint="default" w:ascii="Times New Roman" w:hAnsi="Times New Roman" w:cs="Times New Roman"/>
-          <w:b w:val="0"/>
-          <w:bCs w:val="0"/>
-          <w:sz w:val="24"/>
-          <w:szCs w:val="24"/>
-          <w:lang w:val="en-US"/>
-        </w:rPr>
-        <w:t>Actor:</w:t>
-      </w:r>
-      <w:r>
-        <w:rPr>
-          <w:rFonts w:hint="default" w:ascii="Times New Roman" w:hAnsi="Times New Roman" w:cs="Times New Roman"/>
-          <w:b w:val="0"/>
-          <w:bCs w:val="0"/>
-          <w:sz w:val="24"/>
-          <w:szCs w:val="24"/>
-          <w:lang w:val="en-US"/>
-        </w:rPr>
-        <w:t xml:space="preserve"> </w:t>
-      </w:r>
-      <w:r>
-        <w:rPr>
-          <w:rFonts w:hint="default" w:ascii="Times New Roman" w:hAnsi="Times New Roman" w:eastAsia="SimSun" w:cs="Times New Roman"/>
-          <w:sz w:val="24"/>
-          <w:szCs w:val="24"/>
-        </w:rPr>
-        <w:t>Partner Supermarket (Corporate Client), Dispatcher</w:t>
-      </w:r>
-    </w:p>
-    <w:p>
-      <w:pPr>
-        <w:numPr>
-          <w:ilvl w:val="0"/>
-          <w:numId w:val="5"/>
-        </w:numPr>
-        <w:tabs>
-          <w:tab w:val="clear" w:pos="420"/>
-        </w:tabs>
-        <w:ind w:left="1600" w:leftChars="0" w:hanging="420" w:firstLineChars="0"/>
-        <w:jc w:val="both"/>
-        <w:rPr>
-          <w:rFonts w:hint="default" w:ascii="Times New Roman" w:hAnsi="Times New Roman" w:cs="Times New Roman"/>
-          <w:b w:val="0"/>
-          <w:bCs w:val="0"/>
-          <w:sz w:val="24"/>
-          <w:szCs w:val="24"/>
-          <w:lang w:val="en-US"/>
-        </w:rPr>
-      </w:pPr>
-      <w:r>
-        <w:rPr>
-          <w:rFonts w:hint="default" w:ascii="Times New Roman" w:hAnsi="Times New Roman" w:cs="Times New Roman"/>
-          <w:b w:val="0"/>
-          <w:bCs w:val="0"/>
-          <w:sz w:val="24"/>
-          <w:szCs w:val="24"/>
-          <w:lang w:val="en-US"/>
-        </w:rPr>
-        <w:t xml:space="preserve">Description: </w:t>
-      </w:r>
-      <w:r>
-        <w:rPr>
-          <w:rFonts w:hint="default" w:ascii="Times New Roman" w:hAnsi="Times New Roman" w:eastAsia="SimSun" w:cs="Times New Roman"/>
-          <w:sz w:val="24"/>
-          <w:szCs w:val="24"/>
-        </w:rPr>
-        <w:t>Processes real-time updates or cancellations of submitted orders before dispatch, updating vehicle allocation statuses instantly.</w:t>
-      </w:r>
-    </w:p>
-    <w:p>
-      <w:pPr>
-        <w:numPr>
-          <w:ilvl w:val="0"/>
-          <w:numId w:val="4"/>
-        </w:numPr>
-        <w:tabs>
-          <w:tab w:val="clear" w:pos="420"/>
-        </w:tabs>
-        <w:ind w:left="1200" w:leftChars="0" w:hanging="420" w:firstLineChars="0"/>
-        <w:jc w:val="both"/>
-        <w:rPr>
-          <w:rFonts w:hint="default" w:ascii="Times New Roman" w:hAnsi="Times New Roman" w:cs="Times New Roman"/>
-          <w:b w:val="0"/>
-          <w:bCs w:val="0"/>
-          <w:sz w:val="24"/>
-          <w:szCs w:val="24"/>
-        </w:rPr>
-      </w:pPr>
-      <w:r>
-        <w:rPr>
-          <w:rFonts w:hint="default" w:ascii="Times New Roman" w:hAnsi="Times New Roman" w:eastAsia="SimSun" w:cs="Times New Roman"/>
-          <w:sz w:val="24"/>
-          <w:szCs w:val="24"/>
-        </w:rPr>
-        <w:t>Automated Invoice Generation</w:t>
-      </w:r>
-      <w:r>
-        <w:rPr>
-          <w:rFonts w:hint="default" w:ascii="Times New Roman" w:hAnsi="Times New Roman" w:cs="Times New Roman"/>
-          <w:b w:val="0"/>
-          <w:bCs w:val="0"/>
-          <w:sz w:val="24"/>
-          <w:szCs w:val="24"/>
-          <w:lang w:val="en-US"/>
-        </w:rPr>
-        <w:t>:</w:t>
-      </w:r>
-    </w:p>
-    <w:p>
-      <w:pPr>
-        <w:numPr>
-          <w:ilvl w:val="0"/>
-          <w:numId w:val="5"/>
-        </w:numPr>
-        <w:tabs>
-          <w:tab w:val="clear" w:pos="420"/>
-        </w:tabs>
-        <w:ind w:left="1600" w:leftChars="0" w:hanging="420" w:firstLineChars="0"/>
-        <w:jc w:val="both"/>
-        <w:rPr>
-          <w:rFonts w:hint="default" w:ascii="Times New Roman" w:hAnsi="Times New Roman" w:cs="Times New Roman"/>
-          <w:b w:val="0"/>
-          <w:bCs w:val="0"/>
-          <w:sz w:val="24"/>
-          <w:szCs w:val="24"/>
-          <w:lang w:val="en-US"/>
-        </w:rPr>
-      </w:pPr>
-      <w:r>
-        <w:rPr>
-          <w:rFonts w:hint="default" w:ascii="Times New Roman" w:hAnsi="Times New Roman" w:cs="Times New Roman"/>
-          <w:b w:val="0"/>
-          <w:bCs w:val="0"/>
-          <w:sz w:val="24"/>
-          <w:szCs w:val="24"/>
-          <w:lang w:val="en-US"/>
-        </w:rPr>
-        <w:t>Actor:</w:t>
-      </w:r>
-      <w:r>
-        <w:rPr>
-          <w:rFonts w:hint="default" w:ascii="Times New Roman" w:hAnsi="Times New Roman" w:cs="Times New Roman"/>
-          <w:b w:val="0"/>
-          <w:bCs w:val="0"/>
-          <w:sz w:val="24"/>
-          <w:szCs w:val="24"/>
-          <w:lang w:val="en-US"/>
-        </w:rPr>
-        <w:t xml:space="preserve"> </w:t>
-      </w:r>
-      <w:r>
-        <w:rPr>
-          <w:rFonts w:hint="default" w:ascii="Times New Roman" w:hAnsi="Times New Roman" w:eastAsia="SimSun" w:cs="Times New Roman"/>
-          <w:sz w:val="24"/>
-          <w:szCs w:val="24"/>
-        </w:rPr>
-        <w:t>Accountant, External Accounting System</w:t>
-      </w:r>
-    </w:p>
-    <w:p>
-      <w:pPr>
-        <w:numPr>
-          <w:ilvl w:val="0"/>
-          <w:numId w:val="5"/>
-        </w:numPr>
-        <w:tabs>
-          <w:tab w:val="clear" w:pos="420"/>
-        </w:tabs>
-        <w:ind w:left="1600" w:leftChars="0" w:hanging="420" w:firstLineChars="0"/>
-        <w:jc w:val="both"/>
-        <w:rPr>
-          <w:rFonts w:hint="default" w:ascii="Times New Roman" w:hAnsi="Times New Roman" w:cs="Times New Roman"/>
-          <w:b w:val="0"/>
-          <w:bCs w:val="0"/>
-          <w:sz w:val="24"/>
-          <w:szCs w:val="24"/>
-          <w:lang w:val="en-US"/>
-        </w:rPr>
-      </w:pPr>
-      <w:r>
-        <w:rPr>
-          <w:rFonts w:hint="default" w:ascii="Times New Roman" w:hAnsi="Times New Roman" w:cs="Times New Roman"/>
-          <w:b w:val="0"/>
-          <w:bCs w:val="0"/>
-          <w:sz w:val="24"/>
-          <w:szCs w:val="24"/>
-          <w:lang w:val="en-US"/>
-        </w:rPr>
-        <w:t xml:space="preserve">Description: </w:t>
-      </w:r>
-      <w:r>
-        <w:rPr>
-          <w:rFonts w:hint="default" w:ascii="Times New Roman" w:hAnsi="Times New Roman" w:eastAsia="SimSun" w:cs="Times New Roman"/>
-          <w:sz w:val="24"/>
-          <w:szCs w:val="24"/>
-        </w:rPr>
-        <w:t>Compiles automated financial summaries immediately upon delivery completion, calculating precise shipping costs and fees.</w:t>
-      </w:r>
-    </w:p>
-    <w:p>
-      <w:pPr>
-        <w:numPr>
-          <w:ilvl w:val="0"/>
-          <w:numId w:val="4"/>
-        </w:numPr>
-        <w:tabs>
-          <w:tab w:val="clear" w:pos="420"/>
-        </w:tabs>
-        <w:ind w:left="1200" w:leftChars="0" w:hanging="420" w:firstLineChars="0"/>
-        <w:jc w:val="both"/>
-        <w:rPr>
-          <w:rFonts w:hint="default" w:ascii="Times New Roman" w:hAnsi="Times New Roman" w:cs="Times New Roman"/>
-          <w:b w:val="0"/>
-          <w:bCs w:val="0"/>
-          <w:sz w:val="24"/>
-          <w:szCs w:val="24"/>
-        </w:rPr>
-      </w:pPr>
-      <w:r>
-        <w:rPr>
-          <w:rFonts w:hint="default" w:ascii="Times New Roman" w:hAnsi="Times New Roman" w:eastAsia="SimSun" w:cs="Times New Roman"/>
-          <w:sz w:val="24"/>
-          <w:szCs w:val="24"/>
-        </w:rPr>
-        <w:t>Payment Reconciliation</w:t>
-      </w:r>
-      <w:r>
-        <w:rPr>
-          <w:rFonts w:hint="default" w:ascii="Times New Roman" w:hAnsi="Times New Roman" w:cs="Times New Roman"/>
-          <w:b w:val="0"/>
-          <w:bCs w:val="0"/>
-          <w:sz w:val="24"/>
-          <w:szCs w:val="24"/>
-          <w:lang w:val="en-US"/>
-        </w:rPr>
-        <w:t>:</w:t>
-      </w:r>
-    </w:p>
-    <w:p>
-      <w:pPr>
-        <w:numPr>
-          <w:ilvl w:val="0"/>
-          <w:numId w:val="5"/>
-        </w:numPr>
-        <w:tabs>
-          <w:tab w:val="clear" w:pos="420"/>
-        </w:tabs>
-        <w:ind w:left="1600" w:leftChars="0" w:hanging="420" w:firstLineChars="0"/>
-        <w:jc w:val="both"/>
-        <w:rPr>
-          <w:rFonts w:hint="default" w:ascii="Times New Roman" w:hAnsi="Times New Roman" w:cs="Times New Roman"/>
-          <w:b w:val="0"/>
-          <w:bCs w:val="0"/>
-          <w:sz w:val="24"/>
-          <w:szCs w:val="24"/>
-          <w:lang w:val="en-US"/>
-        </w:rPr>
-      </w:pPr>
-      <w:r>
-        <w:rPr>
-          <w:rFonts w:hint="default" w:ascii="Times New Roman" w:hAnsi="Times New Roman" w:cs="Times New Roman"/>
-          <w:b w:val="0"/>
-          <w:bCs w:val="0"/>
-          <w:sz w:val="24"/>
-          <w:szCs w:val="24"/>
-          <w:lang w:val="en-US"/>
-        </w:rPr>
-        <w:t>Actor:</w:t>
-      </w:r>
-      <w:r>
-        <w:rPr>
-          <w:rFonts w:hint="default" w:ascii="Times New Roman" w:hAnsi="Times New Roman" w:cs="Times New Roman"/>
-          <w:b w:val="0"/>
-          <w:bCs w:val="0"/>
-          <w:sz w:val="24"/>
-          <w:szCs w:val="24"/>
-          <w:lang w:val="en-US"/>
-        </w:rPr>
-        <w:t xml:space="preserve"> </w:t>
-      </w:r>
-      <w:r>
-        <w:rPr>
-          <w:rFonts w:hint="default" w:ascii="Times New Roman" w:hAnsi="Times New Roman" w:eastAsia="SimSun" w:cs="Times New Roman"/>
-          <w:sz w:val="24"/>
-          <w:szCs w:val="24"/>
-        </w:rPr>
-        <w:t>Accountant, External Accounting System</w:t>
-      </w:r>
-    </w:p>
-    <w:p>
-      <w:pPr>
-        <w:numPr>
-          <w:ilvl w:val="0"/>
-          <w:numId w:val="5"/>
-        </w:numPr>
-        <w:tabs>
-          <w:tab w:val="clear" w:pos="420"/>
-        </w:tabs>
-        <w:ind w:left="1600" w:leftChars="0" w:hanging="420" w:firstLineChars="0"/>
-        <w:jc w:val="both"/>
-        <w:rPr>
-          <w:rFonts w:hint="default" w:ascii="Times New Roman" w:hAnsi="Times New Roman" w:cs="Times New Roman"/>
-          <w:b w:val="0"/>
-          <w:bCs w:val="0"/>
-          <w:sz w:val="24"/>
-          <w:szCs w:val="24"/>
-          <w:lang w:val="en-US"/>
-        </w:rPr>
-      </w:pPr>
-      <w:r>
-        <w:rPr>
-          <w:rFonts w:hint="default" w:ascii="Times New Roman" w:hAnsi="Times New Roman" w:cs="Times New Roman"/>
-          <w:b w:val="0"/>
-          <w:bCs w:val="0"/>
-          <w:sz w:val="24"/>
-          <w:szCs w:val="24"/>
-          <w:lang w:val="en-US"/>
-        </w:rPr>
-        <w:t xml:space="preserve">Description: </w:t>
-      </w:r>
-      <w:r>
-        <w:rPr>
-          <w:rFonts w:hint="default" w:ascii="Times New Roman" w:hAnsi="Times New Roman" w:eastAsia="SimSun" w:cs="Times New Roman"/>
-          <w:sz w:val="24"/>
-          <w:szCs w:val="24"/>
-        </w:rPr>
         <w:t>Cross-references automated billing files with third-party transaction logs to confirm payments and resolve invoicing errors.</w:t>
       </w:r>
     </w:p>
     <w:p>
       <w:pPr>
-        <w:numPr>
+        <w:pStyle w:val="2"/>
+        <w:bidi w:val="0"/>
+        <w:rPr>
+          <w:rFonts w:hint="default" w:ascii="Times New Roman" w:hAnsi="Times New Roman" w:cs="Times New Roman"/>
+          <w:lang w:val="en-US"/>
+        </w:rPr>
+      </w:pPr>
+      <w:r>
+        <w:rPr>
+          <w:rFonts w:hint="default" w:ascii="Times New Roman" w:hAnsi="Times New Roman" w:cs="Times New Roman"/>
+          <w:lang w:val="en-US"/>
+        </w:rPr>
+        <w:t xml:space="preserve">Part </w:t>
+      </w:r>
+      <w:r>
+        <w:rPr>
+          <w:rFonts w:hint="default" w:cs="Times New Roman"/>
+          <w:lang w:val="en-US"/>
+        </w:rPr>
+        <w:t>D</w:t>
+      </w:r>
+      <w:r>
+        <w:rPr>
+          <w:rFonts w:hint="default" w:ascii="Times New Roman" w:hAnsi="Times New Roman" w:cs="Times New Roman"/>
+          <w:lang w:val="en-US"/>
+        </w:rPr>
+        <w:t xml:space="preserve">: </w:t>
+      </w:r>
+      <w:r>
+        <w:rPr>
+          <w:rFonts w:hint="default" w:cs="Times New Roman"/>
+          <w:lang w:val="en-US"/>
+        </w:rPr>
+        <w:t>Functional Requirements and Task Descriptions</w:t>
+      </w:r>
+    </w:p>
+    <w:p>
+      <w:pPr>
+        <w:numPr>
+          <w:ilvl w:val="0"/>
           <w:numId w:val="0"/>
         </w:numPr>
         <w:jc w:val="both"/>
@@ -6583,6 +7073,7 @@
     <w:p>
       <w:pPr>
         <w:numPr>
+          <w:ilvl w:val="0"/>
           <w:numId w:val="0"/>
         </w:numPr>
         <w:jc w:val="both"/>
@@ -6599,6 +7090,7 @@
     <w:p>
       <w:pPr>
         <w:numPr>
+          <w:ilvl w:val="0"/>
           <w:numId w:val="0"/>
         </w:numPr>
         <w:jc w:val="both"/>
@@ -6615,6 +7107,7 @@
     <w:p>
       <w:pPr>
         <w:numPr>
+          <w:ilvl w:val="0"/>
           <w:numId w:val="0"/>
         </w:numPr>
         <w:jc w:val="both"/>
@@ -6647,6 +7140,7 @@
     <w:p>
       <w:pPr>
         <w:numPr>
+          <w:ilvl w:val="0"/>
           <w:numId w:val="0"/>
         </w:numPr>
         <w:jc w:val="both"/>
@@ -6662,6 +7156,7 @@
     <w:p>
       <w:pPr>
         <w:numPr>
+          <w:ilvl w:val="0"/>
           <w:numId w:val="0"/>
         </w:numPr>
         <w:jc w:val="both"/>
@@ -6677,6 +7172,7 @@
     <w:p>
       <w:pPr>
         <w:numPr>
+          <w:ilvl w:val="0"/>
           <w:numId w:val="0"/>
         </w:numPr>
         <w:jc w:val="both"/>
@@ -6700,6 +7196,7 @@
     <w:p>
       <w:pPr>
         <w:numPr>
+          <w:ilvl w:val="0"/>
           <w:numId w:val="0"/>
         </w:numPr>
         <w:jc w:val="both"/>
@@ -6715,6 +7212,7 @@
     <w:p>
       <w:pPr>
         <w:numPr>
+          <w:ilvl w:val="0"/>
           <w:numId w:val="0"/>
         </w:numPr>
         <w:ind w:left="780" w:leftChars="0"/>

</xml_diff>

<commit_message>
Add workflow of Part 5.1
</commit_message>
<xml_diff>
--- a/Assignments/Assignment1/Team Report.docx
+++ b/Assignments/Assignment1/Team Report.docx
@@ -966,8 +966,6 @@
           <w:lang w:val="en-US"/>
         </w:rPr>
       </w:pPr>
-      <w:bookmarkStart w:id="24" w:name="_GoBack"/>
-      <w:bookmarkEnd w:id="24"/>
     </w:p>
     <w:p>
       <w:pPr>
@@ -1377,38 +1375,12 @@
       </w:r>
       <w:r>
         <w:rPr>
-          <w:sz w:val="28"/>
-          <w:szCs w:val="28"/>
-        </w:rPr>
-        <w:fldChar w:fldCharType="begin"/>
-      </w:r>
-      <w:r>
-        <w:rPr>
-          <w:sz w:val="28"/>
-          <w:szCs w:val="28"/>
-        </w:rPr>
-        <w:instrText xml:space="preserve"> PAGEREF _Toc4876 \h </w:instrText>
-      </w:r>
-      <w:r>
-        <w:rPr>
-          <w:sz w:val="28"/>
-          <w:szCs w:val="28"/>
-        </w:rPr>
-        <w:fldChar w:fldCharType="separate"/>
-      </w:r>
-      <w:r>
-        <w:rPr>
-          <w:sz w:val="28"/>
-          <w:szCs w:val="28"/>
-        </w:rPr>
-        <w:t>4</w:t>
-      </w:r>
-      <w:r>
-        <w:rPr>
-          <w:sz w:val="28"/>
-          <w:szCs w:val="28"/>
-        </w:rPr>
-        <w:fldChar w:fldCharType="end"/>
+          <w:rFonts w:hint="default"/>
+          <w:sz w:val="28"/>
+          <w:szCs w:val="28"/>
+          <w:lang w:val="en-US"/>
+        </w:rPr>
+        <w:t>5</w:t>
       </w:r>
       <w:r>
         <w:rPr>
@@ -1477,38 +1449,12 @@
       </w:r>
       <w:r>
         <w:rPr>
-          <w:sz w:val="28"/>
-          <w:szCs w:val="28"/>
-        </w:rPr>
-        <w:fldChar w:fldCharType="begin"/>
-      </w:r>
-      <w:r>
-        <w:rPr>
-          <w:sz w:val="28"/>
-          <w:szCs w:val="28"/>
-        </w:rPr>
-        <w:instrText xml:space="preserve"> PAGEREF _Toc14437 \h </w:instrText>
-      </w:r>
-      <w:r>
-        <w:rPr>
-          <w:sz w:val="28"/>
-          <w:szCs w:val="28"/>
-        </w:rPr>
-        <w:fldChar w:fldCharType="separate"/>
-      </w:r>
-      <w:r>
-        <w:rPr>
-          <w:sz w:val="28"/>
-          <w:szCs w:val="28"/>
-        </w:rPr>
-        <w:t>4</w:t>
-      </w:r>
-      <w:r>
-        <w:rPr>
-          <w:sz w:val="28"/>
-          <w:szCs w:val="28"/>
-        </w:rPr>
-        <w:fldChar w:fldCharType="end"/>
+          <w:rFonts w:hint="default"/>
+          <w:sz w:val="28"/>
+          <w:szCs w:val="28"/>
+          <w:lang w:val="en-US"/>
+        </w:rPr>
+        <w:t>5</w:t>
       </w:r>
       <w:r>
         <w:rPr>
@@ -1577,38 +1523,12 @@
       </w:r>
       <w:r>
         <w:rPr>
-          <w:sz w:val="28"/>
-          <w:szCs w:val="28"/>
-        </w:rPr>
-        <w:fldChar w:fldCharType="begin"/>
-      </w:r>
-      <w:r>
-        <w:rPr>
-          <w:sz w:val="28"/>
-          <w:szCs w:val="28"/>
-        </w:rPr>
-        <w:instrText xml:space="preserve"> PAGEREF _Toc7289 \h </w:instrText>
-      </w:r>
-      <w:r>
-        <w:rPr>
-          <w:sz w:val="28"/>
-          <w:szCs w:val="28"/>
-        </w:rPr>
-        <w:fldChar w:fldCharType="separate"/>
-      </w:r>
-      <w:r>
-        <w:rPr>
-          <w:sz w:val="28"/>
-          <w:szCs w:val="28"/>
-        </w:rPr>
-        <w:t>4</w:t>
-      </w:r>
-      <w:r>
-        <w:rPr>
-          <w:sz w:val="28"/>
-          <w:szCs w:val="28"/>
-        </w:rPr>
-        <w:fldChar w:fldCharType="end"/>
+          <w:rFonts w:hint="default"/>
+          <w:sz w:val="28"/>
+          <w:szCs w:val="28"/>
+          <w:lang w:val="en-US"/>
+        </w:rPr>
+        <w:t>5</w:t>
       </w:r>
       <w:r>
         <w:rPr>
@@ -1677,38 +1597,12 @@
       </w:r>
       <w:r>
         <w:rPr>
-          <w:sz w:val="28"/>
-          <w:szCs w:val="28"/>
-        </w:rPr>
-        <w:fldChar w:fldCharType="begin"/>
-      </w:r>
-      <w:r>
-        <w:rPr>
-          <w:sz w:val="28"/>
-          <w:szCs w:val="28"/>
-        </w:rPr>
-        <w:instrText xml:space="preserve"> PAGEREF _Toc28948 \h </w:instrText>
-      </w:r>
-      <w:r>
-        <w:rPr>
-          <w:sz w:val="28"/>
-          <w:szCs w:val="28"/>
-        </w:rPr>
-        <w:fldChar w:fldCharType="separate"/>
-      </w:r>
-      <w:r>
-        <w:rPr>
-          <w:sz w:val="28"/>
-          <w:szCs w:val="28"/>
-        </w:rPr>
-        <w:t>5</w:t>
-      </w:r>
-      <w:r>
-        <w:rPr>
-          <w:sz w:val="28"/>
-          <w:szCs w:val="28"/>
-        </w:rPr>
-        <w:fldChar w:fldCharType="end"/>
+          <w:rFonts w:hint="default"/>
+          <w:sz w:val="28"/>
+          <w:szCs w:val="28"/>
+          <w:lang w:val="en-US"/>
+        </w:rPr>
+        <w:t>6</w:t>
       </w:r>
       <w:r>
         <w:rPr>
@@ -1777,38 +1671,12 @@
       </w:r>
       <w:r>
         <w:rPr>
-          <w:sz w:val="28"/>
-          <w:szCs w:val="28"/>
-        </w:rPr>
-        <w:fldChar w:fldCharType="begin"/>
-      </w:r>
-      <w:r>
-        <w:rPr>
-          <w:sz w:val="28"/>
-          <w:szCs w:val="28"/>
-        </w:rPr>
-        <w:instrText xml:space="preserve"> PAGEREF _Toc14638 \h </w:instrText>
-      </w:r>
-      <w:r>
-        <w:rPr>
-          <w:sz w:val="28"/>
-          <w:szCs w:val="28"/>
-        </w:rPr>
-        <w:fldChar w:fldCharType="separate"/>
-      </w:r>
-      <w:r>
-        <w:rPr>
-          <w:sz w:val="28"/>
-          <w:szCs w:val="28"/>
-        </w:rPr>
-        <w:t>6</w:t>
-      </w:r>
-      <w:r>
-        <w:rPr>
-          <w:sz w:val="28"/>
-          <w:szCs w:val="28"/>
-        </w:rPr>
-        <w:fldChar w:fldCharType="end"/>
+          <w:rFonts w:hint="default"/>
+          <w:sz w:val="28"/>
+          <w:szCs w:val="28"/>
+          <w:lang w:val="en-US"/>
+        </w:rPr>
+        <w:t>7</w:t>
       </w:r>
       <w:r>
         <w:rPr>
@@ -1877,38 +1745,12 @@
       </w:r>
       <w:r>
         <w:rPr>
-          <w:sz w:val="28"/>
-          <w:szCs w:val="28"/>
-        </w:rPr>
-        <w:fldChar w:fldCharType="begin"/>
-      </w:r>
-      <w:r>
-        <w:rPr>
-          <w:sz w:val="28"/>
-          <w:szCs w:val="28"/>
-        </w:rPr>
-        <w:instrText xml:space="preserve"> PAGEREF _Toc30163 \h </w:instrText>
-      </w:r>
-      <w:r>
-        <w:rPr>
-          <w:sz w:val="28"/>
-          <w:szCs w:val="28"/>
-        </w:rPr>
-        <w:fldChar w:fldCharType="separate"/>
-      </w:r>
-      <w:r>
-        <w:rPr>
-          <w:sz w:val="28"/>
-          <w:szCs w:val="28"/>
-        </w:rPr>
-        <w:t>6</w:t>
-      </w:r>
-      <w:r>
-        <w:rPr>
-          <w:sz w:val="28"/>
-          <w:szCs w:val="28"/>
-        </w:rPr>
-        <w:fldChar w:fldCharType="end"/>
+          <w:rFonts w:hint="default"/>
+          <w:sz w:val="28"/>
+          <w:szCs w:val="28"/>
+          <w:lang w:val="en-US"/>
+        </w:rPr>
+        <w:t>7</w:t>
       </w:r>
       <w:r>
         <w:rPr>
@@ -1977,38 +1819,12 @@
       </w:r>
       <w:r>
         <w:rPr>
-          <w:sz w:val="28"/>
-          <w:szCs w:val="28"/>
-        </w:rPr>
-        <w:fldChar w:fldCharType="begin"/>
-      </w:r>
-      <w:r>
-        <w:rPr>
-          <w:sz w:val="28"/>
-          <w:szCs w:val="28"/>
-        </w:rPr>
-        <w:instrText xml:space="preserve"> PAGEREF _Toc3325 \h </w:instrText>
-      </w:r>
-      <w:r>
-        <w:rPr>
-          <w:sz w:val="28"/>
-          <w:szCs w:val="28"/>
-        </w:rPr>
-        <w:fldChar w:fldCharType="separate"/>
-      </w:r>
-      <w:r>
-        <w:rPr>
-          <w:sz w:val="28"/>
-          <w:szCs w:val="28"/>
-        </w:rPr>
-        <w:t>6</w:t>
-      </w:r>
-      <w:r>
-        <w:rPr>
-          <w:sz w:val="28"/>
-          <w:szCs w:val="28"/>
-        </w:rPr>
-        <w:fldChar w:fldCharType="end"/>
+          <w:rFonts w:hint="default"/>
+          <w:sz w:val="28"/>
+          <w:szCs w:val="28"/>
+          <w:lang w:val="en-US"/>
+        </w:rPr>
+        <w:t>7</w:t>
       </w:r>
       <w:r>
         <w:rPr>
@@ -2077,38 +1893,12 @@
       </w:r>
       <w:r>
         <w:rPr>
-          <w:sz w:val="28"/>
-          <w:szCs w:val="28"/>
-        </w:rPr>
-        <w:fldChar w:fldCharType="begin"/>
-      </w:r>
-      <w:r>
-        <w:rPr>
-          <w:sz w:val="28"/>
-          <w:szCs w:val="28"/>
-        </w:rPr>
-        <w:instrText xml:space="preserve"> PAGEREF _Toc31842 \h </w:instrText>
-      </w:r>
-      <w:r>
-        <w:rPr>
-          <w:sz w:val="28"/>
-          <w:szCs w:val="28"/>
-        </w:rPr>
-        <w:fldChar w:fldCharType="separate"/>
-      </w:r>
-      <w:r>
-        <w:rPr>
-          <w:sz w:val="28"/>
-          <w:szCs w:val="28"/>
-        </w:rPr>
-        <w:t>6</w:t>
-      </w:r>
-      <w:r>
-        <w:rPr>
-          <w:sz w:val="28"/>
-          <w:szCs w:val="28"/>
-        </w:rPr>
-        <w:fldChar w:fldCharType="end"/>
+          <w:rFonts w:hint="default"/>
+          <w:sz w:val="28"/>
+          <w:szCs w:val="28"/>
+          <w:lang w:val="en-US"/>
+        </w:rPr>
+        <w:t>7</w:t>
       </w:r>
       <w:r>
         <w:rPr>
@@ -2177,38 +1967,12 @@
       </w:r>
       <w:r>
         <w:rPr>
-          <w:sz w:val="28"/>
-          <w:szCs w:val="28"/>
-        </w:rPr>
-        <w:fldChar w:fldCharType="begin"/>
-      </w:r>
-      <w:r>
-        <w:rPr>
-          <w:sz w:val="28"/>
-          <w:szCs w:val="28"/>
-        </w:rPr>
-        <w:instrText xml:space="preserve"> PAGEREF _Toc31478 \h </w:instrText>
-      </w:r>
-      <w:r>
-        <w:rPr>
-          <w:sz w:val="28"/>
-          <w:szCs w:val="28"/>
-        </w:rPr>
-        <w:fldChar w:fldCharType="separate"/>
-      </w:r>
-      <w:r>
-        <w:rPr>
-          <w:sz w:val="28"/>
-          <w:szCs w:val="28"/>
-        </w:rPr>
-        <w:t>7</w:t>
-      </w:r>
-      <w:r>
-        <w:rPr>
-          <w:sz w:val="28"/>
-          <w:szCs w:val="28"/>
-        </w:rPr>
-        <w:fldChar w:fldCharType="end"/>
+          <w:rFonts w:hint="default"/>
+          <w:sz w:val="28"/>
+          <w:szCs w:val="28"/>
+          <w:lang w:val="en-US"/>
+        </w:rPr>
+        <w:t>8</w:t>
       </w:r>
       <w:r>
         <w:rPr>
@@ -2277,38 +2041,12 @@
       </w:r>
       <w:r>
         <w:rPr>
-          <w:sz w:val="28"/>
-          <w:szCs w:val="28"/>
-        </w:rPr>
-        <w:fldChar w:fldCharType="begin"/>
-      </w:r>
-      <w:r>
-        <w:rPr>
-          <w:sz w:val="28"/>
-          <w:szCs w:val="28"/>
-        </w:rPr>
-        <w:instrText xml:space="preserve"> PAGEREF _Toc5791 \h </w:instrText>
-      </w:r>
-      <w:r>
-        <w:rPr>
-          <w:sz w:val="28"/>
-          <w:szCs w:val="28"/>
-        </w:rPr>
-        <w:fldChar w:fldCharType="separate"/>
-      </w:r>
-      <w:r>
-        <w:rPr>
-          <w:sz w:val="28"/>
-          <w:szCs w:val="28"/>
-        </w:rPr>
-        <w:t>7</w:t>
-      </w:r>
-      <w:r>
-        <w:rPr>
-          <w:sz w:val="28"/>
-          <w:szCs w:val="28"/>
-        </w:rPr>
-        <w:fldChar w:fldCharType="end"/>
+          <w:rFonts w:hint="default"/>
+          <w:sz w:val="28"/>
+          <w:szCs w:val="28"/>
+          <w:lang w:val="en-US"/>
+        </w:rPr>
+        <w:t>8</w:t>
       </w:r>
       <w:r>
         <w:rPr>
@@ -2377,38 +2115,12 @@
       </w:r>
       <w:r>
         <w:rPr>
-          <w:sz w:val="28"/>
-          <w:szCs w:val="28"/>
-        </w:rPr>
-        <w:fldChar w:fldCharType="begin"/>
-      </w:r>
-      <w:r>
-        <w:rPr>
-          <w:sz w:val="28"/>
-          <w:szCs w:val="28"/>
-        </w:rPr>
-        <w:instrText xml:space="preserve"> PAGEREF _Toc17511 \h </w:instrText>
-      </w:r>
-      <w:r>
-        <w:rPr>
-          <w:sz w:val="28"/>
-          <w:szCs w:val="28"/>
-        </w:rPr>
-        <w:fldChar w:fldCharType="separate"/>
-      </w:r>
-      <w:r>
-        <w:rPr>
-          <w:sz w:val="28"/>
-          <w:szCs w:val="28"/>
-        </w:rPr>
-        <w:t>7</w:t>
-      </w:r>
-      <w:r>
-        <w:rPr>
-          <w:sz w:val="28"/>
-          <w:szCs w:val="28"/>
-        </w:rPr>
-        <w:fldChar w:fldCharType="end"/>
+          <w:rFonts w:hint="default"/>
+          <w:sz w:val="28"/>
+          <w:szCs w:val="28"/>
+          <w:lang w:val="en-US"/>
+        </w:rPr>
+        <w:t>8</w:t>
       </w:r>
       <w:r>
         <w:rPr>
@@ -2477,38 +2189,12 @@
       </w:r>
       <w:r>
         <w:rPr>
-          <w:sz w:val="28"/>
-          <w:szCs w:val="28"/>
-        </w:rPr>
-        <w:fldChar w:fldCharType="begin"/>
-      </w:r>
-      <w:r>
-        <w:rPr>
-          <w:sz w:val="28"/>
-          <w:szCs w:val="28"/>
-        </w:rPr>
-        <w:instrText xml:space="preserve"> PAGEREF _Toc9211 \h </w:instrText>
-      </w:r>
-      <w:r>
-        <w:rPr>
-          <w:sz w:val="28"/>
-          <w:szCs w:val="28"/>
-        </w:rPr>
-        <w:fldChar w:fldCharType="separate"/>
-      </w:r>
-      <w:r>
-        <w:rPr>
-          <w:sz w:val="28"/>
-          <w:szCs w:val="28"/>
-        </w:rPr>
-        <w:t>8</w:t>
-      </w:r>
-      <w:r>
-        <w:rPr>
-          <w:sz w:val="28"/>
-          <w:szCs w:val="28"/>
-        </w:rPr>
-        <w:fldChar w:fldCharType="end"/>
+          <w:rFonts w:hint="default"/>
+          <w:sz w:val="28"/>
+          <w:szCs w:val="28"/>
+          <w:lang w:val="en-US"/>
+        </w:rPr>
+        <w:t>9</w:t>
       </w:r>
       <w:r>
         <w:rPr>
@@ -2577,38 +2263,12 @@
       </w:r>
       <w:r>
         <w:rPr>
-          <w:sz w:val="28"/>
-          <w:szCs w:val="28"/>
-        </w:rPr>
-        <w:fldChar w:fldCharType="begin"/>
-      </w:r>
-      <w:r>
-        <w:rPr>
-          <w:sz w:val="28"/>
-          <w:szCs w:val="28"/>
-        </w:rPr>
-        <w:instrText xml:space="preserve"> PAGEREF _Toc18664 \h </w:instrText>
-      </w:r>
-      <w:r>
-        <w:rPr>
-          <w:sz w:val="28"/>
-          <w:szCs w:val="28"/>
-        </w:rPr>
-        <w:fldChar w:fldCharType="separate"/>
-      </w:r>
-      <w:r>
-        <w:rPr>
-          <w:sz w:val="28"/>
-          <w:szCs w:val="28"/>
-        </w:rPr>
-        <w:t>8</w:t>
-      </w:r>
-      <w:r>
-        <w:rPr>
-          <w:sz w:val="28"/>
-          <w:szCs w:val="28"/>
-        </w:rPr>
-        <w:fldChar w:fldCharType="end"/>
+          <w:rFonts w:hint="default"/>
+          <w:sz w:val="28"/>
+          <w:szCs w:val="28"/>
+          <w:lang w:val="en-US"/>
+        </w:rPr>
+        <w:t>9</w:t>
       </w:r>
       <w:r>
         <w:rPr>
@@ -2628,17 +2288,19 @@
         </w:tabs>
         <w:ind w:left="0" w:leftChars="0" w:firstLine="0" w:firstLineChars="0"/>
         <w:rPr>
-          <w:sz w:val="28"/>
-          <w:szCs w:val="28"/>
-        </w:rPr>
-      </w:pPr>
-      <w:r>
-        <w:rPr>
           <w:rFonts w:hint="default"/>
           <w:sz w:val="28"/>
           <w:szCs w:val="28"/>
           <w:lang w:val="en-US"/>
         </w:rPr>
+      </w:pPr>
+      <w:r>
+        <w:rPr>
+          <w:rFonts w:hint="default"/>
+          <w:sz w:val="28"/>
+          <w:szCs w:val="28"/>
+          <w:lang w:val="en-US"/>
+        </w:rPr>
         <w:fldChar w:fldCharType="begin"/>
       </w:r>
       <w:r>
@@ -2704,36 +2366,19 @@
       </w:r>
       <w:r>
         <w:rPr>
-          <w:sz w:val="28"/>
-          <w:szCs w:val="28"/>
-        </w:rPr>
-        <w:fldChar w:fldCharType="begin"/>
-      </w:r>
-      <w:r>
-        <w:rPr>
-          <w:sz w:val="28"/>
-          <w:szCs w:val="28"/>
-        </w:rPr>
-        <w:instrText xml:space="preserve"> PAGEREF _Toc21461 \h </w:instrText>
-      </w:r>
-      <w:r>
-        <w:rPr>
-          <w:sz w:val="28"/>
-          <w:szCs w:val="28"/>
-        </w:rPr>
-        <w:fldChar w:fldCharType="separate"/>
-      </w:r>
-      <w:r>
-        <w:rPr>
-          <w:sz w:val="28"/>
-          <w:szCs w:val="28"/>
-        </w:rPr>
-        <w:t>10</w:t>
-      </w:r>
-      <w:r>
-        <w:rPr>
-          <w:sz w:val="28"/>
-          <w:szCs w:val="28"/>
+          <w:rFonts w:hint="default"/>
+          <w:sz w:val="28"/>
+          <w:szCs w:val="28"/>
+          <w:lang w:val="en-US"/>
+        </w:rPr>
+        <w:t>1</w:t>
+      </w:r>
+      <w:r>
+        <w:rPr>
+          <w:rFonts w:hint="default"/>
+          <w:sz w:val="28"/>
+          <w:szCs w:val="28"/>
+          <w:lang w:val="en-US"/>
         </w:rPr>
         <w:fldChar w:fldCharType="end"/>
       </w:r>
@@ -2744,7 +2389,7 @@
           <w:szCs w:val="28"/>
           <w:lang w:val="en-US"/>
         </w:rPr>
-        <w:fldChar w:fldCharType="end"/>
+        <w:t>1</w:t>
       </w:r>
     </w:p>
     <w:p>
@@ -2755,17 +2400,19 @@
         </w:tabs>
         <w:ind w:left="0" w:leftChars="0" w:firstLine="140" w:firstLineChars="50"/>
         <w:rPr>
-          <w:sz w:val="28"/>
-          <w:szCs w:val="28"/>
-        </w:rPr>
-      </w:pPr>
-      <w:r>
-        <w:rPr>
           <w:rFonts w:hint="default"/>
           <w:sz w:val="28"/>
           <w:szCs w:val="28"/>
           <w:lang w:val="en-US"/>
         </w:rPr>
+      </w:pPr>
+      <w:r>
+        <w:rPr>
+          <w:rFonts w:hint="default"/>
+          <w:sz w:val="28"/>
+          <w:szCs w:val="28"/>
+          <w:lang w:val="en-US"/>
+        </w:rPr>
         <w:fldChar w:fldCharType="begin"/>
       </w:r>
       <w:r>
@@ -2840,36 +2487,19 @@
       </w:r>
       <w:r>
         <w:rPr>
-          <w:sz w:val="28"/>
-          <w:szCs w:val="28"/>
-        </w:rPr>
-        <w:fldChar w:fldCharType="begin"/>
-      </w:r>
-      <w:r>
-        <w:rPr>
-          <w:sz w:val="28"/>
-          <w:szCs w:val="28"/>
-        </w:rPr>
-        <w:instrText xml:space="preserve"> PAGEREF _Toc14307 \h </w:instrText>
-      </w:r>
-      <w:r>
-        <w:rPr>
-          <w:sz w:val="28"/>
-          <w:szCs w:val="28"/>
-        </w:rPr>
-        <w:fldChar w:fldCharType="separate"/>
-      </w:r>
-      <w:r>
-        <w:rPr>
-          <w:sz w:val="28"/>
-          <w:szCs w:val="28"/>
-        </w:rPr>
-        <w:t>10</w:t>
-      </w:r>
-      <w:r>
-        <w:rPr>
-          <w:sz w:val="28"/>
-          <w:szCs w:val="28"/>
+          <w:rFonts w:hint="default"/>
+          <w:sz w:val="28"/>
+          <w:szCs w:val="28"/>
+          <w:lang w:val="en-US"/>
+        </w:rPr>
+        <w:t>1</w:t>
+      </w:r>
+      <w:r>
+        <w:rPr>
+          <w:rFonts w:hint="default"/>
+          <w:sz w:val="28"/>
+          <w:szCs w:val="28"/>
+          <w:lang w:val="en-US"/>
         </w:rPr>
         <w:fldChar w:fldCharType="end"/>
       </w:r>
@@ -2880,7 +2510,7 @@
           <w:szCs w:val="28"/>
           <w:lang w:val="en-US"/>
         </w:rPr>
-        <w:fldChar w:fldCharType="end"/>
+        <w:t>1</w:t>
       </w:r>
     </w:p>
     <w:p>
@@ -2891,8 +2521,10 @@
         </w:tabs>
         <w:ind w:left="0" w:leftChars="0" w:firstLine="140" w:firstLineChars="50"/>
         <w:rPr>
-          <w:sz w:val="28"/>
-          <w:szCs w:val="28"/>
+          <w:rFonts w:hint="default"/>
+          <w:sz w:val="28"/>
+          <w:szCs w:val="28"/>
+          <w:lang w:val="en-US"/>
         </w:rPr>
       </w:pPr>
       <w:r>
@@ -2977,36 +2609,19 @@
       </w:r>
       <w:r>
         <w:rPr>
-          <w:sz w:val="28"/>
-          <w:szCs w:val="28"/>
-        </w:rPr>
-        <w:fldChar w:fldCharType="begin"/>
-      </w:r>
-      <w:r>
-        <w:rPr>
-          <w:sz w:val="28"/>
-          <w:szCs w:val="28"/>
-        </w:rPr>
-        <w:instrText xml:space="preserve"> PAGEREF _Toc26473 \h </w:instrText>
-      </w:r>
-      <w:r>
-        <w:rPr>
-          <w:sz w:val="28"/>
-          <w:szCs w:val="28"/>
-        </w:rPr>
-        <w:fldChar w:fldCharType="separate"/>
-      </w:r>
-      <w:r>
-        <w:rPr>
-          <w:sz w:val="28"/>
-          <w:szCs w:val="28"/>
-        </w:rPr>
-        <w:t>11</w:t>
-      </w:r>
-      <w:r>
-        <w:rPr>
-          <w:sz w:val="28"/>
-          <w:szCs w:val="28"/>
+          <w:rFonts w:hint="default"/>
+          <w:sz w:val="28"/>
+          <w:szCs w:val="28"/>
+          <w:lang w:val="en-US"/>
+        </w:rPr>
+        <w:t>1</w:t>
+      </w:r>
+      <w:r>
+        <w:rPr>
+          <w:rFonts w:hint="default"/>
+          <w:sz w:val="28"/>
+          <w:szCs w:val="28"/>
+          <w:lang w:val="en-US"/>
         </w:rPr>
         <w:fldChar w:fldCharType="end"/>
       </w:r>
@@ -3017,7 +2632,7 @@
           <w:szCs w:val="28"/>
           <w:lang w:val="en-US"/>
         </w:rPr>
-        <w:fldChar w:fldCharType="end"/>
+        <w:t>2</w:t>
       </w:r>
     </w:p>
     <w:p>
@@ -3028,17 +2643,19 @@
         </w:tabs>
         <w:ind w:left="0" w:leftChars="0" w:firstLine="140" w:firstLineChars="50"/>
         <w:rPr>
-          <w:sz w:val="28"/>
-          <w:szCs w:val="28"/>
-        </w:rPr>
-      </w:pPr>
-      <w:r>
-        <w:rPr>
           <w:rFonts w:hint="default"/>
           <w:sz w:val="28"/>
           <w:szCs w:val="28"/>
           <w:lang w:val="en-US"/>
         </w:rPr>
+      </w:pPr>
+      <w:r>
+        <w:rPr>
+          <w:rFonts w:hint="default"/>
+          <w:sz w:val="28"/>
+          <w:szCs w:val="28"/>
+          <w:lang w:val="en-US"/>
+        </w:rPr>
         <w:fldChar w:fldCharType="begin"/>
       </w:r>
       <w:r>
@@ -3113,36 +2730,19 @@
       </w:r>
       <w:r>
         <w:rPr>
-          <w:sz w:val="28"/>
-          <w:szCs w:val="28"/>
-        </w:rPr>
-        <w:fldChar w:fldCharType="begin"/>
-      </w:r>
-      <w:r>
-        <w:rPr>
-          <w:sz w:val="28"/>
-          <w:szCs w:val="28"/>
-        </w:rPr>
-        <w:instrText xml:space="preserve"> PAGEREF _Toc18227 \h </w:instrText>
-      </w:r>
-      <w:r>
-        <w:rPr>
-          <w:sz w:val="28"/>
-          <w:szCs w:val="28"/>
-        </w:rPr>
-        <w:fldChar w:fldCharType="separate"/>
-      </w:r>
-      <w:r>
-        <w:rPr>
-          <w:sz w:val="28"/>
-          <w:szCs w:val="28"/>
-        </w:rPr>
-        <w:t>12</w:t>
-      </w:r>
-      <w:r>
-        <w:rPr>
-          <w:sz w:val="28"/>
-          <w:szCs w:val="28"/>
+          <w:rFonts w:hint="default"/>
+          <w:sz w:val="28"/>
+          <w:szCs w:val="28"/>
+          <w:lang w:val="en-US"/>
+        </w:rPr>
+        <w:t>1</w:t>
+      </w:r>
+      <w:r>
+        <w:rPr>
+          <w:rFonts w:hint="default"/>
+          <w:sz w:val="28"/>
+          <w:szCs w:val="28"/>
+          <w:lang w:val="en-US"/>
         </w:rPr>
         <w:fldChar w:fldCharType="end"/>
       </w:r>
@@ -3153,7 +2753,7 @@
           <w:szCs w:val="28"/>
           <w:lang w:val="en-US"/>
         </w:rPr>
-        <w:fldChar w:fldCharType="end"/>
+        <w:t>3</w:t>
       </w:r>
     </w:p>
     <w:p>
@@ -3164,17 +2764,19 @@
         </w:tabs>
         <w:ind w:left="0" w:leftChars="0" w:firstLine="140" w:firstLineChars="50"/>
         <w:rPr>
-          <w:sz w:val="28"/>
-          <w:szCs w:val="28"/>
-        </w:rPr>
-      </w:pPr>
-      <w:r>
-        <w:rPr>
           <w:rFonts w:hint="default"/>
           <w:sz w:val="28"/>
           <w:szCs w:val="28"/>
           <w:lang w:val="en-US"/>
         </w:rPr>
+      </w:pPr>
+      <w:r>
+        <w:rPr>
+          <w:rFonts w:hint="default"/>
+          <w:sz w:val="28"/>
+          <w:szCs w:val="28"/>
+          <w:lang w:val="en-US"/>
+        </w:rPr>
         <w:fldChar w:fldCharType="begin"/>
       </w:r>
       <w:r>
@@ -3249,36 +2851,19 @@
       </w:r>
       <w:r>
         <w:rPr>
-          <w:sz w:val="28"/>
-          <w:szCs w:val="28"/>
-        </w:rPr>
-        <w:fldChar w:fldCharType="begin"/>
-      </w:r>
-      <w:r>
-        <w:rPr>
-          <w:sz w:val="28"/>
-          <w:szCs w:val="28"/>
-        </w:rPr>
-        <w:instrText xml:space="preserve"> PAGEREF _Toc6259 \h </w:instrText>
-      </w:r>
-      <w:r>
-        <w:rPr>
-          <w:sz w:val="28"/>
-          <w:szCs w:val="28"/>
-        </w:rPr>
-        <w:fldChar w:fldCharType="separate"/>
-      </w:r>
-      <w:r>
-        <w:rPr>
-          <w:sz w:val="28"/>
-          <w:szCs w:val="28"/>
-        </w:rPr>
-        <w:t>14</w:t>
-      </w:r>
-      <w:r>
-        <w:rPr>
-          <w:sz w:val="28"/>
-          <w:szCs w:val="28"/>
+          <w:rFonts w:hint="default"/>
+          <w:sz w:val="28"/>
+          <w:szCs w:val="28"/>
+          <w:lang w:val="en-US"/>
+        </w:rPr>
+        <w:t>1</w:t>
+      </w:r>
+      <w:r>
+        <w:rPr>
+          <w:rFonts w:hint="default"/>
+          <w:sz w:val="28"/>
+          <w:szCs w:val="28"/>
+          <w:lang w:val="en-US"/>
         </w:rPr>
         <w:fldChar w:fldCharType="end"/>
       </w:r>
@@ -3289,7 +2874,7 @@
           <w:szCs w:val="28"/>
           <w:lang w:val="en-US"/>
         </w:rPr>
-        <w:fldChar w:fldCharType="end"/>
+        <w:t>5</w:t>
       </w:r>
     </w:p>
     <w:p>
@@ -3300,8 +2885,10 @@
         </w:tabs>
         <w:ind w:left="0" w:leftChars="0" w:firstLine="140" w:firstLineChars="50"/>
         <w:rPr>
-          <w:sz w:val="28"/>
-          <w:szCs w:val="28"/>
+          <w:rFonts w:hint="default"/>
+          <w:sz w:val="28"/>
+          <w:szCs w:val="28"/>
+          <w:lang w:val="en-US"/>
         </w:rPr>
       </w:pPr>
       <w:r>
@@ -3386,36 +2973,19 @@
       </w:r>
       <w:r>
         <w:rPr>
-          <w:sz w:val="28"/>
-          <w:szCs w:val="28"/>
-        </w:rPr>
-        <w:fldChar w:fldCharType="begin"/>
-      </w:r>
-      <w:r>
-        <w:rPr>
-          <w:sz w:val="28"/>
-          <w:szCs w:val="28"/>
-        </w:rPr>
-        <w:instrText xml:space="preserve"> PAGEREF _Toc24520 \h </w:instrText>
-      </w:r>
-      <w:r>
-        <w:rPr>
-          <w:sz w:val="28"/>
-          <w:szCs w:val="28"/>
-        </w:rPr>
-        <w:fldChar w:fldCharType="separate"/>
-      </w:r>
-      <w:r>
-        <w:rPr>
-          <w:sz w:val="28"/>
-          <w:szCs w:val="28"/>
-        </w:rPr>
-        <w:t>15</w:t>
-      </w:r>
-      <w:r>
-        <w:rPr>
-          <w:sz w:val="28"/>
-          <w:szCs w:val="28"/>
+          <w:rFonts w:hint="default"/>
+          <w:sz w:val="28"/>
+          <w:szCs w:val="28"/>
+          <w:lang w:val="en-US"/>
+        </w:rPr>
+        <w:t>1</w:t>
+      </w:r>
+      <w:r>
+        <w:rPr>
+          <w:rFonts w:hint="default"/>
+          <w:sz w:val="28"/>
+          <w:szCs w:val="28"/>
+          <w:lang w:val="en-US"/>
         </w:rPr>
         <w:fldChar w:fldCharType="end"/>
       </w:r>
@@ -3426,7 +2996,7 @@
           <w:szCs w:val="28"/>
           <w:lang w:val="en-US"/>
         </w:rPr>
-        <w:fldChar w:fldCharType="end"/>
+        <w:t>6</w:t>
       </w:r>
     </w:p>
     <w:p>
@@ -3437,8 +3007,10 @@
         </w:tabs>
         <w:ind w:left="0" w:leftChars="0" w:firstLine="140" w:firstLineChars="50"/>
         <w:rPr>
-          <w:sz w:val="28"/>
-          <w:szCs w:val="28"/>
+          <w:rFonts w:hint="default"/>
+          <w:sz w:val="28"/>
+          <w:szCs w:val="28"/>
+          <w:lang w:val="en-US"/>
         </w:rPr>
       </w:pPr>
       <w:r>
@@ -3523,36 +3095,19 @@
       </w:r>
       <w:r>
         <w:rPr>
-          <w:sz w:val="28"/>
-          <w:szCs w:val="28"/>
-        </w:rPr>
-        <w:fldChar w:fldCharType="begin"/>
-      </w:r>
-      <w:r>
-        <w:rPr>
-          <w:sz w:val="28"/>
-          <w:szCs w:val="28"/>
-        </w:rPr>
-        <w:instrText xml:space="preserve"> PAGEREF _Toc29115 \h </w:instrText>
-      </w:r>
-      <w:r>
-        <w:rPr>
-          <w:sz w:val="28"/>
-          <w:szCs w:val="28"/>
-        </w:rPr>
-        <w:fldChar w:fldCharType="separate"/>
-      </w:r>
-      <w:r>
-        <w:rPr>
-          <w:sz w:val="28"/>
-          <w:szCs w:val="28"/>
-        </w:rPr>
-        <w:t>17</w:t>
-      </w:r>
-      <w:r>
-        <w:rPr>
-          <w:sz w:val="28"/>
-          <w:szCs w:val="28"/>
+          <w:rFonts w:hint="default"/>
+          <w:sz w:val="28"/>
+          <w:szCs w:val="28"/>
+          <w:lang w:val="en-US"/>
+        </w:rPr>
+        <w:t>1</w:t>
+      </w:r>
+      <w:r>
+        <w:rPr>
+          <w:rFonts w:hint="default"/>
+          <w:sz w:val="28"/>
+          <w:szCs w:val="28"/>
+          <w:lang w:val="en-US"/>
         </w:rPr>
         <w:fldChar w:fldCharType="end"/>
       </w:r>
@@ -3563,7 +3118,7 @@
           <w:szCs w:val="28"/>
           <w:lang w:val="en-US"/>
         </w:rPr>
-        <w:fldChar w:fldCharType="end"/>
+        <w:t>8</w:t>
       </w:r>
     </w:p>
     <w:p>
@@ -3574,8 +3129,10 @@
         </w:tabs>
         <w:ind w:left="0" w:leftChars="0" w:firstLine="140" w:firstLineChars="50"/>
         <w:rPr>
-          <w:sz w:val="28"/>
-          <w:szCs w:val="28"/>
+          <w:rFonts w:hint="default"/>
+          <w:sz w:val="28"/>
+          <w:szCs w:val="28"/>
+          <w:lang w:val="en-US"/>
         </w:rPr>
       </w:pPr>
       <w:r>
@@ -3660,36 +3217,19 @@
       </w:r>
       <w:r>
         <w:rPr>
-          <w:sz w:val="28"/>
-          <w:szCs w:val="28"/>
-        </w:rPr>
-        <w:fldChar w:fldCharType="begin"/>
-      </w:r>
-      <w:r>
-        <w:rPr>
-          <w:sz w:val="28"/>
-          <w:szCs w:val="28"/>
-        </w:rPr>
-        <w:instrText xml:space="preserve"> PAGEREF _Toc30844 \h </w:instrText>
-      </w:r>
-      <w:r>
-        <w:rPr>
-          <w:sz w:val="28"/>
-          <w:szCs w:val="28"/>
-        </w:rPr>
-        <w:fldChar w:fldCharType="separate"/>
-      </w:r>
-      <w:r>
-        <w:rPr>
-          <w:sz w:val="28"/>
-          <w:szCs w:val="28"/>
-        </w:rPr>
-        <w:t>18</w:t>
-      </w:r>
-      <w:r>
-        <w:rPr>
-          <w:sz w:val="28"/>
-          <w:szCs w:val="28"/>
+          <w:rFonts w:hint="default"/>
+          <w:sz w:val="28"/>
+          <w:szCs w:val="28"/>
+          <w:lang w:val="en-US"/>
+        </w:rPr>
+        <w:t>1</w:t>
+      </w:r>
+      <w:r>
+        <w:rPr>
+          <w:rFonts w:hint="default"/>
+          <w:sz w:val="28"/>
+          <w:szCs w:val="28"/>
+          <w:lang w:val="en-US"/>
         </w:rPr>
         <w:fldChar w:fldCharType="end"/>
       </w:r>
@@ -3700,7 +3240,7 @@
           <w:szCs w:val="28"/>
           <w:lang w:val="en-US"/>
         </w:rPr>
-        <w:fldChar w:fldCharType="end"/>
+        <w:t>9</w:t>
       </w:r>
     </w:p>
     <w:p>
@@ -3711,8 +3251,10 @@
         </w:tabs>
         <w:ind w:left="0" w:leftChars="0" w:firstLine="140" w:firstLineChars="50"/>
         <w:rPr>
-          <w:sz w:val="28"/>
-          <w:szCs w:val="28"/>
+          <w:rFonts w:hint="default"/>
+          <w:sz w:val="28"/>
+          <w:szCs w:val="28"/>
+          <w:lang w:val="en-US"/>
         </w:rPr>
       </w:pPr>
       <w:r>
@@ -3797,36 +3339,19 @@
       </w:r>
       <w:r>
         <w:rPr>
-          <w:sz w:val="28"/>
-          <w:szCs w:val="28"/>
-        </w:rPr>
-        <w:fldChar w:fldCharType="begin"/>
-      </w:r>
-      <w:r>
-        <w:rPr>
-          <w:sz w:val="28"/>
-          <w:szCs w:val="28"/>
-        </w:rPr>
-        <w:instrText xml:space="preserve"> PAGEREF _Toc4382 \h </w:instrText>
-      </w:r>
-      <w:r>
-        <w:rPr>
-          <w:sz w:val="28"/>
-          <w:szCs w:val="28"/>
-        </w:rPr>
-        <w:fldChar w:fldCharType="separate"/>
-      </w:r>
-      <w:r>
-        <w:rPr>
-          <w:sz w:val="28"/>
-          <w:szCs w:val="28"/>
-        </w:rPr>
-        <w:t>20</w:t>
-      </w:r>
-      <w:r>
-        <w:rPr>
-          <w:sz w:val="28"/>
-          <w:szCs w:val="28"/>
+          <w:rFonts w:hint="default"/>
+          <w:sz w:val="28"/>
+          <w:szCs w:val="28"/>
+          <w:lang w:val="en-US"/>
+        </w:rPr>
+        <w:t>2</w:t>
+      </w:r>
+      <w:r>
+        <w:rPr>
+          <w:rFonts w:hint="default"/>
+          <w:sz w:val="28"/>
+          <w:szCs w:val="28"/>
+          <w:lang w:val="en-US"/>
         </w:rPr>
         <w:fldChar w:fldCharType="end"/>
       </w:r>
@@ -3837,7 +3362,7 @@
           <w:szCs w:val="28"/>
           <w:lang w:val="en-US"/>
         </w:rPr>
-        <w:fldChar w:fldCharType="end"/>
+        <w:t>1</w:t>
       </w:r>
     </w:p>
     <w:p>
@@ -3848,8 +3373,10 @@
         </w:tabs>
         <w:ind w:left="0" w:leftChars="0" w:firstLine="140" w:firstLineChars="50"/>
         <w:rPr>
-          <w:sz w:val="28"/>
-          <w:szCs w:val="28"/>
+          <w:rFonts w:hint="default"/>
+          <w:sz w:val="28"/>
+          <w:szCs w:val="28"/>
+          <w:lang w:val="en-US"/>
         </w:rPr>
       </w:pPr>
       <w:r>
@@ -3934,36 +3461,19 @@
       </w:r>
       <w:r>
         <w:rPr>
-          <w:sz w:val="28"/>
-          <w:szCs w:val="28"/>
-        </w:rPr>
-        <w:fldChar w:fldCharType="begin"/>
-      </w:r>
-      <w:r>
-        <w:rPr>
-          <w:sz w:val="28"/>
-          <w:szCs w:val="28"/>
-        </w:rPr>
-        <w:instrText xml:space="preserve"> PAGEREF _Toc22649 \h </w:instrText>
-      </w:r>
-      <w:r>
-        <w:rPr>
-          <w:sz w:val="28"/>
-          <w:szCs w:val="28"/>
-        </w:rPr>
-        <w:fldChar w:fldCharType="separate"/>
-      </w:r>
-      <w:r>
-        <w:rPr>
-          <w:sz w:val="28"/>
-          <w:szCs w:val="28"/>
-        </w:rPr>
-        <w:t>21</w:t>
-      </w:r>
-      <w:r>
-        <w:rPr>
-          <w:sz w:val="28"/>
-          <w:szCs w:val="28"/>
+          <w:rFonts w:hint="default"/>
+          <w:sz w:val="28"/>
+          <w:szCs w:val="28"/>
+          <w:lang w:val="en-US"/>
+        </w:rPr>
+        <w:t>2</w:t>
+      </w:r>
+      <w:r>
+        <w:rPr>
+          <w:rFonts w:hint="default"/>
+          <w:sz w:val="28"/>
+          <w:szCs w:val="28"/>
+          <w:lang w:val="en-US"/>
         </w:rPr>
         <w:fldChar w:fldCharType="end"/>
       </w:r>
@@ -3974,7 +3484,7 @@
           <w:szCs w:val="28"/>
           <w:lang w:val="en-US"/>
         </w:rPr>
-        <w:fldChar w:fldCharType="end"/>
+        <w:t>2</w:t>
       </w:r>
     </w:p>
     <w:p>
@@ -3984,6 +3494,12 @@
           <w:tab w:val="right" w:leader="dot" w:pos="8306"/>
         </w:tabs>
         <w:ind w:left="0" w:leftChars="0" w:firstLine="140" w:firstLineChars="50"/>
+        <w:rPr>
+          <w:rFonts w:hint="default"/>
+          <w:sz w:val="28"/>
+          <w:szCs w:val="28"/>
+          <w:lang w:val="en-US"/>
+        </w:rPr>
       </w:pPr>
       <w:r>
         <w:rPr>
@@ -4067,36 +3583,131 @@
       </w:r>
       <w:r>
         <w:rPr>
-          <w:sz w:val="28"/>
-          <w:szCs w:val="28"/>
+          <w:rFonts w:hint="default"/>
+          <w:sz w:val="28"/>
+          <w:szCs w:val="28"/>
+          <w:lang w:val="en-US"/>
+        </w:rPr>
+        <w:t>2</w:t>
+      </w:r>
+      <w:r>
+        <w:rPr>
+          <w:rFonts w:hint="default"/>
+          <w:sz w:val="28"/>
+          <w:szCs w:val="28"/>
+          <w:lang w:val="en-US"/>
+        </w:rPr>
+        <w:fldChar w:fldCharType="end"/>
+      </w:r>
+      <w:r>
+        <w:rPr>
+          <w:rFonts w:hint="default"/>
+          <w:sz w:val="28"/>
+          <w:szCs w:val="28"/>
+          <w:lang w:val="en-US"/>
+        </w:rPr>
+        <w:t>4</w:t>
+      </w:r>
+    </w:p>
+    <w:p>
+      <w:pPr>
+        <w:pStyle w:val="12"/>
+        <w:tabs>
+          <w:tab w:val="right" w:leader="dot" w:pos="8306"/>
+        </w:tabs>
+        <w:ind w:left="0" w:leftChars="0" w:firstLine="0" w:firstLineChars="0"/>
+        <w:rPr>
+          <w:rFonts w:hint="default"/>
+          <w:sz w:val="28"/>
+          <w:szCs w:val="28"/>
+          <w:lang w:val="en-US"/>
+        </w:rPr>
+      </w:pPr>
+      <w:r>
+        <w:rPr>
+          <w:rFonts w:hint="default"/>
+          <w:sz w:val="28"/>
+          <w:szCs w:val="28"/>
+          <w:lang w:val="en-US"/>
         </w:rPr>
         <w:fldChar w:fldCharType="begin"/>
       </w:r>
       <w:r>
         <w:rPr>
-          <w:sz w:val="28"/>
-          <w:szCs w:val="28"/>
-        </w:rPr>
-        <w:instrText xml:space="preserve"> PAGEREF _Toc18135 \h </w:instrText>
-      </w:r>
-      <w:r>
-        <w:rPr>
-          <w:sz w:val="28"/>
-          <w:szCs w:val="28"/>
+          <w:rFonts w:hint="default"/>
+          <w:sz w:val="28"/>
+          <w:szCs w:val="28"/>
+          <w:lang w:val="en-US"/>
+        </w:rPr>
+        <w:instrText xml:space="preserve"> HYPERLINK \l _Toc21461 </w:instrText>
+      </w:r>
+      <w:r>
+        <w:rPr>
+          <w:rFonts w:hint="default"/>
+          <w:sz w:val="28"/>
+          <w:szCs w:val="28"/>
+          <w:lang w:val="en-US"/>
         </w:rPr>
         <w:fldChar w:fldCharType="separate"/>
       </w:r>
       <w:r>
         <w:rPr>
-          <w:sz w:val="28"/>
-          <w:szCs w:val="28"/>
-        </w:rPr>
-        <w:t>23</w:t>
-      </w:r>
-      <w:r>
-        <w:rPr>
-          <w:sz w:val="28"/>
-          <w:szCs w:val="28"/>
+          <w:rFonts w:hint="default" w:ascii="Times New Roman" w:hAnsi="Times New Roman" w:cs="Times New Roman"/>
+          <w:sz w:val="28"/>
+          <w:szCs w:val="28"/>
+          <w:lang w:val="en-US"/>
+        </w:rPr>
+        <w:t xml:space="preserve">Part </w:t>
+      </w:r>
+      <w:r>
+        <w:rPr>
+          <w:rFonts w:hint="default" w:cs="Times New Roman"/>
+          <w:sz w:val="28"/>
+          <w:szCs w:val="28"/>
+          <w:lang w:val="en-US"/>
+        </w:rPr>
+        <w:t>E</w:t>
+      </w:r>
+      <w:r>
+        <w:rPr>
+          <w:rFonts w:hint="default" w:ascii="Times New Roman" w:hAnsi="Times New Roman" w:cs="Times New Roman"/>
+          <w:sz w:val="28"/>
+          <w:szCs w:val="28"/>
+          <w:lang w:val="en-US"/>
+        </w:rPr>
+        <w:t xml:space="preserve">: </w:t>
+      </w:r>
+      <w:r>
+        <w:rPr>
+          <w:rFonts w:hint="default" w:cs="Times New Roman"/>
+          <w:sz w:val="28"/>
+          <w:szCs w:val="28"/>
+          <w:lang w:val="en-US"/>
+        </w:rPr>
+        <w:t>Workflow</w:t>
+      </w:r>
+      <w:r>
+        <w:rPr>
+          <w:sz w:val="28"/>
+          <w:szCs w:val="28"/>
+        </w:rPr>
+        <w:tab/>
+      </w:r>
+      <w:r>
+        <w:rPr>
+          <w:rFonts w:hint="default"/>
+          <w:sz w:val="28"/>
+          <w:szCs w:val="28"/>
+          <w:lang w:val="en-US"/>
+        </w:rPr>
+        <w:t>2</w:t>
+      </w:r>
+      <w:r>
+        <w:rPr>
+          <w:rFonts w:hint="default"/>
+          <w:sz w:val="28"/>
+          <w:szCs w:val="28"/>
+          <w:lang w:val="en-US"/>
         </w:rPr>
         <w:fldChar w:fldCharType="end"/>
       </w:r>
@@ -4107,8 +3718,1240 @@
           <w:szCs w:val="28"/>
           <w:lang w:val="en-US"/>
         </w:rPr>
+        <w:t>6</w:t>
+      </w:r>
+    </w:p>
+    <w:p>
+      <w:pPr>
+        <w:pStyle w:val="13"/>
+        <w:tabs>
+          <w:tab w:val="right" w:leader="dot" w:pos="8306"/>
+        </w:tabs>
+        <w:ind w:left="0" w:leftChars="0" w:firstLine="140" w:firstLineChars="50"/>
+        <w:rPr>
+          <w:rFonts w:hint="default"/>
+          <w:sz w:val="28"/>
+          <w:szCs w:val="28"/>
+          <w:lang w:val="en-US"/>
+        </w:rPr>
+      </w:pPr>
+      <w:r>
+        <w:rPr>
+          <w:rFonts w:hint="default"/>
+          <w:sz w:val="28"/>
+          <w:szCs w:val="28"/>
+          <w:lang w:val="en-US"/>
+        </w:rPr>
+        <w:fldChar w:fldCharType="begin"/>
+      </w:r>
+      <w:r>
+        <w:rPr>
+          <w:rFonts w:hint="default"/>
+          <w:sz w:val="28"/>
+          <w:szCs w:val="28"/>
+          <w:lang w:val="en-US"/>
+        </w:rPr>
+        <w:instrText xml:space="preserve"> HYPERLINK \l _Toc14307 </w:instrText>
+      </w:r>
+      <w:r>
+        <w:rPr>
+          <w:rFonts w:hint="default"/>
+          <w:sz w:val="28"/>
+          <w:szCs w:val="28"/>
+          <w:lang w:val="en-US"/>
+        </w:rPr>
+        <w:fldChar w:fldCharType="separate"/>
+      </w:r>
+      <w:r>
+        <w:rPr>
+          <w:rFonts w:hint="default"/>
+          <w:sz w:val="28"/>
+          <w:szCs w:val="28"/>
+          <w:lang w:val="en-US"/>
+        </w:rPr>
+        <w:t>5</w:t>
+      </w:r>
+      <w:r>
+        <w:rPr>
+          <w:rFonts w:hint="default" w:ascii="Times New Roman" w:hAnsi="Times New Roman" w:cs="Times New Roman"/>
+          <w:sz w:val="28"/>
+          <w:szCs w:val="28"/>
+          <w:lang w:val="en-US"/>
+        </w:rPr>
+        <w:t>.</w:t>
+      </w:r>
+      <w:r>
+        <w:rPr>
+          <w:rFonts w:hint="default" w:cs="Times New Roman"/>
+          <w:sz w:val="28"/>
+          <w:szCs w:val="28"/>
+          <w:lang w:val="en-US"/>
+        </w:rPr>
+        <w:t>1</w:t>
+      </w:r>
+      <w:r>
+        <w:rPr>
+          <w:rFonts w:hint="default" w:ascii="Times New Roman" w:hAnsi="Times New Roman" w:cs="Times New Roman"/>
+          <w:sz w:val="28"/>
+          <w:szCs w:val="28"/>
+          <w:lang w:val="en-US"/>
+        </w:rPr>
+        <w:t xml:space="preserve"> </w:t>
+      </w:r>
+      <w:r>
+        <w:rPr>
+          <w:rFonts w:hint="default" w:cs="Times New Roman"/>
+          <w:sz w:val="28"/>
+          <w:szCs w:val="28"/>
+          <w:lang w:val="en-US"/>
+        </w:rPr>
+        <w:t>User and Access Management</w:t>
+      </w:r>
+      <w:r>
+        <w:rPr>
+          <w:sz w:val="28"/>
+          <w:szCs w:val="28"/>
+        </w:rPr>
+        <w:tab/>
+      </w:r>
+      <w:r>
+        <w:rPr>
+          <w:rFonts w:hint="default"/>
+          <w:sz w:val="28"/>
+          <w:szCs w:val="28"/>
+          <w:lang w:val="en-US"/>
+        </w:rPr>
+        <w:t>2</w:t>
+      </w:r>
+      <w:r>
+        <w:rPr>
+          <w:rFonts w:hint="default"/>
+          <w:sz w:val="28"/>
+          <w:szCs w:val="28"/>
+          <w:lang w:val="en-US"/>
+        </w:rPr>
         <w:fldChar w:fldCharType="end"/>
       </w:r>
+      <w:r>
+        <w:rPr>
+          <w:rFonts w:hint="default"/>
+          <w:sz w:val="28"/>
+          <w:szCs w:val="28"/>
+          <w:lang w:val="en-US"/>
+        </w:rPr>
+        <w:t>6</w:t>
+      </w:r>
+    </w:p>
+    <w:p>
+      <w:pPr>
+        <w:pStyle w:val="13"/>
+        <w:tabs>
+          <w:tab w:val="right" w:leader="dot" w:pos="8306"/>
+        </w:tabs>
+        <w:ind w:left="0" w:leftChars="0" w:firstLine="140" w:firstLineChars="50"/>
+        <w:rPr>
+          <w:rFonts w:hint="default"/>
+          <w:sz w:val="28"/>
+          <w:szCs w:val="28"/>
+          <w:lang w:val="en-US"/>
+        </w:rPr>
+      </w:pPr>
+      <w:r>
+        <w:rPr>
+          <w:rFonts w:hint="default"/>
+          <w:sz w:val="28"/>
+          <w:szCs w:val="28"/>
+          <w:lang w:val="en-US"/>
+        </w:rPr>
+        <w:fldChar w:fldCharType="begin"/>
+      </w:r>
+      <w:r>
+        <w:rPr>
+          <w:rFonts w:hint="default"/>
+          <w:sz w:val="28"/>
+          <w:szCs w:val="28"/>
+          <w:lang w:val="en-US"/>
+        </w:rPr>
+        <w:instrText xml:space="preserve"> HYPERLINK \l _Toc26473 </w:instrText>
+      </w:r>
+      <w:r>
+        <w:rPr>
+          <w:rFonts w:hint="default"/>
+          <w:sz w:val="28"/>
+          <w:szCs w:val="28"/>
+          <w:lang w:val="en-US"/>
+        </w:rPr>
+        <w:fldChar w:fldCharType="separate"/>
+      </w:r>
+      <w:r>
+        <w:rPr>
+          <w:rFonts w:hint="default"/>
+          <w:sz w:val="28"/>
+          <w:szCs w:val="28"/>
+          <w:lang w:val="en-US"/>
+        </w:rPr>
+        <w:t>5</w:t>
+      </w:r>
+      <w:r>
+        <w:rPr>
+          <w:rFonts w:hint="default" w:ascii="Times New Roman" w:hAnsi="Times New Roman" w:cs="Times New Roman"/>
+          <w:sz w:val="28"/>
+          <w:szCs w:val="28"/>
+          <w:lang w:val="en-US"/>
+        </w:rPr>
+        <w:t>.</w:t>
+      </w:r>
+      <w:r>
+        <w:rPr>
+          <w:rFonts w:hint="default" w:cs="Times New Roman"/>
+          <w:sz w:val="28"/>
+          <w:szCs w:val="28"/>
+          <w:lang w:val="en-US"/>
+        </w:rPr>
+        <w:t>2</w:t>
+      </w:r>
+      <w:r>
+        <w:rPr>
+          <w:rFonts w:hint="default" w:ascii="Times New Roman" w:hAnsi="Times New Roman" w:cs="Times New Roman"/>
+          <w:sz w:val="28"/>
+          <w:szCs w:val="28"/>
+          <w:lang w:val="en-US"/>
+        </w:rPr>
+        <w:t xml:space="preserve"> </w:t>
+      </w:r>
+      <w:r>
+        <w:rPr>
+          <w:rFonts w:hint="default" w:cs="Times New Roman"/>
+          <w:bCs/>
+          <w:sz w:val="28"/>
+          <w:szCs w:val="28"/>
+          <w:lang w:val="en-US"/>
+        </w:rPr>
+        <w:t>Branch and Hub Setup</w:t>
+      </w:r>
+      <w:r>
+        <w:rPr>
+          <w:sz w:val="28"/>
+          <w:szCs w:val="28"/>
+        </w:rPr>
+        <w:tab/>
+      </w:r>
+      <w:r>
+        <w:rPr>
+          <w:rFonts w:hint="default"/>
+          <w:sz w:val="28"/>
+          <w:szCs w:val="28"/>
+          <w:lang w:val="en-US"/>
+        </w:rPr>
+        <w:t>2</w:t>
+      </w:r>
+      <w:r>
+        <w:rPr>
+          <w:rFonts w:hint="default"/>
+          <w:sz w:val="28"/>
+          <w:szCs w:val="28"/>
+          <w:lang w:val="en-US"/>
+        </w:rPr>
+        <w:fldChar w:fldCharType="end"/>
+      </w:r>
+      <w:r>
+        <w:rPr>
+          <w:rFonts w:hint="default"/>
+          <w:sz w:val="28"/>
+          <w:szCs w:val="28"/>
+          <w:lang w:val="en-US"/>
+        </w:rPr>
+        <w:t>7</w:t>
+      </w:r>
+    </w:p>
+    <w:p>
+      <w:pPr>
+        <w:pStyle w:val="13"/>
+        <w:tabs>
+          <w:tab w:val="right" w:leader="dot" w:pos="8306"/>
+        </w:tabs>
+        <w:ind w:left="0" w:leftChars="0" w:firstLine="140" w:firstLineChars="50"/>
+        <w:rPr>
+          <w:rFonts w:hint="default"/>
+          <w:sz w:val="28"/>
+          <w:szCs w:val="28"/>
+          <w:lang w:val="en-US"/>
+        </w:rPr>
+      </w:pPr>
+      <w:r>
+        <w:rPr>
+          <w:rFonts w:hint="default"/>
+          <w:sz w:val="28"/>
+          <w:szCs w:val="28"/>
+          <w:lang w:val="en-US"/>
+        </w:rPr>
+        <w:fldChar w:fldCharType="begin"/>
+      </w:r>
+      <w:r>
+        <w:rPr>
+          <w:rFonts w:hint="default"/>
+          <w:sz w:val="28"/>
+          <w:szCs w:val="28"/>
+          <w:lang w:val="en-US"/>
+        </w:rPr>
+        <w:instrText xml:space="preserve"> HYPERLINK \l _Toc18227 </w:instrText>
+      </w:r>
+      <w:r>
+        <w:rPr>
+          <w:rFonts w:hint="default"/>
+          <w:sz w:val="28"/>
+          <w:szCs w:val="28"/>
+          <w:lang w:val="en-US"/>
+        </w:rPr>
+        <w:fldChar w:fldCharType="separate"/>
+      </w:r>
+      <w:r>
+        <w:rPr>
+          <w:rFonts w:hint="default"/>
+          <w:sz w:val="28"/>
+          <w:szCs w:val="28"/>
+          <w:lang w:val="en-US"/>
+        </w:rPr>
+        <w:t>5</w:t>
+      </w:r>
+      <w:r>
+        <w:rPr>
+          <w:rFonts w:hint="default" w:ascii="Times New Roman" w:hAnsi="Times New Roman" w:cs="Times New Roman"/>
+          <w:sz w:val="28"/>
+          <w:szCs w:val="28"/>
+          <w:lang w:val="en-US"/>
+        </w:rPr>
+        <w:t>.</w:t>
+      </w:r>
+      <w:r>
+        <w:rPr>
+          <w:rFonts w:hint="default" w:cs="Times New Roman"/>
+          <w:sz w:val="28"/>
+          <w:szCs w:val="28"/>
+          <w:lang w:val="en-US"/>
+        </w:rPr>
+        <w:t>3</w:t>
+      </w:r>
+      <w:r>
+        <w:rPr>
+          <w:rFonts w:hint="default" w:ascii="Times New Roman" w:hAnsi="Times New Roman" w:cs="Times New Roman"/>
+          <w:sz w:val="28"/>
+          <w:szCs w:val="28"/>
+          <w:lang w:val="en-US"/>
+        </w:rPr>
+        <w:t xml:space="preserve"> </w:t>
+      </w:r>
+      <w:r>
+        <w:rPr>
+          <w:rFonts w:hint="default" w:cs="Times New Roman"/>
+          <w:sz w:val="28"/>
+          <w:szCs w:val="28"/>
+          <w:lang w:val="en-US"/>
+        </w:rPr>
+        <w:t>Fleet Asset Management</w:t>
+      </w:r>
+      <w:r>
+        <w:rPr>
+          <w:sz w:val="28"/>
+          <w:szCs w:val="28"/>
+        </w:rPr>
+        <w:tab/>
+      </w:r>
+      <w:r>
+        <w:rPr>
+          <w:rFonts w:hint="default"/>
+          <w:sz w:val="28"/>
+          <w:szCs w:val="28"/>
+          <w:lang w:val="en-US"/>
+        </w:rPr>
+        <w:t>x</w:t>
+      </w:r>
+      <w:r>
+        <w:rPr>
+          <w:rFonts w:hint="default"/>
+          <w:sz w:val="28"/>
+          <w:szCs w:val="28"/>
+          <w:lang w:val="en-US"/>
+        </w:rPr>
+        <w:fldChar w:fldCharType="end"/>
+      </w:r>
+      <w:r>
+        <w:rPr>
+          <w:rFonts w:hint="default"/>
+          <w:sz w:val="28"/>
+          <w:szCs w:val="28"/>
+          <w:lang w:val="en-US"/>
+        </w:rPr>
+        <w:t>x</w:t>
+      </w:r>
+      <w:bookmarkStart w:id="24" w:name="_GoBack"/>
+      <w:bookmarkEnd w:id="24"/>
+    </w:p>
+    <w:p>
+      <w:pPr>
+        <w:pStyle w:val="13"/>
+        <w:tabs>
+          <w:tab w:val="right" w:leader="dot" w:pos="8306"/>
+        </w:tabs>
+        <w:ind w:left="0" w:leftChars="0" w:firstLine="140" w:firstLineChars="50"/>
+        <w:rPr>
+          <w:rFonts w:hint="default"/>
+          <w:sz w:val="28"/>
+          <w:szCs w:val="28"/>
+          <w:lang w:val="en-US"/>
+        </w:rPr>
+      </w:pPr>
+      <w:r>
+        <w:rPr>
+          <w:rFonts w:hint="default"/>
+          <w:sz w:val="28"/>
+          <w:szCs w:val="28"/>
+          <w:lang w:val="en-US"/>
+        </w:rPr>
+        <w:fldChar w:fldCharType="begin"/>
+      </w:r>
+      <w:r>
+        <w:rPr>
+          <w:rFonts w:hint="default"/>
+          <w:sz w:val="28"/>
+          <w:szCs w:val="28"/>
+          <w:lang w:val="en-US"/>
+        </w:rPr>
+        <w:instrText xml:space="preserve"> HYPERLINK \l _Toc6259 </w:instrText>
+      </w:r>
+      <w:r>
+        <w:rPr>
+          <w:rFonts w:hint="default"/>
+          <w:sz w:val="28"/>
+          <w:szCs w:val="28"/>
+          <w:lang w:val="en-US"/>
+        </w:rPr>
+        <w:fldChar w:fldCharType="separate"/>
+      </w:r>
+      <w:r>
+        <w:rPr>
+          <w:rFonts w:hint="default"/>
+          <w:sz w:val="28"/>
+          <w:szCs w:val="28"/>
+          <w:lang w:val="en-US"/>
+        </w:rPr>
+        <w:t>5</w:t>
+      </w:r>
+      <w:r>
+        <w:rPr>
+          <w:rFonts w:hint="default" w:ascii="Times New Roman" w:hAnsi="Times New Roman" w:cs="Times New Roman"/>
+          <w:sz w:val="28"/>
+          <w:szCs w:val="28"/>
+          <w:lang w:val="en-US"/>
+        </w:rPr>
+        <w:t>.</w:t>
+      </w:r>
+      <w:r>
+        <w:rPr>
+          <w:rFonts w:hint="default" w:cs="Times New Roman"/>
+          <w:sz w:val="28"/>
+          <w:szCs w:val="28"/>
+          <w:lang w:val="en-US"/>
+        </w:rPr>
+        <w:t>4</w:t>
+      </w:r>
+      <w:r>
+        <w:rPr>
+          <w:rFonts w:hint="default" w:ascii="Times New Roman" w:hAnsi="Times New Roman" w:cs="Times New Roman"/>
+          <w:sz w:val="28"/>
+          <w:szCs w:val="28"/>
+          <w:lang w:val="en-US"/>
+        </w:rPr>
+        <w:t xml:space="preserve"> </w:t>
+      </w:r>
+      <w:r>
+        <w:rPr>
+          <w:rFonts w:hint="default" w:cs="Times New Roman"/>
+          <w:sz w:val="28"/>
+          <w:szCs w:val="28"/>
+          <w:lang w:val="en-US"/>
+        </w:rPr>
+        <w:t>Order Management</w:t>
+      </w:r>
+      <w:r>
+        <w:rPr>
+          <w:sz w:val="28"/>
+          <w:szCs w:val="28"/>
+        </w:rPr>
+        <w:tab/>
+      </w:r>
+      <w:r>
+        <w:rPr>
+          <w:rFonts w:hint="default"/>
+          <w:sz w:val="28"/>
+          <w:szCs w:val="28"/>
+          <w:lang w:val="en-US"/>
+        </w:rPr>
+        <w:t>x</w:t>
+      </w:r>
+      <w:r>
+        <w:rPr>
+          <w:rFonts w:hint="default"/>
+          <w:sz w:val="28"/>
+          <w:szCs w:val="28"/>
+          <w:lang w:val="en-US"/>
+        </w:rPr>
+        <w:fldChar w:fldCharType="end"/>
+      </w:r>
+      <w:r>
+        <w:rPr>
+          <w:rFonts w:hint="default"/>
+          <w:sz w:val="28"/>
+          <w:szCs w:val="28"/>
+          <w:lang w:val="en-US"/>
+        </w:rPr>
+        <w:t>x</w:t>
+      </w:r>
+    </w:p>
+    <w:p>
+      <w:pPr>
+        <w:pStyle w:val="13"/>
+        <w:tabs>
+          <w:tab w:val="right" w:leader="dot" w:pos="8306"/>
+        </w:tabs>
+        <w:ind w:left="0" w:leftChars="0" w:firstLine="140" w:firstLineChars="50"/>
+        <w:rPr>
+          <w:rFonts w:hint="default"/>
+          <w:sz w:val="28"/>
+          <w:szCs w:val="28"/>
+          <w:lang w:val="en-US"/>
+        </w:rPr>
+      </w:pPr>
+      <w:r>
+        <w:rPr>
+          <w:rFonts w:hint="default"/>
+          <w:sz w:val="28"/>
+          <w:szCs w:val="28"/>
+          <w:lang w:val="en-US"/>
+        </w:rPr>
+        <w:fldChar w:fldCharType="begin"/>
+      </w:r>
+      <w:r>
+        <w:rPr>
+          <w:rFonts w:hint="default"/>
+          <w:sz w:val="28"/>
+          <w:szCs w:val="28"/>
+          <w:lang w:val="en-US"/>
+        </w:rPr>
+        <w:instrText xml:space="preserve"> HYPERLINK \l _Toc24520 </w:instrText>
+      </w:r>
+      <w:r>
+        <w:rPr>
+          <w:rFonts w:hint="default"/>
+          <w:sz w:val="28"/>
+          <w:szCs w:val="28"/>
+          <w:lang w:val="en-US"/>
+        </w:rPr>
+        <w:fldChar w:fldCharType="separate"/>
+      </w:r>
+      <w:r>
+        <w:rPr>
+          <w:rFonts w:hint="default"/>
+          <w:sz w:val="28"/>
+          <w:szCs w:val="28"/>
+          <w:lang w:val="en-US"/>
+        </w:rPr>
+        <w:t>5</w:t>
+      </w:r>
+      <w:r>
+        <w:rPr>
+          <w:rFonts w:hint="default" w:ascii="Times New Roman" w:hAnsi="Times New Roman" w:cs="Times New Roman"/>
+          <w:sz w:val="28"/>
+          <w:szCs w:val="28"/>
+          <w:lang w:val="en-US"/>
+        </w:rPr>
+        <w:t>.</w:t>
+      </w:r>
+      <w:r>
+        <w:rPr>
+          <w:rFonts w:hint="default" w:cs="Times New Roman"/>
+          <w:sz w:val="28"/>
+          <w:szCs w:val="28"/>
+          <w:lang w:val="en-US"/>
+        </w:rPr>
+        <w:t>5</w:t>
+      </w:r>
+      <w:r>
+        <w:rPr>
+          <w:rFonts w:hint="default" w:ascii="Times New Roman" w:hAnsi="Times New Roman" w:cs="Times New Roman"/>
+          <w:sz w:val="28"/>
+          <w:szCs w:val="28"/>
+          <w:lang w:val="en-US"/>
+        </w:rPr>
+        <w:t xml:space="preserve"> </w:t>
+      </w:r>
+      <w:r>
+        <w:rPr>
+          <w:rFonts w:hint="default" w:cs="Times New Roman"/>
+          <w:bCs/>
+          <w:sz w:val="28"/>
+          <w:szCs w:val="28"/>
+          <w:lang w:val="en-US"/>
+        </w:rPr>
+        <w:t>Shipment Scheduling and Dispatch</w:t>
+      </w:r>
+      <w:r>
+        <w:rPr>
+          <w:sz w:val="28"/>
+          <w:szCs w:val="28"/>
+        </w:rPr>
+        <w:tab/>
+      </w:r>
+      <w:r>
+        <w:rPr>
+          <w:rFonts w:hint="default"/>
+          <w:sz w:val="28"/>
+          <w:szCs w:val="28"/>
+          <w:lang w:val="en-US"/>
+        </w:rPr>
+        <w:t>x</w:t>
+      </w:r>
+      <w:r>
+        <w:rPr>
+          <w:rFonts w:hint="default"/>
+          <w:sz w:val="28"/>
+          <w:szCs w:val="28"/>
+          <w:lang w:val="en-US"/>
+        </w:rPr>
+        <w:fldChar w:fldCharType="end"/>
+      </w:r>
+      <w:r>
+        <w:rPr>
+          <w:rFonts w:hint="default"/>
+          <w:sz w:val="28"/>
+          <w:szCs w:val="28"/>
+          <w:lang w:val="en-US"/>
+        </w:rPr>
+        <w:t>x</w:t>
+      </w:r>
+    </w:p>
+    <w:p>
+      <w:pPr>
+        <w:pStyle w:val="13"/>
+        <w:tabs>
+          <w:tab w:val="right" w:leader="dot" w:pos="8306"/>
+        </w:tabs>
+        <w:ind w:left="0" w:leftChars="0" w:firstLine="140" w:firstLineChars="50"/>
+        <w:rPr>
+          <w:rFonts w:hint="default"/>
+          <w:sz w:val="28"/>
+          <w:szCs w:val="28"/>
+          <w:lang w:val="en-US"/>
+        </w:rPr>
+      </w:pPr>
+      <w:r>
+        <w:rPr>
+          <w:rFonts w:hint="default"/>
+          <w:sz w:val="28"/>
+          <w:szCs w:val="28"/>
+          <w:lang w:val="en-US"/>
+        </w:rPr>
+        <w:fldChar w:fldCharType="begin"/>
+      </w:r>
+      <w:r>
+        <w:rPr>
+          <w:rFonts w:hint="default"/>
+          <w:sz w:val="28"/>
+          <w:szCs w:val="28"/>
+          <w:lang w:val="en-US"/>
+        </w:rPr>
+        <w:instrText xml:space="preserve"> HYPERLINK \l _Toc29115 </w:instrText>
+      </w:r>
+      <w:r>
+        <w:rPr>
+          <w:rFonts w:hint="default"/>
+          <w:sz w:val="28"/>
+          <w:szCs w:val="28"/>
+          <w:lang w:val="en-US"/>
+        </w:rPr>
+        <w:fldChar w:fldCharType="separate"/>
+      </w:r>
+      <w:r>
+        <w:rPr>
+          <w:rFonts w:hint="default"/>
+          <w:sz w:val="28"/>
+          <w:szCs w:val="28"/>
+          <w:lang w:val="en-US"/>
+        </w:rPr>
+        <w:t>5</w:t>
+      </w:r>
+      <w:r>
+        <w:rPr>
+          <w:rFonts w:hint="default" w:ascii="Times New Roman" w:hAnsi="Times New Roman" w:cs="Times New Roman"/>
+          <w:sz w:val="28"/>
+          <w:szCs w:val="28"/>
+          <w:lang w:val="en-US"/>
+        </w:rPr>
+        <w:t>.</w:t>
+      </w:r>
+      <w:r>
+        <w:rPr>
+          <w:rFonts w:hint="default" w:cs="Times New Roman"/>
+          <w:sz w:val="28"/>
+          <w:szCs w:val="28"/>
+          <w:lang w:val="en-US"/>
+        </w:rPr>
+        <w:t>6</w:t>
+      </w:r>
+      <w:r>
+        <w:rPr>
+          <w:rFonts w:hint="default" w:ascii="Times New Roman" w:hAnsi="Times New Roman" w:cs="Times New Roman"/>
+          <w:sz w:val="28"/>
+          <w:szCs w:val="28"/>
+          <w:lang w:val="en-US"/>
+        </w:rPr>
+        <w:t xml:space="preserve"> </w:t>
+      </w:r>
+      <w:r>
+        <w:rPr>
+          <w:rFonts w:hint="default" w:cs="Times New Roman"/>
+          <w:bCs/>
+          <w:sz w:val="28"/>
+          <w:szCs w:val="28"/>
+          <w:lang w:val="en-US"/>
+        </w:rPr>
+        <w:t>Real-Time Transit Tracking</w:t>
+      </w:r>
+      <w:r>
+        <w:rPr>
+          <w:sz w:val="28"/>
+          <w:szCs w:val="28"/>
+        </w:rPr>
+        <w:tab/>
+      </w:r>
+      <w:r>
+        <w:rPr>
+          <w:rFonts w:hint="default"/>
+          <w:sz w:val="28"/>
+          <w:szCs w:val="28"/>
+          <w:lang w:val="en-US"/>
+        </w:rPr>
+        <w:t>x</w:t>
+      </w:r>
+      <w:r>
+        <w:rPr>
+          <w:rFonts w:hint="default"/>
+          <w:sz w:val="28"/>
+          <w:szCs w:val="28"/>
+          <w:lang w:val="en-US"/>
+        </w:rPr>
+        <w:fldChar w:fldCharType="end"/>
+      </w:r>
+      <w:r>
+        <w:rPr>
+          <w:rFonts w:hint="default"/>
+          <w:sz w:val="28"/>
+          <w:szCs w:val="28"/>
+          <w:lang w:val="en-US"/>
+        </w:rPr>
+        <w:t>x</w:t>
+      </w:r>
+    </w:p>
+    <w:p>
+      <w:pPr>
+        <w:pStyle w:val="13"/>
+        <w:tabs>
+          <w:tab w:val="right" w:leader="dot" w:pos="8306"/>
+        </w:tabs>
+        <w:ind w:left="0" w:leftChars="0" w:firstLine="140" w:firstLineChars="50"/>
+        <w:rPr>
+          <w:rFonts w:hint="default"/>
+          <w:sz w:val="28"/>
+          <w:szCs w:val="28"/>
+          <w:lang w:val="en-US"/>
+        </w:rPr>
+      </w:pPr>
+      <w:r>
+        <w:rPr>
+          <w:rFonts w:hint="default"/>
+          <w:sz w:val="28"/>
+          <w:szCs w:val="28"/>
+          <w:lang w:val="en-US"/>
+        </w:rPr>
+        <w:fldChar w:fldCharType="begin"/>
+      </w:r>
+      <w:r>
+        <w:rPr>
+          <w:rFonts w:hint="default"/>
+          <w:sz w:val="28"/>
+          <w:szCs w:val="28"/>
+          <w:lang w:val="en-US"/>
+        </w:rPr>
+        <w:instrText xml:space="preserve"> HYPERLINK \l _Toc30844 </w:instrText>
+      </w:r>
+      <w:r>
+        <w:rPr>
+          <w:rFonts w:hint="default"/>
+          <w:sz w:val="28"/>
+          <w:szCs w:val="28"/>
+          <w:lang w:val="en-US"/>
+        </w:rPr>
+        <w:fldChar w:fldCharType="separate"/>
+      </w:r>
+      <w:r>
+        <w:rPr>
+          <w:rFonts w:hint="default"/>
+          <w:sz w:val="28"/>
+          <w:szCs w:val="28"/>
+          <w:lang w:val="en-US"/>
+        </w:rPr>
+        <w:t>5</w:t>
+      </w:r>
+      <w:r>
+        <w:rPr>
+          <w:rFonts w:hint="default" w:ascii="Times New Roman" w:hAnsi="Times New Roman" w:cs="Times New Roman"/>
+          <w:sz w:val="28"/>
+          <w:szCs w:val="28"/>
+          <w:lang w:val="en-US"/>
+        </w:rPr>
+        <w:t>.</w:t>
+      </w:r>
+      <w:r>
+        <w:rPr>
+          <w:rFonts w:hint="default" w:cs="Times New Roman"/>
+          <w:sz w:val="28"/>
+          <w:szCs w:val="28"/>
+          <w:lang w:val="en-US"/>
+        </w:rPr>
+        <w:t>7</w:t>
+      </w:r>
+      <w:r>
+        <w:rPr>
+          <w:rFonts w:hint="default" w:ascii="Times New Roman" w:hAnsi="Times New Roman" w:cs="Times New Roman"/>
+          <w:sz w:val="28"/>
+          <w:szCs w:val="28"/>
+          <w:lang w:val="en-US"/>
+        </w:rPr>
+        <w:t xml:space="preserve"> </w:t>
+      </w:r>
+      <w:r>
+        <w:rPr>
+          <w:rFonts w:hint="default" w:cs="Times New Roman"/>
+          <w:bCs/>
+          <w:sz w:val="28"/>
+          <w:szCs w:val="28"/>
+          <w:lang w:val="en-US"/>
+        </w:rPr>
+        <w:t>Handle Delivery Exceptions</w:t>
+      </w:r>
+      <w:r>
+        <w:rPr>
+          <w:sz w:val="28"/>
+          <w:szCs w:val="28"/>
+        </w:rPr>
+        <w:tab/>
+      </w:r>
+      <w:r>
+        <w:rPr>
+          <w:rFonts w:hint="default"/>
+          <w:sz w:val="28"/>
+          <w:szCs w:val="28"/>
+          <w:lang w:val="en-US"/>
+        </w:rPr>
+        <w:t>x</w:t>
+      </w:r>
+      <w:r>
+        <w:rPr>
+          <w:rFonts w:hint="default"/>
+          <w:sz w:val="28"/>
+          <w:szCs w:val="28"/>
+          <w:lang w:val="en-US"/>
+        </w:rPr>
+        <w:fldChar w:fldCharType="end"/>
+      </w:r>
+      <w:r>
+        <w:rPr>
+          <w:rFonts w:hint="default"/>
+          <w:sz w:val="28"/>
+          <w:szCs w:val="28"/>
+          <w:lang w:val="en-US"/>
+        </w:rPr>
+        <w:t>x</w:t>
+      </w:r>
+    </w:p>
+    <w:p>
+      <w:pPr>
+        <w:pStyle w:val="13"/>
+        <w:tabs>
+          <w:tab w:val="right" w:leader="dot" w:pos="8306"/>
+        </w:tabs>
+        <w:ind w:left="0" w:leftChars="0" w:firstLine="140" w:firstLineChars="50"/>
+        <w:rPr>
+          <w:rFonts w:hint="default"/>
+          <w:sz w:val="28"/>
+          <w:szCs w:val="28"/>
+          <w:lang w:val="en-US"/>
+        </w:rPr>
+      </w:pPr>
+      <w:r>
+        <w:rPr>
+          <w:rFonts w:hint="default"/>
+          <w:sz w:val="28"/>
+          <w:szCs w:val="28"/>
+          <w:lang w:val="en-US"/>
+        </w:rPr>
+        <w:fldChar w:fldCharType="begin"/>
+      </w:r>
+      <w:r>
+        <w:rPr>
+          <w:rFonts w:hint="default"/>
+          <w:sz w:val="28"/>
+          <w:szCs w:val="28"/>
+          <w:lang w:val="en-US"/>
+        </w:rPr>
+        <w:instrText xml:space="preserve"> HYPERLINK \l _Toc4382 </w:instrText>
+      </w:r>
+      <w:r>
+        <w:rPr>
+          <w:rFonts w:hint="default"/>
+          <w:sz w:val="28"/>
+          <w:szCs w:val="28"/>
+          <w:lang w:val="en-US"/>
+        </w:rPr>
+        <w:fldChar w:fldCharType="separate"/>
+      </w:r>
+      <w:r>
+        <w:rPr>
+          <w:rFonts w:hint="default"/>
+          <w:sz w:val="28"/>
+          <w:szCs w:val="28"/>
+          <w:lang w:val="en-US"/>
+        </w:rPr>
+        <w:t>5</w:t>
+      </w:r>
+      <w:r>
+        <w:rPr>
+          <w:rFonts w:hint="default" w:ascii="Times New Roman" w:hAnsi="Times New Roman" w:cs="Times New Roman"/>
+          <w:sz w:val="28"/>
+          <w:szCs w:val="28"/>
+          <w:lang w:val="en-US"/>
+        </w:rPr>
+        <w:t>.</w:t>
+      </w:r>
+      <w:r>
+        <w:rPr>
+          <w:rFonts w:hint="default" w:cs="Times New Roman"/>
+          <w:sz w:val="28"/>
+          <w:szCs w:val="28"/>
+          <w:lang w:val="en-US"/>
+        </w:rPr>
+        <w:t>8</w:t>
+      </w:r>
+      <w:r>
+        <w:rPr>
+          <w:rFonts w:hint="default" w:ascii="Times New Roman" w:hAnsi="Times New Roman" w:cs="Times New Roman"/>
+          <w:sz w:val="28"/>
+          <w:szCs w:val="28"/>
+          <w:lang w:val="en-US"/>
+        </w:rPr>
+        <w:t xml:space="preserve"> </w:t>
+      </w:r>
+      <w:r>
+        <w:rPr>
+          <w:rFonts w:hint="default" w:cs="Times New Roman"/>
+          <w:bCs/>
+          <w:sz w:val="28"/>
+          <w:szCs w:val="28"/>
+          <w:lang w:val="en-US"/>
+        </w:rPr>
+        <w:t>Process Order Modifications</w:t>
+      </w:r>
+      <w:r>
+        <w:rPr>
+          <w:sz w:val="28"/>
+          <w:szCs w:val="28"/>
+        </w:rPr>
+        <w:tab/>
+      </w:r>
+      <w:r>
+        <w:rPr>
+          <w:rFonts w:hint="default"/>
+          <w:sz w:val="28"/>
+          <w:szCs w:val="28"/>
+          <w:lang w:val="en-US"/>
+        </w:rPr>
+        <w:t>x</w:t>
+      </w:r>
+      <w:r>
+        <w:rPr>
+          <w:rFonts w:hint="default"/>
+          <w:sz w:val="28"/>
+          <w:szCs w:val="28"/>
+          <w:lang w:val="en-US"/>
+        </w:rPr>
+        <w:fldChar w:fldCharType="end"/>
+      </w:r>
+      <w:r>
+        <w:rPr>
+          <w:rFonts w:hint="default"/>
+          <w:sz w:val="28"/>
+          <w:szCs w:val="28"/>
+          <w:lang w:val="en-US"/>
+        </w:rPr>
+        <w:t>x</w:t>
+      </w:r>
+    </w:p>
+    <w:p>
+      <w:pPr>
+        <w:pStyle w:val="13"/>
+        <w:tabs>
+          <w:tab w:val="right" w:leader="dot" w:pos="8306"/>
+        </w:tabs>
+        <w:ind w:left="0" w:leftChars="0" w:firstLine="140" w:firstLineChars="50"/>
+        <w:rPr>
+          <w:rFonts w:hint="default"/>
+          <w:sz w:val="28"/>
+          <w:szCs w:val="28"/>
+          <w:lang w:val="en-US"/>
+        </w:rPr>
+      </w:pPr>
+      <w:r>
+        <w:rPr>
+          <w:rFonts w:hint="default"/>
+          <w:sz w:val="28"/>
+          <w:szCs w:val="28"/>
+          <w:lang w:val="en-US"/>
+        </w:rPr>
+        <w:fldChar w:fldCharType="begin"/>
+      </w:r>
+      <w:r>
+        <w:rPr>
+          <w:rFonts w:hint="default"/>
+          <w:sz w:val="28"/>
+          <w:szCs w:val="28"/>
+          <w:lang w:val="en-US"/>
+        </w:rPr>
+        <w:instrText xml:space="preserve"> HYPERLINK \l _Toc22649 </w:instrText>
+      </w:r>
+      <w:r>
+        <w:rPr>
+          <w:rFonts w:hint="default"/>
+          <w:sz w:val="28"/>
+          <w:szCs w:val="28"/>
+          <w:lang w:val="en-US"/>
+        </w:rPr>
+        <w:fldChar w:fldCharType="separate"/>
+      </w:r>
+      <w:r>
+        <w:rPr>
+          <w:rFonts w:hint="default"/>
+          <w:sz w:val="28"/>
+          <w:szCs w:val="28"/>
+          <w:lang w:val="en-US"/>
+        </w:rPr>
+        <w:t>5</w:t>
+      </w:r>
+      <w:r>
+        <w:rPr>
+          <w:rFonts w:hint="default" w:ascii="Times New Roman" w:hAnsi="Times New Roman" w:cs="Times New Roman"/>
+          <w:sz w:val="28"/>
+          <w:szCs w:val="28"/>
+          <w:lang w:val="en-US"/>
+        </w:rPr>
+        <w:t>.</w:t>
+      </w:r>
+      <w:r>
+        <w:rPr>
+          <w:rFonts w:hint="default" w:cs="Times New Roman"/>
+          <w:sz w:val="28"/>
+          <w:szCs w:val="28"/>
+          <w:lang w:val="en-US"/>
+        </w:rPr>
+        <w:t>9</w:t>
+      </w:r>
+      <w:r>
+        <w:rPr>
+          <w:rFonts w:hint="default" w:ascii="Times New Roman" w:hAnsi="Times New Roman" w:cs="Times New Roman"/>
+          <w:sz w:val="28"/>
+          <w:szCs w:val="28"/>
+          <w:lang w:val="en-US"/>
+        </w:rPr>
+        <w:t xml:space="preserve"> </w:t>
+      </w:r>
+      <w:r>
+        <w:rPr>
+          <w:rFonts w:hint="default" w:cs="Times New Roman"/>
+          <w:bCs/>
+          <w:sz w:val="28"/>
+          <w:szCs w:val="28"/>
+          <w:lang w:val="en-US"/>
+        </w:rPr>
+        <w:t>Automated Invoice Generation</w:t>
+      </w:r>
+      <w:r>
+        <w:rPr>
+          <w:sz w:val="28"/>
+          <w:szCs w:val="28"/>
+        </w:rPr>
+        <w:tab/>
+      </w:r>
+      <w:r>
+        <w:rPr>
+          <w:rFonts w:hint="default"/>
+          <w:sz w:val="28"/>
+          <w:szCs w:val="28"/>
+          <w:lang w:val="en-US"/>
+        </w:rPr>
+        <w:t>x</w:t>
+      </w:r>
+      <w:r>
+        <w:rPr>
+          <w:rFonts w:hint="default"/>
+          <w:sz w:val="28"/>
+          <w:szCs w:val="28"/>
+          <w:lang w:val="en-US"/>
+        </w:rPr>
+        <w:fldChar w:fldCharType="end"/>
+      </w:r>
+      <w:r>
+        <w:rPr>
+          <w:rFonts w:hint="default"/>
+          <w:sz w:val="28"/>
+          <w:szCs w:val="28"/>
+          <w:lang w:val="en-US"/>
+        </w:rPr>
+        <w:t>x</w:t>
+      </w:r>
+    </w:p>
+    <w:p>
+      <w:pPr>
+        <w:pStyle w:val="13"/>
+        <w:tabs>
+          <w:tab w:val="right" w:leader="dot" w:pos="8306"/>
+        </w:tabs>
+        <w:ind w:left="0" w:leftChars="0" w:firstLine="140" w:firstLineChars="50"/>
+        <w:rPr>
+          <w:rFonts w:hint="default"/>
+          <w:lang w:val="en-US"/>
+        </w:rPr>
+      </w:pPr>
+      <w:r>
+        <w:rPr>
+          <w:rFonts w:hint="default"/>
+          <w:sz w:val="28"/>
+          <w:szCs w:val="28"/>
+          <w:lang w:val="en-US"/>
+        </w:rPr>
+        <w:fldChar w:fldCharType="begin"/>
+      </w:r>
+      <w:r>
+        <w:rPr>
+          <w:rFonts w:hint="default"/>
+          <w:sz w:val="28"/>
+          <w:szCs w:val="28"/>
+          <w:lang w:val="en-US"/>
+        </w:rPr>
+        <w:instrText xml:space="preserve"> HYPERLINK \l _Toc18135 </w:instrText>
+      </w:r>
+      <w:r>
+        <w:rPr>
+          <w:rFonts w:hint="default"/>
+          <w:sz w:val="28"/>
+          <w:szCs w:val="28"/>
+          <w:lang w:val="en-US"/>
+        </w:rPr>
+        <w:fldChar w:fldCharType="separate"/>
+      </w:r>
+      <w:r>
+        <w:rPr>
+          <w:rFonts w:hint="default"/>
+          <w:sz w:val="28"/>
+          <w:szCs w:val="28"/>
+          <w:lang w:val="en-US"/>
+        </w:rPr>
+        <w:t>5</w:t>
+      </w:r>
+      <w:r>
+        <w:rPr>
+          <w:rFonts w:hint="default" w:ascii="Times New Roman" w:hAnsi="Times New Roman" w:cs="Times New Roman"/>
+          <w:sz w:val="28"/>
+          <w:szCs w:val="28"/>
+          <w:lang w:val="en-US"/>
+        </w:rPr>
+        <w:t>.</w:t>
+      </w:r>
+      <w:r>
+        <w:rPr>
+          <w:rFonts w:hint="default" w:cs="Times New Roman"/>
+          <w:sz w:val="28"/>
+          <w:szCs w:val="28"/>
+          <w:lang w:val="en-US"/>
+        </w:rPr>
+        <w:t>10</w:t>
+      </w:r>
+      <w:r>
+        <w:rPr>
+          <w:rFonts w:hint="default" w:ascii="Times New Roman" w:hAnsi="Times New Roman" w:cs="Times New Roman"/>
+          <w:sz w:val="28"/>
+          <w:szCs w:val="28"/>
+          <w:lang w:val="en-US"/>
+        </w:rPr>
+        <w:t xml:space="preserve"> </w:t>
+      </w:r>
+      <w:r>
+        <w:rPr>
+          <w:rFonts w:hint="default" w:cs="Times New Roman"/>
+          <w:bCs/>
+          <w:sz w:val="28"/>
+          <w:szCs w:val="28"/>
+          <w:lang w:val="en-US"/>
+        </w:rPr>
+        <w:t>Payment Reconciliation</w:t>
+      </w:r>
+      <w:r>
+        <w:rPr>
+          <w:sz w:val="28"/>
+          <w:szCs w:val="28"/>
+        </w:rPr>
+        <w:tab/>
+      </w:r>
+      <w:r>
+        <w:rPr>
+          <w:rFonts w:hint="default"/>
+          <w:sz w:val="28"/>
+          <w:szCs w:val="28"/>
+          <w:lang w:val="en-US"/>
+        </w:rPr>
+        <w:t>x</w:t>
+      </w:r>
+      <w:r>
+        <w:rPr>
+          <w:rFonts w:hint="default"/>
+          <w:sz w:val="28"/>
+          <w:szCs w:val="28"/>
+          <w:lang w:val="en-US"/>
+        </w:rPr>
+        <w:fldChar w:fldCharType="end"/>
+      </w:r>
+      <w:r>
+        <w:rPr>
+          <w:rFonts w:hint="default"/>
+          <w:sz w:val="28"/>
+          <w:szCs w:val="28"/>
+          <w:lang w:val="en-US"/>
+        </w:rPr>
+        <w:t>x</w:t>
+      </w:r>
+    </w:p>
+    <w:p>
+      <w:pPr>
+        <w:pStyle w:val="13"/>
+        <w:tabs>
+          <w:tab w:val="right" w:leader="dot" w:pos="8306"/>
+        </w:tabs>
+        <w:ind w:left="0" w:leftChars="0" w:firstLine="140" w:firstLineChars="50"/>
+        <w:rPr>
+          <w:rFonts w:hint="default"/>
+          <w:sz w:val="28"/>
+          <w:szCs w:val="28"/>
+          <w:lang w:val="en-US"/>
+        </w:rPr>
+      </w:pPr>
     </w:p>
     <w:p>
       <w:pPr>
@@ -20333,12 +21176,6 @@
             <w:insideH w:val="single" w:color="auto" w:sz="4" w:space="0"/>
             <w:insideV w:val="single" w:color="auto" w:sz="4" w:space="0"/>
           </w:tblBorders>
-          <w:tblCellMar>
-            <w:top w:w="0" w:type="dxa"/>
-            <w:left w:w="108" w:type="dxa"/>
-            <w:bottom w:w="0" w:type="dxa"/>
-            <w:right w:w="108" w:type="dxa"/>
-          </w:tblCellMar>
         </w:tblPrEx>
         <w:trPr>
           <w:trHeight w:val="585" w:hRule="atLeast"/>
@@ -23225,6 +24062,605 @@
       <w:pPr>
         <w:rPr>
           <w:rFonts w:hint="default" w:ascii="Times New Roman" w:hAnsi="Times New Roman" w:cs="Times New Roman"/>
+          <w:lang w:val="en-US"/>
+        </w:rPr>
+      </w:pPr>
+    </w:p>
+    <w:p>
+      <w:pPr>
+        <w:pStyle w:val="2"/>
+        <w:bidi w:val="0"/>
+        <w:rPr>
+          <w:rFonts w:hint="default" w:cs="Times New Roman"/>
+          <w:lang w:val="en-US"/>
+        </w:rPr>
+      </w:pPr>
+      <w:r>
+        <w:rPr>
+          <w:rFonts w:hint="default" w:ascii="Times New Roman" w:hAnsi="Times New Roman" w:cs="Times New Roman"/>
+          <w:lang w:val="en-US"/>
+        </w:rPr>
+        <w:br w:type="textWrapping"/>
+      </w:r>
+      <w:r>
+        <w:rPr>
+          <w:rFonts w:hint="default" w:ascii="Times New Roman" w:hAnsi="Times New Roman" w:cs="Times New Roman"/>
+          <w:lang w:val="en-US"/>
+        </w:rPr>
+        <w:br w:type="textWrapping"/>
+      </w:r>
+      <w:r>
+        <w:rPr>
+          <w:rFonts w:hint="default" w:ascii="Times New Roman" w:hAnsi="Times New Roman" w:cs="Times New Roman"/>
+          <w:lang w:val="en-US"/>
+        </w:rPr>
+        <w:br w:type="textWrapping"/>
+      </w:r>
+      <w:r>
+        <w:rPr>
+          <w:rFonts w:hint="default" w:ascii="Times New Roman" w:hAnsi="Times New Roman" w:cs="Times New Roman"/>
+          <w:lang w:val="en-US"/>
+        </w:rPr>
+        <w:br w:type="textWrapping"/>
+      </w:r>
+      <w:r>
+        <w:rPr>
+          <w:rFonts w:hint="default" w:ascii="Times New Roman" w:hAnsi="Times New Roman" w:cs="Times New Roman"/>
+          <w:lang w:val="en-US"/>
+        </w:rPr>
+        <w:br w:type="textWrapping"/>
+      </w:r>
+      <w:r>
+        <w:rPr>
+          <w:rFonts w:hint="default" w:ascii="Times New Roman" w:hAnsi="Times New Roman" w:cs="Times New Roman"/>
+          <w:lang w:val="en-US"/>
+        </w:rPr>
+        <w:br w:type="textWrapping"/>
+      </w:r>
+      <w:r>
+        <w:rPr>
+          <w:rFonts w:hint="default" w:ascii="Times New Roman" w:hAnsi="Times New Roman" w:cs="Times New Roman"/>
+          <w:lang w:val="en-US"/>
+        </w:rPr>
+        <w:br w:type="textWrapping"/>
+      </w:r>
+      <w:r>
+        <w:rPr>
+          <w:rFonts w:hint="default" w:ascii="Times New Roman" w:hAnsi="Times New Roman" w:cs="Times New Roman"/>
+          <w:lang w:val="en-US"/>
+        </w:rPr>
+        <w:br w:type="textWrapping"/>
+      </w:r>
+      <w:r>
+        <w:rPr>
+          <w:rFonts w:hint="default" w:ascii="Times New Roman" w:hAnsi="Times New Roman" w:cs="Times New Roman"/>
+          <w:lang w:val="en-US"/>
+        </w:rPr>
+        <w:br w:type="textWrapping"/>
+      </w:r>
+      <w:r>
+        <w:rPr>
+          <w:rFonts w:hint="default" w:ascii="Times New Roman" w:hAnsi="Times New Roman" w:cs="Times New Roman"/>
+          <w:lang w:val="en-US"/>
+        </w:rPr>
+        <w:br w:type="textWrapping"/>
+      </w:r>
+      <w:r>
+        <w:rPr>
+          <w:rFonts w:hint="default" w:ascii="Times New Roman" w:hAnsi="Times New Roman" w:cs="Times New Roman"/>
+          <w:lang w:val="en-US"/>
+        </w:rPr>
+        <w:br w:type="textWrapping"/>
+      </w:r>
+      <w:r>
+        <w:rPr>
+          <w:rFonts w:hint="default" w:ascii="Times New Roman" w:hAnsi="Times New Roman" w:cs="Times New Roman"/>
+          <w:lang w:val="en-US"/>
+        </w:rPr>
+        <w:br w:type="textWrapping"/>
+      </w:r>
+      <w:r>
+        <w:rPr>
+          <w:rFonts w:hint="default" w:ascii="Times New Roman" w:hAnsi="Times New Roman" w:cs="Times New Roman"/>
+          <w:lang w:val="en-US"/>
+        </w:rPr>
+        <w:br w:type="textWrapping"/>
+      </w:r>
+      <w:r>
+        <w:rPr>
+          <w:rFonts w:hint="default" w:ascii="Times New Roman" w:hAnsi="Times New Roman" w:cs="Times New Roman"/>
+          <w:lang w:val="en-US"/>
+        </w:rPr>
+        <w:br w:type="textWrapping"/>
+      </w:r>
+      <w:r>
+        <w:rPr>
+          <w:rFonts w:hint="default" w:ascii="Times New Roman" w:hAnsi="Times New Roman" w:cs="Times New Roman"/>
+          <w:lang w:val="en-US"/>
+        </w:rPr>
+        <w:br w:type="textWrapping"/>
+      </w:r>
+      <w:r>
+        <w:rPr>
+          <w:rFonts w:hint="default" w:ascii="Times New Roman" w:hAnsi="Times New Roman" w:cs="Times New Roman"/>
+          <w:lang w:val="en-US"/>
+        </w:rPr>
+        <w:br w:type="textWrapping"/>
+      </w:r>
+      <w:r>
+        <w:rPr>
+          <w:rFonts w:hint="default" w:ascii="Times New Roman" w:hAnsi="Times New Roman" w:cs="Times New Roman"/>
+          <w:lang w:val="en-US"/>
+        </w:rPr>
+        <w:br w:type="textWrapping"/>
+      </w:r>
+      <w:r>
+        <w:rPr>
+          <w:rFonts w:hint="default" w:ascii="Times New Roman" w:hAnsi="Times New Roman" w:cs="Times New Roman"/>
+          <w:lang w:val="en-US"/>
+        </w:rPr>
+        <w:br w:type="textWrapping"/>
+      </w:r>
+      <w:r>
+        <w:rPr>
+          <w:rFonts w:hint="default" w:ascii="Times New Roman" w:hAnsi="Times New Roman" w:cs="Times New Roman"/>
+          <w:lang w:val="en-US"/>
+        </w:rPr>
+        <w:br w:type="textWrapping"/>
+      </w:r>
+      <w:r>
+        <w:rPr>
+          <w:rFonts w:hint="default" w:ascii="Times New Roman" w:hAnsi="Times New Roman" w:cs="Times New Roman"/>
+          <w:lang w:val="en-US"/>
+        </w:rPr>
+        <w:br w:type="textWrapping"/>
+      </w:r>
+      <w:r>
+        <w:rPr>
+          <w:rFonts w:hint="default" w:ascii="Times New Roman" w:hAnsi="Times New Roman" w:cs="Times New Roman"/>
+          <w:lang w:val="en-US"/>
+        </w:rPr>
+        <w:br w:type="textWrapping"/>
+      </w:r>
+      <w:r>
+        <w:rPr>
+          <w:rFonts w:hint="default" w:ascii="Times New Roman" w:hAnsi="Times New Roman" w:cs="Times New Roman"/>
+          <w:lang w:val="en-US"/>
+        </w:rPr>
+        <w:t xml:space="preserve">Part </w:t>
+      </w:r>
+      <w:r>
+        <w:rPr>
+          <w:rFonts w:hint="default" w:cs="Times New Roman"/>
+          <w:lang w:val="en-US"/>
+        </w:rPr>
+        <w:t>E</w:t>
+      </w:r>
+      <w:r>
+        <w:rPr>
+          <w:rFonts w:hint="default" w:ascii="Times New Roman" w:hAnsi="Times New Roman" w:cs="Times New Roman"/>
+          <w:lang w:val="en-US"/>
+        </w:rPr>
+        <w:t xml:space="preserve">: </w:t>
+      </w:r>
+      <w:r>
+        <w:rPr>
+          <w:rFonts w:hint="default" w:cs="Times New Roman"/>
+          <w:lang w:val="en-US"/>
+        </w:rPr>
+        <w:t>Workflow</w:t>
+      </w:r>
+    </w:p>
+    <w:p>
+      <w:pPr>
+        <w:pStyle w:val="3"/>
+        <w:bidi w:val="0"/>
+        <w:spacing w:line="240" w:lineRule="auto"/>
+        <w:ind w:left="400" w:leftChars="100" w:firstLine="0" w:firstLineChars="0"/>
+        <w:rPr>
+          <w:rFonts w:hint="default" w:cs="Times New Roman"/>
+          <w:lang w:val="en-US"/>
+        </w:rPr>
+      </w:pPr>
+      <w:r>
+        <w:rPr>
+          <w:rFonts w:hint="default" w:cs="Times New Roman"/>
+          <w:lang w:val="en-US"/>
+        </w:rPr>
+        <w:t>5</w:t>
+      </w:r>
+      <w:r>
+        <w:rPr>
+          <w:rFonts w:hint="default" w:ascii="Times New Roman" w:hAnsi="Times New Roman" w:cs="Times New Roman"/>
+          <w:lang w:val="en-US"/>
+        </w:rPr>
+        <w:t>.</w:t>
+      </w:r>
+      <w:r>
+        <w:rPr>
+          <w:rFonts w:hint="default" w:cs="Times New Roman"/>
+          <w:lang w:val="en-US"/>
+        </w:rPr>
+        <w:t>1</w:t>
+      </w:r>
+      <w:r>
+        <w:rPr>
+          <w:rFonts w:hint="default" w:ascii="Times New Roman" w:hAnsi="Times New Roman" w:cs="Times New Roman"/>
+          <w:lang w:val="en-US"/>
+        </w:rPr>
+        <w:t xml:space="preserve"> </w:t>
+      </w:r>
+      <w:r>
+        <w:rPr>
+          <w:rFonts w:hint="default" w:cs="Times New Roman"/>
+          <w:lang w:val="en-US"/>
+        </w:rPr>
+        <w:t>User and Access Management</w:t>
+      </w:r>
+    </w:p>
+    <w:p>
+      <w:pPr>
+        <w:rPr>
+          <w:rFonts w:hint="default" w:cs="Times New Roman"/>
+          <w:lang w:val="en-US"/>
+        </w:rPr>
+      </w:pPr>
+      <w:r>
+        <w:drawing>
+          <wp:anchor distT="0" distB="0" distL="114300" distR="114300" simplePos="0" relativeHeight="251662336" behindDoc="0" locked="0" layoutInCell="1" allowOverlap="1">
+            <wp:simplePos x="0" y="0"/>
+            <wp:positionH relativeFrom="column">
+              <wp:posOffset>720725</wp:posOffset>
+            </wp:positionH>
+            <wp:positionV relativeFrom="paragraph">
+              <wp:posOffset>0</wp:posOffset>
+            </wp:positionV>
+            <wp:extent cx="3832860" cy="5288280"/>
+            <wp:effectExtent l="0" t="0" r="7620" b="0"/>
+            <wp:wrapSquare wrapText="bothSides"/>
+            <wp:docPr id="3" name="Picture 2"/>
+            <wp:cNvGraphicFramePr>
+              <a:graphicFrameLocks xmlns:a="http://schemas.openxmlformats.org/drawingml/2006/main" noChangeAspect="1"/>
+            </wp:cNvGraphicFramePr>
+            <a:graphic xmlns:a="http://schemas.openxmlformats.org/drawingml/2006/main">
+              <a:graphicData uri="http://schemas.openxmlformats.org/drawingml/2006/picture">
+                <pic:pic xmlns:pic="http://schemas.openxmlformats.org/drawingml/2006/picture">
+                  <pic:nvPicPr>
+                    <pic:cNvPr id="3" name="Picture 2"/>
+                    <pic:cNvPicPr>
+                      <a:picLocks noChangeAspect="1"/>
+                    </pic:cNvPicPr>
+                  </pic:nvPicPr>
+                  <pic:blipFill>
+                    <a:blip r:embed="rId8"/>
+                    <a:stretch>
+                      <a:fillRect/>
+                    </a:stretch>
+                  </pic:blipFill>
+                  <pic:spPr>
+                    <a:xfrm>
+                      <a:off x="0" y="0"/>
+                      <a:ext cx="3832860" cy="5288280"/>
+                    </a:xfrm>
+                    <a:prstGeom prst="rect">
+                      <a:avLst/>
+                    </a:prstGeom>
+                    <a:noFill/>
+                    <a:ln>
+                      <a:noFill/>
+                    </a:ln>
+                  </pic:spPr>
+                </pic:pic>
+              </a:graphicData>
+            </a:graphic>
+          </wp:anchor>
+        </w:drawing>
+      </w:r>
+    </w:p>
+    <w:p>
+      <w:pPr>
+        <w:rPr>
+          <w:rFonts w:hint="default" w:cs="Times New Roman"/>
+          <w:lang w:val="en-US"/>
+        </w:rPr>
+      </w:pPr>
+    </w:p>
+    <w:p>
+      <w:pPr>
+        <w:rPr>
+          <w:rFonts w:hint="default" w:cs="Times New Roman"/>
+          <w:lang w:val="en-US"/>
+        </w:rPr>
+      </w:pPr>
+    </w:p>
+    <w:p>
+      <w:pPr>
+        <w:rPr>
+          <w:rFonts w:hint="default" w:cs="Times New Roman"/>
+          <w:lang w:val="en-US"/>
+        </w:rPr>
+      </w:pPr>
+    </w:p>
+    <w:p>
+      <w:pPr>
+        <w:rPr>
+          <w:rFonts w:hint="default" w:cs="Times New Roman"/>
+          <w:lang w:val="en-US"/>
+        </w:rPr>
+      </w:pPr>
+    </w:p>
+    <w:p>
+      <w:pPr>
+        <w:rPr>
+          <w:rFonts w:hint="default" w:cs="Times New Roman"/>
+          <w:lang w:val="en-US"/>
+        </w:rPr>
+      </w:pPr>
+    </w:p>
+    <w:p>
+      <w:pPr>
+        <w:rPr>
+          <w:rFonts w:hint="default" w:cs="Times New Roman"/>
+          <w:lang w:val="en-US"/>
+        </w:rPr>
+      </w:pPr>
+    </w:p>
+    <w:p>
+      <w:pPr>
+        <w:rPr>
+          <w:rFonts w:hint="default" w:cs="Times New Roman"/>
+          <w:lang w:val="en-US"/>
+        </w:rPr>
+      </w:pPr>
+    </w:p>
+    <w:p>
+      <w:pPr>
+        <w:rPr>
+          <w:rFonts w:hint="default" w:cs="Times New Roman"/>
+          <w:lang w:val="en-US"/>
+        </w:rPr>
+      </w:pPr>
+    </w:p>
+    <w:p>
+      <w:pPr>
+        <w:rPr>
+          <w:rFonts w:hint="default" w:cs="Times New Roman"/>
+          <w:lang w:val="en-US"/>
+        </w:rPr>
+      </w:pPr>
+    </w:p>
+    <w:p>
+      <w:pPr>
+        <w:rPr>
+          <w:rFonts w:hint="default" w:cs="Times New Roman"/>
+          <w:lang w:val="en-US"/>
+        </w:rPr>
+      </w:pPr>
+    </w:p>
+    <w:p>
+      <w:pPr>
+        <w:rPr>
+          <w:rFonts w:hint="default" w:cs="Times New Roman"/>
+          <w:lang w:val="en-US"/>
+        </w:rPr>
+      </w:pPr>
+    </w:p>
+    <w:p>
+      <w:pPr>
+        <w:rPr>
+          <w:rFonts w:hint="default" w:cs="Times New Roman"/>
+          <w:lang w:val="en-US"/>
+        </w:rPr>
+      </w:pPr>
+    </w:p>
+    <w:p>
+      <w:pPr>
+        <w:rPr>
+          <w:rFonts w:hint="default" w:cs="Times New Roman"/>
+          <w:lang w:val="en-US"/>
+        </w:rPr>
+      </w:pPr>
+    </w:p>
+    <w:p>
+      <w:pPr>
+        <w:rPr>
+          <w:rFonts w:hint="default" w:cs="Times New Roman"/>
+          <w:lang w:val="en-US"/>
+        </w:rPr>
+      </w:pPr>
+    </w:p>
+    <w:p>
+      <w:pPr>
+        <w:rPr>
+          <w:rFonts w:hint="default" w:cs="Times New Roman"/>
+          <w:lang w:val="en-US"/>
+        </w:rPr>
+      </w:pPr>
+    </w:p>
+    <w:p>
+      <w:pPr>
+        <w:rPr>
+          <w:rFonts w:hint="default" w:cs="Times New Roman"/>
+          <w:lang w:val="en-US"/>
+        </w:rPr>
+      </w:pPr>
+    </w:p>
+    <w:p>
+      <w:pPr>
+        <w:rPr>
+          <w:rFonts w:hint="default" w:cs="Times New Roman"/>
+          <w:lang w:val="en-US"/>
+        </w:rPr>
+      </w:pPr>
+    </w:p>
+    <w:p>
+      <w:pPr>
+        <w:jc w:val="center"/>
+        <w:rPr>
+          <w:rFonts w:hint="default" w:cs="Times New Roman"/>
+          <w:b/>
+          <w:bCs/>
+          <w:i/>
+          <w:iCs/>
+          <w:sz w:val="21"/>
+          <w:szCs w:val="21"/>
+          <w:lang w:val="en-US"/>
+        </w:rPr>
+      </w:pPr>
+    </w:p>
+    <w:p>
+      <w:pPr>
+        <w:jc w:val="center"/>
+        <w:rPr>
+          <w:rFonts w:hint="default" w:cs="Times New Roman"/>
+          <w:b/>
+          <w:bCs/>
+          <w:i/>
+          <w:iCs/>
+          <w:sz w:val="21"/>
+          <w:szCs w:val="21"/>
+          <w:lang w:val="en-US"/>
+        </w:rPr>
+      </w:pPr>
+      <w:r>
+        <w:rPr>
+          <w:rFonts w:hint="default" w:cs="Times New Roman"/>
+          <w:b/>
+          <w:bCs/>
+          <w:i/>
+          <w:iCs/>
+          <w:sz w:val="21"/>
+          <w:szCs w:val="21"/>
+          <w:lang w:val="en-US"/>
+        </w:rPr>
+        <w:t>Figure 1: Workflow of User and Access Management task</w:t>
+      </w:r>
+    </w:p>
+    <w:p>
+      <w:pPr>
+        <w:rPr>
+          <w:rFonts w:hint="default" w:cs="Times New Roman"/>
+          <w:lang w:val="en-US"/>
+        </w:rPr>
+      </w:pPr>
+    </w:p>
+    <w:p>
+      <w:pPr>
+        <w:rPr>
+          <w:rFonts w:hint="default" w:cs="Times New Roman"/>
+          <w:lang w:val="en-US"/>
+        </w:rPr>
+      </w:pPr>
+    </w:p>
+    <w:p>
+      <w:pPr>
+        <w:rPr>
+          <w:rFonts w:hint="default" w:cs="Times New Roman"/>
+          <w:lang w:val="en-US"/>
+        </w:rPr>
+      </w:pPr>
+    </w:p>
+    <w:p>
+      <w:pPr>
+        <w:rPr>
+          <w:rFonts w:hint="default" w:cs="Times New Roman"/>
+          <w:lang w:val="en-US"/>
+        </w:rPr>
+      </w:pPr>
+    </w:p>
+    <w:p>
+      <w:pPr>
+        <w:rPr>
+          <w:rFonts w:hint="default" w:cs="Times New Roman"/>
+          <w:lang w:val="en-US"/>
+        </w:rPr>
+      </w:pPr>
+    </w:p>
+    <w:p>
+      <w:pPr>
+        <w:rPr>
+          <w:rFonts w:hint="default"/>
+          <w:lang w:val="en-US"/>
+        </w:rPr>
+      </w:pPr>
+    </w:p>
+    <w:p>
+      <w:pPr>
+        <w:pStyle w:val="3"/>
+        <w:bidi w:val="0"/>
+        <w:spacing w:line="240" w:lineRule="auto"/>
+        <w:ind w:left="400" w:leftChars="100" w:firstLine="0" w:firstLineChars="0"/>
+        <w:rPr>
+          <w:rStyle w:val="15"/>
+          <w:rFonts w:hint="default" w:cs="Times New Roman"/>
+          <w:b/>
+          <w:bCs/>
+          <w:sz w:val="28"/>
+          <w:szCs w:val="28"/>
+          <w:lang w:val="en-US"/>
+        </w:rPr>
+      </w:pPr>
+      <w:r>
+        <w:rPr>
+          <w:rFonts w:hint="default" w:cs="Times New Roman"/>
+          <w:lang w:val="en-US"/>
+        </w:rPr>
+        <w:t>5</w:t>
+      </w:r>
+      <w:r>
+        <w:rPr>
+          <w:rFonts w:hint="default" w:ascii="Times New Roman" w:hAnsi="Times New Roman" w:cs="Times New Roman"/>
+          <w:lang w:val="en-US"/>
+        </w:rPr>
+        <w:t>.</w:t>
+      </w:r>
+      <w:r>
+        <w:rPr>
+          <w:rFonts w:hint="default" w:cs="Times New Roman"/>
+          <w:lang w:val="en-US"/>
+        </w:rPr>
+        <w:t>2</w:t>
+      </w:r>
+      <w:r>
+        <w:rPr>
+          <w:rFonts w:hint="default" w:ascii="Times New Roman" w:hAnsi="Times New Roman" w:cs="Times New Roman"/>
+          <w:lang w:val="en-US"/>
+        </w:rPr>
+        <w:t xml:space="preserve"> </w:t>
+      </w:r>
+      <w:r>
+        <w:rPr>
+          <w:rStyle w:val="15"/>
+          <w:rFonts w:hint="default" w:cs="Times New Roman"/>
+          <w:b/>
+          <w:bCs/>
+          <w:sz w:val="28"/>
+          <w:szCs w:val="28"/>
+          <w:lang w:val="en-US"/>
+        </w:rPr>
+        <w:t>Branch and Hub Setup</w:t>
+      </w:r>
+    </w:p>
+    <w:p>
+      <w:pPr>
+        <w:rPr>
+          <w:rFonts w:hint="default"/>
+          <w:lang w:val="en-US"/>
+        </w:rPr>
+      </w:pPr>
+    </w:p>
+    <w:p>
+      <w:pPr>
+        <w:rPr>
+          <w:rFonts w:hint="default"/>
+          <w:lang w:val="en-US"/>
+        </w:rPr>
+      </w:pPr>
+    </w:p>
+    <w:p>
+      <w:pPr>
+        <w:rPr>
+          <w:rFonts w:hint="default"/>
           <w:lang w:val="en-US"/>
         </w:rPr>
       </w:pPr>

</xml_diff>

<commit_message>
Add Part F: Data Model
</commit_message>
<xml_diff>
--- a/Assignments/Assignment1/Team Report.docx
+++ b/Assignments/Assignment1/Team Report.docx
@@ -4884,6 +4884,118 @@
     </w:p>
     <w:p>
       <w:pPr>
+        <w:pStyle w:val="12"/>
+        <w:tabs>
+          <w:tab w:val="right" w:leader="dot" w:pos="8306"/>
+        </w:tabs>
+        <w:ind w:left="0" w:leftChars="0" w:firstLine="0" w:firstLineChars="0"/>
+        <w:rPr>
+          <w:rFonts w:hint="default"/>
+          <w:sz w:val="28"/>
+          <w:szCs w:val="28"/>
+          <w:lang w:val="en-US"/>
+        </w:rPr>
+      </w:pPr>
+      <w:r>
+        <w:rPr>
+          <w:rFonts w:hint="default"/>
+          <w:sz w:val="28"/>
+          <w:szCs w:val="28"/>
+          <w:lang w:val="en-US"/>
+        </w:rPr>
+        <w:fldChar w:fldCharType="begin"/>
+      </w:r>
+      <w:r>
+        <w:rPr>
+          <w:rFonts w:hint="default"/>
+          <w:sz w:val="28"/>
+          <w:szCs w:val="28"/>
+          <w:lang w:val="en-US"/>
+        </w:rPr>
+        <w:instrText xml:space="preserve"> HYPERLINK \l _Toc21461 </w:instrText>
+      </w:r>
+      <w:r>
+        <w:rPr>
+          <w:rFonts w:hint="default"/>
+          <w:sz w:val="28"/>
+          <w:szCs w:val="28"/>
+          <w:lang w:val="en-US"/>
+        </w:rPr>
+        <w:fldChar w:fldCharType="separate"/>
+      </w:r>
+      <w:r>
+        <w:rPr>
+          <w:rFonts w:hint="default" w:ascii="Times New Roman" w:hAnsi="Times New Roman" w:cs="Times New Roman"/>
+          <w:sz w:val="28"/>
+          <w:szCs w:val="28"/>
+          <w:lang w:val="en-US"/>
+        </w:rPr>
+        <w:t xml:space="preserve">Part </w:t>
+      </w:r>
+      <w:r>
+        <w:rPr>
+          <w:rFonts w:hint="default" w:cs="Times New Roman"/>
+          <w:sz w:val="28"/>
+          <w:szCs w:val="28"/>
+          <w:lang w:val="en-US"/>
+        </w:rPr>
+        <w:t>F</w:t>
+      </w:r>
+      <w:r>
+        <w:rPr>
+          <w:rFonts w:hint="default" w:ascii="Times New Roman" w:hAnsi="Times New Roman" w:cs="Times New Roman"/>
+          <w:sz w:val="28"/>
+          <w:szCs w:val="28"/>
+          <w:lang w:val="en-US"/>
+        </w:rPr>
+        <w:t xml:space="preserve">: </w:t>
+      </w:r>
+      <w:r>
+        <w:rPr>
+          <w:rFonts w:hint="default" w:cs="Times New Roman"/>
+          <w:sz w:val="28"/>
+          <w:szCs w:val="28"/>
+          <w:lang w:val="en-US"/>
+        </w:rPr>
+        <w:t>Data Model</w:t>
+      </w:r>
+      <w:r>
+        <w:rPr>
+          <w:sz w:val="28"/>
+          <w:szCs w:val="28"/>
+        </w:rPr>
+        <w:tab/>
+      </w:r>
+      <w:r>
+        <w:rPr>
+          <w:rFonts w:hint="default"/>
+          <w:sz w:val="28"/>
+          <w:szCs w:val="28"/>
+          <w:lang w:val="en-US"/>
+        </w:rPr>
+        <w:t>3</w:t>
+      </w:r>
+      <w:r>
+        <w:rPr>
+          <w:rFonts w:hint="default"/>
+          <w:sz w:val="28"/>
+          <w:szCs w:val="28"/>
+          <w:lang w:val="en-US"/>
+        </w:rPr>
+        <w:fldChar w:fldCharType="end"/>
+      </w:r>
+      <w:r>
+        <w:rPr>
+          <w:rFonts w:hint="default"/>
+          <w:sz w:val="28"/>
+          <w:szCs w:val="28"/>
+          <w:lang w:val="en-US"/>
+        </w:rPr>
+        <w:t>6</w:t>
+      </w:r>
+    </w:p>
+    <w:p>
+      <w:pPr>
         <w:pStyle w:val="13"/>
         <w:tabs>
           <w:tab w:val="right" w:leader="dot" w:pos="8306"/>
@@ -4896,6 +5008,338 @@
           <w:lang w:val="en-US"/>
         </w:rPr>
       </w:pPr>
+      <w:r>
+        <w:rPr>
+          <w:rFonts w:hint="default"/>
+          <w:sz w:val="28"/>
+          <w:szCs w:val="28"/>
+          <w:lang w:val="en-US"/>
+        </w:rPr>
+        <w:fldChar w:fldCharType="begin"/>
+      </w:r>
+      <w:r>
+        <w:rPr>
+          <w:rFonts w:hint="default"/>
+          <w:sz w:val="28"/>
+          <w:szCs w:val="28"/>
+          <w:lang w:val="en-US"/>
+        </w:rPr>
+        <w:instrText xml:space="preserve"> HYPERLINK \l _Toc18135 </w:instrText>
+      </w:r>
+      <w:r>
+        <w:rPr>
+          <w:rFonts w:hint="default"/>
+          <w:sz w:val="28"/>
+          <w:szCs w:val="28"/>
+          <w:lang w:val="en-US"/>
+        </w:rPr>
+        <w:fldChar w:fldCharType="separate"/>
+      </w:r>
+      <w:r>
+        <w:rPr>
+          <w:rFonts w:hint="default"/>
+          <w:sz w:val="28"/>
+          <w:szCs w:val="28"/>
+          <w:lang w:val="en-US"/>
+        </w:rPr>
+        <w:t>6</w:t>
+      </w:r>
+      <w:r>
+        <w:rPr>
+          <w:rFonts w:hint="default" w:ascii="Times New Roman" w:hAnsi="Times New Roman" w:cs="Times New Roman"/>
+          <w:sz w:val="28"/>
+          <w:szCs w:val="28"/>
+          <w:lang w:val="en-US"/>
+        </w:rPr>
+        <w:t>.</w:t>
+      </w:r>
+      <w:r>
+        <w:rPr>
+          <w:rFonts w:hint="default" w:cs="Times New Roman"/>
+          <w:sz w:val="28"/>
+          <w:szCs w:val="28"/>
+          <w:lang w:val="en-US"/>
+        </w:rPr>
+        <w:t>1</w:t>
+      </w:r>
+      <w:r>
+        <w:rPr>
+          <w:rFonts w:hint="default" w:ascii="Times New Roman" w:hAnsi="Times New Roman" w:cs="Times New Roman"/>
+          <w:sz w:val="28"/>
+          <w:szCs w:val="28"/>
+          <w:lang w:val="en-US"/>
+        </w:rPr>
+        <w:t xml:space="preserve"> </w:t>
+      </w:r>
+      <w:r>
+        <w:rPr>
+          <w:rFonts w:hint="default" w:cs="Times New Roman"/>
+          <w:sz w:val="28"/>
+          <w:szCs w:val="28"/>
+          <w:lang w:val="en-US"/>
+        </w:rPr>
+        <w:t>Conceptual Data Model</w:t>
+      </w:r>
+      <w:r>
+        <w:rPr>
+          <w:sz w:val="28"/>
+          <w:szCs w:val="28"/>
+        </w:rPr>
+        <w:tab/>
+      </w:r>
+      <w:r>
+        <w:rPr>
+          <w:rFonts w:hint="default"/>
+          <w:sz w:val="28"/>
+          <w:szCs w:val="28"/>
+          <w:lang w:val="en-US"/>
+        </w:rPr>
+        <w:fldChar w:fldCharType="end"/>
+      </w:r>
+      <w:r>
+        <w:rPr>
+          <w:rFonts w:hint="default"/>
+          <w:sz w:val="28"/>
+          <w:szCs w:val="28"/>
+          <w:lang w:val="en-US"/>
+        </w:rPr>
+        <w:t>xx</w:t>
+      </w:r>
+    </w:p>
+    <w:p>
+      <w:pPr>
+        <w:pStyle w:val="13"/>
+        <w:tabs>
+          <w:tab w:val="right" w:leader="dot" w:pos="8306"/>
+        </w:tabs>
+        <w:ind w:left="0" w:leftChars="0" w:firstLine="140" w:firstLineChars="50"/>
+        <w:rPr>
+          <w:rFonts w:hint="default"/>
+          <w:sz w:val="28"/>
+          <w:szCs w:val="28"/>
+          <w:lang w:val="en-US"/>
+        </w:rPr>
+      </w:pPr>
+      <w:r>
+        <w:rPr>
+          <w:rFonts w:hint="default"/>
+          <w:sz w:val="28"/>
+          <w:szCs w:val="28"/>
+          <w:lang w:val="en-US"/>
+        </w:rPr>
+        <w:fldChar w:fldCharType="begin"/>
+      </w:r>
+      <w:r>
+        <w:rPr>
+          <w:rFonts w:hint="default"/>
+          <w:sz w:val="28"/>
+          <w:szCs w:val="28"/>
+          <w:lang w:val="en-US"/>
+        </w:rPr>
+        <w:instrText xml:space="preserve"> HYPERLINK \l _Toc18135 </w:instrText>
+      </w:r>
+      <w:r>
+        <w:rPr>
+          <w:rFonts w:hint="default"/>
+          <w:sz w:val="28"/>
+          <w:szCs w:val="28"/>
+          <w:lang w:val="en-US"/>
+        </w:rPr>
+        <w:fldChar w:fldCharType="separate"/>
+      </w:r>
+      <w:r>
+        <w:rPr>
+          <w:rFonts w:hint="default"/>
+          <w:sz w:val="28"/>
+          <w:szCs w:val="28"/>
+          <w:lang w:val="en-US"/>
+        </w:rPr>
+        <w:t>6</w:t>
+      </w:r>
+      <w:r>
+        <w:rPr>
+          <w:rFonts w:hint="default" w:ascii="Times New Roman" w:hAnsi="Times New Roman" w:cs="Times New Roman"/>
+          <w:sz w:val="28"/>
+          <w:szCs w:val="28"/>
+          <w:lang w:val="en-US"/>
+        </w:rPr>
+        <w:t>.</w:t>
+      </w:r>
+      <w:r>
+        <w:rPr>
+          <w:rFonts w:hint="default" w:cs="Times New Roman"/>
+          <w:sz w:val="28"/>
+          <w:szCs w:val="28"/>
+          <w:lang w:val="en-US"/>
+        </w:rPr>
+        <w:t>2</w:t>
+      </w:r>
+      <w:r>
+        <w:rPr>
+          <w:rFonts w:hint="default" w:ascii="Times New Roman" w:hAnsi="Times New Roman" w:cs="Times New Roman"/>
+          <w:sz w:val="28"/>
+          <w:szCs w:val="28"/>
+          <w:lang w:val="en-US"/>
+        </w:rPr>
+        <w:t xml:space="preserve"> </w:t>
+      </w:r>
+      <w:r>
+        <w:rPr>
+          <w:rFonts w:hint="default" w:cs="Times New Roman"/>
+          <w:sz w:val="28"/>
+          <w:szCs w:val="28"/>
+          <w:lang w:val="en-US"/>
+        </w:rPr>
+        <w:t>Logical Data Model and Entity Relationship Diagram</w:t>
+      </w:r>
+      <w:r>
+        <w:rPr>
+          <w:sz w:val="28"/>
+          <w:szCs w:val="28"/>
+        </w:rPr>
+        <w:tab/>
+      </w:r>
+      <w:r>
+        <w:rPr>
+          <w:rFonts w:hint="default"/>
+          <w:sz w:val="28"/>
+          <w:szCs w:val="28"/>
+          <w:lang w:val="en-US"/>
+        </w:rPr>
+        <w:fldChar w:fldCharType="end"/>
+      </w:r>
+      <w:r>
+        <w:rPr>
+          <w:rFonts w:hint="default"/>
+          <w:sz w:val="28"/>
+          <w:szCs w:val="28"/>
+          <w:lang w:val="en-US"/>
+        </w:rPr>
+        <w:t>xx</w:t>
+      </w:r>
+    </w:p>
+    <w:p>
+      <w:pPr>
+        <w:pStyle w:val="13"/>
+        <w:tabs>
+          <w:tab w:val="right" w:leader="dot" w:pos="8306"/>
+        </w:tabs>
+        <w:ind w:left="0" w:leftChars="0" w:firstLine="140" w:firstLineChars="50"/>
+        <w:rPr>
+          <w:rFonts w:hint="default"/>
+          <w:sz w:val="28"/>
+          <w:szCs w:val="28"/>
+          <w:lang w:val="en-US"/>
+        </w:rPr>
+      </w:pPr>
+      <w:r>
+        <w:rPr>
+          <w:rFonts w:hint="default"/>
+          <w:sz w:val="28"/>
+          <w:szCs w:val="28"/>
+          <w:lang w:val="en-US"/>
+        </w:rPr>
+        <w:fldChar w:fldCharType="begin"/>
+      </w:r>
+      <w:r>
+        <w:rPr>
+          <w:rFonts w:hint="default"/>
+          <w:sz w:val="28"/>
+          <w:szCs w:val="28"/>
+          <w:lang w:val="en-US"/>
+        </w:rPr>
+        <w:instrText xml:space="preserve"> HYPERLINK \l _Toc18135 </w:instrText>
+      </w:r>
+      <w:r>
+        <w:rPr>
+          <w:rFonts w:hint="default"/>
+          <w:sz w:val="28"/>
+          <w:szCs w:val="28"/>
+          <w:lang w:val="en-US"/>
+        </w:rPr>
+        <w:fldChar w:fldCharType="separate"/>
+      </w:r>
+      <w:r>
+        <w:rPr>
+          <w:rFonts w:hint="default"/>
+          <w:sz w:val="28"/>
+          <w:szCs w:val="28"/>
+          <w:lang w:val="en-US"/>
+        </w:rPr>
+        <w:t>6</w:t>
+      </w:r>
+      <w:r>
+        <w:rPr>
+          <w:rFonts w:hint="default" w:ascii="Times New Roman" w:hAnsi="Times New Roman" w:cs="Times New Roman"/>
+          <w:sz w:val="28"/>
+          <w:szCs w:val="28"/>
+          <w:lang w:val="en-US"/>
+        </w:rPr>
+        <w:t>.</w:t>
+      </w:r>
+      <w:r>
+        <w:rPr>
+          <w:rFonts w:hint="default" w:cs="Times New Roman"/>
+          <w:sz w:val="28"/>
+          <w:szCs w:val="28"/>
+          <w:lang w:val="en-US"/>
+        </w:rPr>
+        <w:t>3</w:t>
+      </w:r>
+      <w:r>
+        <w:rPr>
+          <w:rFonts w:hint="default" w:ascii="Times New Roman" w:hAnsi="Times New Roman" w:cs="Times New Roman"/>
+          <w:sz w:val="28"/>
+          <w:szCs w:val="28"/>
+          <w:lang w:val="en-US"/>
+        </w:rPr>
+        <w:t xml:space="preserve"> </w:t>
+      </w:r>
+      <w:r>
+        <w:rPr>
+          <w:rFonts w:hint="default" w:cs="Times New Roman"/>
+          <w:sz w:val="28"/>
+          <w:szCs w:val="28"/>
+          <w:lang w:val="en-US"/>
+        </w:rPr>
+        <w:t>Physical</w:t>
+      </w:r>
+      <w:bookmarkStart w:id="24" w:name="_GoBack"/>
+      <w:bookmarkEnd w:id="24"/>
+      <w:r>
+        <w:rPr>
+          <w:rFonts w:hint="default" w:cs="Times New Roman"/>
+          <w:sz w:val="28"/>
+          <w:szCs w:val="28"/>
+          <w:lang w:val="en-US"/>
+        </w:rPr>
+        <w:t xml:space="preserve"> Data Model</w:t>
+      </w:r>
+      <w:r>
+        <w:rPr>
+          <w:sz w:val="28"/>
+          <w:szCs w:val="28"/>
+        </w:rPr>
+        <w:tab/>
+      </w:r>
+      <w:r>
+        <w:rPr>
+          <w:rFonts w:hint="default"/>
+          <w:sz w:val="28"/>
+          <w:szCs w:val="28"/>
+          <w:lang w:val="en-US"/>
+        </w:rPr>
+        <w:fldChar w:fldCharType="end"/>
+      </w:r>
+      <w:r>
+        <w:rPr>
+          <w:rFonts w:hint="default"/>
+          <w:sz w:val="28"/>
+          <w:szCs w:val="28"/>
+          <w:lang w:val="en-US"/>
+        </w:rPr>
+        <w:t>xx</w:t>
+      </w:r>
     </w:p>
     <w:p>
       <w:pPr>
@@ -16622,6 +17066,14 @@
       </w:tblGrid>
       <w:tr>
         <w:tblPrEx>
+          <w:tblBorders>
+            <w:top w:val="single" w:color="auto" w:sz="4" w:space="0"/>
+            <w:left w:val="single" w:color="auto" w:sz="4" w:space="0"/>
+            <w:bottom w:val="single" w:color="auto" w:sz="4" w:space="0"/>
+            <w:right w:val="single" w:color="auto" w:sz="4" w:space="0"/>
+            <w:insideH w:val="single" w:color="auto" w:sz="4" w:space="0"/>
+            <w:insideV w:val="single" w:color="auto" w:sz="4" w:space="0"/>
+          </w:tblBorders>
           <w:tblCellMar>
             <w:top w:w="0" w:type="dxa"/>
             <w:left w:w="108" w:type="dxa"/>
@@ -19630,6 +20082,14 @@
       </w:tblGrid>
       <w:tr>
         <w:tblPrEx>
+          <w:tblBorders>
+            <w:top w:val="single" w:color="auto" w:sz="4" w:space="0"/>
+            <w:left w:val="single" w:color="auto" w:sz="4" w:space="0"/>
+            <w:bottom w:val="single" w:color="auto" w:sz="4" w:space="0"/>
+            <w:right w:val="single" w:color="auto" w:sz="4" w:space="0"/>
+            <w:insideH w:val="single" w:color="auto" w:sz="4" w:space="0"/>
+            <w:insideV w:val="single" w:color="auto" w:sz="4" w:space="0"/>
+          </w:tblBorders>
           <w:tblCellMar>
             <w:top w:w="0" w:type="dxa"/>
             <w:left w:w="108" w:type="dxa"/>
@@ -27463,7 +27923,6 @@
           <w:sz w:val="21"/>
           <w:szCs w:val="21"/>
           <w:u w:val="none"/>
-          <w:bdr w:val="none" w:color="auto" w:sz="0" w:space="0"/>
           <w:vertAlign w:val="baseline"/>
         </w:rPr>
         <w:drawing>
@@ -27919,8 +28378,6 @@
           <w:lang w:val="en-US"/>
         </w:rPr>
       </w:pPr>
-      <w:bookmarkStart w:id="24" w:name="_GoBack"/>
-      <w:bookmarkEnd w:id="24"/>
     </w:p>
     <w:p>
       <w:pPr>
@@ -27985,6 +28442,58 @@
           <w:lang w:val="en-US"/>
         </w:rPr>
       </w:pPr>
+      <w:r>
+        <w:rPr>
+          <w:rFonts w:hint="default"/>
+          <w:lang w:val="en-US"/>
+        </w:rPr>
+        <w:br w:type="textWrapping"/>
+      </w:r>
+      <w:r>
+        <w:rPr>
+          <w:rFonts w:hint="default"/>
+          <w:lang w:val="en-US"/>
+        </w:rPr>
+        <w:br w:type="textWrapping"/>
+      </w:r>
+    </w:p>
+    <w:p>
+      <w:pPr>
+        <w:pStyle w:val="2"/>
+        <w:bidi w:val="0"/>
+        <w:rPr>
+          <w:rFonts w:hint="default" w:ascii="Times New Roman" w:hAnsi="Times New Roman" w:cs="Times New Roman"/>
+          <w:lang w:val="en-US"/>
+        </w:rPr>
+      </w:pPr>
+      <w:r>
+        <w:rPr>
+          <w:rFonts w:hint="default" w:ascii="Times New Roman" w:hAnsi="Times New Roman" w:cs="Times New Roman"/>
+          <w:lang w:val="en-US"/>
+        </w:rPr>
+        <w:t xml:space="preserve">Part </w:t>
+      </w:r>
+      <w:r>
+        <w:rPr>
+          <w:rFonts w:hint="default" w:cs="Times New Roman"/>
+          <w:lang w:val="en-US"/>
+        </w:rPr>
+        <w:t>F</w:t>
+      </w:r>
+      <w:r>
+        <w:rPr>
+          <w:rFonts w:hint="default" w:ascii="Times New Roman" w:hAnsi="Times New Roman" w:cs="Times New Roman"/>
+          <w:lang w:val="en-US"/>
+        </w:rPr>
+        <w:t xml:space="preserve">: </w:t>
+      </w:r>
+      <w:r>
+        <w:rPr>
+          <w:rFonts w:hint="default" w:cs="Times New Roman"/>
+          <w:lang w:val="en-US"/>
+        </w:rPr>
+        <w:t>Data Model</w:t>
+      </w:r>
     </w:p>
     <w:p>
       <w:pPr>

</xml_diff>